<commit_message>
Align Task 04 with lecturer grayscale example and public PNG inputs
</commit_message>
<xml_diff>
--- a/2638120_Thaslim_Mohammed_Sahl_High_Performance_Computing.docx
+++ b/2638120_Thaslim_Mohammed_Sahl_High_Performance_Computing.docx
@@ -61,7 +61,7 @@
     </w:p>
     <w:p>
       <w:r>
-        <w:t>The GitHub project is private during development as requested. Notebook setup first attempts the hosted resource URLs, then loads a checksum-verified compressed copy stored in the notebook. The listed GitHub Colab links require repository access until the student approves a visibility change. The executed Colab notebooks are linked separately under each task.</w:t>
+        <w:t>The GitHub project is private during development as requested. Notebook setup first attempts hosted project resources, then loads a checksum-verified compressed copy stored in the notebook. Task 04 separately downloads its demonstration images from public URLs that already work without a GitHub login. The listed GitHub Colab links require repository access until the student approves a visibility change. The executed Colab notebooks are linked separately under each task.</w:t>
       </w:r>
     </w:p>
     <w:p>
@@ -75,7 +75,7 @@
     </w:p>
     <w:p>
       <w:r>
-        <w:t>All 23 initial test groups passed on the Tesla T4. They include multiple CPU thread counts, all supplied matrix pairs, exhaustive recovery of the 67,600-password domain, ten complete pixel comparisons, invalid inputs, AddressSanitizer, and UndefinedBehaviorSanitizer. Raw logs and a machine-readable validation manifest are saved under evidence/validation. The figures and numerical observations below come from those runs.</w:t>
+        <w:t>All 23 initial test groups passed on the Tesla T4, including multiple CPU thread counts, all supplied matrix pairs, exhaustive recovery of the 67,600-password domain, invalid inputs, AddressSanitizer and UndefinedBehaviorSanitizer. After incorporating the last-class grayscale example, Task 04 was rerun: both updated test groups passed, including fourteen complete PNG comparisons. Raw logs and separate initial and updated validation manifests are saved under evidence/validation. Task 04 figures and timings below use the updated run.</w:t>
       </w:r>
     </w:p>
     <w:p>
@@ -937,12 +937,12 @@
     </w:p>
     <w:p>
       <w:r>
-        <w:t>LodePNG decodes each file into an RGBA host array. Its original copyright and licence notices are retained. The input images are original repeatable test patterns: shapes at 512x384, a gradient at 640x480 and a checkerboard at 257x193. The final dimensions deliberately include a non-divisible pixel count.</w:t>
+        <w:t>The notebook uses wget to download download.png (300x300) from the lecturer's public image URL, plus smarties.png (413x356) and sudoku.png (558x563) from pinned public OpenCV sample URLs. SHA-256 and PNG dimensions are checked before use; image_downloads.json records the source and load mode. These images require no private GitHub login or Drive mount. LodePNG decodes each file into an RGBA host array, with its original licence notices retained.</w:t>
       </w:r>
     </w:p>
     <w:p>
       <w:r>
-        <w:t>Integer luminance is (77*R + 150*G + 29*B) / 256, rounded down. The 3x3 Gx matrix is [-1,0,1; -2,0,2; -1,0,1], and Gy is [-1,-2,-1; 0,0,0; 1,2,1]. Each thread visits its pixel's 3x3 neighbourhood and treats any out-of-image sample as zero.</w:t>
+        <w:t>The last-class sample demonstrates PNG decoding, explicit CUDA memory transfers and rgbToGray; its final kernel stops at grayscale conversion. This implementation extends that workflow with the assessed Sobel convolution. Luminance uses the lecturer's 0.30R + 0.59G + 0.11B weights as (30*R + 59*G + 11*B) / 100, rounded down. Integer arithmetic gives identical CPU and GPU truncation. Gx is [-1,0,1; -2,0,2; -1,0,1] and Gy is [-1,-2,-1; 0,0,0; 1,2,1]. Out-of-image neighbours are zero.</w:t>
       </w:r>
     </w:p>
     <w:p>
@@ -1021,7 +1021,7 @@
           <w:rFonts w:ascii="Consolas" w:hAnsi="Consolas"/>
           <w:sz w:val="18"/>
         </w:rPr>
-        <w:t>./SobelEdge outputs images/shapes.png images/gradient.png images/checkerboard.png</w:t>
+        <w:t>./SobelEdge outputs images/download.png images/smarties.png images/sudoku.png</w:t>
       </w:r>
     </w:p>
     <w:p>
@@ -1035,7 +1035,7 @@
     </w:p>
     <w:p>
       <w:r>
-        <w:t>All pixels matched both references for ten PNGs: the three main patterns, 3x3 black and white inputs, a single pixel, a 6x4 input, and random RGBA inputs of 2x5, 17x19 and 1025x2. Tests covered zero padding, saturation, preserved transparency and padded launch threads.</w:t>
+        <w:t>The updated notebook downloaded all three demonstration PNGs live from their public URLs on the Tesla T4. All pixels matched the serial C reference and independent NumPy oracle for fourteen PNGs: these three public inputs, three original synthetic patterns, 3x3 black and white inputs, a single pixel, a 6x4 input, random RGBA inputs of 2x5, 17x19 and 1025x2, and a coloured rounding fixture. That fixture detects the previous grayscale weights and checks changing alpha values. Tests covered zero padding, saturation, transparency and padded launch threads.</w:t>
       </w:r>
     </w:p>
     <w:p>
@@ -1045,14 +1045,17 @@
     </w:p>
     <w:p>
       <w:r>
-        <w:t>The recorded 640x480 gradient run took 14.651 ms for serial CPU computation, 0.035 ms for the CUDA kernel, and 0.754 ms for transfers plus kernel. These are single-run observations. GPU allocation, PNG decoding and encoding are outside the transfer-and-kernel interval. The first CUDA invocation has additional startup overhead, so timings are not stable benchmark estimates.</w:t>
+        <w:t>The updated 413x356 smarties.png run took 9.062 ms for serial CPU computation, 0.030 ms for the CUDA kernel, and 0.487 ms for transfers plus kernel. These are single-run observations. GPU allocation, PNG decoding and encoding are outside the transfer-and-kernel interval. The first CUDA invocation has additional startup overhead, so timings are not stable benchmark estimates.</w:t>
       </w:r>
     </w:p>
     <w:p>
+      <w:pPr>
+        <w:keepNext/>
+      </w:pPr>
       <w:r>
         <w:drawing>
           <wp:inline xmlns:a="http://schemas.openxmlformats.org/drawingml/2006/main" xmlns:pic="http://schemas.openxmlformats.org/drawingml/2006/picture">
-            <wp:extent cx="5760720" cy="2133600"/>
+            <wp:extent cx="5303520" cy="2599765"/>
             <wp:docPr id="1" name="Picture 1"/>
             <wp:cNvGraphicFramePr>
               <a:graphicFrameLocks noChangeAspect="1"/>
@@ -1061,7 +1064,7 @@
               <a:graphicData uri="http://schemas.openxmlformats.org/drawingml/2006/picture">
                 <pic:pic>
                   <pic:nvPicPr>
-                    <pic:cNvPr id="0" name="figure_shapes.png"/>
+                    <pic:cNvPr id="0" name="figure_download.png"/>
                     <pic:cNvPicPr/>
                   </pic:nvPicPr>
                   <pic:blipFill>
@@ -1073,7 +1076,7 @@
                   <pic:spPr>
                     <a:xfrm>
                       <a:off x="0" y="0"/>
-                      <a:ext cx="5760720" cy="2133600"/>
+                      <a:ext cx="5303520" cy="2599765"/>
                     </a:xfrm>
                     <a:prstGeom prst="rect"/>
                   </pic:spPr>
@@ -1086,48 +1089,7 @@
     </w:p>
     <w:p>
       <w:r>
-        <w:t>Input on the left and verified Sobel edge image on the right for shapes.png.</w:t>
-      </w:r>
-    </w:p>
-    <w:p>
-      <w:r>
-        <w:drawing>
-          <wp:inline xmlns:a="http://schemas.openxmlformats.org/drawingml/2006/main" xmlns:pic="http://schemas.openxmlformats.org/drawingml/2006/picture">
-            <wp:extent cx="5760720" cy="2133600"/>
-            <wp:docPr id="2" name="Picture 2"/>
-            <wp:cNvGraphicFramePr>
-              <a:graphicFrameLocks noChangeAspect="1"/>
-            </wp:cNvGraphicFramePr>
-            <a:graphic>
-              <a:graphicData uri="http://schemas.openxmlformats.org/drawingml/2006/picture">
-                <pic:pic>
-                  <pic:nvPicPr>
-                    <pic:cNvPr id="0" name="figure_gradient.png"/>
-                    <pic:cNvPicPr/>
-                  </pic:nvPicPr>
-                  <pic:blipFill>
-                    <a:blip r:embed="rId19"/>
-                    <a:stretch>
-                      <a:fillRect/>
-                    </a:stretch>
-                  </pic:blipFill>
-                  <pic:spPr>
-                    <a:xfrm>
-                      <a:off x="0" y="0"/>
-                      <a:ext cx="5760720" cy="2133600"/>
-                    </a:xfrm>
-                    <a:prstGeom prst="rect"/>
-                  </pic:spPr>
-                </pic:pic>
-              </a:graphicData>
-            </a:graphic>
-          </wp:inline>
-        </w:drawing>
-      </w:r>
-    </w:p>
-    <w:p>
-      <w:r>
-        <w:t>Input on the left and verified Sobel edge image on the right for gradient.png.</w:t>
+        <w:t>Input on the left and verified Sobel edge image on the right for download.png.</w:t>
       </w:r>
     </w:p>
     <w:p>
@@ -1204,7 +1166,7 @@
     </w:p>
     <w:p>
       <w:r>
-        <w:t>Lecturer source collection. code sir.txt; CryptForCuda.c; PasswordGeneratorToText.c; OMPMatSumFromFile.c.txt; Negative.cu. Supplied source examples.</w:t>
+        <w:t>Lecturer source collection. code sir.txt; CryptForCuda.c; PasswordGeneratorToText.c; OMPMatSumFromFile.c.txt; Negative.cu; last-class SobelEdge.cu PNG/grayscale example supplied as pasted text. Supplied teaching examples.</w:t>
       </w:r>
     </w:p>
     <w:p>
@@ -1218,7 +1180,7 @@
       </w:r>
     </w:p>
     <w:p>
-      <w:hyperlink r:id="rId20">
+      <w:hyperlink r:id="rId19">
         <w:r>
           <w:rPr>
             <w:color w:val="164B6B"/>
@@ -1229,7 +1191,7 @@
       </w:hyperlink>
     </w:p>
     <w:p>
-      <w:hyperlink r:id="rId21">
+      <w:hyperlink r:id="rId20">
         <w:r>
           <w:rPr>
             <w:color w:val="164B6B"/>
@@ -1240,7 +1202,7 @@
       </w:hyperlink>
     </w:p>
     <w:p>
-      <w:hyperlink r:id="rId22">
+      <w:hyperlink r:id="rId21">
         <w:r>
           <w:rPr>
             <w:color w:val="164B6B"/>
@@ -1250,8 +1212,30 @@
         </w:r>
       </w:hyperlink>
     </w:p>
+    <w:p>
+      <w:hyperlink r:id="rId22">
+        <w:r>
+          <w:rPr>
+            <w:color w:val="164B6B"/>
+            <w:u w:val="single"/>
+          </w:rPr>
+          <w:t>Lecturer PNG input used in Task 04</w:t>
+        </w:r>
+      </w:hyperlink>
+    </w:p>
+    <w:p>
+      <w:hyperlink r:id="rId23">
+        <w:r>
+          <w:rPr>
+            <w:color w:val="164B6B"/>
+            <w:u w:val="single"/>
+          </w:rPr>
+          <w:t>OpenCV sample PNG inputs and upstream licence (pinned revision)</w:t>
+        </w:r>
+      </w:hyperlink>
+    </w:p>
     <w:sectPr>
-      <w:footerReference w:type="default" r:id="rId23"/>
+      <w:footerReference w:type="default" r:id="rId24"/>
       <w:pgSz w:w="12240" w:h="15840"/>
       <w:pgMar w:top="1152" w:right="1224" w:bottom="1080" w:left="1224" w:header="720" w:footer="720" w:gutter="0"/>
       <w:cols w:space="720"/>

</xml_diff>

<commit_message>
Add Task 04 X and Y gradient outputs and four-view evidence
</commit_message>
<xml_diff>
--- a/2638120_Thaslim_Mohammed_Sahl_High_Performance_Computing.docx
+++ b/2638120_Thaslim_Mohammed_Sahl_High_Performance_Computing.docx
@@ -12,7 +12,7 @@
     </w:p>
     <w:p>
       <w:r>
-        <w:t>6CS005 2025 26 assessment</w:t>
+        <w:t>6CS005 2025/26 assessment</w:t>
       </w:r>
     </w:p>
     <w:p>
@@ -45,7 +45,7 @@
     </w:p>
     <w:p>
       <w:r>
-        <w:t>Task folders follow the Practical Task and Task 01 to Task 04 organisation. Required output names are result.txt for word counts, results.txt for matrices, decrypted.txt for passwords, and outImg_ prefixed PNGs for edges. No input resource requires mounting a private Google Drive folder.</w:t>
+        <w:t>Task folders follow the Practical Task and Task 01 to Task 04 organisation. Output names used here are result.txt for word counts, results.txt for matrices, decrypted.txt for passwords, and outImg_ prefixed PNGs for edges. Task 04 adds outImg_Gx_ and outImg_Gy_ PNGs so all four illustrated views can be shown. No input resource requires mounting a private Google Drive folder.</w:t>
       </w:r>
     </w:p>
     <w:p>
@@ -75,7 +75,7 @@
     </w:p>
     <w:p>
       <w:r>
-        <w:t>All 23 initial test groups passed on the Tesla T4, including multiple CPU thread counts, all supplied matrix pairs, exhaustive recovery of the 67,600-password domain, invalid inputs, AddressSanitizer and UndefinedBehaviorSanitizer. After incorporating the last-class grayscale example, Task 04 was rerun: both updated test groups passed, including fourteen complete PNG comparisons. Raw logs and separate initial and updated validation manifests are saved under evidence/validation. Task 04 figures and timings below use the updated run.</w:t>
+        <w:t>All 23 initial test groups passed on the Tesla T4, including multiple CPU thread counts, all supplied matrix pairs, exhaustive recovery of the 67,600-password domain, invalid inputs, AddressSanitizer and UndefinedBehaviorSanitizer. Task 04 was then rerun with separate X and Y maps: all 3 updated groups passed, including complete comparisons of three maps for each of 19 PNG inputs. Raw logs and separate initial and updated validation manifests are saved under evidence/validation. Task 04 figures and timings below use the four-view version.</w:t>
       </w:r>
     </w:p>
     <w:p>
@@ -887,7 +887,9 @@
         <w:keepNext/>
       </w:pPr>
       <w:r>
-        <w:t>Task 04 Sobel Edge Detection using Cuda across many PNG images</w:t>
+        <w:t>Task 04</w:t>
+        <w:br/>
+        <w:t>Sobel Edge Detection using Cuda across many PNG images</w:t>
       </w:r>
     </w:p>
     <w:p>
@@ -923,7 +925,7 @@
     </w:p>
     <w:p>
       <w:r>
-        <w:t>Decode multiple PNG images, apply the Sobel horizontal and vertical kernels on the GPU with zero padding, and save each resulting edge image with the original width, height and alpha channel.</w:t>
+        <w:t>Process multiple PNG inputs with CUDA and reproduce the brief's four views for each input: Original Image, Gradient in X direction, Gradient in Y direction and Sobel Edge Detection. The four panels illustrate one input; the brief does not specify exactly four different inputs. Save both gradient maps and the combined edge map at the original dimensions.</w:t>
       </w:r>
     </w:p>
     <w:p>
@@ -947,12 +949,12 @@
     </w:p>
     <w:p>
       <w:r>
-        <w:t>The edge magnitude is sqrt(Gx*Gx + Gy*Gy), truncated to an integer and capped at 255. That edge value is written to R, G and B; alpha is copied from the original pixel. Reading always uses the separate input buffer, so one pixel's output cannot change a neighbour's input.</w:t>
+        <w:t>Gx measures left-to-right intensity changes and Gy measures top-to-bottom changes, following the written axis definitions. The kernel saves min(255, abs(Gx)) and min(255, abs(Gy)) in separate one-byte-per-pixel display buffers. The final magnitude uses the original signed sums: sqrt(Gx*Gx + Gy*Gy), then truncation and saturation at 255. Clipping a display map never changes that calculation. The final edge value fills RGB and preserves input alpha; the separate gradient maps contain grayscale intensity only.</w:t>
       </w:r>
     </w:p>
     <w:p>
       <w:r>
-        <w:t>GPU memory is sized as width*height*4 bytes for each input and output array. The x grid uses ceil(pixel_count/256) blocks, with a bounds guard in the kernel. The command accepts an output directory and any number of input images. Result names are outImg_ followed by the input basename. Distinct basenames avoid accidental overwriting.</w:t>
+        <w:t>RGBA input and final output arrays each use width*height*4 bytes. Each gradient array uses width*height bytes. The x grid has ceil(pixel_count/256) blocks and a guard for padded threads. The command accepts any number of PNGs. Output names are outImg_, outImg_Gx_ and outImg_Gy_ followed by the input basename. The host rejects duplicate or colliding generated names before processing. Gradient encoding uses lodepng_encode_file with LCT_GREY, 8, matching the lecturer's grayscale-buffer workflow.</w:t>
       </w:r>
     </w:p>
     <w:p>
@@ -966,7 +968,7 @@
     </w:p>
     <w:p>
       <w:r>
-        <w:t>After launch and execution checks, the output is copied to the host. A serial C reference expresses the gradients as neighbour sums and compares every RGBA byte. An independent NumPy checker also uses padded image arrays and validates the complete output, including alpha.</w:t>
+        <w:t>Checked kernel completion precedes device-to-host copies of all three maps. A serial C reference expresses the gradients as neighbour sums and compares every final RGBA byte and both gradient buffers. An independent NumPy checker verifies all saved maps and their dimensions, including alpha in the final edge image.</w:t>
       </w:r>
     </w:p>
     <w:p>
@@ -976,7 +978,7 @@
     </w:p>
     <w:p>
       <w:r>
-        <w:t>Images are processed one at a time, releasing host buffers, device buffers and events after each image. The CPU reference needs a third host array for verification. Peak working memory depends on the largest image, rather than the sum of every image in the batch.</w:t>
+        <w:t>Images are processed one at a time. Host image and reference buffers, all four device buffers and timing events are released after each image, including failure paths. Working memory depends on the largest image. Gradients are encoded losslessly from 8-bit grayscale buffers; LodePNG can optimise the file's storage without changing its decoded intensities.</w:t>
       </w:r>
     </w:p>
     <w:p>
@@ -1035,27 +1037,28 @@
     </w:p>
     <w:p>
       <w:r>
-        <w:t>The updated notebook downloaded all three demonstration PNGs live from their public URLs on the Tesla T4. All pixels matched the serial C reference and independent NumPy oracle for fourteen PNGs: these three public inputs, three original synthetic patterns, 3x3 black and white inputs, a single pixel, a 6x4 input, random RGBA inputs of 2x5, 17x19 and 1025x2, and a coloured rounding fixture. That fixture detects the previous grayscale weights and checks changing alpha values. Tests covered zero padding, saturation, transparency and padded launch threads.</w:t>
+        <w:t>The revised notebook downloaded all three demonstration PNGs live on the Tesla T4. Every pixel in all three saved maps matched the references across 19 PNG inputs. Fixtures cover zero padding, saturation, final-image transparency, grayscale rounding and padded launches, as well as the public images and original synthetic patterns.</w:t>
       </w:r>
     </w:p>
     <w:p>
       <w:r>
-        <w:t>Corrupt PNGs, missing files, missing output directories and duplicate basenames were tested. A corrupt image followed by a valid image confirmed that the valid image still processed and the overall command reported the batch failure.</w:t>
+        <w:t>Directional fixtures independently check that a horizontal ramp has zero interior Gy and a vertical ramp has zero interior Gx. Negative gradients remain visible through their absolute values. A constructed 3x3 patch gives Gx=6, Gy=8 and final magnitude 10 at its centre, reproducing the brief's numerical example. Corrupt files, invalid paths, duplicate inputs and cross-output filename collisions are also tested; a batch continues to a valid image after a corrupt one.</w:t>
       </w:r>
     </w:p>
     <w:p>
       <w:r>
-        <w:t>The updated 413x356 smarties.png run took 9.062 ms for serial CPU computation, 0.030 ms for the CUDA kernel, and 0.487 ms for transfers plus kernel. These are single-run observations. GPU allocation, PNG decoding and encoding are outside the transfer-and-kernel interval. The first CUDA invocation has additional startup overhead, so timings are not stable benchmark estimates.</w:t>
+        <w:t>The updated 413x356 smarties.png run took 4.657 ms for serial CPU computation, 0.021 ms for the CUDA kernel, and 0.461 ms for transfers plus kernel. These are single-run observations. GPU allocation, PNG decoding and encoding are outside the transfer-and-kernel interval. The first CUDA invocation has additional startup overhead, so timings are not stable benchmark estimates.</w:t>
       </w:r>
     </w:p>
     <w:p>
       <w:pPr>
         <w:keepNext/>
+        <w:jc w:val="center"/>
       </w:pPr>
       <w:r>
         <w:drawing>
           <wp:inline xmlns:a="http://schemas.openxmlformats.org/drawingml/2006/main" xmlns:pic="http://schemas.openxmlformats.org/drawingml/2006/picture">
-            <wp:extent cx="5303520" cy="2599765"/>
+            <wp:extent cx="4114800" cy="4477109"/>
             <wp:docPr id="1" name="Picture 1"/>
             <wp:cNvGraphicFramePr>
               <a:graphicFrameLocks noChangeAspect="1"/>
@@ -1076,7 +1079,7 @@
                   <pic:spPr>
                     <a:xfrm>
                       <a:off x="0" y="0"/>
-                      <a:ext cx="5303520" cy="2599765"/>
+                      <a:ext cx="4114800" cy="4477109"/>
                     </a:xfrm>
                     <a:prstGeom prst="rect"/>
                   </pic:spPr>
@@ -1089,7 +1092,7 @@
     </w:p>
     <w:p>
       <w:r>
-        <w:t>Input on the left and verified Sobel edge image on the right for download.png.</w:t>
+        <w:t>The four illustrated views for download.png: original, X gradient, Y gradient and combined Sobel edges. All computed maps come from the CUDA run.</w:t>
       </w:r>
     </w:p>
     <w:p>

</xml_diff>

<commit_message>
Add Colab screenshots and use one Task 4 demonstration image
</commit_message>
<xml_diff>
--- a/2638120_Thaslim_Mohammed_Sahl_High_Performance_Computing.docx
+++ b/2638120_Thaslim_Mohammed_Sahl_High_Performance_Computing.docx
@@ -21,7 +21,7 @@
         <w:br/>
         <w:t>Student number 2638120</w:t>
         <w:br/>
-        <w:t>5 October 2026</w:t>
+        <w:t>6 October 2026</w:t>
       </w:r>
     </w:p>
     <w:p>
@@ -61,7 +61,7 @@
     </w:p>
     <w:p>
       <w:r>
-        <w:t>The GitHub project is private during development as requested. Notebook setup first attempts hosted project resources, then loads a checksum-verified compressed copy stored in the notebook. Task 04 separately downloads its demonstration images from public URLs that already work without a GitHub login. The listed GitHub Colab links require repository access until the student approves a visibility change. The executed Colab notebooks are linked separately under each task.</w:t>
+        <w:t>The GitHub project is private during development as requested. Notebook setup first attempts hosted project resources, then loads a checksum-verified compressed copy stored in the notebook. Task 04 separately downloads its one demonstration image from the lecturer's public URL without a GitHub login. The listed GitHub Colab links require repository access until the student approves a visibility change. The executed Colab notebooks are linked separately under each task.</w:t>
       </w:r>
     </w:p>
     <w:p>
@@ -75,7 +75,7 @@
     </w:p>
     <w:p>
       <w:r>
-        <w:t>All 23 initial test groups passed on the Tesla T4, including multiple CPU thread counts, all supplied matrix pairs, exhaustive recovery of the 67,600-password domain, invalid inputs, AddressSanitizer and UndefinedBehaviorSanitizer. Task 04 was then rerun with separate X and Y maps: all 3 updated groups passed, including complete comparisons of three maps for each of 19 PNG inputs. Raw logs and separate initial and updated validation manifests are saved under evidence/validation. Task 04 figures and timings below use the four-view version.</w:t>
+        <w:t>All 23 initial test groups passed on the Tesla T4, including multiple CPU thread counts, all supplied matrix pairs, exhaustive recovery of the 67,600-password domain, invalid inputs, AddressSanitizer and UndefinedBehaviorSanitizer. Task 04 was then rerun with separate X and Y maps: all 3 updated groups passed, including complete comparisons of three maps for each of 14 PNG inputs. Raw logs and separate initial and updated validation manifests are saved under evidence/validation. Task 04 figures and timings below use the four-view version.</w:t>
       </w:r>
     </w:p>
     <w:p>
@@ -230,105 +230,67 @@
     </w:p>
     <w:p>
       <w:pPr>
-        <w:spacing w:after="0" w:before="0"/>
+        <w:pStyle w:val="Heading2"/>
+        <w:keepNext/>
+        <w:pageBreakBefore/>
       </w:pPr>
       <w:r>
-        <w:rPr>
-          <w:rFonts w:ascii="Consolas" w:hAnsi="Consolas"/>
-          <w:sz w:val="18"/>
-        </w:rPr>
-        <w:t>Word</w:t>
-        <w:tab/>
-        <w:t>Frequency</w:t>
+        <w:t>Colab execution evidence</w:t>
       </w:r>
     </w:p>
     <w:p>
       <w:pPr>
-        <w:spacing w:after="0" w:before="0"/>
+        <w:keepNext/>
+        <w:spacing w:after="140"/>
+        <w:jc w:val="center"/>
       </w:pPr>
       <w:r>
-        <w:rPr>
-          <w:rFonts w:ascii="Consolas" w:hAnsi="Consolas"/>
-          <w:sz w:val="18"/>
-        </w:rPr>
-        <w:t>abstraction</w:t>
-        <w:tab/>
-        <w:t>1199</w:t>
+        <w:drawing>
+          <wp:inline xmlns:a="http://schemas.openxmlformats.org/drawingml/2006/main" xmlns:pic="http://schemas.openxmlformats.org/drawingml/2006/picture">
+            <wp:extent cx="5250887" cy="4892040"/>
+            <wp:docPr id="1" name="Picture 1" descr="Figure 1. Task 01 word occurrence results in Google Colab."/>
+            <wp:cNvGraphicFramePr>
+              <a:graphicFrameLocks noChangeAspect="1"/>
+            </wp:cNvGraphicFramePr>
+            <a:graphic>
+              <a:graphicData uri="http://schemas.openxmlformats.org/drawingml/2006/picture">
+                <pic:pic>
+                  <pic:nvPicPr>
+                    <pic:cNvPr id="0" name="Task_01_Colab.jpg"/>
+                    <pic:cNvPicPr/>
+                  </pic:nvPicPr>
+                  <pic:blipFill>
+                    <a:blip r:embed="rId12"/>
+                    <a:stretch>
+                      <a:fillRect/>
+                    </a:stretch>
+                  </pic:blipFill>
+                  <pic:spPr>
+                    <a:xfrm>
+                      <a:off x="0" y="0"/>
+                      <a:ext cx="5250887" cy="4892040"/>
+                    </a:xfrm>
+                    <a:prstGeom prst="rect"/>
+                  </pic:spPr>
+                </pic:pic>
+              </a:graphicData>
+            </a:graphic>
+          </wp:inline>
+        </w:drawing>
       </w:r>
     </w:p>
     <w:p>
       <w:pPr>
-        <w:spacing w:after="0" w:before="0"/>
+        <w:pStyle w:val="Caption"/>
+        <w:keepNext/>
       </w:pPr>
       <w:r>
-        <w:rPr>
-          <w:rFonts w:ascii="Consolas" w:hAnsi="Consolas"/>
-          <w:sz w:val="18"/>
-        </w:rPr>
-        <w:t>accuracy</w:t>
-        <w:tab/>
-        <w:t>1220</w:t>
-      </w:r>
-    </w:p>
-    <w:p>
-      <w:pPr>
-        <w:spacing w:after="0" w:before="0"/>
-      </w:pPr>
-      <w:r>
-        <w:rPr>
-          <w:rFonts w:ascii="Consolas" w:hAnsi="Consolas"/>
-          <w:sz w:val="18"/>
-        </w:rPr>
-        <w:t>addition</w:t>
-        <w:tab/>
-        <w:t>1212</w:t>
-      </w:r>
-    </w:p>
-    <w:p>
-      <w:pPr>
-        <w:spacing w:after="0" w:before="0"/>
-      </w:pPr>
-      <w:r>
-        <w:rPr>
-          <w:rFonts w:ascii="Consolas" w:hAnsi="Consolas"/>
-          <w:sz w:val="18"/>
-        </w:rPr>
-        <w:t>ai</w:t>
-        <w:tab/>
-        <w:t>1250</w:t>
-      </w:r>
-    </w:p>
-    <w:p>
-      <w:pPr>
-        <w:spacing w:after="0" w:before="0"/>
-      </w:pPr>
-      <w:r>
-        <w:rPr>
-          <w:rFonts w:ascii="Consolas" w:hAnsi="Consolas"/>
-          <w:sz w:val="18"/>
-        </w:rPr>
-        <w:t>algorithm</w:t>
-        <w:tab/>
-        <w:t>1252</w:t>
-      </w:r>
-    </w:p>
-    <w:p>
-      <w:pPr>
-        <w:spacing w:after="0" w:before="0"/>
-      </w:pPr>
-      <w:r>
-        <w:rPr>
-          <w:rFonts w:ascii="Consolas" w:hAnsi="Consolas"/>
-          <w:sz w:val="18"/>
-        </w:rPr>
-        <w:t>analysis</w:t>
-        <w:tab/>
-        <w:t>1258</w:t>
+        <w:t>Figure 1. Task 01 word occurrence results in Google Colab.</w:t>
       </w:r>
     </w:p>
     <w:p>
       <w:r>
-        <w:t>Excerpt from the verified alphabetical output. The complete file contains 94 word rows.</w:t>
+        <w:t>The captured program summary shows four requested and four actual Pthreads, 120,000 total words and 94 unique words. It names result.txt as the output file. The next cell displays part of the word-frequency file. These visible results document the supplied dataset run; the independent checks described above also test thread counts and boundary cases.</w:t>
       </w:r>
     </w:p>
     <w:p>
@@ -365,7 +327,7 @@
       </w:r>
     </w:p>
     <w:p>
-      <w:hyperlink r:id="rId12">
+      <w:hyperlink r:id="rId13">
         <w:r>
           <w:rPr>
             <w:color w:val="164B6B"/>
@@ -376,7 +338,7 @@
       </w:hyperlink>
     </w:p>
     <w:p>
-      <w:hyperlink r:id="rId13">
+      <w:hyperlink r:id="rId14">
         <w:r>
           <w:rPr>
             <w:color w:val="164B6B"/>
@@ -574,6 +536,71 @@
       <w:pPr>
         <w:pStyle w:val="Heading2"/>
         <w:keepNext/>
+        <w:pageBreakBefore/>
+      </w:pPr>
+      <w:r>
+        <w:t>Colab execution evidence</w:t>
+      </w:r>
+    </w:p>
+    <w:p>
+      <w:pPr>
+        <w:keepNext/>
+        <w:spacing w:after="140"/>
+        <w:jc w:val="center"/>
+      </w:pPr>
+      <w:r>
+        <w:drawing>
+          <wp:inline xmlns:a="http://schemas.openxmlformats.org/drawingml/2006/main" xmlns:pic="http://schemas.openxmlformats.org/drawingml/2006/picture">
+            <wp:extent cx="5250887" cy="4892040"/>
+            <wp:docPr id="2" name="Picture 2" descr="Figure 2. Task 02 matrix operations in Google Colab."/>
+            <wp:cNvGraphicFramePr>
+              <a:graphicFrameLocks noChangeAspect="1"/>
+            </wp:cNvGraphicFramePr>
+            <a:graphic>
+              <a:graphicData uri="http://schemas.openxmlformats.org/drawingml/2006/picture">
+                <pic:pic>
+                  <pic:nvPicPr>
+                    <pic:cNvPr id="0" name="Task_02_Colab.jpg"/>
+                    <pic:cNvPicPr/>
+                  </pic:nvPicPr>
+                  <pic:blipFill>
+                    <a:blip r:embed="rId15"/>
+                    <a:stretch>
+                      <a:fillRect/>
+                    </a:stretch>
+                  </pic:blipFill>
+                  <pic:spPr>
+                    <a:xfrm>
+                      <a:off x="0" y="0"/>
+                      <a:ext cx="5250887" cy="4892040"/>
+                    </a:xfrm>
+                    <a:prstGeom prst="rect"/>
+                  </pic:spPr>
+                </pic:pic>
+              </a:graphicData>
+            </a:graphic>
+          </wp:inline>
+        </w:drawing>
+      </w:r>
+    </w:p>
+    <w:p>
+      <w:pPr>
+        <w:pStyle w:val="Caption"/>
+        <w:keepNext/>
+      </w:pPr>
+      <w:r>
+        <w:t>Figure 2. Task 02 matrix operations in Google Colab.</w:t>
+      </w:r>
+    </w:p>
+    <w:p>
+      <w:r>
+        <w:t>The visible summary reports 50 matrices processed as 25 pairs and names results.txt. The output preview below contains numeric matrix rows and a matrix multiplication heading with its result dimensions. This confirms that the program writes matrix results to the required file. The separate NumPy comparisons verify every applicable operation, including rows that are outside this screenshot.</w:t>
+      </w:r>
+    </w:p>
+    <w:p>
+      <w:pPr>
+        <w:pStyle w:val="Heading2"/>
+        <w:keepNext/>
       </w:pPr>
       <w:r>
         <w:t>Performance and limits</w:t>
@@ -604,7 +631,7 @@
       </w:r>
     </w:p>
     <w:p>
-      <w:hyperlink r:id="rId14">
+      <w:hyperlink r:id="rId16">
         <w:r>
           <w:rPr>
             <w:color w:val="164B6B"/>
@@ -615,7 +642,7 @@
       </w:hyperlink>
     </w:p>
     <w:p>
-      <w:hyperlink r:id="rId15">
+      <w:hyperlink r:id="rId17">
         <w:r>
           <w:rPr>
             <w:color w:val="164B6B"/>
@@ -861,6 +888,71 @@
       <w:pPr>
         <w:pStyle w:val="Heading2"/>
         <w:keepNext/>
+        <w:pageBreakBefore/>
+      </w:pPr>
+      <w:r>
+        <w:t>Colab execution evidence</w:t>
+      </w:r>
+    </w:p>
+    <w:p>
+      <w:pPr>
+        <w:keepNext/>
+        <w:spacing w:after="140"/>
+        <w:jc w:val="center"/>
+      </w:pPr>
+      <w:r>
+        <w:drawing>
+          <wp:inline xmlns:a="http://schemas.openxmlformats.org/drawingml/2006/main" xmlns:pic="http://schemas.openxmlformats.org/drawingml/2006/picture">
+            <wp:extent cx="5250887" cy="4892040"/>
+            <wp:docPr id="3" name="Picture 3" descr="Figure 3. Task 03 CUDA password recovery in Google Colab."/>
+            <wp:cNvGraphicFramePr>
+              <a:graphicFrameLocks noChangeAspect="1"/>
+            </wp:cNvGraphicFramePr>
+            <a:graphic>
+              <a:graphicData uri="http://schemas.openxmlformats.org/drawingml/2006/picture">
+                <pic:pic>
+                  <pic:nvPicPr>
+                    <pic:cNvPr id="0" name="Task_03_Colab.jpg"/>
+                    <pic:cNvPicPr/>
+                  </pic:nvPicPr>
+                  <pic:blipFill>
+                    <a:blip r:embed="rId18"/>
+                    <a:stretch>
+                      <a:fillRect/>
+                    </a:stretch>
+                  </pic:blipFill>
+                  <pic:spPr>
+                    <a:xfrm>
+                      <a:off x="0" y="0"/>
+                      <a:ext cx="5250887" cy="4892040"/>
+                    </a:xfrm>
+                    <a:prstGeom prst="rect"/>
+                  </pic:spPr>
+                </pic:pic>
+              </a:graphicData>
+            </a:graphic>
+          </wp:inline>
+        </w:drawing>
+      </w:r>
+    </w:p>
+    <w:p>
+      <w:pPr>
+        <w:pStyle w:val="Caption"/>
+        <w:keepNext/>
+      </w:pPr>
+      <w:r>
+        <w:t>Figure 3. Task 03 CUDA password recovery in Google Colab.</w:t>
+      </w:r>
+    </w:p>
+    <w:p>
+      <w:r>
+        <w:t>The program summary reports 10,000 recovered and verified passwords out of 10,000 and identifies decrypted.txt. The display cell shows encrypted records beside their recovered two-letter, two-digit plaintext values. The T4 runtime is visible in the Colab status bar. The full-domain and invalid-input tests described above provide checks beyond these displayed examples.</w:t>
+      </w:r>
+    </w:p>
+    <w:p>
+      <w:pPr>
+        <w:pStyle w:val="Heading2"/>
+        <w:keepNext/>
       </w:pPr>
       <w:r>
         <w:t>Performance and limits</w:t>
@@ -893,7 +985,7 @@
       </w:r>
     </w:p>
     <w:p>
-      <w:hyperlink r:id="rId16">
+      <w:hyperlink r:id="rId19">
         <w:r>
           <w:rPr>
             <w:color w:val="164B6B"/>
@@ -904,7 +996,7 @@
       </w:hyperlink>
     </w:p>
     <w:p>
-      <w:hyperlink r:id="rId17">
+      <w:hyperlink r:id="rId20">
         <w:r>
           <w:rPr>
             <w:color w:val="164B6B"/>
@@ -925,7 +1017,7 @@
     </w:p>
     <w:p>
       <w:r>
-        <w:t>Process multiple PNG inputs with CUDA and reproduce the brief's four views for each input: Original Image, Gradient in X direction, Gradient in Y direction and Sobel Edge Detection. The four panels illustrate one input; the brief does not specify exactly four different inputs. Save both gradient maps and the combined edge map at the original dimensions.</w:t>
+        <w:t>Use one public input image, download.png, to demonstrate the brief's four views: Original Image, Gradient in X direction, Gradient in Y direction and Sobel Edge Detection. The four panels are views of the same input. Save both gradient maps and the combined edge map at the original dimensions. The CUDA program also accepts multiple PNG paths when a batch is required.</w:t>
       </w:r>
     </w:p>
     <w:p>
@@ -939,7 +1031,7 @@
     </w:p>
     <w:p>
       <w:r>
-        <w:t>The notebook uses wget to download download.png (300x300) from the lecturer's public image URL, plus smarties.png (413x356) and sudoku.png (558x563) from pinned public OpenCV sample URLs. SHA-256 and PNG dimensions are checked before use; image_downloads.json records the source and load mode. These images require no private GitHub login or Drive mount. LodePNG decodes each file into an RGBA host array, with its original licence notices retained.</w:t>
+        <w:t>The notebook uses wget to download download.png (300x300) from the public image URL in the lecturer's last-class code. SHA-256 and PNG dimensions are checked before use; image_downloads.json records the source and load mode. This input requires no private GitHub login or Drive mount. LodePNG decodes the file into an RGBA host array, with its original licence notices retained.</w:t>
       </w:r>
     </w:p>
     <w:p>
@@ -1023,7 +1115,7 @@
           <w:rFonts w:ascii="Consolas" w:hAnsi="Consolas"/>
           <w:sz w:val="18"/>
         </w:rPr>
-        <w:t>./SobelEdge outputs images/download.png images/smarties.png images/sudoku.png</w:t>
+        <w:t>./SobelEdge outputs images/download.png</w:t>
       </w:r>
     </w:p>
     <w:p>
@@ -1037,7 +1129,7 @@
     </w:p>
     <w:p>
       <w:r>
-        <w:t>The revised notebook downloaded all three demonstration PNGs live on the Tesla T4. Every pixel in all three saved maps matched the references across 19 PNG inputs. Fixtures cover zero padding, saturation, final-image transparency, grayscale rounding and padded launches, as well as the public images and original synthetic patterns.</w:t>
+        <w:t>The revised notebook downloaded its single demonstration image live on the Tesla T4. Every pixel in the X gradient, Y gradient and final edge maps matched the references across 14 PNG test inputs. The public demonstration uses only download.png; additional small generated fixtures check zero padding, saturation, final-image transparency, grayscale rounding and padded launches.</w:t>
       </w:r>
     </w:p>
     <w:p>
@@ -1047,52 +1139,7 @@
     </w:p>
     <w:p>
       <w:r>
-        <w:t>The updated 413x356 smarties.png run took 4.657 ms for serial CPU computation, 0.021 ms for the CUDA kernel, and 0.461 ms for transfers plus kernel. These are single-run observations. GPU allocation, PNG decoding and encoding are outside the transfer-and-kernel interval. The first CUDA invocation has additional startup overhead, so timings are not stable benchmark estimates.</w:t>
-      </w:r>
-    </w:p>
-    <w:p>
-      <w:pPr>
-        <w:keepNext/>
-        <w:jc w:val="center"/>
-      </w:pPr>
-      <w:r>
-        <w:drawing>
-          <wp:inline xmlns:a="http://schemas.openxmlformats.org/drawingml/2006/main" xmlns:pic="http://schemas.openxmlformats.org/drawingml/2006/picture">
-            <wp:extent cx="4114800" cy="4477109"/>
-            <wp:docPr id="1" name="Picture 1"/>
-            <wp:cNvGraphicFramePr>
-              <a:graphicFrameLocks noChangeAspect="1"/>
-            </wp:cNvGraphicFramePr>
-            <a:graphic>
-              <a:graphicData uri="http://schemas.openxmlformats.org/drawingml/2006/picture">
-                <pic:pic>
-                  <pic:nvPicPr>
-                    <pic:cNvPr id="0" name="figure_download.png"/>
-                    <pic:cNvPicPr/>
-                  </pic:nvPicPr>
-                  <pic:blipFill>
-                    <a:blip r:embed="rId18"/>
-                    <a:stretch>
-                      <a:fillRect/>
-                    </a:stretch>
-                  </pic:blipFill>
-                  <pic:spPr>
-                    <a:xfrm>
-                      <a:off x="0" y="0"/>
-                      <a:ext cx="4114800" cy="4477109"/>
-                    </a:xfrm>
-                    <a:prstGeom prst="rect"/>
-                  </pic:spPr>
-                </pic:pic>
-              </a:graphicData>
-            </a:graphic>
-          </wp:inline>
-        </w:drawing>
-      </w:r>
-    </w:p>
-    <w:p>
-      <w:r>
-        <w:t>The four illustrated views for download.png: original, X gradient, Y gradient and combined Sobel edges. All computed maps come from the CUDA run.</w:t>
+        <w:t>The updated 300x300 download.png run took 3.217 ms for serial CPU computation, 0.143 ms for the CUDA kernel, and 1.950 ms for transfers plus kernel. These are single-run observations. GPU allocation, PNG decoding and encoding are outside the transfer-and-kernel interval. The first CUDA invocation has additional startup overhead, so timings are not stable benchmark estimates.</w:t>
       </w:r>
     </w:p>
     <w:p>
@@ -1115,6 +1162,136 @@
       </w:r>
     </w:p>
     <w:p>
+      <w:pPr>
+        <w:pStyle w:val="Heading2"/>
+        <w:keepNext/>
+        <w:pageBreakBefore/>
+      </w:pPr>
+      <w:r>
+        <w:t>Colab execution evidence</w:t>
+      </w:r>
+    </w:p>
+    <w:p>
+      <w:pPr>
+        <w:keepNext/>
+        <w:spacing w:after="140"/>
+        <w:jc w:val="center"/>
+      </w:pPr>
+      <w:r>
+        <w:drawing>
+          <wp:inline xmlns:a="http://schemas.openxmlformats.org/drawingml/2006/main" xmlns:pic="http://schemas.openxmlformats.org/drawingml/2006/picture">
+            <wp:extent cx="5250887" cy="4892040"/>
+            <wp:docPr id="4" name="Picture 4" descr="Figure 4. Task 04 single-image CUDA execution in Google Colab."/>
+            <wp:cNvGraphicFramePr>
+              <a:graphicFrameLocks noChangeAspect="1"/>
+            </wp:cNvGraphicFramePr>
+            <a:graphic>
+              <a:graphicData uri="http://schemas.openxmlformats.org/drawingml/2006/picture">
+                <pic:pic>
+                  <pic:nvPicPr>
+                    <pic:cNvPr id="0" name="Task_04_Colab.jpg"/>
+                    <pic:cNvPicPr/>
+                  </pic:nvPicPr>
+                  <pic:blipFill>
+                    <a:blip r:embed="rId21"/>
+                    <a:stretch>
+                      <a:fillRect/>
+                    </a:stretch>
+                  </pic:blipFill>
+                  <pic:spPr>
+                    <a:xfrm>
+                      <a:off x="0" y="0"/>
+                      <a:ext cx="5250887" cy="4892040"/>
+                    </a:xfrm>
+                    <a:prstGeom prst="rect"/>
+                  </pic:spPr>
+                </pic:pic>
+              </a:graphicData>
+            </a:graphic>
+          </wp:inline>
+        </w:drawing>
+      </w:r>
+    </w:p>
+    <w:p>
+      <w:pPr>
+        <w:pStyle w:val="Caption"/>
+        <w:keepNext/>
+      </w:pPr>
+      <w:r>
+        <w:t>Figure 4. Task 04 single-image CUDA execution in Google Colab.</w:t>
+      </w:r>
+    </w:p>
+    <w:p>
+      <w:r>
+        <w:t>This capture records the notebook run for the 300x300 download.png image on the T4 runtime. Its output identifies the X gradient, Y gradient and final edge PNGs. The reference comparison checks these maps against the serial C calculation. The independent NumPy tests check the saved PNG pixels and gradient directions separately.</w:t>
+      </w:r>
+    </w:p>
+    <w:p>
+      <w:pPr>
+        <w:pStyle w:val="Heading2"/>
+        <w:keepNext/>
+        <w:pageBreakBefore/>
+      </w:pPr>
+      <w:r>
+        <w:t>Task 04 image outputs</w:t>
+      </w:r>
+    </w:p>
+    <w:p>
+      <w:pPr>
+        <w:keepNext/>
+        <w:spacing w:after="140"/>
+        <w:jc w:val="center"/>
+      </w:pPr>
+      <w:r>
+        <w:drawing>
+          <wp:inline xmlns:a="http://schemas.openxmlformats.org/drawingml/2006/main" xmlns:pic="http://schemas.openxmlformats.org/drawingml/2006/picture">
+            <wp:extent cx="6217920" cy="5274668"/>
+            <wp:docPr id="5" name="Picture 5" descr="Figure 5. Four views of the same download.png input displayed in Google Colab."/>
+            <wp:cNvGraphicFramePr>
+              <a:graphicFrameLocks noChangeAspect="1"/>
+            </wp:cNvGraphicFramePr>
+            <a:graphic>
+              <a:graphicData uri="http://schemas.openxmlformats.org/drawingml/2006/picture">
+                <pic:pic>
+                  <pic:nvPicPr>
+                    <pic:cNvPr id="0" name="Task_04_Four_Views_Colab.jpg"/>
+                    <pic:cNvPicPr/>
+                  </pic:nvPicPr>
+                  <pic:blipFill>
+                    <a:blip r:embed="rId22"/>
+                    <a:stretch>
+                      <a:fillRect/>
+                    </a:stretch>
+                  </pic:blipFill>
+                  <pic:spPr>
+                    <a:xfrm>
+                      <a:off x="0" y="0"/>
+                      <a:ext cx="6217920" cy="5274668"/>
+                    </a:xfrm>
+                    <a:prstGeom prst="rect"/>
+                  </pic:spPr>
+                </pic:pic>
+              </a:graphicData>
+            </a:graphic>
+          </wp:inline>
+        </w:drawing>
+      </w:r>
+    </w:p>
+    <w:p>
+      <w:pPr>
+        <w:pStyle w:val="Caption"/>
+        <w:keepNext/>
+      </w:pPr>
+      <w:r>
+        <w:t>Figure 5. Four views of the same download.png input displayed in Google Colab.</w:t>
+      </w:r>
+    </w:p>
+    <w:p>
+      <w:r>
+        <w:t>The upper-left panel is the original colour image. The upper-right panel displays the absolute X gradient, which responds to left-right intensity changes; the lower-left displays the absolute Y gradient, which responds to top-bottom changes. The lower-right panel is the combined Sobel magnitude. Each map is calculated by the CUDA kernel from the same original pixels. Display values are clamped to 255, while the final magnitude uses the signed, unclipped Gx and Gy sums. All four views retain the 300x300 image dimensions.</w:t>
+      </w:r>
+    </w:p>
+    <w:p>
       <w:r>
         <w:br w:type="page"/>
       </w:r>
@@ -1131,6 +1308,11 @@
     <w:p>
       <w:r>
         <w:t>The evidence directory contains validation logs and four separate browser screen recordings named Task_01.mp4 to Task_04.mp4. Each recording captures the live Colab view while the corresponding program is rerun and its output is displayed. CUDA computation runs on Colab's GPU. The recordings capture the browser viewport at a reduced frame rate, with the original elapsed time preserved. Output files are saved beside each task source.</w:t>
+      </w:r>
+    </w:p>
+    <w:p>
+      <w:r>
+        <w:t>The task sections contain actual Google Colab screenshots with captions and explanations of their visible results. Tasks 01 to 03 use captures from their verified executions. Task 04 shows its current single-image execution and the four views of download.png. The screenshots accompany the saved outputs and validation logs; a partial output preview alone does not establish that every test passed.</w:t>
       </w:r>
     </w:p>
     <w:p>
@@ -1183,7 +1365,7 @@
       </w:r>
     </w:p>
     <w:p>
-      <w:hyperlink r:id="rId19">
+      <w:hyperlink r:id="rId23">
         <w:r>
           <w:rPr>
             <w:color w:val="164B6B"/>
@@ -1194,7 +1376,7 @@
       </w:hyperlink>
     </w:p>
     <w:p>
-      <w:hyperlink r:id="rId20">
+      <w:hyperlink r:id="rId24">
         <w:r>
           <w:rPr>
             <w:color w:val="164B6B"/>
@@ -1205,7 +1387,7 @@
       </w:hyperlink>
     </w:p>
     <w:p>
-      <w:hyperlink r:id="rId21">
+      <w:hyperlink r:id="rId25">
         <w:r>
           <w:rPr>
             <w:color w:val="164B6B"/>
@@ -1216,7 +1398,7 @@
       </w:hyperlink>
     </w:p>
     <w:p>
-      <w:hyperlink r:id="rId22">
+      <w:hyperlink r:id="rId26">
         <w:r>
           <w:rPr>
             <w:color w:val="164B6B"/>
@@ -1226,19 +1408,8 @@
         </w:r>
       </w:hyperlink>
     </w:p>
-    <w:p>
-      <w:hyperlink r:id="rId23">
-        <w:r>
-          <w:rPr>
-            <w:color w:val="164B6B"/>
-            <w:u w:val="single"/>
-          </w:rPr>
-          <w:t>OpenCV sample PNG inputs and upstream licence (pinned revision)</w:t>
-        </w:r>
-      </w:hyperlink>
-    </w:p>
     <w:sectPr>
-      <w:footerReference w:type="default" r:id="rId24"/>
+      <w:footerReference w:type="default" r:id="rId27"/>
       <w:pgSz w:w="12240" w:h="15840"/>
       <w:pgMar w:top="1152" w:right="1224" w:bottom="1080" w:left="1224" w:header="720" w:footer="720" w:gutter="0"/>
       <w:cols w:space="720"/>
@@ -2420,10 +2591,11 @@
       <w:spacing w:line="240" w:lineRule="auto"/>
     </w:pPr>
     <w:rPr>
+      <w:rFonts w:ascii="Arial" w:hAnsi="Arial"/>
       <w:b/>
       <w:bCs/>
-      <w:color w:val="4F81BD" w:themeColor="accent1"/>
-      <w:sz w:val="18"/>
+      <w:color w:val="000000"/>
+      <w:sz w:val="20"/>
       <w:szCs w:val="18"/>
     </w:rPr>
   </w:style>

</xml_diff>

<commit_message>
Simplify Colab notebooks and add report table of figures
</commit_message>
<xml_diff>
--- a/2638120_Thaslim_Mohammed_Sahl_High_Performance_Computing.docx
+++ b/2638120_Thaslim_Mohammed_Sahl_High_Performance_Computing.docx
@@ -70,7 +70,7 @@
       <w:r>
         <w:fldChar w:fldCharType="separate"/>
       </w:r>
-      <w:hyperlink w:anchor="_Toc242194251" w:history="1">
+      <w:hyperlink w:anchor="_Toc242217212" w:history="1">
         <w:r>
           <w:rPr>
             <w:rStyle w:val="Hyperlink"/>
@@ -97,7 +97,7 @@
             <w:noProof/>
             <w:webHidden/>
           </w:rPr>
-          <w:instrText xml:space="preserve"> PAGEREF _Toc242194251 \h </w:instrText>
+          <w:instrText xml:space="preserve"> PAGEREF _Toc242217212 \h </w:instrText>
         </w:r>
         <w:r>
           <w:rPr>
@@ -117,7 +117,7 @@
             <w:noProof/>
             <w:webHidden/>
           </w:rPr>
-          <w:t>4</w:t>
+          <w:t>5</w:t>
         </w:r>
         <w:r>
           <w:rPr>
@@ -142,7 +142,7 @@
           <w14:ligatures w14:val="standardContextual"/>
         </w:rPr>
       </w:pPr>
-      <w:hyperlink w:anchor="_Toc242194252" w:history="1">
+      <w:hyperlink w:anchor="_Toc242217213" w:history="1">
         <w:r>
           <w:rPr>
             <w:rStyle w:val="Hyperlink"/>
@@ -169,7 +169,7 @@
             <w:noProof/>
             <w:webHidden/>
           </w:rPr>
-          <w:instrText xml:space="preserve"> PAGEREF _Toc242194252 \h </w:instrText>
+          <w:instrText xml:space="preserve"> PAGEREF _Toc242217213 \h </w:instrText>
         </w:r>
         <w:r>
           <w:rPr>
@@ -189,7 +189,7 @@
             <w:noProof/>
             <w:webHidden/>
           </w:rPr>
-          <w:t>4</w:t>
+          <w:t>5</w:t>
         </w:r>
         <w:r>
           <w:rPr>
@@ -214,7 +214,7 @@
           <w14:ligatures w14:val="standardContextual"/>
         </w:rPr>
       </w:pPr>
-      <w:hyperlink w:anchor="_Toc242194253" w:history="1">
+      <w:hyperlink w:anchor="_Toc242217214" w:history="1">
         <w:r>
           <w:rPr>
             <w:rStyle w:val="Hyperlink"/>
@@ -241,7 +241,7 @@
             <w:noProof/>
             <w:webHidden/>
           </w:rPr>
-          <w:instrText xml:space="preserve"> PAGEREF _Toc242194253 \h </w:instrText>
+          <w:instrText xml:space="preserve"> PAGEREF _Toc242217214 \h </w:instrText>
         </w:r>
         <w:r>
           <w:rPr>
@@ -261,7 +261,7 @@
             <w:noProof/>
             <w:webHidden/>
           </w:rPr>
-          <w:t>5</w:t>
+          <w:t>6</w:t>
         </w:r>
         <w:r>
           <w:rPr>
@@ -286,7 +286,7 @@
           <w14:ligatures w14:val="standardContextual"/>
         </w:rPr>
       </w:pPr>
-      <w:hyperlink w:anchor="_Toc242194254" w:history="1">
+      <w:hyperlink w:anchor="_Toc242217215" w:history="1">
         <w:r>
           <w:rPr>
             <w:rStyle w:val="Hyperlink"/>
@@ -313,7 +313,7 @@
             <w:noProof/>
             <w:webHidden/>
           </w:rPr>
-          <w:instrText xml:space="preserve"> PAGEREF _Toc242194254 \h </w:instrText>
+          <w:instrText xml:space="preserve"> PAGEREF _Toc242217215 \h </w:instrText>
         </w:r>
         <w:r>
           <w:rPr>
@@ -333,7 +333,7 @@
             <w:noProof/>
             <w:webHidden/>
           </w:rPr>
-          <w:t>5</w:t>
+          <w:t>6</w:t>
         </w:r>
         <w:r>
           <w:rPr>
@@ -358,7 +358,7 @@
           <w14:ligatures w14:val="standardContextual"/>
         </w:rPr>
       </w:pPr>
-      <w:hyperlink w:anchor="_Toc242194255" w:history="1">
+      <w:hyperlink w:anchor="_Toc242217216" w:history="1">
         <w:r>
           <w:rPr>
             <w:rStyle w:val="Hyperlink"/>
@@ -385,7 +385,7 @@
             <w:noProof/>
             <w:webHidden/>
           </w:rPr>
-          <w:instrText xml:space="preserve"> PAGEREF _Toc242194255 \h </w:instrText>
+          <w:instrText xml:space="preserve"> PAGEREF _Toc242217216 \h </w:instrText>
         </w:r>
         <w:r>
           <w:rPr>
@@ -405,7 +405,7 @@
             <w:noProof/>
             <w:webHidden/>
           </w:rPr>
-          <w:t>5</w:t>
+          <w:t>6</w:t>
         </w:r>
         <w:r>
           <w:rPr>
@@ -430,7 +430,7 @@
           <w14:ligatures w14:val="standardContextual"/>
         </w:rPr>
       </w:pPr>
-      <w:hyperlink w:anchor="_Toc242194256" w:history="1">
+      <w:hyperlink w:anchor="_Toc242217217" w:history="1">
         <w:r>
           <w:rPr>
             <w:rStyle w:val="Hyperlink"/>
@@ -457,7 +457,7 @@
             <w:noProof/>
             <w:webHidden/>
           </w:rPr>
-          <w:instrText xml:space="preserve"> PAGEREF _Toc242194256 \h </w:instrText>
+          <w:instrText xml:space="preserve"> PAGEREF _Toc242217217 \h </w:instrText>
         </w:r>
         <w:r>
           <w:rPr>
@@ -477,7 +477,7 @@
             <w:noProof/>
             <w:webHidden/>
           </w:rPr>
-          <w:t>6</w:t>
+          <w:t>7</w:t>
         </w:r>
         <w:r>
           <w:rPr>
@@ -502,7 +502,7 @@
           <w14:ligatures w14:val="standardContextual"/>
         </w:rPr>
       </w:pPr>
-      <w:hyperlink w:anchor="_Toc242194257" w:history="1">
+      <w:hyperlink w:anchor="_Toc242217218" w:history="1">
         <w:r>
           <w:rPr>
             <w:rStyle w:val="Hyperlink"/>
@@ -529,7 +529,7 @@
             <w:noProof/>
             <w:webHidden/>
           </w:rPr>
-          <w:instrText xml:space="preserve"> PAGEREF _Toc242194257 \h </w:instrText>
+          <w:instrText xml:space="preserve"> PAGEREF _Toc242217218 \h </w:instrText>
         </w:r>
         <w:r>
           <w:rPr>
@@ -549,7 +549,7 @@
             <w:noProof/>
             <w:webHidden/>
           </w:rPr>
-          <w:t>6</w:t>
+          <w:t>7</w:t>
         </w:r>
         <w:r>
           <w:rPr>
@@ -574,7 +574,7 @@
           <w14:ligatures w14:val="standardContextual"/>
         </w:rPr>
       </w:pPr>
-      <w:hyperlink w:anchor="_Toc242194258" w:history="1">
+      <w:hyperlink w:anchor="_Toc242217219" w:history="1">
         <w:r>
           <w:rPr>
             <w:rStyle w:val="Hyperlink"/>
@@ -601,7 +601,7 @@
             <w:noProof/>
             <w:webHidden/>
           </w:rPr>
-          <w:instrText xml:space="preserve"> PAGEREF _Toc242194258 \h </w:instrText>
+          <w:instrText xml:space="preserve"> PAGEREF _Toc242217219 \h </w:instrText>
         </w:r>
         <w:r>
           <w:rPr>
@@ -621,7 +621,7 @@
             <w:noProof/>
             <w:webHidden/>
           </w:rPr>
-          <w:t>7</w:t>
+          <w:t>8</w:t>
         </w:r>
         <w:r>
           <w:rPr>
@@ -646,7 +646,7 @@
           <w14:ligatures w14:val="standardContextual"/>
         </w:rPr>
       </w:pPr>
-      <w:hyperlink w:anchor="_Toc242194259" w:history="1">
+      <w:hyperlink w:anchor="_Toc242217220" w:history="1">
         <w:r>
           <w:rPr>
             <w:rStyle w:val="Hyperlink"/>
@@ -673,7 +673,7 @@
             <w:noProof/>
             <w:webHidden/>
           </w:rPr>
-          <w:instrText xml:space="preserve"> PAGEREF _Toc242194259 \h </w:instrText>
+          <w:instrText xml:space="preserve"> PAGEREF _Toc242217220 \h </w:instrText>
         </w:r>
         <w:r>
           <w:rPr>
@@ -693,7 +693,7 @@
             <w:noProof/>
             <w:webHidden/>
           </w:rPr>
-          <w:t>7</w:t>
+          <w:t>8</w:t>
         </w:r>
         <w:r>
           <w:rPr>
@@ -718,7 +718,7 @@
           <w14:ligatures w14:val="standardContextual"/>
         </w:rPr>
       </w:pPr>
-      <w:hyperlink w:anchor="_Toc242194260" w:history="1">
+      <w:hyperlink w:anchor="_Toc242217221" w:history="1">
         <w:r>
           <w:rPr>
             <w:rStyle w:val="Hyperlink"/>
@@ -745,7 +745,7 @@
             <w:noProof/>
             <w:webHidden/>
           </w:rPr>
-          <w:instrText xml:space="preserve"> PAGEREF _Toc242194260 \h </w:instrText>
+          <w:instrText xml:space="preserve"> PAGEREF _Toc242217221 \h </w:instrText>
         </w:r>
         <w:r>
           <w:rPr>
@@ -765,7 +765,7 @@
             <w:noProof/>
             <w:webHidden/>
           </w:rPr>
-          <w:t>7</w:t>
+          <w:t>8</w:t>
         </w:r>
         <w:r>
           <w:rPr>
@@ -790,7 +790,7 @@
           <w14:ligatures w14:val="standardContextual"/>
         </w:rPr>
       </w:pPr>
-      <w:hyperlink w:anchor="_Toc242194261" w:history="1">
+      <w:hyperlink w:anchor="_Toc242217222" w:history="1">
         <w:r>
           <w:rPr>
             <w:rStyle w:val="Hyperlink"/>
@@ -817,7 +817,7 @@
             <w:noProof/>
             <w:webHidden/>
           </w:rPr>
-          <w:instrText xml:space="preserve"> PAGEREF _Toc242194261 \h </w:instrText>
+          <w:instrText xml:space="preserve"> PAGEREF _Toc242217222 \h </w:instrText>
         </w:r>
         <w:r>
           <w:rPr>
@@ -837,7 +837,7 @@
             <w:noProof/>
             <w:webHidden/>
           </w:rPr>
-          <w:t>8</w:t>
+          <w:t>9</w:t>
         </w:r>
         <w:r>
           <w:rPr>
@@ -862,7 +862,7 @@
           <w14:ligatures w14:val="standardContextual"/>
         </w:rPr>
       </w:pPr>
-      <w:hyperlink w:anchor="_Toc242194262" w:history="1">
+      <w:hyperlink w:anchor="_Toc242217223" w:history="1">
         <w:r>
           <w:rPr>
             <w:rStyle w:val="Hyperlink"/>
@@ -889,7 +889,7 @@
             <w:noProof/>
             <w:webHidden/>
           </w:rPr>
-          <w:instrText xml:space="preserve"> PAGEREF _Toc242194262 \h </w:instrText>
+          <w:instrText xml:space="preserve"> PAGEREF _Toc242217223 \h </w:instrText>
         </w:r>
         <w:r>
           <w:rPr>
@@ -909,7 +909,7 @@
             <w:noProof/>
             <w:webHidden/>
           </w:rPr>
-          <w:t>9</w:t>
+          <w:t>10</w:t>
         </w:r>
         <w:r>
           <w:rPr>
@@ -934,7 +934,7 @@
           <w14:ligatures w14:val="standardContextual"/>
         </w:rPr>
       </w:pPr>
-      <w:hyperlink w:anchor="_Toc242194263" w:history="1">
+      <w:hyperlink w:anchor="_Toc242217224" w:history="1">
         <w:r>
           <w:rPr>
             <w:rStyle w:val="Hyperlink"/>
@@ -961,7 +961,7 @@
             <w:noProof/>
             <w:webHidden/>
           </w:rPr>
-          <w:instrText xml:space="preserve"> PAGEREF _Toc242194263 \h </w:instrText>
+          <w:instrText xml:space="preserve"> PAGEREF _Toc242217224 \h </w:instrText>
         </w:r>
         <w:r>
           <w:rPr>
@@ -981,7 +981,7 @@
             <w:noProof/>
             <w:webHidden/>
           </w:rPr>
-          <w:t>9</w:t>
+          <w:t>10</w:t>
         </w:r>
         <w:r>
           <w:rPr>
@@ -1006,7 +1006,7 @@
           <w14:ligatures w14:val="standardContextual"/>
         </w:rPr>
       </w:pPr>
-      <w:hyperlink w:anchor="_Toc242194264" w:history="1">
+      <w:hyperlink w:anchor="_Toc242217225" w:history="1">
         <w:r>
           <w:rPr>
             <w:rStyle w:val="Hyperlink"/>
@@ -1033,7 +1033,7 @@
             <w:noProof/>
             <w:webHidden/>
           </w:rPr>
-          <w:instrText xml:space="preserve"> PAGEREF _Toc242194264 \h </w:instrText>
+          <w:instrText xml:space="preserve"> PAGEREF _Toc242217225 \h </w:instrText>
         </w:r>
         <w:r>
           <w:rPr>
@@ -1053,7 +1053,7 @@
             <w:noProof/>
             <w:webHidden/>
           </w:rPr>
-          <w:t>9</w:t>
+          <w:t>10</w:t>
         </w:r>
         <w:r>
           <w:rPr>
@@ -1078,7 +1078,7 @@
           <w14:ligatures w14:val="standardContextual"/>
         </w:rPr>
       </w:pPr>
-      <w:hyperlink w:anchor="_Toc242194265" w:history="1">
+      <w:hyperlink w:anchor="_Toc242217226" w:history="1">
         <w:r>
           <w:rPr>
             <w:rStyle w:val="Hyperlink"/>
@@ -1105,7 +1105,7 @@
             <w:noProof/>
             <w:webHidden/>
           </w:rPr>
-          <w:instrText xml:space="preserve"> PAGEREF _Toc242194265 \h </w:instrText>
+          <w:instrText xml:space="preserve"> PAGEREF _Toc242217226 \h </w:instrText>
         </w:r>
         <w:r>
           <w:rPr>
@@ -1125,7 +1125,7 @@
             <w:noProof/>
             <w:webHidden/>
           </w:rPr>
-          <w:t>10</w:t>
+          <w:t>11</w:t>
         </w:r>
         <w:r>
           <w:rPr>
@@ -1150,7 +1150,7 @@
           <w14:ligatures w14:val="standardContextual"/>
         </w:rPr>
       </w:pPr>
-      <w:hyperlink w:anchor="_Toc242194266" w:history="1">
+      <w:hyperlink w:anchor="_Toc242217227" w:history="1">
         <w:r>
           <w:rPr>
             <w:rStyle w:val="Hyperlink"/>
@@ -1177,7 +1177,7 @@
             <w:noProof/>
             <w:webHidden/>
           </w:rPr>
-          <w:instrText xml:space="preserve"> PAGEREF _Toc242194266 \h </w:instrText>
+          <w:instrText xml:space="preserve"> PAGEREF _Toc242217227 \h </w:instrText>
         </w:r>
         <w:r>
           <w:rPr>
@@ -1197,7 +1197,7 @@
             <w:noProof/>
             <w:webHidden/>
           </w:rPr>
-          <w:t>10</w:t>
+          <w:t>11</w:t>
         </w:r>
         <w:r>
           <w:rPr>
@@ -1222,7 +1222,7 @@
           <w14:ligatures w14:val="standardContextual"/>
         </w:rPr>
       </w:pPr>
-      <w:hyperlink w:anchor="_Toc242194267" w:history="1">
+      <w:hyperlink w:anchor="_Toc242217228" w:history="1">
         <w:r>
           <w:rPr>
             <w:rStyle w:val="Hyperlink"/>
@@ -1249,7 +1249,7 @@
             <w:noProof/>
             <w:webHidden/>
           </w:rPr>
-          <w:instrText xml:space="preserve"> PAGEREF _Toc242194267 \h </w:instrText>
+          <w:instrText xml:space="preserve"> PAGEREF _Toc242217228 \h </w:instrText>
         </w:r>
         <w:r>
           <w:rPr>
@@ -1269,7 +1269,7 @@
             <w:noProof/>
             <w:webHidden/>
           </w:rPr>
-          <w:t>11</w:t>
+          <w:t>12</w:t>
         </w:r>
         <w:r>
           <w:rPr>
@@ -1294,7 +1294,7 @@
           <w14:ligatures w14:val="standardContextual"/>
         </w:rPr>
       </w:pPr>
-      <w:hyperlink w:anchor="_Toc242194268" w:history="1">
+      <w:hyperlink w:anchor="_Toc242217229" w:history="1">
         <w:r>
           <w:rPr>
             <w:rStyle w:val="Hyperlink"/>
@@ -1321,7 +1321,7 @@
             <w:noProof/>
             <w:webHidden/>
           </w:rPr>
-          <w:instrText xml:space="preserve"> PAGEREF _Toc242194268 \h </w:instrText>
+          <w:instrText xml:space="preserve"> PAGEREF _Toc242217229 \h </w:instrText>
         </w:r>
         <w:r>
           <w:rPr>
@@ -1341,7 +1341,7 @@
             <w:noProof/>
             <w:webHidden/>
           </w:rPr>
-          <w:t>11</w:t>
+          <w:t>12</w:t>
         </w:r>
         <w:r>
           <w:rPr>
@@ -1366,7 +1366,7 @@
           <w14:ligatures w14:val="standardContextual"/>
         </w:rPr>
       </w:pPr>
-      <w:hyperlink w:anchor="_Toc242194269" w:history="1">
+      <w:hyperlink w:anchor="_Toc242217230" w:history="1">
         <w:r>
           <w:rPr>
             <w:rStyle w:val="Hyperlink"/>
@@ -1393,7 +1393,7 @@
             <w:noProof/>
             <w:webHidden/>
           </w:rPr>
-          <w:instrText xml:space="preserve"> PAGEREF _Toc242194269 \h </w:instrText>
+          <w:instrText xml:space="preserve"> PAGEREF _Toc242217230 \h </w:instrText>
         </w:r>
         <w:r>
           <w:rPr>
@@ -1413,7 +1413,7 @@
             <w:noProof/>
             <w:webHidden/>
           </w:rPr>
-          <w:t>11</w:t>
+          <w:t>12</w:t>
         </w:r>
         <w:r>
           <w:rPr>
@@ -1438,7 +1438,7 @@
           <w14:ligatures w14:val="standardContextual"/>
         </w:rPr>
       </w:pPr>
-      <w:hyperlink w:anchor="_Toc242194270" w:history="1">
+      <w:hyperlink w:anchor="_Toc242217231" w:history="1">
         <w:r>
           <w:rPr>
             <w:rStyle w:val="Hyperlink"/>
@@ -1465,7 +1465,7 @@
             <w:noProof/>
             <w:webHidden/>
           </w:rPr>
-          <w:instrText xml:space="preserve"> PAGEREF _Toc242194270 \h </w:instrText>
+          <w:instrText xml:space="preserve"> PAGEREF _Toc242217231 \h </w:instrText>
         </w:r>
         <w:r>
           <w:rPr>
@@ -1485,7 +1485,7 @@
             <w:noProof/>
             <w:webHidden/>
           </w:rPr>
-          <w:t>12</w:t>
+          <w:t>13</w:t>
         </w:r>
         <w:r>
           <w:rPr>
@@ -1510,7 +1510,7 @@
           <w14:ligatures w14:val="standardContextual"/>
         </w:rPr>
       </w:pPr>
-      <w:hyperlink w:anchor="_Toc242194271" w:history="1">
+      <w:hyperlink w:anchor="_Toc242217232" w:history="1">
         <w:r>
           <w:rPr>
             <w:rStyle w:val="Hyperlink"/>
@@ -1537,7 +1537,7 @@
             <w:noProof/>
             <w:webHidden/>
           </w:rPr>
-          <w:instrText xml:space="preserve"> PAGEREF _Toc242194271 \h </w:instrText>
+          <w:instrText xml:space="preserve"> PAGEREF _Toc242217232 \h </w:instrText>
         </w:r>
         <w:r>
           <w:rPr>
@@ -1557,7 +1557,7 @@
             <w:noProof/>
             <w:webHidden/>
           </w:rPr>
-          <w:t>13</w:t>
+          <w:t>14</w:t>
         </w:r>
         <w:r>
           <w:rPr>
@@ -1582,7 +1582,7 @@
           <w14:ligatures w14:val="standardContextual"/>
         </w:rPr>
       </w:pPr>
-      <w:hyperlink w:anchor="_Toc242194272" w:history="1">
+      <w:hyperlink w:anchor="_Toc242217233" w:history="1">
         <w:r>
           <w:rPr>
             <w:rStyle w:val="Hyperlink"/>
@@ -1609,7 +1609,7 @@
             <w:noProof/>
             <w:webHidden/>
           </w:rPr>
-          <w:instrText xml:space="preserve"> PAGEREF _Toc242194272 \h </w:instrText>
+          <w:instrText xml:space="preserve"> PAGEREF _Toc242217233 \h </w:instrText>
         </w:r>
         <w:r>
           <w:rPr>
@@ -1629,7 +1629,7 @@
             <w:noProof/>
             <w:webHidden/>
           </w:rPr>
-          <w:t>13</w:t>
+          <w:t>14</w:t>
         </w:r>
         <w:r>
           <w:rPr>
@@ -1654,7 +1654,7 @@
           <w14:ligatures w14:val="standardContextual"/>
         </w:rPr>
       </w:pPr>
-      <w:hyperlink w:anchor="_Toc242194273" w:history="1">
+      <w:hyperlink w:anchor="_Toc242217234" w:history="1">
         <w:r>
           <w:rPr>
             <w:rStyle w:val="Hyperlink"/>
@@ -1681,7 +1681,7 @@
             <w:noProof/>
             <w:webHidden/>
           </w:rPr>
-          <w:instrText xml:space="preserve"> PAGEREF _Toc242194273 \h </w:instrText>
+          <w:instrText xml:space="preserve"> PAGEREF _Toc242217234 \h </w:instrText>
         </w:r>
         <w:r>
           <w:rPr>
@@ -1701,7 +1701,7 @@
             <w:noProof/>
             <w:webHidden/>
           </w:rPr>
-          <w:t>13</w:t>
+          <w:t>14</w:t>
         </w:r>
         <w:r>
           <w:rPr>
@@ -1726,7 +1726,7 @@
           <w14:ligatures w14:val="standardContextual"/>
         </w:rPr>
       </w:pPr>
-      <w:hyperlink w:anchor="_Toc242194274" w:history="1">
+      <w:hyperlink w:anchor="_Toc242217235" w:history="1">
         <w:r>
           <w:rPr>
             <w:rStyle w:val="Hyperlink"/>
@@ -1753,7 +1753,7 @@
             <w:noProof/>
             <w:webHidden/>
           </w:rPr>
-          <w:instrText xml:space="preserve"> PAGEREF _Toc242194274 \h </w:instrText>
+          <w:instrText xml:space="preserve"> PAGEREF _Toc242217235 \h </w:instrText>
         </w:r>
         <w:r>
           <w:rPr>
@@ -1773,7 +1773,7 @@
             <w:noProof/>
             <w:webHidden/>
           </w:rPr>
-          <w:t>14</w:t>
+          <w:t>15</w:t>
         </w:r>
         <w:r>
           <w:rPr>
@@ -1798,7 +1798,7 @@
           <w14:ligatures w14:val="standardContextual"/>
         </w:rPr>
       </w:pPr>
-      <w:hyperlink w:anchor="_Toc242194275" w:history="1">
+      <w:hyperlink w:anchor="_Toc242217236" w:history="1">
         <w:r>
           <w:rPr>
             <w:rStyle w:val="Hyperlink"/>
@@ -1825,7 +1825,7 @@
             <w:noProof/>
             <w:webHidden/>
           </w:rPr>
-          <w:instrText xml:space="preserve"> PAGEREF _Toc242194275 \h </w:instrText>
+          <w:instrText xml:space="preserve"> PAGEREF _Toc242217236 \h </w:instrText>
         </w:r>
         <w:r>
           <w:rPr>
@@ -1845,7 +1845,7 @@
             <w:noProof/>
             <w:webHidden/>
           </w:rPr>
-          <w:t>14</w:t>
+          <w:t>15</w:t>
         </w:r>
         <w:r>
           <w:rPr>
@@ -1870,7 +1870,7 @@
           <w14:ligatures w14:val="standardContextual"/>
         </w:rPr>
       </w:pPr>
-      <w:hyperlink w:anchor="_Toc242194276" w:history="1">
+      <w:hyperlink w:anchor="_Toc242217237" w:history="1">
         <w:r>
           <w:rPr>
             <w:rStyle w:val="Hyperlink"/>
@@ -1897,7 +1897,7 @@
             <w:noProof/>
             <w:webHidden/>
           </w:rPr>
-          <w:instrText xml:space="preserve"> PAGEREF _Toc242194276 \h </w:instrText>
+          <w:instrText xml:space="preserve"> PAGEREF _Toc242217237 \h </w:instrText>
         </w:r>
         <w:r>
           <w:rPr>
@@ -1917,7 +1917,7 @@
             <w:noProof/>
             <w:webHidden/>
           </w:rPr>
-          <w:t>15</w:t>
+          <w:t>16</w:t>
         </w:r>
         <w:r>
           <w:rPr>
@@ -1942,7 +1942,7 @@
           <w14:ligatures w14:val="standardContextual"/>
         </w:rPr>
       </w:pPr>
-      <w:hyperlink w:anchor="_Toc242194277" w:history="1">
+      <w:hyperlink w:anchor="_Toc242217238" w:history="1">
         <w:r>
           <w:rPr>
             <w:rStyle w:val="Hyperlink"/>
@@ -1969,7 +1969,7 @@
             <w:noProof/>
             <w:webHidden/>
           </w:rPr>
-          <w:instrText xml:space="preserve"> PAGEREF _Toc242194277 \h </w:instrText>
+          <w:instrText xml:space="preserve"> PAGEREF _Toc242217238 \h </w:instrText>
         </w:r>
         <w:r>
           <w:rPr>
@@ -1989,7 +1989,7 @@
             <w:noProof/>
             <w:webHidden/>
           </w:rPr>
-          <w:t>15</w:t>
+          <w:t>16</w:t>
         </w:r>
         <w:r>
           <w:rPr>
@@ -2014,7 +2014,7 @@
           <w14:ligatures w14:val="standardContextual"/>
         </w:rPr>
       </w:pPr>
-      <w:hyperlink w:anchor="_Toc242194278" w:history="1">
+      <w:hyperlink w:anchor="_Toc242217239" w:history="1">
         <w:r>
           <w:rPr>
             <w:rStyle w:val="Hyperlink"/>
@@ -2041,7 +2041,7 @@
             <w:noProof/>
             <w:webHidden/>
           </w:rPr>
-          <w:instrText xml:space="preserve"> PAGEREF _Toc242194278 \h </w:instrText>
+          <w:instrText xml:space="preserve"> PAGEREF _Toc242217239 \h </w:instrText>
         </w:r>
         <w:r>
           <w:rPr>
@@ -2061,7 +2061,7 @@
             <w:noProof/>
             <w:webHidden/>
           </w:rPr>
-          <w:t>15</w:t>
+          <w:t>16</w:t>
         </w:r>
         <w:r>
           <w:rPr>
@@ -2086,7 +2086,7 @@
           <w14:ligatures w14:val="standardContextual"/>
         </w:rPr>
       </w:pPr>
-      <w:hyperlink w:anchor="_Toc242194279" w:history="1">
+      <w:hyperlink w:anchor="_Toc242217240" w:history="1">
         <w:r>
           <w:rPr>
             <w:rStyle w:val="Hyperlink"/>
@@ -2113,7 +2113,7 @@
             <w:noProof/>
             <w:webHidden/>
           </w:rPr>
-          <w:instrText xml:space="preserve"> PAGEREF _Toc242194279 \h </w:instrText>
+          <w:instrText xml:space="preserve"> PAGEREF _Toc242217240 \h </w:instrText>
         </w:r>
         <w:r>
           <w:rPr>
@@ -2133,7 +2133,7 @@
             <w:noProof/>
             <w:webHidden/>
           </w:rPr>
-          <w:t>16</w:t>
+          <w:t>17</w:t>
         </w:r>
         <w:r>
           <w:rPr>
@@ -2158,7 +2158,7 @@
           <w14:ligatures w14:val="standardContextual"/>
         </w:rPr>
       </w:pPr>
-      <w:hyperlink w:anchor="_Toc242194280" w:history="1">
+      <w:hyperlink w:anchor="_Toc242217241" w:history="1">
         <w:r>
           <w:rPr>
             <w:rStyle w:val="Hyperlink"/>
@@ -2185,7 +2185,7 @@
             <w:noProof/>
             <w:webHidden/>
           </w:rPr>
-          <w:instrText xml:space="preserve"> PAGEREF _Toc242194280 \h </w:instrText>
+          <w:instrText xml:space="preserve"> PAGEREF _Toc242217241 \h </w:instrText>
         </w:r>
         <w:r>
           <w:rPr>
@@ -2205,7 +2205,7 @@
             <w:noProof/>
             <w:webHidden/>
           </w:rPr>
-          <w:t>17</w:t>
+          <w:t>18</w:t>
         </w:r>
         <w:r>
           <w:rPr>
@@ -2230,7 +2230,7 @@
           <w14:ligatures w14:val="standardContextual"/>
         </w:rPr>
       </w:pPr>
-      <w:hyperlink w:anchor="_Toc242194281" w:history="1">
+      <w:hyperlink w:anchor="_Toc242217242" w:history="1">
         <w:r>
           <w:rPr>
             <w:rStyle w:val="Hyperlink"/>
@@ -2257,7 +2257,7 @@
             <w:noProof/>
             <w:webHidden/>
           </w:rPr>
-          <w:instrText xml:space="preserve"> PAGEREF _Toc242194281 \h </w:instrText>
+          <w:instrText xml:space="preserve"> PAGEREF _Toc242217242 \h </w:instrText>
         </w:r>
         <w:r>
           <w:rPr>
@@ -2277,7 +2277,7 @@
             <w:noProof/>
             <w:webHidden/>
           </w:rPr>
-          <w:t>17</w:t>
+          <w:t>18</w:t>
         </w:r>
         <w:r>
           <w:rPr>
@@ -2302,7 +2302,7 @@
           <w14:ligatures w14:val="standardContextual"/>
         </w:rPr>
       </w:pPr>
-      <w:hyperlink w:anchor="_Toc242194282" w:history="1">
+      <w:hyperlink w:anchor="_Toc242217243" w:history="1">
         <w:r>
           <w:rPr>
             <w:rStyle w:val="Hyperlink"/>
@@ -2329,7 +2329,7 @@
             <w:noProof/>
             <w:webHidden/>
           </w:rPr>
-          <w:instrText xml:space="preserve"> PAGEREF _Toc242194282 \h </w:instrText>
+          <w:instrText xml:space="preserve"> PAGEREF _Toc242217243 \h </w:instrText>
         </w:r>
         <w:r>
           <w:rPr>
@@ -2349,7 +2349,7 @@
             <w:noProof/>
             <w:webHidden/>
           </w:rPr>
-          <w:t>17</w:t>
+          <w:t>18</w:t>
         </w:r>
         <w:r>
           <w:rPr>
@@ -2374,7 +2374,7 @@
           <w14:ligatures w14:val="standardContextual"/>
         </w:rPr>
       </w:pPr>
-      <w:hyperlink w:anchor="_Toc242194283" w:history="1">
+      <w:hyperlink w:anchor="_Toc242217244" w:history="1">
         <w:r>
           <w:rPr>
             <w:rStyle w:val="Hyperlink"/>
@@ -2401,7 +2401,7 @@
             <w:noProof/>
             <w:webHidden/>
           </w:rPr>
-          <w:instrText xml:space="preserve"> PAGEREF _Toc242194283 \h </w:instrText>
+          <w:instrText xml:space="preserve"> PAGEREF _Toc242217244 \h </w:instrText>
         </w:r>
         <w:r>
           <w:rPr>
@@ -2421,7 +2421,7 @@
             <w:noProof/>
             <w:webHidden/>
           </w:rPr>
-          <w:t>18</w:t>
+          <w:t>19</w:t>
         </w:r>
         <w:r>
           <w:rPr>
@@ -2446,7 +2446,7 @@
           <w14:ligatures w14:val="standardContextual"/>
         </w:rPr>
       </w:pPr>
-      <w:hyperlink w:anchor="_Toc242194284" w:history="1">
+      <w:hyperlink w:anchor="_Toc242217245" w:history="1">
         <w:r>
           <w:rPr>
             <w:rStyle w:val="Hyperlink"/>
@@ -2473,7 +2473,7 @@
             <w:noProof/>
             <w:webHidden/>
           </w:rPr>
-          <w:instrText xml:space="preserve"> PAGEREF _Toc242194284 \h </w:instrText>
+          <w:instrText xml:space="preserve"> PAGEREF _Toc242217245 \h </w:instrText>
         </w:r>
         <w:r>
           <w:rPr>
@@ -2493,7 +2493,7 @@
             <w:noProof/>
             <w:webHidden/>
           </w:rPr>
-          <w:t>18</w:t>
+          <w:t>19</w:t>
         </w:r>
         <w:r>
           <w:rPr>
@@ -2518,7 +2518,7 @@
           <w14:ligatures w14:val="standardContextual"/>
         </w:rPr>
       </w:pPr>
-      <w:hyperlink w:anchor="_Toc242194285" w:history="1">
+      <w:hyperlink w:anchor="_Toc242217246" w:history="1">
         <w:r>
           <w:rPr>
             <w:rStyle w:val="Hyperlink"/>
@@ -2545,7 +2545,7 @@
             <w:noProof/>
             <w:webHidden/>
           </w:rPr>
-          <w:instrText xml:space="preserve"> PAGEREF _Toc242194285 \h </w:instrText>
+          <w:instrText xml:space="preserve"> PAGEREF _Toc242217246 \h </w:instrText>
         </w:r>
         <w:r>
           <w:rPr>
@@ -2565,7 +2565,7 @@
             <w:noProof/>
             <w:webHidden/>
           </w:rPr>
-          <w:t>19</w:t>
+          <w:t>20</w:t>
         </w:r>
         <w:r>
           <w:rPr>
@@ -2590,7 +2590,7 @@
           <w14:ligatures w14:val="standardContextual"/>
         </w:rPr>
       </w:pPr>
-      <w:hyperlink w:anchor="_Toc242194286" w:history="1">
+      <w:hyperlink w:anchor="_Toc242217247" w:history="1">
         <w:r>
           <w:rPr>
             <w:rStyle w:val="Hyperlink"/>
@@ -2617,7 +2617,7 @@
             <w:noProof/>
             <w:webHidden/>
           </w:rPr>
-          <w:instrText xml:space="preserve"> PAGEREF _Toc242194286 \h </w:instrText>
+          <w:instrText xml:space="preserve"> PAGEREF _Toc242217247 \h </w:instrText>
         </w:r>
         <w:r>
           <w:rPr>
@@ -2637,7 +2637,7 @@
             <w:noProof/>
             <w:webHidden/>
           </w:rPr>
-          <w:t>19</w:t>
+          <w:t>20</w:t>
         </w:r>
         <w:r>
           <w:rPr>
@@ -2662,7 +2662,7 @@
           <w14:ligatures w14:val="standardContextual"/>
         </w:rPr>
       </w:pPr>
-      <w:hyperlink w:anchor="_Toc242194287" w:history="1">
+      <w:hyperlink w:anchor="_Toc242217248" w:history="1">
         <w:r>
           <w:rPr>
             <w:rStyle w:val="Hyperlink"/>
@@ -2689,7 +2689,7 @@
             <w:noProof/>
             <w:webHidden/>
           </w:rPr>
-          <w:instrText xml:space="preserve"> PAGEREF _Toc242194287 \h </w:instrText>
+          <w:instrText xml:space="preserve"> PAGEREF _Toc242217248 \h </w:instrText>
         </w:r>
         <w:r>
           <w:rPr>
@@ -2709,7 +2709,7 @@
             <w:noProof/>
             <w:webHidden/>
           </w:rPr>
-          <w:t>19</w:t>
+          <w:t>20</w:t>
         </w:r>
         <w:r>
           <w:rPr>
@@ -2734,7 +2734,7 @@
           <w14:ligatures w14:val="standardContextual"/>
         </w:rPr>
       </w:pPr>
-      <w:hyperlink w:anchor="_Toc242194288" w:history="1">
+      <w:hyperlink w:anchor="_Toc242217249" w:history="1">
         <w:r>
           <w:rPr>
             <w:rStyle w:val="Hyperlink"/>
@@ -2761,7 +2761,7 @@
             <w:noProof/>
             <w:webHidden/>
           </w:rPr>
-          <w:instrText xml:space="preserve"> PAGEREF _Toc242194288 \h </w:instrText>
+          <w:instrText xml:space="preserve"> PAGEREF _Toc242217249 \h </w:instrText>
         </w:r>
         <w:r>
           <w:rPr>
@@ -2781,7 +2781,7 @@
             <w:noProof/>
             <w:webHidden/>
           </w:rPr>
-          <w:t>20</w:t>
+          <w:t>21</w:t>
         </w:r>
         <w:r>
           <w:rPr>
@@ -2806,7 +2806,7 @@
           <w14:ligatures w14:val="standardContextual"/>
         </w:rPr>
       </w:pPr>
-      <w:hyperlink w:anchor="_Toc242194289" w:history="1">
+      <w:hyperlink w:anchor="_Toc242217250" w:history="1">
         <w:r>
           <w:rPr>
             <w:rStyle w:val="Hyperlink"/>
@@ -2833,7 +2833,7 @@
             <w:noProof/>
             <w:webHidden/>
           </w:rPr>
-          <w:instrText xml:space="preserve"> PAGEREF _Toc242194289 \h </w:instrText>
+          <w:instrText xml:space="preserve"> PAGEREF _Toc242217250 \h </w:instrText>
         </w:r>
         <w:r>
           <w:rPr>
@@ -2853,7 +2853,7 @@
             <w:noProof/>
             <w:webHidden/>
           </w:rPr>
-          <w:t>21</w:t>
+          <w:t>22</w:t>
         </w:r>
         <w:r>
           <w:rPr>
@@ -2878,7 +2878,7 @@
           <w14:ligatures w14:val="standardContextual"/>
         </w:rPr>
       </w:pPr>
-      <w:hyperlink w:anchor="_Toc242194290" w:history="1">
+      <w:hyperlink w:anchor="_Toc242217251" w:history="1">
         <w:r>
           <w:rPr>
             <w:rStyle w:val="Hyperlink"/>
@@ -2905,7 +2905,7 @@
             <w:noProof/>
             <w:webHidden/>
           </w:rPr>
-          <w:instrText xml:space="preserve"> PAGEREF _Toc242194290 \h </w:instrText>
+          <w:instrText xml:space="preserve"> PAGEREF _Toc242217251 \h </w:instrText>
         </w:r>
         <w:r>
           <w:rPr>
@@ -2925,7 +2925,7 @@
             <w:noProof/>
             <w:webHidden/>
           </w:rPr>
-          <w:t>22</w:t>
+          <w:t>23</w:t>
         </w:r>
         <w:r>
           <w:rPr>
@@ -2950,7 +2950,7 @@
           <w14:ligatures w14:val="standardContextual"/>
         </w:rPr>
       </w:pPr>
-      <w:hyperlink w:anchor="_Toc242194291" w:history="1">
+      <w:hyperlink w:anchor="_Toc242217252" w:history="1">
         <w:r>
           <w:rPr>
             <w:rStyle w:val="Hyperlink"/>
@@ -2977,7 +2977,7 @@
             <w:noProof/>
             <w:webHidden/>
           </w:rPr>
-          <w:instrText xml:space="preserve"> PAGEREF _Toc242194291 \h </w:instrText>
+          <w:instrText xml:space="preserve"> PAGEREF _Toc242217252 \h </w:instrText>
         </w:r>
         <w:r>
           <w:rPr>
@@ -2997,6 +2997,682 @@
             <w:noProof/>
             <w:webHidden/>
           </w:rPr>
+          <w:t>23</w:t>
+        </w:r>
+        <w:r>
+          <w:rPr>
+            <w:noProof/>
+            <w:webHidden/>
+          </w:rPr>
+          <w:fldChar w:fldCharType="end"/>
+        </w:r>
+      </w:hyperlink>
+    </w:p>
+    <w:p>
+      <w:r>
+        <w:fldChar w:fldCharType="end"/>
+      </w:r>
+    </w:p>
+    <w:p>
+      <w:r>
+        <w:br w:type="page"/>
+      </w:r>
+    </w:p>
+    <w:p>
+      <w:pPr>
+        <w:pStyle w:val="TOCHeading"/>
+      </w:pPr>
+      <w:r>
+        <w:lastRenderedPageBreak/>
+        <w:t>Table of figures</w:t>
+      </w:r>
+    </w:p>
+    <w:p>
+      <w:pPr>
+        <w:pStyle w:val="TableofFigures"/>
+        <w:tabs>
+          <w:tab w:val="right" w:leader="dot" w:pos="9782"/>
+        </w:tabs>
+        <w:rPr>
+          <w:rFonts w:asciiTheme="minorHAnsi" w:eastAsiaTheme="minorEastAsia" w:hAnsiTheme="minorHAnsi" w:cstheme="minorBidi"/>
+          <w:noProof/>
+          <w:kern w:val="2"/>
+          <w:szCs w:val="24"/>
+          <w14:ligatures w14:val="standardContextual"/>
+        </w:rPr>
+      </w:pPr>
+      <w:r>
+        <w:fldChar w:fldCharType="begin"/>
+      </w:r>
+      <w:r>
+        <w:instrText xml:space="preserve"> TOC \h \z \c "Figure" </w:instrText>
+      </w:r>
+      <w:r>
+        <w:fldChar w:fldCharType="separate"/>
+      </w:r>
+      <w:hyperlink w:anchor="_Toc242217253" w:history="1">
+        <w:r>
+          <w:rPr>
+            <w:rStyle w:val="Hyperlink"/>
+            <w:noProof/>
+          </w:rPr>
+          <w:t>Figure 1. Colab code for mutex-protected slice allocation in countWords.</w:t>
+        </w:r>
+        <w:r>
+          <w:rPr>
+            <w:noProof/>
+            <w:webHidden/>
+          </w:rPr>
+          <w:tab/>
+        </w:r>
+        <w:r>
+          <w:rPr>
+            <w:noProof/>
+            <w:webHidden/>
+          </w:rPr>
+          <w:fldChar w:fldCharType="begin"/>
+        </w:r>
+        <w:r>
+          <w:rPr>
+            <w:noProof/>
+            <w:webHidden/>
+          </w:rPr>
+          <w:instrText xml:space="preserve"> PAGEREF _Toc242217253 \h </w:instrText>
+        </w:r>
+        <w:r>
+          <w:rPr>
+            <w:noProof/>
+            <w:webHidden/>
+          </w:rPr>
+        </w:r>
+        <w:r>
+          <w:rPr>
+            <w:noProof/>
+            <w:webHidden/>
+          </w:rPr>
+          <w:fldChar w:fldCharType="separate"/>
+        </w:r>
+        <w:r>
+          <w:rPr>
+            <w:noProof/>
+            <w:webHidden/>
+          </w:rPr>
+          <w:t>7</w:t>
+        </w:r>
+        <w:r>
+          <w:rPr>
+            <w:noProof/>
+            <w:webHidden/>
+          </w:rPr>
+          <w:fldChar w:fldCharType="end"/>
+        </w:r>
+      </w:hyperlink>
+    </w:p>
+    <w:p>
+      <w:pPr>
+        <w:pStyle w:val="TableofFigures"/>
+        <w:tabs>
+          <w:tab w:val="right" w:leader="dot" w:pos="9782"/>
+        </w:tabs>
+        <w:rPr>
+          <w:rFonts w:asciiTheme="minorHAnsi" w:eastAsiaTheme="minorEastAsia" w:hAnsiTheme="minorHAnsi" w:cstheme="minorBidi"/>
+          <w:noProof/>
+          <w:kern w:val="2"/>
+          <w:szCs w:val="24"/>
+          <w14:ligatures w14:val="standardContextual"/>
+        </w:rPr>
+      </w:pPr>
+      <w:hyperlink w:anchor="_Toc242217254" w:history="1">
+        <w:r>
+          <w:rPr>
+            <w:rStyle w:val="Hyperlink"/>
+            <w:noProof/>
+          </w:rPr>
+          <w:t>Figure 2. Task 01 word occurrence results in Google Colab.</w:t>
+        </w:r>
+        <w:r>
+          <w:rPr>
+            <w:noProof/>
+            <w:webHidden/>
+          </w:rPr>
+          <w:tab/>
+        </w:r>
+        <w:r>
+          <w:rPr>
+            <w:noProof/>
+            <w:webHidden/>
+          </w:rPr>
+          <w:fldChar w:fldCharType="begin"/>
+        </w:r>
+        <w:r>
+          <w:rPr>
+            <w:noProof/>
+            <w:webHidden/>
+          </w:rPr>
+          <w:instrText xml:space="preserve"> PAGEREF _Toc242217254 \h </w:instrText>
+        </w:r>
+        <w:r>
+          <w:rPr>
+            <w:noProof/>
+            <w:webHidden/>
+          </w:rPr>
+        </w:r>
+        <w:r>
+          <w:rPr>
+            <w:noProof/>
+            <w:webHidden/>
+          </w:rPr>
+          <w:fldChar w:fldCharType="separate"/>
+        </w:r>
+        <w:r>
+          <w:rPr>
+            <w:noProof/>
+            <w:webHidden/>
+          </w:rPr>
+          <w:t>9</w:t>
+        </w:r>
+        <w:r>
+          <w:rPr>
+            <w:noProof/>
+            <w:webHidden/>
+          </w:rPr>
+          <w:fldChar w:fldCharType="end"/>
+        </w:r>
+      </w:hyperlink>
+    </w:p>
+    <w:p>
+      <w:pPr>
+        <w:pStyle w:val="TableofFigures"/>
+        <w:tabs>
+          <w:tab w:val="right" w:leader="dot" w:pos="9782"/>
+        </w:tabs>
+        <w:rPr>
+          <w:rFonts w:asciiTheme="minorHAnsi" w:eastAsiaTheme="minorEastAsia" w:hAnsiTheme="minorHAnsi" w:cstheme="minorBidi"/>
+          <w:noProof/>
+          <w:kern w:val="2"/>
+          <w:szCs w:val="24"/>
+          <w14:ligatures w14:val="standardContextual"/>
+        </w:rPr>
+      </w:pPr>
+      <w:hyperlink w:anchor="_Toc242217255" w:history="1">
+        <w:r>
+          <w:rPr>
+            <w:rStyle w:val="Hyperlink"/>
+            <w:noProof/>
+          </w:rPr>
+          <w:t>Figure 3. Colab code for parallel matrix rows and local product accumulation.</w:t>
+        </w:r>
+        <w:r>
+          <w:rPr>
+            <w:noProof/>
+            <w:webHidden/>
+          </w:rPr>
+          <w:tab/>
+        </w:r>
+        <w:r>
+          <w:rPr>
+            <w:noProof/>
+            <w:webHidden/>
+          </w:rPr>
+          <w:fldChar w:fldCharType="begin"/>
+        </w:r>
+        <w:r>
+          <w:rPr>
+            <w:noProof/>
+            <w:webHidden/>
+          </w:rPr>
+          <w:instrText xml:space="preserve"> PAGEREF _Toc242217255 \h </w:instrText>
+        </w:r>
+        <w:r>
+          <w:rPr>
+            <w:noProof/>
+            <w:webHidden/>
+          </w:rPr>
+        </w:r>
+        <w:r>
+          <w:rPr>
+            <w:noProof/>
+            <w:webHidden/>
+          </w:rPr>
+          <w:fldChar w:fldCharType="separate"/>
+        </w:r>
+        <w:r>
+          <w:rPr>
+            <w:noProof/>
+            <w:webHidden/>
+          </w:rPr>
+          <w:t>11</w:t>
+        </w:r>
+        <w:r>
+          <w:rPr>
+            <w:noProof/>
+            <w:webHidden/>
+          </w:rPr>
+          <w:fldChar w:fldCharType="end"/>
+        </w:r>
+      </w:hyperlink>
+    </w:p>
+    <w:p>
+      <w:pPr>
+        <w:pStyle w:val="TableofFigures"/>
+        <w:tabs>
+          <w:tab w:val="right" w:leader="dot" w:pos="9782"/>
+        </w:tabs>
+        <w:rPr>
+          <w:rFonts w:asciiTheme="minorHAnsi" w:eastAsiaTheme="minorEastAsia" w:hAnsiTheme="minorHAnsi" w:cstheme="minorBidi"/>
+          <w:noProof/>
+          <w:kern w:val="2"/>
+          <w:szCs w:val="24"/>
+          <w14:ligatures w14:val="standardContextual"/>
+        </w:rPr>
+      </w:pPr>
+      <w:hyperlink w:anchor="_Toc242217256" w:history="1">
+        <w:r>
+          <w:rPr>
+            <w:rStyle w:val="Hyperlink"/>
+            <w:noProof/>
+          </w:rPr>
+          <w:t>Figure 4. Task 02 matrix operations in Google Colab.</w:t>
+        </w:r>
+        <w:r>
+          <w:rPr>
+            <w:noProof/>
+            <w:webHidden/>
+          </w:rPr>
+          <w:tab/>
+        </w:r>
+        <w:r>
+          <w:rPr>
+            <w:noProof/>
+            <w:webHidden/>
+          </w:rPr>
+          <w:fldChar w:fldCharType="begin"/>
+        </w:r>
+        <w:r>
+          <w:rPr>
+            <w:noProof/>
+            <w:webHidden/>
+          </w:rPr>
+          <w:instrText xml:space="preserve"> PAGEREF _Toc242217256 \h </w:instrText>
+        </w:r>
+        <w:r>
+          <w:rPr>
+            <w:noProof/>
+            <w:webHidden/>
+          </w:rPr>
+        </w:r>
+        <w:r>
+          <w:rPr>
+            <w:noProof/>
+            <w:webHidden/>
+          </w:rPr>
+          <w:fldChar w:fldCharType="separate"/>
+        </w:r>
+        <w:r>
+          <w:rPr>
+            <w:noProof/>
+            <w:webHidden/>
+          </w:rPr>
+          <w:t>13</w:t>
+        </w:r>
+        <w:r>
+          <w:rPr>
+            <w:noProof/>
+            <w:webHidden/>
+          </w:rPr>
+          <w:fldChar w:fldCharType="end"/>
+        </w:r>
+      </w:hyperlink>
+    </w:p>
+    <w:p>
+      <w:pPr>
+        <w:pStyle w:val="TableofFigures"/>
+        <w:tabs>
+          <w:tab w:val="right" w:leader="dot" w:pos="9782"/>
+        </w:tabs>
+        <w:rPr>
+          <w:rFonts w:asciiTheme="minorHAnsi" w:eastAsiaTheme="minorEastAsia" w:hAnsiTheme="minorHAnsi" w:cstheme="minorBidi"/>
+          <w:noProof/>
+          <w:kern w:val="2"/>
+          <w:szCs w:val="24"/>
+          <w14:ligatures w14:val="standardContextual"/>
+        </w:rPr>
+      </w:pPr>
+      <w:hyperlink w:anchor="_Toc242217257" w:history="1">
+        <w:r>
+          <w:rPr>
+            <w:rStyle w:val="Hyperlink"/>
+            <w:noProof/>
+          </w:rPr>
+          <w:t>Figure 5. Colab code for password indexing and candidate search.</w:t>
+        </w:r>
+        <w:r>
+          <w:rPr>
+            <w:noProof/>
+            <w:webHidden/>
+          </w:rPr>
+          <w:tab/>
+        </w:r>
+        <w:r>
+          <w:rPr>
+            <w:noProof/>
+            <w:webHidden/>
+          </w:rPr>
+          <w:fldChar w:fldCharType="begin"/>
+        </w:r>
+        <w:r>
+          <w:rPr>
+            <w:noProof/>
+            <w:webHidden/>
+          </w:rPr>
+          <w:instrText xml:space="preserve"> PAGEREF _Toc242217257 \h </w:instrText>
+        </w:r>
+        <w:r>
+          <w:rPr>
+            <w:noProof/>
+            <w:webHidden/>
+          </w:rPr>
+        </w:r>
+        <w:r>
+          <w:rPr>
+            <w:noProof/>
+            <w:webHidden/>
+          </w:rPr>
+          <w:fldChar w:fldCharType="separate"/>
+        </w:r>
+        <w:r>
+          <w:rPr>
+            <w:noProof/>
+            <w:webHidden/>
+          </w:rPr>
+          <w:t>15</w:t>
+        </w:r>
+        <w:r>
+          <w:rPr>
+            <w:noProof/>
+            <w:webHidden/>
+          </w:rPr>
+          <w:fldChar w:fldCharType="end"/>
+        </w:r>
+      </w:hyperlink>
+    </w:p>
+    <w:p>
+      <w:pPr>
+        <w:pStyle w:val="TableofFigures"/>
+        <w:tabs>
+          <w:tab w:val="right" w:leader="dot" w:pos="9782"/>
+        </w:tabs>
+        <w:rPr>
+          <w:rFonts w:asciiTheme="minorHAnsi" w:eastAsiaTheme="minorEastAsia" w:hAnsiTheme="minorHAnsi" w:cstheme="minorBidi"/>
+          <w:noProof/>
+          <w:kern w:val="2"/>
+          <w:szCs w:val="24"/>
+          <w14:ligatures w14:val="standardContextual"/>
+        </w:rPr>
+      </w:pPr>
+      <w:hyperlink w:anchor="_Toc242217258" w:history="1">
+        <w:r>
+          <w:rPr>
+            <w:rStyle w:val="Hyperlink"/>
+            <w:noProof/>
+          </w:rPr>
+          <w:t>Figure 6. Task 03 CUDA password recovery in Google Colab.</w:t>
+        </w:r>
+        <w:r>
+          <w:rPr>
+            <w:noProof/>
+            <w:webHidden/>
+          </w:rPr>
+          <w:tab/>
+        </w:r>
+        <w:r>
+          <w:rPr>
+            <w:noProof/>
+            <w:webHidden/>
+          </w:rPr>
+          <w:fldChar w:fldCharType="begin"/>
+        </w:r>
+        <w:r>
+          <w:rPr>
+            <w:noProof/>
+            <w:webHidden/>
+          </w:rPr>
+          <w:instrText xml:space="preserve"> PAGEREF _Toc242217258 \h </w:instrText>
+        </w:r>
+        <w:r>
+          <w:rPr>
+            <w:noProof/>
+            <w:webHidden/>
+          </w:rPr>
+        </w:r>
+        <w:r>
+          <w:rPr>
+            <w:noProof/>
+            <w:webHidden/>
+          </w:rPr>
+          <w:fldChar w:fldCharType="separate"/>
+        </w:r>
+        <w:r>
+          <w:rPr>
+            <w:noProof/>
+            <w:webHidden/>
+          </w:rPr>
+          <w:t>17</w:t>
+        </w:r>
+        <w:r>
+          <w:rPr>
+            <w:noProof/>
+            <w:webHidden/>
+          </w:rPr>
+          <w:fldChar w:fldCharType="end"/>
+        </w:r>
+      </w:hyperlink>
+    </w:p>
+    <w:p>
+      <w:pPr>
+        <w:pStyle w:val="TableofFigures"/>
+        <w:tabs>
+          <w:tab w:val="right" w:leader="dot" w:pos="9782"/>
+        </w:tabs>
+        <w:rPr>
+          <w:rFonts w:asciiTheme="minorHAnsi" w:eastAsiaTheme="minorEastAsia" w:hAnsiTheme="minorHAnsi" w:cstheme="minorBidi"/>
+          <w:noProof/>
+          <w:kern w:val="2"/>
+          <w:szCs w:val="24"/>
+          <w14:ligatures w14:val="standardContextual"/>
+        </w:rPr>
+      </w:pPr>
+      <w:hyperlink w:anchor="_Toc242217259" w:history="1">
+        <w:r>
+          <w:rPr>
+            <w:rStyle w:val="Hyperlink"/>
+            <w:noProof/>
+          </w:rPr>
+          <w:t>Figure 7. Colab code for pixel indexing, Sobel gradients and edge magnitude.</w:t>
+        </w:r>
+        <w:r>
+          <w:rPr>
+            <w:noProof/>
+            <w:webHidden/>
+          </w:rPr>
+          <w:tab/>
+        </w:r>
+        <w:r>
+          <w:rPr>
+            <w:noProof/>
+            <w:webHidden/>
+          </w:rPr>
+          <w:fldChar w:fldCharType="begin"/>
+        </w:r>
+        <w:r>
+          <w:rPr>
+            <w:noProof/>
+            <w:webHidden/>
+          </w:rPr>
+          <w:instrText xml:space="preserve"> PAGEREF _Toc242217259 \h </w:instrText>
+        </w:r>
+        <w:r>
+          <w:rPr>
+            <w:noProof/>
+            <w:webHidden/>
+          </w:rPr>
+        </w:r>
+        <w:r>
+          <w:rPr>
+            <w:noProof/>
+            <w:webHidden/>
+          </w:rPr>
+          <w:fldChar w:fldCharType="separate"/>
+        </w:r>
+        <w:r>
+          <w:rPr>
+            <w:noProof/>
+            <w:webHidden/>
+          </w:rPr>
+          <w:t>19</w:t>
+        </w:r>
+        <w:r>
+          <w:rPr>
+            <w:noProof/>
+            <w:webHidden/>
+          </w:rPr>
+          <w:fldChar w:fldCharType="end"/>
+        </w:r>
+      </w:hyperlink>
+    </w:p>
+    <w:p>
+      <w:pPr>
+        <w:pStyle w:val="TableofFigures"/>
+        <w:tabs>
+          <w:tab w:val="right" w:leader="dot" w:pos="9782"/>
+        </w:tabs>
+        <w:rPr>
+          <w:rFonts w:asciiTheme="minorHAnsi" w:eastAsiaTheme="minorEastAsia" w:hAnsiTheme="minorHAnsi" w:cstheme="minorBidi"/>
+          <w:noProof/>
+          <w:kern w:val="2"/>
+          <w:szCs w:val="24"/>
+          <w14:ligatures w14:val="standardContextual"/>
+        </w:rPr>
+      </w:pPr>
+      <w:hyperlink w:anchor="_Toc242217260" w:history="1">
+        <w:r>
+          <w:rPr>
+            <w:rStyle w:val="Hyperlink"/>
+            <w:noProof/>
+          </w:rPr>
+          <w:t>Figure 8. Task 04 single-image CUDA execution in Google Colab.</w:t>
+        </w:r>
+        <w:r>
+          <w:rPr>
+            <w:noProof/>
+            <w:webHidden/>
+          </w:rPr>
+          <w:tab/>
+        </w:r>
+        <w:r>
+          <w:rPr>
+            <w:noProof/>
+            <w:webHidden/>
+          </w:rPr>
+          <w:fldChar w:fldCharType="begin"/>
+        </w:r>
+        <w:r>
+          <w:rPr>
+            <w:noProof/>
+            <w:webHidden/>
+          </w:rPr>
+          <w:instrText xml:space="preserve"> PAGEREF _Toc242217260 \h </w:instrText>
+        </w:r>
+        <w:r>
+          <w:rPr>
+            <w:noProof/>
+            <w:webHidden/>
+          </w:rPr>
+        </w:r>
+        <w:r>
+          <w:rPr>
+            <w:noProof/>
+            <w:webHidden/>
+          </w:rPr>
+          <w:fldChar w:fldCharType="separate"/>
+        </w:r>
+        <w:r>
+          <w:rPr>
+            <w:noProof/>
+            <w:webHidden/>
+          </w:rPr>
+          <w:t>21</w:t>
+        </w:r>
+        <w:r>
+          <w:rPr>
+            <w:noProof/>
+            <w:webHidden/>
+          </w:rPr>
+          <w:fldChar w:fldCharType="end"/>
+        </w:r>
+      </w:hyperlink>
+    </w:p>
+    <w:p>
+      <w:pPr>
+        <w:pStyle w:val="TableofFigures"/>
+        <w:tabs>
+          <w:tab w:val="right" w:leader="dot" w:pos="9782"/>
+        </w:tabs>
+        <w:rPr>
+          <w:rFonts w:asciiTheme="minorHAnsi" w:eastAsiaTheme="minorEastAsia" w:hAnsiTheme="minorHAnsi" w:cstheme="minorBidi"/>
+          <w:noProof/>
+          <w:kern w:val="2"/>
+          <w:szCs w:val="24"/>
+          <w14:ligatures w14:val="standardContextual"/>
+        </w:rPr>
+      </w:pPr>
+      <w:hyperlink w:anchor="_Toc242217261" w:history="1">
+        <w:r>
+          <w:rPr>
+            <w:rStyle w:val="Hyperlink"/>
+            <w:noProof/>
+          </w:rPr>
+          <w:t>Figure 9. Four views of the same download.png input displayed in Google Colab.</w:t>
+        </w:r>
+        <w:r>
+          <w:rPr>
+            <w:noProof/>
+            <w:webHidden/>
+          </w:rPr>
+          <w:tab/>
+        </w:r>
+        <w:r>
+          <w:rPr>
+            <w:noProof/>
+            <w:webHidden/>
+          </w:rPr>
+          <w:fldChar w:fldCharType="begin"/>
+        </w:r>
+        <w:r>
+          <w:rPr>
+            <w:noProof/>
+            <w:webHidden/>
+          </w:rPr>
+          <w:instrText xml:space="preserve"> PAGEREF _Toc242217261 \h </w:instrText>
+        </w:r>
+        <w:r>
+          <w:rPr>
+            <w:noProof/>
+            <w:webHidden/>
+          </w:rPr>
+        </w:r>
+        <w:r>
+          <w:rPr>
+            <w:noProof/>
+            <w:webHidden/>
+          </w:rPr>
+          <w:fldChar w:fldCharType="separate"/>
+        </w:r>
+        <w:r>
+          <w:rPr>
+            <w:noProof/>
+            <w:webHidden/>
+          </w:rPr>
           <w:t>22</w:t>
         </w:r>
         <w:r>
@@ -3022,7 +3698,7 @@
       <w:pPr>
         <w:pStyle w:val="Heading1"/>
       </w:pPr>
-      <w:bookmarkStart w:id="0" w:name="_Toc242194251"/>
+      <w:bookmarkStart w:id="0" w:name="_Toc242217212"/>
       <w:r>
         <w:lastRenderedPageBreak/>
         <w:t>Execution and files</w:t>
@@ -3052,14 +3728,14 @@
     </w:p>
     <w:p>
       <w:r>
-        <w:t>The GitHub project is private during development as requested. Notebook setup first attempts hosted project resources, then loads a checksum-verified compressed copy stored in the notebook. Task 04 separately downloads its one demonstration image from the lecturer's public URL without a GitHub login. The listed GitHub Colab links require repository access until the student approves a visibility change. The executed Colab notebooks are linked separately under each task.</w:t>
+        <w:t>Open the task notebook in Google Colab and run its first cell to upload the required files. Task 01 uses WordOccurrenceDataset.txt, Task 02 uses MatData.txt, and Task 03 uses passwords.txt and expected_passwords.txt. Task 04 uses lodepng.cpp and lodepng.h and downloads download.png from the public image URL. The notebook then writes the source, compiles the program, runs it and displays the output. Use a T4 GPU for the CUDA tasks. The GitHub notebook links require access to the private repository; local notebook files can be opened with Colab's Upload notebook option.</w:t>
       </w:r>
     </w:p>
     <w:p>
       <w:pPr>
         <w:pStyle w:val="Heading1"/>
       </w:pPr>
-      <w:bookmarkStart w:id="1" w:name="_Toc242194252"/>
+      <w:bookmarkStart w:id="1" w:name="_Toc242217213"/>
       <w:r>
         <w:t>Validation result</w:t>
       </w:r>
@@ -3067,10 +3743,7 @@
     </w:p>
     <w:p>
       <w:r>
-        <w:t xml:space="preserve">All 23 initial test groups passed on the Tesla T4, including multiple CPU thread counts, all supplied matrix pairs, exhaustive recovery of the 67,600-password domain, invalid inputs, AddressSanitizer and UndefinedBehaviorSanitizer. Task 04 was then rerun with separate X and Y maps: all 3 updated groups passed, including complete comparisons of three maps for each of 14 PNG inputs. Raw logs and separate initial and updated validation manifests are saved under evidence/validation. Task 04 figures and timings </w:t>
-      </w:r>
-      <w:r>
-        <w:t>below use the four-view version.</w:t>
+        <w:t>All 23 initial test groups passed on the Tesla T4, including multiple CPU thread counts, all supplied matrix pairs, exhaustive recovery of the 67,600-password domain, invalid inputs, AddressSanitizer and UndefinedBehaviorSanitizer. Task 04 was then rerun with separate X and Y maps: all 3 updated groups passed, including complete comparisons of three maps for each of 14 PNG inputs. Raw logs and separate initial and updated validation manifests are saved under evidence/validation. Task 04 figures and timings below use the four-view version.</w:t>
       </w:r>
     </w:p>
     <w:p>
@@ -3078,7 +3751,7 @@
         <w:pStyle w:val="Heading1"/>
         <w:pageBreakBefore/>
       </w:pPr>
-      <w:bookmarkStart w:id="2" w:name="_Toc242194253"/>
+      <w:bookmarkStart w:id="2" w:name="_Toc242217214"/>
       <w:r>
         <w:lastRenderedPageBreak/>
         <w:t>Task 01 Word Occurrence Counting using Multithreading</w:t>
@@ -3111,7 +3784,7 @@
       <w:pPr>
         <w:pStyle w:val="Heading2"/>
       </w:pPr>
-      <w:bookmarkStart w:id="3" w:name="_Toc242194254"/>
+      <w:bookmarkStart w:id="3" w:name="_Toc242217215"/>
       <w:r>
         <w:t>Objective</w:t>
       </w:r>
@@ -3126,7 +3799,7 @@
       <w:pPr>
         <w:pStyle w:val="Heading2"/>
       </w:pPr>
-      <w:bookmarkStart w:id="4" w:name="_Toc242194255"/>
+      <w:bookmarkStart w:id="4" w:name="_Toc242217216"/>
       <w:r>
         <w:t>Implementation</w:t>
       </w:r>
@@ -3151,7 +3824,7 @@
       <w:pPr>
         <w:pStyle w:val="Heading2"/>
       </w:pPr>
-      <w:bookmarkStart w:id="5" w:name="_Toc242194256"/>
+      <w:bookmarkStart w:id="5" w:name="_Toc242217217"/>
       <w:r>
         <w:lastRenderedPageBreak/>
         <w:t>Code I implemented</w:t>
@@ -3168,7 +3841,7 @@
           <w:noProof/>
         </w:rPr>
         <w:drawing>
-          <wp:inline distT="0" distB="0" distL="0" distR="0" wp14:anchorId="6D38E8CE" wp14:editId="3B481E92">
+          <wp:inline distT="0" distB="0" distL="0" distR="0" wp14:anchorId="1C14DB47" wp14:editId="672CF7A6">
             <wp:extent cx="6217920" cy="4707854"/>
             <wp:effectExtent l="0" t="0" r="0" b="0"/>
             <wp:docPr id="1" name="Picture 1" descr="Figure 1. Colab code for mutex-protected slice allocation in countWords."/>
@@ -3209,9 +3882,22 @@
         <w:pStyle w:val="Caption"/>
         <w:keepNext/>
       </w:pPr>
-      <w:r>
-        <w:t>Figure 1. Colab code for mutex-protected slice allocation in countWords.</w:t>
-      </w:r>
+      <w:bookmarkStart w:id="6" w:name="_Toc242217253"/>
+      <w:r>
+        <w:t xml:space="preserve">Figure </w:t>
+      </w:r>
+      <w:fldSimple w:instr=" SEQ Figure \* ARABIC ">
+        <w:r>
+          <w:rPr>
+            <w:noProof/>
+          </w:rPr>
+          <w:t>1</w:t>
+        </w:r>
+      </w:fldSimple>
+      <w:r>
+        <w:t>. Colab code for mutex-protected slice allocation in countWords.</w:t>
+      </w:r>
+      <w:bookmarkEnd w:id="6"/>
     </w:p>
     <w:p>
       <w:r>
@@ -3227,11 +3913,11 @@
       <w:pPr>
         <w:pStyle w:val="Heading2"/>
       </w:pPr>
-      <w:bookmarkStart w:id="6" w:name="_Toc242194257"/>
+      <w:bookmarkStart w:id="7" w:name="_Toc242217218"/>
       <w:r>
         <w:t>Synchronisation and memory</w:t>
       </w:r>
-      <w:bookmarkEnd w:id="6"/>
+      <w:bookmarkEnd w:id="7"/>
     </w:p>
     <w:p>
       <w:r>
@@ -3247,12 +3933,12 @@
       <w:pPr>
         <w:pStyle w:val="Heading2"/>
       </w:pPr>
-      <w:bookmarkStart w:id="7" w:name="_Toc242194258"/>
+      <w:bookmarkStart w:id="8" w:name="_Toc242217219"/>
       <w:r>
         <w:lastRenderedPageBreak/>
         <w:t>Build and run</w:t>
       </w:r>
-      <w:bookmarkEnd w:id="7"/>
+      <w:bookmarkEnd w:id="8"/>
     </w:p>
     <w:p>
       <w:pPr>
@@ -3280,11 +3966,11 @@
       <w:pPr>
         <w:pStyle w:val="Heading2"/>
       </w:pPr>
-      <w:bookmarkStart w:id="8" w:name="_Toc242194259"/>
+      <w:bookmarkStart w:id="9" w:name="_Toc242217220"/>
       <w:r>
         <w:t>Results and tests</w:t>
       </w:r>
-      <w:bookmarkEnd w:id="8"/>
+      <w:bookmarkEnd w:id="9"/>
     </w:p>
     <w:p>
       <w:r>
@@ -3298,18 +3984,18 @@
     </w:p>
     <w:p>
       <w:r>
-        <w:t>AddressSanitizer and UndefinedBehaviorSanitizer passed on the supplied dataset with seven threads. Thread IDs and per-thread slice counts are printed for the viva; their distribution can vary with scheduling without changing the final frequencies.</w:t>
+        <w:t>AddressSanitizer and UndefinedBehaviorSanitizer passed on the supplied dataset with seven threads. The program prints thread IDs and per-thread slice counts; their distribution can vary with scheduling without changing the final frequencies.</w:t>
       </w:r>
     </w:p>
     <w:p>
       <w:pPr>
         <w:pStyle w:val="Heading2"/>
       </w:pPr>
-      <w:bookmarkStart w:id="9" w:name="_Toc242194260"/>
+      <w:bookmarkStart w:id="10" w:name="_Toc242217221"/>
       <w:r>
         <w:t>Performance and limits</w:t>
       </w:r>
-      <w:bookmarkEnd w:id="9"/>
+      <w:bookmarkEnd w:id="10"/>
     </w:p>
     <w:p>
       <w:r>
@@ -3326,12 +4012,12 @@
         <w:pStyle w:val="Heading2"/>
         <w:pageBreakBefore/>
       </w:pPr>
-      <w:bookmarkStart w:id="10" w:name="_Toc242194261"/>
+      <w:bookmarkStart w:id="11" w:name="_Toc242217222"/>
       <w:r>
         <w:lastRenderedPageBreak/>
         <w:t>Colab execution evidence</w:t>
       </w:r>
-      <w:bookmarkEnd w:id="10"/>
+      <w:bookmarkEnd w:id="11"/>
     </w:p>
     <w:p>
       <w:pPr>
@@ -3343,7 +4029,7 @@
           <w:noProof/>
         </w:rPr>
         <w:drawing>
-          <wp:inline distT="0" distB="0" distL="0" distR="0" wp14:anchorId="58C9AB11" wp14:editId="4BB497D2">
+          <wp:inline distT="0" distB="0" distL="0" distR="0" wp14:anchorId="432598BC" wp14:editId="146140B0">
             <wp:extent cx="5250887" cy="4892040"/>
             <wp:effectExtent l="0" t="0" r="0" b="0"/>
             <wp:docPr id="2" name="Picture 2" descr="Figure 2. Task 01 word occurrence results in Google Colab."/>
@@ -3384,9 +4070,22 @@
         <w:pStyle w:val="Caption"/>
         <w:keepNext/>
       </w:pPr>
-      <w:r>
-        <w:t>Figure 2. Task 01 word occurrence results in Google Colab.</w:t>
-      </w:r>
+      <w:bookmarkStart w:id="12" w:name="_Toc242217254"/>
+      <w:r>
+        <w:t xml:space="preserve">Figure </w:t>
+      </w:r>
+      <w:fldSimple w:instr=" SEQ Figure \* ARABIC ">
+        <w:r>
+          <w:rPr>
+            <w:noProof/>
+          </w:rPr>
+          <w:t>2</w:t>
+        </w:r>
+      </w:fldSimple>
+      <w:r>
+        <w:t>. Task 01 word occurrence results in Google Colab.</w:t>
+      </w:r>
+      <w:bookmarkEnd w:id="12"/>
     </w:p>
     <w:p>
       <w:r>
@@ -3398,12 +4097,12 @@
         <w:pStyle w:val="Heading1"/>
         <w:pageBreakBefore/>
       </w:pPr>
-      <w:bookmarkStart w:id="11" w:name="_Toc242194262"/>
+      <w:bookmarkStart w:id="13" w:name="_Toc242217223"/>
       <w:r>
         <w:lastRenderedPageBreak/>
         <w:t>Task 02 Multiple operations with Matrices using multithreading</w:t>
       </w:r>
-      <w:bookmarkEnd w:id="11"/>
+      <w:bookmarkEnd w:id="13"/>
     </w:p>
     <w:p>
       <w:hyperlink r:id="rId13">
@@ -3431,11 +4130,11 @@
       <w:pPr>
         <w:pStyle w:val="Heading2"/>
       </w:pPr>
-      <w:bookmarkStart w:id="12" w:name="_Toc242194263"/>
+      <w:bookmarkStart w:id="14" w:name="_Toc242217224"/>
       <w:r>
         <w:t>Objective</w:t>
       </w:r>
-      <w:bookmarkEnd w:id="12"/>
+      <w:bookmarkEnd w:id="14"/>
     </w:p>
     <w:p>
       <w:r>
@@ -3446,11 +4145,11 @@
       <w:pPr>
         <w:pStyle w:val="Heading2"/>
       </w:pPr>
-      <w:bookmarkStart w:id="13" w:name="_Toc242194264"/>
+      <w:bookmarkStart w:id="15" w:name="_Toc242217225"/>
       <w:r>
         <w:t>Implementation</w:t>
       </w:r>
-      <w:bookmarkEnd w:id="13"/>
+      <w:bookmarkEnd w:id="15"/>
     </w:p>
     <w:p>
       <w:r>
@@ -3471,12 +4170,12 @@
       <w:pPr>
         <w:pStyle w:val="Heading2"/>
       </w:pPr>
-      <w:bookmarkStart w:id="14" w:name="_Toc242194265"/>
+      <w:bookmarkStart w:id="16" w:name="_Toc242217226"/>
       <w:r>
         <w:lastRenderedPageBreak/>
         <w:t>Code I implemented</w:t>
       </w:r>
-      <w:bookmarkEnd w:id="14"/>
+      <w:bookmarkEnd w:id="16"/>
     </w:p>
     <w:p>
       <w:pPr>
@@ -3488,7 +4187,7 @@
           <w:noProof/>
         </w:rPr>
         <w:drawing>
-          <wp:inline distT="0" distB="0" distL="0" distR="0" wp14:anchorId="6A313BA9" wp14:editId="7DCAC391">
+          <wp:inline distT="0" distB="0" distL="0" distR="0" wp14:anchorId="71FB51FD" wp14:editId="51853DA3">
             <wp:extent cx="6217920" cy="3661664"/>
             <wp:effectExtent l="0" t="0" r="0" b="0"/>
             <wp:docPr id="3" name="Picture 3" descr="Figure 3. Colab code for parallel matrix rows and local product accumulation."/>
@@ -3529,9 +4228,22 @@
         <w:pStyle w:val="Caption"/>
         <w:keepNext/>
       </w:pPr>
-      <w:r>
-        <w:t>Figure 3. Colab code for parallel matrix rows and local product accumulation.</w:t>
-      </w:r>
+      <w:bookmarkStart w:id="17" w:name="_Toc242217255"/>
+      <w:r>
+        <w:t xml:space="preserve">Figure </w:t>
+      </w:r>
+      <w:fldSimple w:instr=" SEQ Figure \* ARABIC ">
+        <w:r>
+          <w:rPr>
+            <w:noProof/>
+          </w:rPr>
+          <w:t>3</w:t>
+        </w:r>
+      </w:fldSimple>
+      <w:r>
+        <w:t>. Colab code for parallel matrix rows and local product accumulation.</w:t>
+      </w:r>
+      <w:bookmarkEnd w:id="17"/>
     </w:p>
     <w:p>
       <w:r>
@@ -3547,11 +4259,11 @@
       <w:pPr>
         <w:pStyle w:val="Heading2"/>
       </w:pPr>
-      <w:bookmarkStart w:id="15" w:name="_Toc242194266"/>
+      <w:bookmarkStart w:id="18" w:name="_Toc242217227"/>
       <w:r>
         <w:t>Synchronisation and memory</w:t>
       </w:r>
-      <w:bookmarkEnd w:id="15"/>
+      <w:bookmarkEnd w:id="18"/>
     </w:p>
     <w:p>
       <w:r>
@@ -3572,12 +4284,12 @@
       <w:pPr>
         <w:pStyle w:val="Heading2"/>
       </w:pPr>
-      <w:bookmarkStart w:id="16" w:name="_Toc242194267"/>
+      <w:bookmarkStart w:id="19" w:name="_Toc242217228"/>
       <w:r>
         <w:lastRenderedPageBreak/>
         <w:t>Build and run</w:t>
       </w:r>
-      <w:bookmarkEnd w:id="16"/>
+      <w:bookmarkEnd w:id="19"/>
     </w:p>
     <w:p>
       <w:pPr>
@@ -3605,11 +4317,11 @@
       <w:pPr>
         <w:pStyle w:val="Heading2"/>
       </w:pPr>
-      <w:bookmarkStart w:id="17" w:name="_Toc242194268"/>
+      <w:bookmarkStart w:id="20" w:name="_Toc242217229"/>
       <w:r>
         <w:t>Results and tests</w:t>
       </w:r>
-      <w:bookmarkEnd w:id="17"/>
+      <w:bookmarkEnd w:id="20"/>
     </w:p>
     <w:p>
       <w:r>
@@ -3690,11 +4402,11 @@
       <w:pPr>
         <w:pStyle w:val="Heading2"/>
       </w:pPr>
-      <w:bookmarkStart w:id="18" w:name="_Toc242194269"/>
+      <w:bookmarkStart w:id="21" w:name="_Toc242217230"/>
       <w:r>
         <w:t>Performance and limits</w:t>
       </w:r>
-      <w:bookmarkEnd w:id="18"/>
+      <w:bookmarkEnd w:id="21"/>
     </w:p>
     <w:p>
       <w:r>
@@ -3711,12 +4423,12 @@
         <w:pStyle w:val="Heading2"/>
         <w:pageBreakBefore/>
       </w:pPr>
-      <w:bookmarkStart w:id="19" w:name="_Toc242194270"/>
+      <w:bookmarkStart w:id="22" w:name="_Toc242217231"/>
       <w:r>
         <w:lastRenderedPageBreak/>
         <w:t>Colab execution evidence</w:t>
       </w:r>
-      <w:bookmarkEnd w:id="19"/>
+      <w:bookmarkEnd w:id="22"/>
     </w:p>
     <w:p>
       <w:pPr>
@@ -3728,7 +4440,7 @@
           <w:noProof/>
         </w:rPr>
         <w:drawing>
-          <wp:inline distT="0" distB="0" distL="0" distR="0" wp14:anchorId="66BD9792" wp14:editId="126CACA9">
+          <wp:inline distT="0" distB="0" distL="0" distR="0" wp14:anchorId="7F9A7140" wp14:editId="62F798B0">
             <wp:extent cx="5250887" cy="4892040"/>
             <wp:effectExtent l="0" t="0" r="0" b="0"/>
             <wp:docPr id="4" name="Picture 4" descr="Figure 4. Task 02 matrix operations in Google Colab."/>
@@ -3769,9 +4481,22 @@
         <w:pStyle w:val="Caption"/>
         <w:keepNext/>
       </w:pPr>
-      <w:r>
-        <w:t>Figure 4. Task 02 matrix operations in Google Colab.</w:t>
-      </w:r>
+      <w:bookmarkStart w:id="23" w:name="_Toc242217256"/>
+      <w:r>
+        <w:t xml:space="preserve">Figure </w:t>
+      </w:r>
+      <w:fldSimple w:instr=" SEQ Figure \* ARABIC ">
+        <w:r>
+          <w:rPr>
+            <w:noProof/>
+          </w:rPr>
+          <w:t>4</w:t>
+        </w:r>
+      </w:fldSimple>
+      <w:r>
+        <w:t>. Task 02 matrix operations in Google Colab.</w:t>
+      </w:r>
+      <w:bookmarkEnd w:id="23"/>
     </w:p>
     <w:p>
       <w:r>
@@ -3783,12 +4508,12 @@
         <w:pStyle w:val="Heading1"/>
         <w:pageBreakBefore/>
       </w:pPr>
-      <w:bookmarkStart w:id="20" w:name="_Toc242194271"/>
+      <w:bookmarkStart w:id="24" w:name="_Toc242217232"/>
       <w:r>
         <w:lastRenderedPageBreak/>
         <w:t>Task 03 Password Cracking with Files using CUDA</w:t>
       </w:r>
-      <w:bookmarkEnd w:id="20"/>
+      <w:bookmarkEnd w:id="24"/>
     </w:p>
     <w:p>
       <w:hyperlink r:id="rId17">
@@ -3816,11 +4541,11 @@
       <w:pPr>
         <w:pStyle w:val="Heading2"/>
       </w:pPr>
-      <w:bookmarkStart w:id="21" w:name="_Toc242194272"/>
+      <w:bookmarkStart w:id="25" w:name="_Toc242217233"/>
       <w:r>
         <w:t>Objective</w:t>
       </w:r>
-      <w:bookmarkEnd w:id="21"/>
+      <w:bookmarkEnd w:id="25"/>
     </w:p>
     <w:p>
       <w:r>
@@ -3831,11 +4556,11 @@
       <w:pPr>
         <w:pStyle w:val="Heading2"/>
       </w:pPr>
-      <w:bookmarkStart w:id="22" w:name="_Toc242194273"/>
+      <w:bookmarkStart w:id="26" w:name="_Toc242217234"/>
       <w:r>
         <w:t>Implementation</w:t>
       </w:r>
-      <w:bookmarkEnd w:id="22"/>
+      <w:bookmarkEnd w:id="26"/>
     </w:p>
     <w:p>
       <w:r>
@@ -3861,12 +4586,12 @@
       <w:pPr>
         <w:pStyle w:val="Heading2"/>
       </w:pPr>
-      <w:bookmarkStart w:id="23" w:name="_Toc242194274"/>
+      <w:bookmarkStart w:id="27" w:name="_Toc242217235"/>
       <w:r>
         <w:lastRenderedPageBreak/>
         <w:t>Code I implemented</w:t>
       </w:r>
-      <w:bookmarkEnd w:id="23"/>
+      <w:bookmarkEnd w:id="27"/>
     </w:p>
     <w:p>
       <w:pPr>
@@ -3878,7 +4603,7 @@
           <w:noProof/>
         </w:rPr>
         <w:drawing>
-          <wp:inline distT="0" distB="0" distL="0" distR="0" wp14:anchorId="6E288318" wp14:editId="233A164C">
+          <wp:inline distT="0" distB="0" distL="0" distR="0" wp14:anchorId="4FA97C44" wp14:editId="34111EDC">
             <wp:extent cx="6217920" cy="4374554"/>
             <wp:effectExtent l="0" t="0" r="0" b="0"/>
             <wp:docPr id="5" name="Picture 5" descr="Figure 5. Colab code for password indexing and candidate search."/>
@@ -3919,9 +4644,22 @@
         <w:pStyle w:val="Caption"/>
         <w:keepNext/>
       </w:pPr>
-      <w:r>
-        <w:t>Figure 5. Colab code for password indexing and candidate search.</w:t>
-      </w:r>
+      <w:bookmarkStart w:id="28" w:name="_Toc242217257"/>
+      <w:r>
+        <w:t xml:space="preserve">Figure </w:t>
+      </w:r>
+      <w:fldSimple w:instr=" SEQ Figure \* ARABIC ">
+        <w:r>
+          <w:rPr>
+            <w:noProof/>
+          </w:rPr>
+          <w:t>5</w:t>
+        </w:r>
+      </w:fldSimple>
+      <w:r>
+        <w:t>. Colab code for password indexing and candidate search.</w:t>
+      </w:r>
+      <w:bookmarkEnd w:id="28"/>
     </w:p>
     <w:p>
       <w:r>
@@ -3937,11 +4675,11 @@
       <w:pPr>
         <w:pStyle w:val="Heading2"/>
       </w:pPr>
-      <w:bookmarkStart w:id="24" w:name="_Toc242194275"/>
+      <w:bookmarkStart w:id="29" w:name="_Toc242217236"/>
       <w:r>
         <w:t>Synchronisation and memory</w:t>
       </w:r>
-      <w:bookmarkEnd w:id="24"/>
+      <w:bookmarkEnd w:id="29"/>
     </w:p>
     <w:p>
       <w:r>
@@ -3957,12 +4695,12 @@
       <w:pPr>
         <w:pStyle w:val="Heading2"/>
       </w:pPr>
-      <w:bookmarkStart w:id="25" w:name="_Toc242194276"/>
+      <w:bookmarkStart w:id="30" w:name="_Toc242217237"/>
       <w:r>
         <w:lastRenderedPageBreak/>
         <w:t>Build and run</w:t>
       </w:r>
-      <w:bookmarkEnd w:id="25"/>
+      <w:bookmarkEnd w:id="30"/>
     </w:p>
     <w:p>
       <w:pPr>
@@ -3990,11 +4728,11 @@
       <w:pPr>
         <w:pStyle w:val="Heading2"/>
       </w:pPr>
-      <w:bookmarkStart w:id="26" w:name="_Toc242194277"/>
+      <w:bookmarkStart w:id="31" w:name="_Toc242217238"/>
       <w:r>
         <w:t>Results and tests</w:t>
       </w:r>
-      <w:bookmarkEnd w:id="26"/>
+      <w:bookmarkEnd w:id="31"/>
     </w:p>
     <w:p>
       <w:r>
@@ -4119,11 +4857,11 @@
       <w:pPr>
         <w:pStyle w:val="Heading2"/>
       </w:pPr>
-      <w:bookmarkStart w:id="27" w:name="_Toc242194278"/>
+      <w:bookmarkStart w:id="32" w:name="_Toc242217239"/>
       <w:r>
         <w:t>Performance and limits</w:t>
       </w:r>
-      <w:bookmarkEnd w:id="27"/>
+      <w:bookmarkEnd w:id="32"/>
     </w:p>
     <w:p>
       <w:r>
@@ -4140,12 +4878,12 @@
         <w:pStyle w:val="Heading2"/>
         <w:pageBreakBefore/>
       </w:pPr>
-      <w:bookmarkStart w:id="28" w:name="_Toc242194279"/>
+      <w:bookmarkStart w:id="33" w:name="_Toc242217240"/>
       <w:r>
         <w:lastRenderedPageBreak/>
         <w:t>Colab execution evidence</w:t>
       </w:r>
-      <w:bookmarkEnd w:id="28"/>
+      <w:bookmarkEnd w:id="33"/>
     </w:p>
     <w:p>
       <w:pPr>
@@ -4157,7 +4895,7 @@
           <w:noProof/>
         </w:rPr>
         <w:drawing>
-          <wp:inline distT="0" distB="0" distL="0" distR="0" wp14:anchorId="06762EB7" wp14:editId="7EEAD26E">
+          <wp:inline distT="0" distB="0" distL="0" distR="0" wp14:anchorId="0FD9B5D1" wp14:editId="2E20C8E0">
             <wp:extent cx="5250887" cy="4892040"/>
             <wp:effectExtent l="0" t="0" r="0" b="0"/>
             <wp:docPr id="6" name="Picture 6" descr="Figure 6. Task 03 CUDA password recovery in Google Colab."/>
@@ -4198,9 +4936,22 @@
         <w:pStyle w:val="Caption"/>
         <w:keepNext/>
       </w:pPr>
-      <w:r>
-        <w:t>Figure 6. Task 03 CUDA password recovery in Google Colab.</w:t>
-      </w:r>
+      <w:bookmarkStart w:id="34" w:name="_Toc242217258"/>
+      <w:r>
+        <w:t xml:space="preserve">Figure </w:t>
+      </w:r>
+      <w:fldSimple w:instr=" SEQ Figure \* ARABIC ">
+        <w:r>
+          <w:rPr>
+            <w:noProof/>
+          </w:rPr>
+          <w:t>6</w:t>
+        </w:r>
+      </w:fldSimple>
+      <w:r>
+        <w:t>. Task 03 CUDA password recovery in Google Colab.</w:t>
+      </w:r>
+      <w:bookmarkEnd w:id="34"/>
     </w:p>
     <w:p>
       <w:r>
@@ -4212,7 +4963,7 @@
         <w:pStyle w:val="Heading1"/>
         <w:pageBreakBefore/>
       </w:pPr>
-      <w:bookmarkStart w:id="29" w:name="_Toc242194280"/>
+      <w:bookmarkStart w:id="35" w:name="_Toc242217241"/>
       <w:r>
         <w:lastRenderedPageBreak/>
         <w:t>Task 04</w:t>
@@ -4221,7 +4972,7 @@
         <w:br/>
         <w:t>Sobel Edge Detection using Cuda across many PNG images</w:t>
       </w:r>
-      <w:bookmarkEnd w:id="29"/>
+      <w:bookmarkEnd w:id="35"/>
     </w:p>
     <w:p>
       <w:hyperlink r:id="rId21">
@@ -4249,11 +5000,11 @@
       <w:pPr>
         <w:pStyle w:val="Heading2"/>
       </w:pPr>
-      <w:bookmarkStart w:id="30" w:name="_Toc242194281"/>
+      <w:bookmarkStart w:id="36" w:name="_Toc242217242"/>
       <w:r>
         <w:t>Objective</w:t>
       </w:r>
-      <w:bookmarkEnd w:id="30"/>
+      <w:bookmarkEnd w:id="36"/>
     </w:p>
     <w:p>
       <w:r>
@@ -4264,15 +5015,15 @@
       <w:pPr>
         <w:pStyle w:val="Heading2"/>
       </w:pPr>
-      <w:bookmarkStart w:id="31" w:name="_Toc242194282"/>
+      <w:bookmarkStart w:id="37" w:name="_Toc242217243"/>
       <w:r>
         <w:t>Implementation</w:t>
       </w:r>
-      <w:bookmarkEnd w:id="31"/>
-    </w:p>
-    <w:p>
-      <w:r>
-        <w:t>The notebook uses wget to download download.png (300x300) from the public image URL in the lecturer's last-class code. SHA-256 and PNG dimensions are checked before use; image_downloads.json records the source and load mode. This input requires no private GitHub login or Drive mount. LodePNG decodes the file into an RGBA host array, with its original licence notices retained.</w:t>
+      <w:bookmarkEnd w:id="37"/>
+    </w:p>
+    <w:p>
+      <w:r>
+        <w:t>The notebook uses wget to download download.png (300x300) from the public image URL in the lecturer's last-class code and checks its SHA-256 checksum before use. The input needs no GitHub login or Drive mount. After lodepng.cpp and lodepng.h are uploaded, LodePNG decodes the file into an RGBA host array, with its original licence notices retained.</w:t>
       </w:r>
     </w:p>
     <w:p>
@@ -4294,12 +5045,12 @@
       <w:pPr>
         <w:pStyle w:val="Heading2"/>
       </w:pPr>
-      <w:bookmarkStart w:id="32" w:name="_Toc242194283"/>
+      <w:bookmarkStart w:id="38" w:name="_Toc242217244"/>
       <w:r>
         <w:lastRenderedPageBreak/>
         <w:t>Code I implemented</w:t>
       </w:r>
-      <w:bookmarkEnd w:id="32"/>
+      <w:bookmarkEnd w:id="38"/>
     </w:p>
     <w:p>
       <w:pPr>
@@ -4311,7 +5062,7 @@
           <w:noProof/>
         </w:rPr>
         <w:drawing>
-          <wp:inline distT="0" distB="0" distL="0" distR="0" wp14:anchorId="1197CFC2" wp14:editId="0809FA74">
+          <wp:inline distT="0" distB="0" distL="0" distR="0" wp14:anchorId="3AC70AD3" wp14:editId="00F70524">
             <wp:extent cx="6040790" cy="4754879"/>
             <wp:effectExtent l="0" t="0" r="0" b="0"/>
             <wp:docPr id="7" name="Picture 7" descr="Figure 7. Colab code for pixel indexing, Sobel gradients and edge magnitude."/>
@@ -4352,9 +5103,22 @@
         <w:pStyle w:val="Caption"/>
         <w:keepNext/>
       </w:pPr>
-      <w:r>
-        <w:t>Figure 7. Colab code for pixel indexing, Sobel gradients and edge magnitude.</w:t>
-      </w:r>
+      <w:bookmarkStart w:id="39" w:name="_Toc242217259"/>
+      <w:r>
+        <w:t xml:space="preserve">Figure </w:t>
+      </w:r>
+      <w:fldSimple w:instr=" SEQ Figure \* ARABIC ">
+        <w:r>
+          <w:rPr>
+            <w:noProof/>
+          </w:rPr>
+          <w:t>7</w:t>
+        </w:r>
+      </w:fldSimple>
+      <w:r>
+        <w:t>. Colab code for pixel indexing, Sobel gradients and edge magnitude.</w:t>
+      </w:r>
+      <w:bookmarkEnd w:id="39"/>
     </w:p>
     <w:p>
       <w:r>
@@ -4370,11 +5134,11 @@
       <w:pPr>
         <w:pStyle w:val="Heading2"/>
       </w:pPr>
-      <w:bookmarkStart w:id="33" w:name="_Toc242194284"/>
+      <w:bookmarkStart w:id="40" w:name="_Toc242217245"/>
       <w:r>
         <w:t>Synchronisation and memory</w:t>
       </w:r>
-      <w:bookmarkEnd w:id="33"/>
+      <w:bookmarkEnd w:id="40"/>
     </w:p>
     <w:p>
       <w:r>
@@ -4396,11 +5160,11 @@
       <w:pPr>
         <w:pStyle w:val="Heading2"/>
       </w:pPr>
-      <w:bookmarkStart w:id="34" w:name="_Toc242194285"/>
+      <w:bookmarkStart w:id="41" w:name="_Toc242217246"/>
       <w:r>
         <w:t>Build and run</w:t>
       </w:r>
-      <w:bookmarkEnd w:id="34"/>
+      <w:bookmarkEnd w:id="41"/>
     </w:p>
     <w:p>
       <w:pPr>
@@ -4439,11 +5203,11 @@
       <w:pPr>
         <w:pStyle w:val="Heading2"/>
       </w:pPr>
-      <w:bookmarkStart w:id="35" w:name="_Toc242194286"/>
+      <w:bookmarkStart w:id="42" w:name="_Toc242217247"/>
       <w:r>
         <w:t>Results and tests</w:t>
       </w:r>
-      <w:bookmarkEnd w:id="35"/>
+      <w:bookmarkEnd w:id="42"/>
     </w:p>
     <w:p>
       <w:r>
@@ -4464,11 +5228,11 @@
       <w:pPr>
         <w:pStyle w:val="Heading2"/>
       </w:pPr>
-      <w:bookmarkStart w:id="36" w:name="_Toc242194287"/>
+      <w:bookmarkStart w:id="43" w:name="_Toc242217248"/>
       <w:r>
         <w:t>Performance and limits</w:t>
       </w:r>
-      <w:bookmarkEnd w:id="36"/>
+      <w:bookmarkEnd w:id="43"/>
     </w:p>
     <w:p>
       <w:r>
@@ -4485,12 +5249,12 @@
         <w:pStyle w:val="Heading2"/>
         <w:pageBreakBefore/>
       </w:pPr>
-      <w:bookmarkStart w:id="37" w:name="_Toc242194288"/>
+      <w:bookmarkStart w:id="44" w:name="_Toc242217249"/>
       <w:r>
         <w:lastRenderedPageBreak/>
         <w:t>Colab execution evidence</w:t>
       </w:r>
-      <w:bookmarkEnd w:id="37"/>
+      <w:bookmarkEnd w:id="44"/>
     </w:p>
     <w:p>
       <w:pPr>
@@ -4502,7 +5266,7 @@
           <w:noProof/>
         </w:rPr>
         <w:drawing>
-          <wp:inline distT="0" distB="0" distL="0" distR="0" wp14:anchorId="01D9F7BB" wp14:editId="22016E44">
+          <wp:inline distT="0" distB="0" distL="0" distR="0" wp14:anchorId="1F8CEA4E" wp14:editId="7C057CF6">
             <wp:extent cx="5250887" cy="4892040"/>
             <wp:effectExtent l="0" t="0" r="0" b="0"/>
             <wp:docPr id="8" name="Picture 8" descr="Figure 8. Task 04 single-image CUDA execution in Google Colab."/>
@@ -4543,9 +5307,22 @@
         <w:pStyle w:val="Caption"/>
         <w:keepNext/>
       </w:pPr>
-      <w:r>
-        <w:t>Figure 8. Task 04 single-image CUDA execution in Google Colab.</w:t>
-      </w:r>
+      <w:bookmarkStart w:id="45" w:name="_Toc242217260"/>
+      <w:r>
+        <w:t xml:space="preserve">Figure </w:t>
+      </w:r>
+      <w:fldSimple w:instr=" SEQ Figure \* ARABIC ">
+        <w:r>
+          <w:rPr>
+            <w:noProof/>
+          </w:rPr>
+          <w:t>8</w:t>
+        </w:r>
+      </w:fldSimple>
+      <w:r>
+        <w:t>. Task 04 single-image CUDA execution in Google Colab.</w:t>
+      </w:r>
+      <w:bookmarkEnd w:id="45"/>
     </w:p>
     <w:p>
       <w:r>
@@ -4557,12 +5334,12 @@
         <w:pStyle w:val="Heading2"/>
         <w:pageBreakBefore/>
       </w:pPr>
-      <w:bookmarkStart w:id="38" w:name="_Toc242194289"/>
+      <w:bookmarkStart w:id="46" w:name="_Toc242217250"/>
       <w:r>
         <w:lastRenderedPageBreak/>
         <w:t>Task 04 image outputs</w:t>
       </w:r>
-      <w:bookmarkEnd w:id="38"/>
+      <w:bookmarkEnd w:id="46"/>
     </w:p>
     <w:p>
       <w:pPr>
@@ -4574,7 +5351,7 @@
           <w:noProof/>
         </w:rPr>
         <w:drawing>
-          <wp:inline distT="0" distB="0" distL="0" distR="0" wp14:anchorId="2BEFFC6D" wp14:editId="30B3A449">
+          <wp:inline distT="0" distB="0" distL="0" distR="0" wp14:anchorId="7997F1C5" wp14:editId="552319A9">
             <wp:extent cx="6217920" cy="5274668"/>
             <wp:effectExtent l="0" t="0" r="0" b="0"/>
             <wp:docPr id="9" name="Picture 9" descr="Figure 9. Four views of the same download.png input displayed in Google Colab."/>
@@ -4615,16 +5392,26 @@
         <w:pStyle w:val="Caption"/>
         <w:keepNext/>
       </w:pPr>
-      <w:r>
-        <w:t>Figure 9. Four views of the same download.png input displayed in Google Colab.</w:t>
-      </w:r>
-    </w:p>
-    <w:p>
-      <w:r>
-        <w:t>The upper-left panel is the original colour image. The upper-right panel displays the absolute X gradient, which responds to left-right intensity changes; the lower-left displays the absolute Y gradient, which responds to top-bottom changes. The lower-right panel is the combined Sobel magnitude. Each map is calculated by the CUDA kernel from the same original pixels. Display values are clamped to 255, while the final magnitude uses the signed, unclipped Gx and Gy sums. All four views retain the 300x300 imag</w:t>
-      </w:r>
-      <w:r>
-        <w:t>e dimensions.</w:t>
+      <w:bookmarkStart w:id="47" w:name="_Toc242217261"/>
+      <w:r>
+        <w:t xml:space="preserve">Figure </w:t>
+      </w:r>
+      <w:fldSimple w:instr=" SEQ Figure \* ARABIC ">
+        <w:r>
+          <w:rPr>
+            <w:noProof/>
+          </w:rPr>
+          <w:t>9</w:t>
+        </w:r>
+      </w:fldSimple>
+      <w:r>
+        <w:t>. Four views of the same download.png input displayed in Google Colab.</w:t>
+      </w:r>
+      <w:bookmarkEnd w:id="47"/>
+    </w:p>
+    <w:p>
+      <w:r>
+        <w:t>The upper-left panel is the original colour image. The upper-right panel displays the absolute X gradient, which responds to left-right intensity changes; the lower-left displays the absolute Y gradient, which responds to top-bottom changes. The lower-right panel is the combined Sobel magnitude. Each map is calculated by the CUDA kernel from the same original pixels. Display values are clamped to 255, while the final magnitude uses the signed, unclipped Gx and Gy sums. All four views retain the 300x300 image dimensions.</w:t>
       </w:r>
     </w:p>
     <w:p>
@@ -4632,12 +5419,12 @@
         <w:pStyle w:val="Heading1"/>
         <w:pageBreakBefore/>
       </w:pPr>
-      <w:bookmarkStart w:id="39" w:name="_Toc242194290"/>
+      <w:bookmarkStart w:id="48" w:name="_Toc242217251"/>
       <w:r>
         <w:lastRenderedPageBreak/>
         <w:t>Evidence and submission</w:t>
       </w:r>
-      <w:bookmarkEnd w:id="39"/>
+      <w:bookmarkEnd w:id="48"/>
     </w:p>
     <w:p>
       <w:r>
@@ -4651,18 +5438,18 @@
     </w:p>
     <w:p>
       <w:r>
-        <w:t>Each task is packaged separately with its C or CUDA source, notebook and resources. A complete portfolio archive also contains this report, the viva guide and all four task folders. Video evidence is kept locally in the evidence directory; large recording files are excluded from Git history.</w:t>
+        <w:t>Each task is packaged separately with its C or CUDA source, notebook and resources. A complete portfolio archive also contains this report and all four task folders. Video evidence is kept locally in the evidence directory; large recording files are excluded from Git history.</w:t>
       </w:r>
     </w:p>
     <w:p>
       <w:pPr>
         <w:pStyle w:val="Heading1"/>
       </w:pPr>
-      <w:bookmarkStart w:id="40" w:name="_Toc242194291"/>
+      <w:bookmarkStart w:id="49" w:name="_Toc242217252"/>
       <w:r>
         <w:t>References</w:t>
       </w:r>
-      <w:bookmarkEnd w:id="40"/>
+      <w:bookmarkEnd w:id="49"/>
     </w:p>
     <w:p>
       <w:r>
@@ -5003,31 +5790,31 @@
       </w:rPr>
     </w:lvl>
   </w:abstractNum>
-  <w:num w:numId="1" w16cid:durableId="1824544447">
+  <w:num w:numId="1" w16cid:durableId="359598881">
     <w:abstractNumId w:val="8"/>
   </w:num>
-  <w:num w:numId="2" w16cid:durableId="120462017">
+  <w:num w:numId="2" w16cid:durableId="825821402">
     <w:abstractNumId w:val="6"/>
   </w:num>
-  <w:num w:numId="3" w16cid:durableId="1564680215">
+  <w:num w:numId="3" w16cid:durableId="27998067">
     <w:abstractNumId w:val="5"/>
   </w:num>
-  <w:num w:numId="4" w16cid:durableId="270750898">
+  <w:num w:numId="4" w16cid:durableId="1100760886">
     <w:abstractNumId w:val="4"/>
   </w:num>
-  <w:num w:numId="5" w16cid:durableId="633877274">
+  <w:num w:numId="5" w16cid:durableId="603541976">
     <w:abstractNumId w:val="7"/>
   </w:num>
-  <w:num w:numId="6" w16cid:durableId="54856227">
+  <w:num w:numId="6" w16cid:durableId="164709869">
     <w:abstractNumId w:val="3"/>
   </w:num>
-  <w:num w:numId="7" w16cid:durableId="1656907482">
+  <w:num w:numId="7" w16cid:durableId="136652107">
     <w:abstractNumId w:val="2"/>
   </w:num>
-  <w:num w:numId="8" w16cid:durableId="115485190">
+  <w:num w:numId="8" w16cid:durableId="66803525">
     <w:abstractNumId w:val="1"/>
   </w:num>
-  <w:num w:numId="9" w16cid:durableId="1883512484">
+  <w:num w:numId="9" w16cid:durableId="489370559">
     <w:abstractNumId w:val="0"/>
   </w:num>
 </w:numbering>
@@ -16619,6 +17406,13 @@
       <w:ind w:left="288"/>
     </w:pPr>
   </w:style>
+  <w:style w:type="paragraph" w:customStyle="1" w:styleId="TableofFigures1">
+    <w:name w:val="Table of Figures1"/>
+    <w:basedOn w:val="Normal"/>
+    <w:pPr>
+      <w:spacing w:after="160"/>
+    </w:pPr>
+  </w:style>
   <w:style w:type="paragraph" w:styleId="TOC1">
     <w:name w:val="toc 1"/>
     <w:basedOn w:val="Normal"/>
@@ -16626,7 +17420,7 @@
     <w:autoRedefine/>
     <w:uiPriority w:val="39"/>
     <w:unhideWhenUsed/>
-    <w:rsid w:val="00215C37"/>
+    <w:rsid w:val="00C01FB6"/>
     <w:pPr>
       <w:spacing w:after="100"/>
     </w:pPr>
@@ -16638,7 +17432,7 @@
     <w:autoRedefine/>
     <w:uiPriority w:val="39"/>
     <w:unhideWhenUsed/>
-    <w:rsid w:val="00215C37"/>
+    <w:rsid w:val="00C01FB6"/>
     <w:pPr>
       <w:spacing w:after="100"/>
       <w:ind w:left="240"/>
@@ -16649,11 +17443,22 @@
     <w:basedOn w:val="DefaultParagraphFont"/>
     <w:uiPriority w:val="99"/>
     <w:unhideWhenUsed/>
-    <w:rsid w:val="00215C37"/>
+    <w:rsid w:val="00C01FB6"/>
     <w:rPr>
       <w:color w:val="0000FF" w:themeColor="hyperlink"/>
       <w:u w:val="single"/>
     </w:rPr>
+  </w:style>
+  <w:style w:type="paragraph" w:styleId="TableofFigures">
+    <w:name w:val="table of figures"/>
+    <w:basedOn w:val="Normal"/>
+    <w:next w:val="Normal"/>
+    <w:uiPriority w:val="99"/>
+    <w:unhideWhenUsed/>
+    <w:rsid w:val="00C01FB6"/>
+    <w:pPr>
+      <w:spacing w:after="0"/>
+    </w:pPr>
   </w:style>
 </w:styles>
 </file>

</xml_diff>

<commit_message>
Publish assignment downloads and public access instructions
</commit_message>
<xml_diff>
--- a/2638120_Thaslim_Mohammed_Sahl_High_Performance_Computing.docx
+++ b/2638120_Thaslim_Mohammed_Sahl_High_Performance_Computing.docx
@@ -70,7 +70,7 @@
       <w:r>
         <w:fldChar w:fldCharType="separate"/>
       </w:r>
-      <w:hyperlink w:anchor="_Toc242217212" w:history="1">
+      <w:hyperlink w:anchor="_Toc242223207" w:history="1">
         <w:r>
           <w:rPr>
             <w:rStyle w:val="Hyperlink"/>
@@ -97,7 +97,7 @@
             <w:noProof/>
             <w:webHidden/>
           </w:rPr>
-          <w:instrText xml:space="preserve"> PAGEREF _Toc242217212 \h </w:instrText>
+          <w:instrText xml:space="preserve"> PAGEREF _Toc242223207 \h </w:instrText>
         </w:r>
         <w:r>
           <w:rPr>
@@ -142,7 +142,7 @@
           <w14:ligatures w14:val="standardContextual"/>
         </w:rPr>
       </w:pPr>
-      <w:hyperlink w:anchor="_Toc242217213" w:history="1">
+      <w:hyperlink w:anchor="_Toc242223208" w:history="1">
         <w:r>
           <w:rPr>
             <w:rStyle w:val="Hyperlink"/>
@@ -169,7 +169,7 @@
             <w:noProof/>
             <w:webHidden/>
           </w:rPr>
-          <w:instrText xml:space="preserve"> PAGEREF _Toc242217213 \h </w:instrText>
+          <w:instrText xml:space="preserve"> PAGEREF _Toc242223208 \h </w:instrText>
         </w:r>
         <w:r>
           <w:rPr>
@@ -214,7 +214,7 @@
           <w14:ligatures w14:val="standardContextual"/>
         </w:rPr>
       </w:pPr>
-      <w:hyperlink w:anchor="_Toc242217214" w:history="1">
+      <w:hyperlink w:anchor="_Toc242223209" w:history="1">
         <w:r>
           <w:rPr>
             <w:rStyle w:val="Hyperlink"/>
@@ -241,7 +241,7 @@
             <w:noProof/>
             <w:webHidden/>
           </w:rPr>
-          <w:instrText xml:space="preserve"> PAGEREF _Toc242217214 \h </w:instrText>
+          <w:instrText xml:space="preserve"> PAGEREF _Toc242223209 \h </w:instrText>
         </w:r>
         <w:r>
           <w:rPr>
@@ -286,7 +286,7 @@
           <w14:ligatures w14:val="standardContextual"/>
         </w:rPr>
       </w:pPr>
-      <w:hyperlink w:anchor="_Toc242217215" w:history="1">
+      <w:hyperlink w:anchor="_Toc242223210" w:history="1">
         <w:r>
           <w:rPr>
             <w:rStyle w:val="Hyperlink"/>
@@ -313,7 +313,7 @@
             <w:noProof/>
             <w:webHidden/>
           </w:rPr>
-          <w:instrText xml:space="preserve"> PAGEREF _Toc242217215 \h </w:instrText>
+          <w:instrText xml:space="preserve"> PAGEREF _Toc242223210 \h </w:instrText>
         </w:r>
         <w:r>
           <w:rPr>
@@ -358,7 +358,7 @@
           <w14:ligatures w14:val="standardContextual"/>
         </w:rPr>
       </w:pPr>
-      <w:hyperlink w:anchor="_Toc242217216" w:history="1">
+      <w:hyperlink w:anchor="_Toc242223211" w:history="1">
         <w:r>
           <w:rPr>
             <w:rStyle w:val="Hyperlink"/>
@@ -385,7 +385,7 @@
             <w:noProof/>
             <w:webHidden/>
           </w:rPr>
-          <w:instrText xml:space="preserve"> PAGEREF _Toc242217216 \h </w:instrText>
+          <w:instrText xml:space="preserve"> PAGEREF _Toc242223211 \h </w:instrText>
         </w:r>
         <w:r>
           <w:rPr>
@@ -430,7 +430,7 @@
           <w14:ligatures w14:val="standardContextual"/>
         </w:rPr>
       </w:pPr>
-      <w:hyperlink w:anchor="_Toc242217217" w:history="1">
+      <w:hyperlink w:anchor="_Toc242223212" w:history="1">
         <w:r>
           <w:rPr>
             <w:rStyle w:val="Hyperlink"/>
@@ -457,7 +457,7 @@
             <w:noProof/>
             <w:webHidden/>
           </w:rPr>
-          <w:instrText xml:space="preserve"> PAGEREF _Toc242217217 \h </w:instrText>
+          <w:instrText xml:space="preserve"> PAGEREF _Toc242223212 \h </w:instrText>
         </w:r>
         <w:r>
           <w:rPr>
@@ -502,7 +502,7 @@
           <w14:ligatures w14:val="standardContextual"/>
         </w:rPr>
       </w:pPr>
-      <w:hyperlink w:anchor="_Toc242217218" w:history="1">
+      <w:hyperlink w:anchor="_Toc242223213" w:history="1">
         <w:r>
           <w:rPr>
             <w:rStyle w:val="Hyperlink"/>
@@ -529,7 +529,7 @@
             <w:noProof/>
             <w:webHidden/>
           </w:rPr>
-          <w:instrText xml:space="preserve"> PAGEREF _Toc242217218 \h </w:instrText>
+          <w:instrText xml:space="preserve"> PAGEREF _Toc242223213 \h </w:instrText>
         </w:r>
         <w:r>
           <w:rPr>
@@ -574,7 +574,7 @@
           <w14:ligatures w14:val="standardContextual"/>
         </w:rPr>
       </w:pPr>
-      <w:hyperlink w:anchor="_Toc242217219" w:history="1">
+      <w:hyperlink w:anchor="_Toc242223214" w:history="1">
         <w:r>
           <w:rPr>
             <w:rStyle w:val="Hyperlink"/>
@@ -601,7 +601,7 @@
             <w:noProof/>
             <w:webHidden/>
           </w:rPr>
-          <w:instrText xml:space="preserve"> PAGEREF _Toc242217219 \h </w:instrText>
+          <w:instrText xml:space="preserve"> PAGEREF _Toc242223214 \h </w:instrText>
         </w:r>
         <w:r>
           <w:rPr>
@@ -646,7 +646,7 @@
           <w14:ligatures w14:val="standardContextual"/>
         </w:rPr>
       </w:pPr>
-      <w:hyperlink w:anchor="_Toc242217220" w:history="1">
+      <w:hyperlink w:anchor="_Toc242223215" w:history="1">
         <w:r>
           <w:rPr>
             <w:rStyle w:val="Hyperlink"/>
@@ -673,7 +673,7 @@
             <w:noProof/>
             <w:webHidden/>
           </w:rPr>
-          <w:instrText xml:space="preserve"> PAGEREF _Toc242217220 \h </w:instrText>
+          <w:instrText xml:space="preserve"> PAGEREF _Toc242223215 \h </w:instrText>
         </w:r>
         <w:r>
           <w:rPr>
@@ -718,7 +718,7 @@
           <w14:ligatures w14:val="standardContextual"/>
         </w:rPr>
       </w:pPr>
-      <w:hyperlink w:anchor="_Toc242217221" w:history="1">
+      <w:hyperlink w:anchor="_Toc242223216" w:history="1">
         <w:r>
           <w:rPr>
             <w:rStyle w:val="Hyperlink"/>
@@ -745,7 +745,7 @@
             <w:noProof/>
             <w:webHidden/>
           </w:rPr>
-          <w:instrText xml:space="preserve"> PAGEREF _Toc242217221 \h </w:instrText>
+          <w:instrText xml:space="preserve"> PAGEREF _Toc242223216 \h </w:instrText>
         </w:r>
         <w:r>
           <w:rPr>
@@ -790,7 +790,7 @@
           <w14:ligatures w14:val="standardContextual"/>
         </w:rPr>
       </w:pPr>
-      <w:hyperlink w:anchor="_Toc242217222" w:history="1">
+      <w:hyperlink w:anchor="_Toc242223217" w:history="1">
         <w:r>
           <w:rPr>
             <w:rStyle w:val="Hyperlink"/>
@@ -817,7 +817,7 @@
             <w:noProof/>
             <w:webHidden/>
           </w:rPr>
-          <w:instrText xml:space="preserve"> PAGEREF _Toc242217222 \h </w:instrText>
+          <w:instrText xml:space="preserve"> PAGEREF _Toc242223217 \h </w:instrText>
         </w:r>
         <w:r>
           <w:rPr>
@@ -862,7 +862,7 @@
           <w14:ligatures w14:val="standardContextual"/>
         </w:rPr>
       </w:pPr>
-      <w:hyperlink w:anchor="_Toc242217223" w:history="1">
+      <w:hyperlink w:anchor="_Toc242223218" w:history="1">
         <w:r>
           <w:rPr>
             <w:rStyle w:val="Hyperlink"/>
@@ -889,7 +889,7 @@
             <w:noProof/>
             <w:webHidden/>
           </w:rPr>
-          <w:instrText xml:space="preserve"> PAGEREF _Toc242217223 \h </w:instrText>
+          <w:instrText xml:space="preserve"> PAGEREF _Toc242223218 \h </w:instrText>
         </w:r>
         <w:r>
           <w:rPr>
@@ -934,7 +934,7 @@
           <w14:ligatures w14:val="standardContextual"/>
         </w:rPr>
       </w:pPr>
-      <w:hyperlink w:anchor="_Toc242217224" w:history="1">
+      <w:hyperlink w:anchor="_Toc242223219" w:history="1">
         <w:r>
           <w:rPr>
             <w:rStyle w:val="Hyperlink"/>
@@ -961,7 +961,7 @@
             <w:noProof/>
             <w:webHidden/>
           </w:rPr>
-          <w:instrText xml:space="preserve"> PAGEREF _Toc242217224 \h </w:instrText>
+          <w:instrText xml:space="preserve"> PAGEREF _Toc242223219 \h </w:instrText>
         </w:r>
         <w:r>
           <w:rPr>
@@ -1006,7 +1006,7 @@
           <w14:ligatures w14:val="standardContextual"/>
         </w:rPr>
       </w:pPr>
-      <w:hyperlink w:anchor="_Toc242217225" w:history="1">
+      <w:hyperlink w:anchor="_Toc242223220" w:history="1">
         <w:r>
           <w:rPr>
             <w:rStyle w:val="Hyperlink"/>
@@ -1033,7 +1033,7 @@
             <w:noProof/>
             <w:webHidden/>
           </w:rPr>
-          <w:instrText xml:space="preserve"> PAGEREF _Toc242217225 \h </w:instrText>
+          <w:instrText xml:space="preserve"> PAGEREF _Toc242223220 \h </w:instrText>
         </w:r>
         <w:r>
           <w:rPr>
@@ -1078,7 +1078,7 @@
           <w14:ligatures w14:val="standardContextual"/>
         </w:rPr>
       </w:pPr>
-      <w:hyperlink w:anchor="_Toc242217226" w:history="1">
+      <w:hyperlink w:anchor="_Toc242223221" w:history="1">
         <w:r>
           <w:rPr>
             <w:rStyle w:val="Hyperlink"/>
@@ -1105,7 +1105,7 @@
             <w:noProof/>
             <w:webHidden/>
           </w:rPr>
-          <w:instrText xml:space="preserve"> PAGEREF _Toc242217226 \h </w:instrText>
+          <w:instrText xml:space="preserve"> PAGEREF _Toc242223221 \h </w:instrText>
         </w:r>
         <w:r>
           <w:rPr>
@@ -1150,7 +1150,7 @@
           <w14:ligatures w14:val="standardContextual"/>
         </w:rPr>
       </w:pPr>
-      <w:hyperlink w:anchor="_Toc242217227" w:history="1">
+      <w:hyperlink w:anchor="_Toc242223222" w:history="1">
         <w:r>
           <w:rPr>
             <w:rStyle w:val="Hyperlink"/>
@@ -1177,7 +1177,7 @@
             <w:noProof/>
             <w:webHidden/>
           </w:rPr>
-          <w:instrText xml:space="preserve"> PAGEREF _Toc242217227 \h </w:instrText>
+          <w:instrText xml:space="preserve"> PAGEREF _Toc242223222 \h </w:instrText>
         </w:r>
         <w:r>
           <w:rPr>
@@ -1222,7 +1222,7 @@
           <w14:ligatures w14:val="standardContextual"/>
         </w:rPr>
       </w:pPr>
-      <w:hyperlink w:anchor="_Toc242217228" w:history="1">
+      <w:hyperlink w:anchor="_Toc242223223" w:history="1">
         <w:r>
           <w:rPr>
             <w:rStyle w:val="Hyperlink"/>
@@ -1249,7 +1249,7 @@
             <w:noProof/>
             <w:webHidden/>
           </w:rPr>
-          <w:instrText xml:space="preserve"> PAGEREF _Toc242217228 \h </w:instrText>
+          <w:instrText xml:space="preserve"> PAGEREF _Toc242223223 \h </w:instrText>
         </w:r>
         <w:r>
           <w:rPr>
@@ -1294,7 +1294,7 @@
           <w14:ligatures w14:val="standardContextual"/>
         </w:rPr>
       </w:pPr>
-      <w:hyperlink w:anchor="_Toc242217229" w:history="1">
+      <w:hyperlink w:anchor="_Toc242223224" w:history="1">
         <w:r>
           <w:rPr>
             <w:rStyle w:val="Hyperlink"/>
@@ -1321,7 +1321,7 @@
             <w:noProof/>
             <w:webHidden/>
           </w:rPr>
-          <w:instrText xml:space="preserve"> PAGEREF _Toc242217229 \h </w:instrText>
+          <w:instrText xml:space="preserve"> PAGEREF _Toc242223224 \h </w:instrText>
         </w:r>
         <w:r>
           <w:rPr>
@@ -1366,7 +1366,7 @@
           <w14:ligatures w14:val="standardContextual"/>
         </w:rPr>
       </w:pPr>
-      <w:hyperlink w:anchor="_Toc242217230" w:history="1">
+      <w:hyperlink w:anchor="_Toc242223225" w:history="1">
         <w:r>
           <w:rPr>
             <w:rStyle w:val="Hyperlink"/>
@@ -1393,7 +1393,7 @@
             <w:noProof/>
             <w:webHidden/>
           </w:rPr>
-          <w:instrText xml:space="preserve"> PAGEREF _Toc242217230 \h </w:instrText>
+          <w:instrText xml:space="preserve"> PAGEREF _Toc242223225 \h </w:instrText>
         </w:r>
         <w:r>
           <w:rPr>
@@ -1438,7 +1438,7 @@
           <w14:ligatures w14:val="standardContextual"/>
         </w:rPr>
       </w:pPr>
-      <w:hyperlink w:anchor="_Toc242217231" w:history="1">
+      <w:hyperlink w:anchor="_Toc242223226" w:history="1">
         <w:r>
           <w:rPr>
             <w:rStyle w:val="Hyperlink"/>
@@ -1465,7 +1465,7 @@
             <w:noProof/>
             <w:webHidden/>
           </w:rPr>
-          <w:instrText xml:space="preserve"> PAGEREF _Toc242217231 \h </w:instrText>
+          <w:instrText xml:space="preserve"> PAGEREF _Toc242223226 \h </w:instrText>
         </w:r>
         <w:r>
           <w:rPr>
@@ -1510,7 +1510,7 @@
           <w14:ligatures w14:val="standardContextual"/>
         </w:rPr>
       </w:pPr>
-      <w:hyperlink w:anchor="_Toc242217232" w:history="1">
+      <w:hyperlink w:anchor="_Toc242223227" w:history="1">
         <w:r>
           <w:rPr>
             <w:rStyle w:val="Hyperlink"/>
@@ -1537,7 +1537,7 @@
             <w:noProof/>
             <w:webHidden/>
           </w:rPr>
-          <w:instrText xml:space="preserve"> PAGEREF _Toc242217232 \h </w:instrText>
+          <w:instrText xml:space="preserve"> PAGEREF _Toc242223227 \h </w:instrText>
         </w:r>
         <w:r>
           <w:rPr>
@@ -1582,7 +1582,7 @@
           <w14:ligatures w14:val="standardContextual"/>
         </w:rPr>
       </w:pPr>
-      <w:hyperlink w:anchor="_Toc242217233" w:history="1">
+      <w:hyperlink w:anchor="_Toc242223228" w:history="1">
         <w:r>
           <w:rPr>
             <w:rStyle w:val="Hyperlink"/>
@@ -1609,7 +1609,7 @@
             <w:noProof/>
             <w:webHidden/>
           </w:rPr>
-          <w:instrText xml:space="preserve"> PAGEREF _Toc242217233 \h </w:instrText>
+          <w:instrText xml:space="preserve"> PAGEREF _Toc242223228 \h </w:instrText>
         </w:r>
         <w:r>
           <w:rPr>
@@ -1654,7 +1654,7 @@
           <w14:ligatures w14:val="standardContextual"/>
         </w:rPr>
       </w:pPr>
-      <w:hyperlink w:anchor="_Toc242217234" w:history="1">
+      <w:hyperlink w:anchor="_Toc242223229" w:history="1">
         <w:r>
           <w:rPr>
             <w:rStyle w:val="Hyperlink"/>
@@ -1681,7 +1681,7 @@
             <w:noProof/>
             <w:webHidden/>
           </w:rPr>
-          <w:instrText xml:space="preserve"> PAGEREF _Toc242217234 \h </w:instrText>
+          <w:instrText xml:space="preserve"> PAGEREF _Toc242223229 \h </w:instrText>
         </w:r>
         <w:r>
           <w:rPr>
@@ -1726,7 +1726,7 @@
           <w14:ligatures w14:val="standardContextual"/>
         </w:rPr>
       </w:pPr>
-      <w:hyperlink w:anchor="_Toc242217235" w:history="1">
+      <w:hyperlink w:anchor="_Toc242223230" w:history="1">
         <w:r>
           <w:rPr>
             <w:rStyle w:val="Hyperlink"/>
@@ -1753,7 +1753,7 @@
             <w:noProof/>
             <w:webHidden/>
           </w:rPr>
-          <w:instrText xml:space="preserve"> PAGEREF _Toc242217235 \h </w:instrText>
+          <w:instrText xml:space="preserve"> PAGEREF _Toc242223230 \h </w:instrText>
         </w:r>
         <w:r>
           <w:rPr>
@@ -1798,7 +1798,7 @@
           <w14:ligatures w14:val="standardContextual"/>
         </w:rPr>
       </w:pPr>
-      <w:hyperlink w:anchor="_Toc242217236" w:history="1">
+      <w:hyperlink w:anchor="_Toc242223231" w:history="1">
         <w:r>
           <w:rPr>
             <w:rStyle w:val="Hyperlink"/>
@@ -1825,7 +1825,7 @@
             <w:noProof/>
             <w:webHidden/>
           </w:rPr>
-          <w:instrText xml:space="preserve"> PAGEREF _Toc242217236 \h </w:instrText>
+          <w:instrText xml:space="preserve"> PAGEREF _Toc242223231 \h </w:instrText>
         </w:r>
         <w:r>
           <w:rPr>
@@ -1870,7 +1870,7 @@
           <w14:ligatures w14:val="standardContextual"/>
         </w:rPr>
       </w:pPr>
-      <w:hyperlink w:anchor="_Toc242217237" w:history="1">
+      <w:hyperlink w:anchor="_Toc242223232" w:history="1">
         <w:r>
           <w:rPr>
             <w:rStyle w:val="Hyperlink"/>
@@ -1897,7 +1897,7 @@
             <w:noProof/>
             <w:webHidden/>
           </w:rPr>
-          <w:instrText xml:space="preserve"> PAGEREF _Toc242217237 \h </w:instrText>
+          <w:instrText xml:space="preserve"> PAGEREF _Toc242223232 \h </w:instrText>
         </w:r>
         <w:r>
           <w:rPr>
@@ -1942,7 +1942,7 @@
           <w14:ligatures w14:val="standardContextual"/>
         </w:rPr>
       </w:pPr>
-      <w:hyperlink w:anchor="_Toc242217238" w:history="1">
+      <w:hyperlink w:anchor="_Toc242223233" w:history="1">
         <w:r>
           <w:rPr>
             <w:rStyle w:val="Hyperlink"/>
@@ -1969,7 +1969,7 @@
             <w:noProof/>
             <w:webHidden/>
           </w:rPr>
-          <w:instrText xml:space="preserve"> PAGEREF _Toc242217238 \h </w:instrText>
+          <w:instrText xml:space="preserve"> PAGEREF _Toc242223233 \h </w:instrText>
         </w:r>
         <w:r>
           <w:rPr>
@@ -2014,7 +2014,7 @@
           <w14:ligatures w14:val="standardContextual"/>
         </w:rPr>
       </w:pPr>
-      <w:hyperlink w:anchor="_Toc242217239" w:history="1">
+      <w:hyperlink w:anchor="_Toc242223234" w:history="1">
         <w:r>
           <w:rPr>
             <w:rStyle w:val="Hyperlink"/>
@@ -2041,7 +2041,7 @@
             <w:noProof/>
             <w:webHidden/>
           </w:rPr>
-          <w:instrText xml:space="preserve"> PAGEREF _Toc242217239 \h </w:instrText>
+          <w:instrText xml:space="preserve"> PAGEREF _Toc242223234 \h </w:instrText>
         </w:r>
         <w:r>
           <w:rPr>
@@ -2086,7 +2086,7 @@
           <w14:ligatures w14:val="standardContextual"/>
         </w:rPr>
       </w:pPr>
-      <w:hyperlink w:anchor="_Toc242217240" w:history="1">
+      <w:hyperlink w:anchor="_Toc242223235" w:history="1">
         <w:r>
           <w:rPr>
             <w:rStyle w:val="Hyperlink"/>
@@ -2113,7 +2113,7 @@
             <w:noProof/>
             <w:webHidden/>
           </w:rPr>
-          <w:instrText xml:space="preserve"> PAGEREF _Toc242217240 \h </w:instrText>
+          <w:instrText xml:space="preserve"> PAGEREF _Toc242223235 \h </w:instrText>
         </w:r>
         <w:r>
           <w:rPr>
@@ -2158,7 +2158,7 @@
           <w14:ligatures w14:val="standardContextual"/>
         </w:rPr>
       </w:pPr>
-      <w:hyperlink w:anchor="_Toc242217241" w:history="1">
+      <w:hyperlink w:anchor="_Toc242223236" w:history="1">
         <w:r>
           <w:rPr>
             <w:rStyle w:val="Hyperlink"/>
@@ -2185,7 +2185,7 @@
             <w:noProof/>
             <w:webHidden/>
           </w:rPr>
-          <w:instrText xml:space="preserve"> PAGEREF _Toc242217241 \h </w:instrText>
+          <w:instrText xml:space="preserve"> PAGEREF _Toc242223236 \h </w:instrText>
         </w:r>
         <w:r>
           <w:rPr>
@@ -2230,7 +2230,7 @@
           <w14:ligatures w14:val="standardContextual"/>
         </w:rPr>
       </w:pPr>
-      <w:hyperlink w:anchor="_Toc242217242" w:history="1">
+      <w:hyperlink w:anchor="_Toc242223237" w:history="1">
         <w:r>
           <w:rPr>
             <w:rStyle w:val="Hyperlink"/>
@@ -2257,7 +2257,7 @@
             <w:noProof/>
             <w:webHidden/>
           </w:rPr>
-          <w:instrText xml:space="preserve"> PAGEREF _Toc242217242 \h </w:instrText>
+          <w:instrText xml:space="preserve"> PAGEREF _Toc242223237 \h </w:instrText>
         </w:r>
         <w:r>
           <w:rPr>
@@ -2302,7 +2302,7 @@
           <w14:ligatures w14:val="standardContextual"/>
         </w:rPr>
       </w:pPr>
-      <w:hyperlink w:anchor="_Toc242217243" w:history="1">
+      <w:hyperlink w:anchor="_Toc242223238" w:history="1">
         <w:r>
           <w:rPr>
             <w:rStyle w:val="Hyperlink"/>
@@ -2329,7 +2329,7 @@
             <w:noProof/>
             <w:webHidden/>
           </w:rPr>
-          <w:instrText xml:space="preserve"> PAGEREF _Toc242217243 \h </w:instrText>
+          <w:instrText xml:space="preserve"> PAGEREF _Toc242223238 \h </w:instrText>
         </w:r>
         <w:r>
           <w:rPr>
@@ -2374,7 +2374,7 @@
           <w14:ligatures w14:val="standardContextual"/>
         </w:rPr>
       </w:pPr>
-      <w:hyperlink w:anchor="_Toc242217244" w:history="1">
+      <w:hyperlink w:anchor="_Toc242223239" w:history="1">
         <w:r>
           <w:rPr>
             <w:rStyle w:val="Hyperlink"/>
@@ -2401,7 +2401,7 @@
             <w:noProof/>
             <w:webHidden/>
           </w:rPr>
-          <w:instrText xml:space="preserve"> PAGEREF _Toc242217244 \h </w:instrText>
+          <w:instrText xml:space="preserve"> PAGEREF _Toc242223239 \h </w:instrText>
         </w:r>
         <w:r>
           <w:rPr>
@@ -2446,7 +2446,7 @@
           <w14:ligatures w14:val="standardContextual"/>
         </w:rPr>
       </w:pPr>
-      <w:hyperlink w:anchor="_Toc242217245" w:history="1">
+      <w:hyperlink w:anchor="_Toc242223240" w:history="1">
         <w:r>
           <w:rPr>
             <w:rStyle w:val="Hyperlink"/>
@@ -2473,7 +2473,7 @@
             <w:noProof/>
             <w:webHidden/>
           </w:rPr>
-          <w:instrText xml:space="preserve"> PAGEREF _Toc242217245 \h </w:instrText>
+          <w:instrText xml:space="preserve"> PAGEREF _Toc242223240 \h </w:instrText>
         </w:r>
         <w:r>
           <w:rPr>
@@ -2518,7 +2518,7 @@
           <w14:ligatures w14:val="standardContextual"/>
         </w:rPr>
       </w:pPr>
-      <w:hyperlink w:anchor="_Toc242217246" w:history="1">
+      <w:hyperlink w:anchor="_Toc242223241" w:history="1">
         <w:r>
           <w:rPr>
             <w:rStyle w:val="Hyperlink"/>
@@ -2545,7 +2545,7 @@
             <w:noProof/>
             <w:webHidden/>
           </w:rPr>
-          <w:instrText xml:space="preserve"> PAGEREF _Toc242217246 \h </w:instrText>
+          <w:instrText xml:space="preserve"> PAGEREF _Toc242223241 \h </w:instrText>
         </w:r>
         <w:r>
           <w:rPr>
@@ -2590,7 +2590,7 @@
           <w14:ligatures w14:val="standardContextual"/>
         </w:rPr>
       </w:pPr>
-      <w:hyperlink w:anchor="_Toc242217247" w:history="1">
+      <w:hyperlink w:anchor="_Toc242223242" w:history="1">
         <w:r>
           <w:rPr>
             <w:rStyle w:val="Hyperlink"/>
@@ -2617,7 +2617,7 @@
             <w:noProof/>
             <w:webHidden/>
           </w:rPr>
-          <w:instrText xml:space="preserve"> PAGEREF _Toc242217247 \h </w:instrText>
+          <w:instrText xml:space="preserve"> PAGEREF _Toc242223242 \h </w:instrText>
         </w:r>
         <w:r>
           <w:rPr>
@@ -2662,7 +2662,7 @@
           <w14:ligatures w14:val="standardContextual"/>
         </w:rPr>
       </w:pPr>
-      <w:hyperlink w:anchor="_Toc242217248" w:history="1">
+      <w:hyperlink w:anchor="_Toc242223243" w:history="1">
         <w:r>
           <w:rPr>
             <w:rStyle w:val="Hyperlink"/>
@@ -2689,7 +2689,7 @@
             <w:noProof/>
             <w:webHidden/>
           </w:rPr>
-          <w:instrText xml:space="preserve"> PAGEREF _Toc242217248 \h </w:instrText>
+          <w:instrText xml:space="preserve"> PAGEREF _Toc242223243 \h </w:instrText>
         </w:r>
         <w:r>
           <w:rPr>
@@ -2734,7 +2734,7 @@
           <w14:ligatures w14:val="standardContextual"/>
         </w:rPr>
       </w:pPr>
-      <w:hyperlink w:anchor="_Toc242217249" w:history="1">
+      <w:hyperlink w:anchor="_Toc242223244" w:history="1">
         <w:r>
           <w:rPr>
             <w:rStyle w:val="Hyperlink"/>
@@ -2761,7 +2761,7 @@
             <w:noProof/>
             <w:webHidden/>
           </w:rPr>
-          <w:instrText xml:space="preserve"> PAGEREF _Toc242217249 \h </w:instrText>
+          <w:instrText xml:space="preserve"> PAGEREF _Toc242223244 \h </w:instrText>
         </w:r>
         <w:r>
           <w:rPr>
@@ -2806,7 +2806,7 @@
           <w14:ligatures w14:val="standardContextual"/>
         </w:rPr>
       </w:pPr>
-      <w:hyperlink w:anchor="_Toc242217250" w:history="1">
+      <w:hyperlink w:anchor="_Toc242223245" w:history="1">
         <w:r>
           <w:rPr>
             <w:rStyle w:val="Hyperlink"/>
@@ -2833,7 +2833,7 @@
             <w:noProof/>
             <w:webHidden/>
           </w:rPr>
-          <w:instrText xml:space="preserve"> PAGEREF _Toc242217250 \h </w:instrText>
+          <w:instrText xml:space="preserve"> PAGEREF _Toc242223245 \h </w:instrText>
         </w:r>
         <w:r>
           <w:rPr>
@@ -2878,7 +2878,7 @@
           <w14:ligatures w14:val="standardContextual"/>
         </w:rPr>
       </w:pPr>
-      <w:hyperlink w:anchor="_Toc242217251" w:history="1">
+      <w:hyperlink w:anchor="_Toc242223246" w:history="1">
         <w:r>
           <w:rPr>
             <w:rStyle w:val="Hyperlink"/>
@@ -2905,7 +2905,7 @@
             <w:noProof/>
             <w:webHidden/>
           </w:rPr>
-          <w:instrText xml:space="preserve"> PAGEREF _Toc242217251 \h </w:instrText>
+          <w:instrText xml:space="preserve"> PAGEREF _Toc242223246 \h </w:instrText>
         </w:r>
         <w:r>
           <w:rPr>
@@ -2950,7 +2950,7 @@
           <w14:ligatures w14:val="standardContextual"/>
         </w:rPr>
       </w:pPr>
-      <w:hyperlink w:anchor="_Toc242217252" w:history="1">
+      <w:hyperlink w:anchor="_Toc242223247" w:history="1">
         <w:r>
           <w:rPr>
             <w:rStyle w:val="Hyperlink"/>
@@ -2977,7 +2977,7 @@
             <w:noProof/>
             <w:webHidden/>
           </w:rPr>
-          <w:instrText xml:space="preserve"> PAGEREF _Toc242217252 \h </w:instrText>
+          <w:instrText xml:space="preserve"> PAGEREF _Toc242223247 \h </w:instrText>
         </w:r>
         <w:r>
           <w:rPr>
@@ -3050,7 +3050,7 @@
       <w:r>
         <w:fldChar w:fldCharType="separate"/>
       </w:r>
-      <w:hyperlink w:anchor="_Toc242217253" w:history="1">
+      <w:hyperlink w:anchor="_Toc242223248" w:history="1">
         <w:r>
           <w:rPr>
             <w:rStyle w:val="Hyperlink"/>
@@ -3077,7 +3077,7 @@
             <w:noProof/>
             <w:webHidden/>
           </w:rPr>
-          <w:instrText xml:space="preserve"> PAGEREF _Toc242217253 \h </w:instrText>
+          <w:instrText xml:space="preserve"> PAGEREF _Toc242223248 \h </w:instrText>
         </w:r>
         <w:r>
           <w:rPr>
@@ -3122,7 +3122,7 @@
           <w14:ligatures w14:val="standardContextual"/>
         </w:rPr>
       </w:pPr>
-      <w:hyperlink w:anchor="_Toc242217254" w:history="1">
+      <w:hyperlink w:anchor="_Toc242223249" w:history="1">
         <w:r>
           <w:rPr>
             <w:rStyle w:val="Hyperlink"/>
@@ -3149,7 +3149,7 @@
             <w:noProof/>
             <w:webHidden/>
           </w:rPr>
-          <w:instrText xml:space="preserve"> PAGEREF _Toc242217254 \h </w:instrText>
+          <w:instrText xml:space="preserve"> PAGEREF _Toc242223249 \h </w:instrText>
         </w:r>
         <w:r>
           <w:rPr>
@@ -3194,7 +3194,7 @@
           <w14:ligatures w14:val="standardContextual"/>
         </w:rPr>
       </w:pPr>
-      <w:hyperlink w:anchor="_Toc242217255" w:history="1">
+      <w:hyperlink w:anchor="_Toc242223250" w:history="1">
         <w:r>
           <w:rPr>
             <w:rStyle w:val="Hyperlink"/>
@@ -3221,7 +3221,7 @@
             <w:noProof/>
             <w:webHidden/>
           </w:rPr>
-          <w:instrText xml:space="preserve"> PAGEREF _Toc242217255 \h </w:instrText>
+          <w:instrText xml:space="preserve"> PAGEREF _Toc242223250 \h </w:instrText>
         </w:r>
         <w:r>
           <w:rPr>
@@ -3266,7 +3266,7 @@
           <w14:ligatures w14:val="standardContextual"/>
         </w:rPr>
       </w:pPr>
-      <w:hyperlink w:anchor="_Toc242217256" w:history="1">
+      <w:hyperlink w:anchor="_Toc242223251" w:history="1">
         <w:r>
           <w:rPr>
             <w:rStyle w:val="Hyperlink"/>
@@ -3293,7 +3293,7 @@
             <w:noProof/>
             <w:webHidden/>
           </w:rPr>
-          <w:instrText xml:space="preserve"> PAGEREF _Toc242217256 \h </w:instrText>
+          <w:instrText xml:space="preserve"> PAGEREF _Toc242223251 \h </w:instrText>
         </w:r>
         <w:r>
           <w:rPr>
@@ -3338,7 +3338,7 @@
           <w14:ligatures w14:val="standardContextual"/>
         </w:rPr>
       </w:pPr>
-      <w:hyperlink w:anchor="_Toc242217257" w:history="1">
+      <w:hyperlink w:anchor="_Toc242223252" w:history="1">
         <w:r>
           <w:rPr>
             <w:rStyle w:val="Hyperlink"/>
@@ -3365,7 +3365,7 @@
             <w:noProof/>
             <w:webHidden/>
           </w:rPr>
-          <w:instrText xml:space="preserve"> PAGEREF _Toc242217257 \h </w:instrText>
+          <w:instrText xml:space="preserve"> PAGEREF _Toc242223252 \h </w:instrText>
         </w:r>
         <w:r>
           <w:rPr>
@@ -3410,7 +3410,7 @@
           <w14:ligatures w14:val="standardContextual"/>
         </w:rPr>
       </w:pPr>
-      <w:hyperlink w:anchor="_Toc242217258" w:history="1">
+      <w:hyperlink w:anchor="_Toc242223253" w:history="1">
         <w:r>
           <w:rPr>
             <w:rStyle w:val="Hyperlink"/>
@@ -3437,7 +3437,7 @@
             <w:noProof/>
             <w:webHidden/>
           </w:rPr>
-          <w:instrText xml:space="preserve"> PAGEREF _Toc242217258 \h </w:instrText>
+          <w:instrText xml:space="preserve"> PAGEREF _Toc242223253 \h </w:instrText>
         </w:r>
         <w:r>
           <w:rPr>
@@ -3482,7 +3482,7 @@
           <w14:ligatures w14:val="standardContextual"/>
         </w:rPr>
       </w:pPr>
-      <w:hyperlink w:anchor="_Toc242217259" w:history="1">
+      <w:hyperlink w:anchor="_Toc242223254" w:history="1">
         <w:r>
           <w:rPr>
             <w:rStyle w:val="Hyperlink"/>
@@ -3509,7 +3509,7 @@
             <w:noProof/>
             <w:webHidden/>
           </w:rPr>
-          <w:instrText xml:space="preserve"> PAGEREF _Toc242217259 \h </w:instrText>
+          <w:instrText xml:space="preserve"> PAGEREF _Toc242223254 \h </w:instrText>
         </w:r>
         <w:r>
           <w:rPr>
@@ -3554,7 +3554,7 @@
           <w14:ligatures w14:val="standardContextual"/>
         </w:rPr>
       </w:pPr>
-      <w:hyperlink w:anchor="_Toc242217260" w:history="1">
+      <w:hyperlink w:anchor="_Toc242223255" w:history="1">
         <w:r>
           <w:rPr>
             <w:rStyle w:val="Hyperlink"/>
@@ -3581,7 +3581,7 @@
             <w:noProof/>
             <w:webHidden/>
           </w:rPr>
-          <w:instrText xml:space="preserve"> PAGEREF _Toc242217260 \h </w:instrText>
+          <w:instrText xml:space="preserve"> PAGEREF _Toc242223255 \h </w:instrText>
         </w:r>
         <w:r>
           <w:rPr>
@@ -3626,7 +3626,7 @@
           <w14:ligatures w14:val="standardContextual"/>
         </w:rPr>
       </w:pPr>
-      <w:hyperlink w:anchor="_Toc242217261" w:history="1">
+      <w:hyperlink w:anchor="_Toc242223256" w:history="1">
         <w:r>
           <w:rPr>
             <w:rStyle w:val="Hyperlink"/>
@@ -3653,7 +3653,7 @@
             <w:noProof/>
             <w:webHidden/>
           </w:rPr>
-          <w:instrText xml:space="preserve"> PAGEREF _Toc242217261 \h </w:instrText>
+          <w:instrText xml:space="preserve"> PAGEREF _Toc242223256 \h </w:instrText>
         </w:r>
         <w:r>
           <w:rPr>
@@ -3698,7 +3698,7 @@
       <w:pPr>
         <w:pStyle w:val="Heading1"/>
       </w:pPr>
-      <w:bookmarkStart w:id="0" w:name="_Toc242217212"/>
+      <w:bookmarkStart w:id="0" w:name="_Toc242223207"/>
       <w:r>
         <w:lastRenderedPageBreak/>
         <w:t>Execution and files</w:t>
@@ -3727,15 +3727,26 @@
       </w:hyperlink>
     </w:p>
     <w:p>
-      <w:r>
-        <w:t>Open the task notebook in Google Colab and run its first cell to upload the required files. Task 01 uses WordOccurrenceDataset.txt, Task 02 uses MatData.txt, and Task 03 uses passwords.txt and expected_passwords.txt. Task 04 uses lodepng.cpp and lodepng.h and downloads download.png from the public image URL. The notebook then writes the source, compiles the program, runs it and displays the output. Use a T4 GPU for the CUDA tasks. The GitHub notebook links require access to the private repository; local notebook files can be opened with Colab's Upload notebook option.</w:t>
+      <w:hyperlink r:id="rId9">
+        <w:r>
+          <w:rPr>
+            <w:color w:val="164B6B"/>
+            <w:u w:val="single"/>
+          </w:rPr>
+          <w:t>Download complete assignment and recordings</w:t>
+        </w:r>
+      </w:hyperlink>
+    </w:p>
+    <w:p>
+      <w:r>
+        <w:t>Open a task notebook in Google Colab and upload the files requested by its first cell: Task 01, WordOccurrenceDataset.txt; Task 02, MatData.txt; Task 03, passwords.txt and expected_passwords.txt; Task 04, lodepng.cpp and lodepng.h. Task 04 downloads download.png from its public URL. Run all cells to compile the program and display the output. Use a T4 GPU for the CUDA tasks. All four notebook links allow anyone with the link to view and copy the code. The GitHub project contains the source and resources.</w:t>
       </w:r>
     </w:p>
     <w:p>
       <w:pPr>
         <w:pStyle w:val="Heading1"/>
       </w:pPr>
-      <w:bookmarkStart w:id="1" w:name="_Toc242217213"/>
+      <w:bookmarkStart w:id="1" w:name="_Toc242223208"/>
       <w:r>
         <w:t>Validation result</w:t>
       </w:r>
@@ -3751,7 +3762,7 @@
         <w:pStyle w:val="Heading1"/>
         <w:pageBreakBefore/>
       </w:pPr>
-      <w:bookmarkStart w:id="2" w:name="_Toc242217214"/>
+      <w:bookmarkStart w:id="2" w:name="_Toc242223209"/>
       <w:r>
         <w:lastRenderedPageBreak/>
         <w:t>Task 01 Word Occurrence Counting using Multithreading</w:t>
@@ -3759,7 +3770,7 @@
       <w:bookmarkEnd w:id="2"/>
     </w:p>
     <w:p>
-      <w:hyperlink r:id="rId9">
+      <w:hyperlink r:id="rId10">
         <w:r>
           <w:rPr>
             <w:color w:val="164B6B"/>
@@ -3770,7 +3781,7 @@
       </w:hyperlink>
     </w:p>
     <w:p>
-      <w:hyperlink r:id="rId10">
+      <w:hyperlink r:id="rId11">
         <w:r>
           <w:rPr>
             <w:color w:val="164B6B"/>
@@ -3784,7 +3795,7 @@
       <w:pPr>
         <w:pStyle w:val="Heading2"/>
       </w:pPr>
-      <w:bookmarkStart w:id="3" w:name="_Toc242217215"/>
+      <w:bookmarkStart w:id="3" w:name="_Toc242223210"/>
       <w:r>
         <w:t>Objective</w:t>
       </w:r>
@@ -3799,7 +3810,7 @@
       <w:pPr>
         <w:pStyle w:val="Heading2"/>
       </w:pPr>
-      <w:bookmarkStart w:id="4" w:name="_Toc242217216"/>
+      <w:bookmarkStart w:id="4" w:name="_Toc242223211"/>
       <w:r>
         <w:t>Implementation</w:t>
       </w:r>
@@ -3824,7 +3835,7 @@
       <w:pPr>
         <w:pStyle w:val="Heading2"/>
       </w:pPr>
-      <w:bookmarkStart w:id="5" w:name="_Toc242217217"/>
+      <w:bookmarkStart w:id="5" w:name="_Toc242223212"/>
       <w:r>
         <w:lastRenderedPageBreak/>
         <w:t>Code I implemented</w:t>
@@ -3856,7 +3867,7 @@
                     <pic:cNvPicPr/>
                   </pic:nvPicPr>
                   <pic:blipFill>
-                    <a:blip r:embed="rId11"/>
+                    <a:blip r:embed="rId12"/>
                     <a:stretch>
                       <a:fillRect/>
                     </a:stretch>
@@ -3882,7 +3893,7 @@
         <w:pStyle w:val="Caption"/>
         <w:keepNext/>
       </w:pPr>
-      <w:bookmarkStart w:id="6" w:name="_Toc242217253"/>
+      <w:bookmarkStart w:id="6" w:name="_Toc242223248"/>
       <w:r>
         <w:t xml:space="preserve">Figure </w:t>
       </w:r>
@@ -3913,7 +3924,7 @@
       <w:pPr>
         <w:pStyle w:val="Heading2"/>
       </w:pPr>
-      <w:bookmarkStart w:id="7" w:name="_Toc242217218"/>
+      <w:bookmarkStart w:id="7" w:name="_Toc242223213"/>
       <w:r>
         <w:t>Synchronisation and memory</w:t>
       </w:r>
@@ -3933,7 +3944,7 @@
       <w:pPr>
         <w:pStyle w:val="Heading2"/>
       </w:pPr>
-      <w:bookmarkStart w:id="8" w:name="_Toc242217219"/>
+      <w:bookmarkStart w:id="8" w:name="_Toc242223214"/>
       <w:r>
         <w:lastRenderedPageBreak/>
         <w:t>Build and run</w:t>
@@ -3966,7 +3977,7 @@
       <w:pPr>
         <w:pStyle w:val="Heading2"/>
       </w:pPr>
-      <w:bookmarkStart w:id="9" w:name="_Toc242217220"/>
+      <w:bookmarkStart w:id="9" w:name="_Toc242223215"/>
       <w:r>
         <w:t>Results and tests</w:t>
       </w:r>
@@ -3991,7 +4002,7 @@
       <w:pPr>
         <w:pStyle w:val="Heading2"/>
       </w:pPr>
-      <w:bookmarkStart w:id="10" w:name="_Toc242217221"/>
+      <w:bookmarkStart w:id="10" w:name="_Toc242223216"/>
       <w:r>
         <w:t>Performance and limits</w:t>
       </w:r>
@@ -4012,7 +4023,7 @@
         <w:pStyle w:val="Heading2"/>
         <w:pageBreakBefore/>
       </w:pPr>
-      <w:bookmarkStart w:id="11" w:name="_Toc242217222"/>
+      <w:bookmarkStart w:id="11" w:name="_Toc242223217"/>
       <w:r>
         <w:lastRenderedPageBreak/>
         <w:t>Colab execution evidence</w:t>
@@ -4044,7 +4055,7 @@
                     <pic:cNvPicPr/>
                   </pic:nvPicPr>
                   <pic:blipFill>
-                    <a:blip r:embed="rId12"/>
+                    <a:blip r:embed="rId13"/>
                     <a:stretch>
                       <a:fillRect/>
                     </a:stretch>
@@ -4070,7 +4081,7 @@
         <w:pStyle w:val="Caption"/>
         <w:keepNext/>
       </w:pPr>
-      <w:bookmarkStart w:id="12" w:name="_Toc242217254"/>
+      <w:bookmarkStart w:id="12" w:name="_Toc242223249"/>
       <w:r>
         <w:t xml:space="preserve">Figure </w:t>
       </w:r>
@@ -4097,7 +4108,7 @@
         <w:pStyle w:val="Heading1"/>
         <w:pageBreakBefore/>
       </w:pPr>
-      <w:bookmarkStart w:id="13" w:name="_Toc242217223"/>
+      <w:bookmarkStart w:id="13" w:name="_Toc242223218"/>
       <w:r>
         <w:lastRenderedPageBreak/>
         <w:t>Task 02 Multiple operations with Matrices using multithreading</w:t>
@@ -4105,7 +4116,7 @@
       <w:bookmarkEnd w:id="13"/>
     </w:p>
     <w:p>
-      <w:hyperlink r:id="rId13">
+      <w:hyperlink r:id="rId14">
         <w:r>
           <w:rPr>
             <w:color w:val="164B6B"/>
@@ -4116,7 +4127,7 @@
       </w:hyperlink>
     </w:p>
     <w:p>
-      <w:hyperlink r:id="rId14">
+      <w:hyperlink r:id="rId15">
         <w:r>
           <w:rPr>
             <w:color w:val="164B6B"/>
@@ -4130,7 +4141,7 @@
       <w:pPr>
         <w:pStyle w:val="Heading2"/>
       </w:pPr>
-      <w:bookmarkStart w:id="14" w:name="_Toc242217224"/>
+      <w:bookmarkStart w:id="14" w:name="_Toc242223219"/>
       <w:r>
         <w:t>Objective</w:t>
       </w:r>
@@ -4145,7 +4156,7 @@
       <w:pPr>
         <w:pStyle w:val="Heading2"/>
       </w:pPr>
-      <w:bookmarkStart w:id="15" w:name="_Toc242217225"/>
+      <w:bookmarkStart w:id="15" w:name="_Toc242223220"/>
       <w:r>
         <w:t>Implementation</w:t>
       </w:r>
@@ -4170,7 +4181,7 @@
       <w:pPr>
         <w:pStyle w:val="Heading2"/>
       </w:pPr>
-      <w:bookmarkStart w:id="16" w:name="_Toc242217226"/>
+      <w:bookmarkStart w:id="16" w:name="_Toc242223221"/>
       <w:r>
         <w:lastRenderedPageBreak/>
         <w:t>Code I implemented</w:t>
@@ -4202,7 +4213,7 @@
                     <pic:cNvPicPr/>
                   </pic:nvPicPr>
                   <pic:blipFill>
-                    <a:blip r:embed="rId15"/>
+                    <a:blip r:embed="rId16"/>
                     <a:stretch>
                       <a:fillRect/>
                     </a:stretch>
@@ -4228,7 +4239,7 @@
         <w:pStyle w:val="Caption"/>
         <w:keepNext/>
       </w:pPr>
-      <w:bookmarkStart w:id="17" w:name="_Toc242217255"/>
+      <w:bookmarkStart w:id="17" w:name="_Toc242223250"/>
       <w:r>
         <w:t xml:space="preserve">Figure </w:t>
       </w:r>
@@ -4259,7 +4270,7 @@
       <w:pPr>
         <w:pStyle w:val="Heading2"/>
       </w:pPr>
-      <w:bookmarkStart w:id="18" w:name="_Toc242217227"/>
+      <w:bookmarkStart w:id="18" w:name="_Toc242223222"/>
       <w:r>
         <w:t>Synchronisation and memory</w:t>
       </w:r>
@@ -4284,7 +4295,7 @@
       <w:pPr>
         <w:pStyle w:val="Heading2"/>
       </w:pPr>
-      <w:bookmarkStart w:id="19" w:name="_Toc242217228"/>
+      <w:bookmarkStart w:id="19" w:name="_Toc242223223"/>
       <w:r>
         <w:lastRenderedPageBreak/>
         <w:t>Build and run</w:t>
@@ -4317,7 +4328,7 @@
       <w:pPr>
         <w:pStyle w:val="Heading2"/>
       </w:pPr>
-      <w:bookmarkStart w:id="20" w:name="_Toc242217229"/>
+      <w:bookmarkStart w:id="20" w:name="_Toc242223224"/>
       <w:r>
         <w:t>Results and tests</w:t>
       </w:r>
@@ -4402,7 +4413,7 @@
       <w:pPr>
         <w:pStyle w:val="Heading2"/>
       </w:pPr>
-      <w:bookmarkStart w:id="21" w:name="_Toc242217230"/>
+      <w:bookmarkStart w:id="21" w:name="_Toc242223225"/>
       <w:r>
         <w:t>Performance and limits</w:t>
       </w:r>
@@ -4423,7 +4434,7 @@
         <w:pStyle w:val="Heading2"/>
         <w:pageBreakBefore/>
       </w:pPr>
-      <w:bookmarkStart w:id="22" w:name="_Toc242217231"/>
+      <w:bookmarkStart w:id="22" w:name="_Toc242223226"/>
       <w:r>
         <w:lastRenderedPageBreak/>
         <w:t>Colab execution evidence</w:t>
@@ -4455,7 +4466,7 @@
                     <pic:cNvPicPr/>
                   </pic:nvPicPr>
                   <pic:blipFill>
-                    <a:blip r:embed="rId16"/>
+                    <a:blip r:embed="rId17"/>
                     <a:stretch>
                       <a:fillRect/>
                     </a:stretch>
@@ -4481,7 +4492,7 @@
         <w:pStyle w:val="Caption"/>
         <w:keepNext/>
       </w:pPr>
-      <w:bookmarkStart w:id="23" w:name="_Toc242217256"/>
+      <w:bookmarkStart w:id="23" w:name="_Toc242223251"/>
       <w:r>
         <w:t xml:space="preserve">Figure </w:t>
       </w:r>
@@ -4508,7 +4519,7 @@
         <w:pStyle w:val="Heading1"/>
         <w:pageBreakBefore/>
       </w:pPr>
-      <w:bookmarkStart w:id="24" w:name="_Toc242217232"/>
+      <w:bookmarkStart w:id="24" w:name="_Toc242223227"/>
       <w:r>
         <w:lastRenderedPageBreak/>
         <w:t>Task 03 Password Cracking with Files using CUDA</w:t>
@@ -4516,7 +4527,7 @@
       <w:bookmarkEnd w:id="24"/>
     </w:p>
     <w:p>
-      <w:hyperlink r:id="rId17">
+      <w:hyperlink r:id="rId18">
         <w:r>
           <w:rPr>
             <w:color w:val="164B6B"/>
@@ -4527,7 +4538,7 @@
       </w:hyperlink>
     </w:p>
     <w:p>
-      <w:hyperlink r:id="rId18">
+      <w:hyperlink r:id="rId19">
         <w:r>
           <w:rPr>
             <w:color w:val="164B6B"/>
@@ -4541,7 +4552,7 @@
       <w:pPr>
         <w:pStyle w:val="Heading2"/>
       </w:pPr>
-      <w:bookmarkStart w:id="25" w:name="_Toc242217233"/>
+      <w:bookmarkStart w:id="25" w:name="_Toc242223228"/>
       <w:r>
         <w:t>Objective</w:t>
       </w:r>
@@ -4556,7 +4567,7 @@
       <w:pPr>
         <w:pStyle w:val="Heading2"/>
       </w:pPr>
-      <w:bookmarkStart w:id="26" w:name="_Toc242217234"/>
+      <w:bookmarkStart w:id="26" w:name="_Toc242223229"/>
       <w:r>
         <w:t>Implementation</w:t>
       </w:r>
@@ -4586,7 +4597,7 @@
       <w:pPr>
         <w:pStyle w:val="Heading2"/>
       </w:pPr>
-      <w:bookmarkStart w:id="27" w:name="_Toc242217235"/>
+      <w:bookmarkStart w:id="27" w:name="_Toc242223230"/>
       <w:r>
         <w:lastRenderedPageBreak/>
         <w:t>Code I implemented</w:t>
@@ -4618,7 +4629,7 @@
                     <pic:cNvPicPr/>
                   </pic:nvPicPr>
                   <pic:blipFill>
-                    <a:blip r:embed="rId19"/>
+                    <a:blip r:embed="rId20"/>
                     <a:stretch>
                       <a:fillRect/>
                     </a:stretch>
@@ -4644,7 +4655,7 @@
         <w:pStyle w:val="Caption"/>
         <w:keepNext/>
       </w:pPr>
-      <w:bookmarkStart w:id="28" w:name="_Toc242217257"/>
+      <w:bookmarkStart w:id="28" w:name="_Toc242223252"/>
       <w:r>
         <w:t xml:space="preserve">Figure </w:t>
       </w:r>
@@ -4675,7 +4686,7 @@
       <w:pPr>
         <w:pStyle w:val="Heading2"/>
       </w:pPr>
-      <w:bookmarkStart w:id="29" w:name="_Toc242217236"/>
+      <w:bookmarkStart w:id="29" w:name="_Toc242223231"/>
       <w:r>
         <w:t>Synchronisation and memory</w:t>
       </w:r>
@@ -4695,7 +4706,7 @@
       <w:pPr>
         <w:pStyle w:val="Heading2"/>
       </w:pPr>
-      <w:bookmarkStart w:id="30" w:name="_Toc242217237"/>
+      <w:bookmarkStart w:id="30" w:name="_Toc242223232"/>
       <w:r>
         <w:lastRenderedPageBreak/>
         <w:t>Build and run</w:t>
@@ -4728,7 +4739,7 @@
       <w:pPr>
         <w:pStyle w:val="Heading2"/>
       </w:pPr>
-      <w:bookmarkStart w:id="31" w:name="_Toc242217238"/>
+      <w:bookmarkStart w:id="31" w:name="_Toc242223233"/>
       <w:r>
         <w:t>Results and tests</w:t>
       </w:r>
@@ -4857,7 +4868,7 @@
       <w:pPr>
         <w:pStyle w:val="Heading2"/>
       </w:pPr>
-      <w:bookmarkStart w:id="32" w:name="_Toc242217239"/>
+      <w:bookmarkStart w:id="32" w:name="_Toc242223234"/>
       <w:r>
         <w:t>Performance and limits</w:t>
       </w:r>
@@ -4878,7 +4889,7 @@
         <w:pStyle w:val="Heading2"/>
         <w:pageBreakBefore/>
       </w:pPr>
-      <w:bookmarkStart w:id="33" w:name="_Toc242217240"/>
+      <w:bookmarkStart w:id="33" w:name="_Toc242223235"/>
       <w:r>
         <w:lastRenderedPageBreak/>
         <w:t>Colab execution evidence</w:t>
@@ -4910,7 +4921,7 @@
                     <pic:cNvPicPr/>
                   </pic:nvPicPr>
                   <pic:blipFill>
-                    <a:blip r:embed="rId20"/>
+                    <a:blip r:embed="rId21"/>
                     <a:stretch>
                       <a:fillRect/>
                     </a:stretch>
@@ -4936,7 +4947,7 @@
         <w:pStyle w:val="Caption"/>
         <w:keepNext/>
       </w:pPr>
-      <w:bookmarkStart w:id="34" w:name="_Toc242217258"/>
+      <w:bookmarkStart w:id="34" w:name="_Toc242223253"/>
       <w:r>
         <w:t xml:space="preserve">Figure </w:t>
       </w:r>
@@ -4963,7 +4974,7 @@
         <w:pStyle w:val="Heading1"/>
         <w:pageBreakBefore/>
       </w:pPr>
-      <w:bookmarkStart w:id="35" w:name="_Toc242217241"/>
+      <w:bookmarkStart w:id="35" w:name="_Toc242223236"/>
       <w:r>
         <w:lastRenderedPageBreak/>
         <w:t>Task 04</w:t>
@@ -4975,7 +4986,7 @@
       <w:bookmarkEnd w:id="35"/>
     </w:p>
     <w:p>
-      <w:hyperlink r:id="rId21">
+      <w:hyperlink r:id="rId22">
         <w:r>
           <w:rPr>
             <w:color w:val="164B6B"/>
@@ -4986,7 +4997,7 @@
       </w:hyperlink>
     </w:p>
     <w:p>
-      <w:hyperlink r:id="rId22">
+      <w:hyperlink r:id="rId23">
         <w:r>
           <w:rPr>
             <w:color w:val="164B6B"/>
@@ -5000,7 +5011,7 @@
       <w:pPr>
         <w:pStyle w:val="Heading2"/>
       </w:pPr>
-      <w:bookmarkStart w:id="36" w:name="_Toc242217242"/>
+      <w:bookmarkStart w:id="36" w:name="_Toc242223237"/>
       <w:r>
         <w:t>Objective</w:t>
       </w:r>
@@ -5015,7 +5026,7 @@
       <w:pPr>
         <w:pStyle w:val="Heading2"/>
       </w:pPr>
-      <w:bookmarkStart w:id="37" w:name="_Toc242217243"/>
+      <w:bookmarkStart w:id="37" w:name="_Toc242223238"/>
       <w:r>
         <w:t>Implementation</w:t>
       </w:r>
@@ -5045,7 +5056,7 @@
       <w:pPr>
         <w:pStyle w:val="Heading2"/>
       </w:pPr>
-      <w:bookmarkStart w:id="38" w:name="_Toc242217244"/>
+      <w:bookmarkStart w:id="38" w:name="_Toc242223239"/>
       <w:r>
         <w:lastRenderedPageBreak/>
         <w:t>Code I implemented</w:t>
@@ -5077,7 +5088,7 @@
                     <pic:cNvPicPr/>
                   </pic:nvPicPr>
                   <pic:blipFill>
-                    <a:blip r:embed="rId23"/>
+                    <a:blip r:embed="rId24"/>
                     <a:stretch>
                       <a:fillRect/>
                     </a:stretch>
@@ -5103,7 +5114,7 @@
         <w:pStyle w:val="Caption"/>
         <w:keepNext/>
       </w:pPr>
-      <w:bookmarkStart w:id="39" w:name="_Toc242217259"/>
+      <w:bookmarkStart w:id="39" w:name="_Toc242223254"/>
       <w:r>
         <w:t xml:space="preserve">Figure </w:t>
       </w:r>
@@ -5134,7 +5145,7 @@
       <w:pPr>
         <w:pStyle w:val="Heading2"/>
       </w:pPr>
-      <w:bookmarkStart w:id="40" w:name="_Toc242217245"/>
+      <w:bookmarkStart w:id="40" w:name="_Toc242223240"/>
       <w:r>
         <w:t>Synchronisation and memory</w:t>
       </w:r>
@@ -5160,7 +5171,7 @@
       <w:pPr>
         <w:pStyle w:val="Heading2"/>
       </w:pPr>
-      <w:bookmarkStart w:id="41" w:name="_Toc242217246"/>
+      <w:bookmarkStart w:id="41" w:name="_Toc242223241"/>
       <w:r>
         <w:t>Build and run</w:t>
       </w:r>
@@ -5203,7 +5214,7 @@
       <w:pPr>
         <w:pStyle w:val="Heading2"/>
       </w:pPr>
-      <w:bookmarkStart w:id="42" w:name="_Toc242217247"/>
+      <w:bookmarkStart w:id="42" w:name="_Toc242223242"/>
       <w:r>
         <w:t>Results and tests</w:t>
       </w:r>
@@ -5228,7 +5239,7 @@
       <w:pPr>
         <w:pStyle w:val="Heading2"/>
       </w:pPr>
-      <w:bookmarkStart w:id="43" w:name="_Toc242217248"/>
+      <w:bookmarkStart w:id="43" w:name="_Toc242223243"/>
       <w:r>
         <w:t>Performance and limits</w:t>
       </w:r>
@@ -5249,7 +5260,7 @@
         <w:pStyle w:val="Heading2"/>
         <w:pageBreakBefore/>
       </w:pPr>
-      <w:bookmarkStart w:id="44" w:name="_Toc242217249"/>
+      <w:bookmarkStart w:id="44" w:name="_Toc242223244"/>
       <w:r>
         <w:lastRenderedPageBreak/>
         <w:t>Colab execution evidence</w:t>
@@ -5281,7 +5292,7 @@
                     <pic:cNvPicPr/>
                   </pic:nvPicPr>
                   <pic:blipFill>
-                    <a:blip r:embed="rId24"/>
+                    <a:blip r:embed="rId25"/>
                     <a:stretch>
                       <a:fillRect/>
                     </a:stretch>
@@ -5307,7 +5318,7 @@
         <w:pStyle w:val="Caption"/>
         <w:keepNext/>
       </w:pPr>
-      <w:bookmarkStart w:id="45" w:name="_Toc242217260"/>
+      <w:bookmarkStart w:id="45" w:name="_Toc242223255"/>
       <w:r>
         <w:t xml:space="preserve">Figure </w:t>
       </w:r>
@@ -5334,7 +5345,7 @@
         <w:pStyle w:val="Heading2"/>
         <w:pageBreakBefore/>
       </w:pPr>
-      <w:bookmarkStart w:id="46" w:name="_Toc242217250"/>
+      <w:bookmarkStart w:id="46" w:name="_Toc242223245"/>
       <w:r>
         <w:lastRenderedPageBreak/>
         <w:t>Task 04 image outputs</w:t>
@@ -5366,7 +5377,7 @@
                     <pic:cNvPicPr/>
                   </pic:nvPicPr>
                   <pic:blipFill>
-                    <a:blip r:embed="rId25"/>
+                    <a:blip r:embed="rId26"/>
                     <a:stretch>
                       <a:fillRect/>
                     </a:stretch>
@@ -5392,7 +5403,7 @@
         <w:pStyle w:val="Caption"/>
         <w:keepNext/>
       </w:pPr>
-      <w:bookmarkStart w:id="47" w:name="_Toc242217261"/>
+      <w:bookmarkStart w:id="47" w:name="_Toc242223256"/>
       <w:r>
         <w:t xml:space="preserve">Figure </w:t>
       </w:r>
@@ -5419,7 +5430,7 @@
         <w:pStyle w:val="Heading1"/>
         <w:pageBreakBefore/>
       </w:pPr>
-      <w:bookmarkStart w:id="48" w:name="_Toc242217251"/>
+      <w:bookmarkStart w:id="48" w:name="_Toc242223246"/>
       <w:r>
         <w:lastRenderedPageBreak/>
         <w:t>Evidence and submission</w:t>
@@ -5445,7 +5456,7 @@
       <w:pPr>
         <w:pStyle w:val="Heading1"/>
       </w:pPr>
-      <w:bookmarkStart w:id="49" w:name="_Toc242217252"/>
+      <w:bookmarkStart w:id="49" w:name="_Toc242223247"/>
       <w:r>
         <w:t>References</w:t>
       </w:r>
@@ -5487,7 +5498,7 @@
       </w:r>
     </w:p>
     <w:p>
-      <w:hyperlink r:id="rId26">
+      <w:hyperlink r:id="rId27">
         <w:r>
           <w:rPr>
             <w:color w:val="164B6B"/>
@@ -5498,7 +5509,7 @@
       </w:hyperlink>
     </w:p>
     <w:p>
-      <w:hyperlink r:id="rId27">
+      <w:hyperlink r:id="rId28">
         <w:r>
           <w:rPr>
             <w:color w:val="164B6B"/>
@@ -5509,7 +5520,7 @@
       </w:hyperlink>
     </w:p>
     <w:p>
-      <w:hyperlink r:id="rId28">
+      <w:hyperlink r:id="rId29">
         <w:r>
           <w:rPr>
             <w:color w:val="164B6B"/>
@@ -5520,7 +5531,7 @@
       </w:hyperlink>
     </w:p>
     <w:p>
-      <w:hyperlink r:id="rId29">
+      <w:hyperlink r:id="rId30">
         <w:r>
           <w:rPr>
             <w:color w:val="164B6B"/>
@@ -5531,7 +5542,7 @@
       </w:hyperlink>
     </w:p>
     <w:sectPr>
-      <w:footerReference w:type="default" r:id="rId30"/>
+      <w:footerReference w:type="default" r:id="rId31"/>
       <w:pgSz w:w="12240" w:h="15840"/>
       <w:pgMar w:top="1152" w:right="1224" w:bottom="1296" w:left="1224" w:header="720" w:footer="504" w:gutter="0"/>
       <w:cols w:space="720"/>

</xml_diff>

<commit_message>
Finalize submission report with public access details
</commit_message>
<xml_diff>
--- a/2638120_Thaslim_Mohammed_Sahl_High_Performance_Computing.docx
+++ b/2638120_Thaslim_Mohammed_Sahl_High_Performance_Computing.docx
@@ -25,7 +25,7 @@
       </w:r>
       <w:r>
         <w:br/>
-        <w:t>6 October 2026</w:t>
+        <w:t>7 October 2026</w:t>
       </w:r>
     </w:p>
     <w:p>
@@ -70,7 +70,7 @@
       <w:r>
         <w:fldChar w:fldCharType="separate"/>
       </w:r>
-      <w:hyperlink w:anchor="_Toc242223207" w:history="1">
+      <w:hyperlink w:anchor="_Toc242224211" w:history="1">
         <w:r>
           <w:rPr>
             <w:rStyle w:val="Hyperlink"/>
@@ -97,7 +97,7 @@
             <w:noProof/>
             <w:webHidden/>
           </w:rPr>
-          <w:instrText xml:space="preserve"> PAGEREF _Toc242223207 \h </w:instrText>
+          <w:instrText xml:space="preserve"> PAGEREF _Toc242224211 \h </w:instrText>
         </w:r>
         <w:r>
           <w:rPr>
@@ -142,7 +142,7 @@
           <w14:ligatures w14:val="standardContextual"/>
         </w:rPr>
       </w:pPr>
-      <w:hyperlink w:anchor="_Toc242223208" w:history="1">
+      <w:hyperlink w:anchor="_Toc242224212" w:history="1">
         <w:r>
           <w:rPr>
             <w:rStyle w:val="Hyperlink"/>
@@ -169,7 +169,7 @@
             <w:noProof/>
             <w:webHidden/>
           </w:rPr>
-          <w:instrText xml:space="preserve"> PAGEREF _Toc242223208 \h </w:instrText>
+          <w:instrText xml:space="preserve"> PAGEREF _Toc242224212 \h </w:instrText>
         </w:r>
         <w:r>
           <w:rPr>
@@ -214,7 +214,7 @@
           <w14:ligatures w14:val="standardContextual"/>
         </w:rPr>
       </w:pPr>
-      <w:hyperlink w:anchor="_Toc242223209" w:history="1">
+      <w:hyperlink w:anchor="_Toc242224213" w:history="1">
         <w:r>
           <w:rPr>
             <w:rStyle w:val="Hyperlink"/>
@@ -241,7 +241,7 @@
             <w:noProof/>
             <w:webHidden/>
           </w:rPr>
-          <w:instrText xml:space="preserve"> PAGEREF _Toc242223209 \h </w:instrText>
+          <w:instrText xml:space="preserve"> PAGEREF _Toc242224213 \h </w:instrText>
         </w:r>
         <w:r>
           <w:rPr>
@@ -286,7 +286,7 @@
           <w14:ligatures w14:val="standardContextual"/>
         </w:rPr>
       </w:pPr>
-      <w:hyperlink w:anchor="_Toc242223210" w:history="1">
+      <w:hyperlink w:anchor="_Toc242224214" w:history="1">
         <w:r>
           <w:rPr>
             <w:rStyle w:val="Hyperlink"/>
@@ -313,7 +313,7 @@
             <w:noProof/>
             <w:webHidden/>
           </w:rPr>
-          <w:instrText xml:space="preserve"> PAGEREF _Toc242223210 \h </w:instrText>
+          <w:instrText xml:space="preserve"> PAGEREF _Toc242224214 \h </w:instrText>
         </w:r>
         <w:r>
           <w:rPr>
@@ -358,7 +358,7 @@
           <w14:ligatures w14:val="standardContextual"/>
         </w:rPr>
       </w:pPr>
-      <w:hyperlink w:anchor="_Toc242223211" w:history="1">
+      <w:hyperlink w:anchor="_Toc242224215" w:history="1">
         <w:r>
           <w:rPr>
             <w:rStyle w:val="Hyperlink"/>
@@ -385,7 +385,7 @@
             <w:noProof/>
             <w:webHidden/>
           </w:rPr>
-          <w:instrText xml:space="preserve"> PAGEREF _Toc242223211 \h </w:instrText>
+          <w:instrText xml:space="preserve"> PAGEREF _Toc242224215 \h </w:instrText>
         </w:r>
         <w:r>
           <w:rPr>
@@ -430,7 +430,7 @@
           <w14:ligatures w14:val="standardContextual"/>
         </w:rPr>
       </w:pPr>
-      <w:hyperlink w:anchor="_Toc242223212" w:history="1">
+      <w:hyperlink w:anchor="_Toc242224216" w:history="1">
         <w:r>
           <w:rPr>
             <w:rStyle w:val="Hyperlink"/>
@@ -457,7 +457,7 @@
             <w:noProof/>
             <w:webHidden/>
           </w:rPr>
-          <w:instrText xml:space="preserve"> PAGEREF _Toc242223212 \h </w:instrText>
+          <w:instrText xml:space="preserve"> PAGEREF _Toc242224216 \h </w:instrText>
         </w:r>
         <w:r>
           <w:rPr>
@@ -502,7 +502,7 @@
           <w14:ligatures w14:val="standardContextual"/>
         </w:rPr>
       </w:pPr>
-      <w:hyperlink w:anchor="_Toc242223213" w:history="1">
+      <w:hyperlink w:anchor="_Toc242224217" w:history="1">
         <w:r>
           <w:rPr>
             <w:rStyle w:val="Hyperlink"/>
@@ -529,7 +529,7 @@
             <w:noProof/>
             <w:webHidden/>
           </w:rPr>
-          <w:instrText xml:space="preserve"> PAGEREF _Toc242223213 \h </w:instrText>
+          <w:instrText xml:space="preserve"> PAGEREF _Toc242224217 \h </w:instrText>
         </w:r>
         <w:r>
           <w:rPr>
@@ -574,7 +574,7 @@
           <w14:ligatures w14:val="standardContextual"/>
         </w:rPr>
       </w:pPr>
-      <w:hyperlink w:anchor="_Toc242223214" w:history="1">
+      <w:hyperlink w:anchor="_Toc242224218" w:history="1">
         <w:r>
           <w:rPr>
             <w:rStyle w:val="Hyperlink"/>
@@ -601,7 +601,7 @@
             <w:noProof/>
             <w:webHidden/>
           </w:rPr>
-          <w:instrText xml:space="preserve"> PAGEREF _Toc242223214 \h </w:instrText>
+          <w:instrText xml:space="preserve"> PAGEREF _Toc242224218 \h </w:instrText>
         </w:r>
         <w:r>
           <w:rPr>
@@ -646,7 +646,7 @@
           <w14:ligatures w14:val="standardContextual"/>
         </w:rPr>
       </w:pPr>
-      <w:hyperlink w:anchor="_Toc242223215" w:history="1">
+      <w:hyperlink w:anchor="_Toc242224219" w:history="1">
         <w:r>
           <w:rPr>
             <w:rStyle w:val="Hyperlink"/>
@@ -673,7 +673,7 @@
             <w:noProof/>
             <w:webHidden/>
           </w:rPr>
-          <w:instrText xml:space="preserve"> PAGEREF _Toc242223215 \h </w:instrText>
+          <w:instrText xml:space="preserve"> PAGEREF _Toc242224219 \h </w:instrText>
         </w:r>
         <w:r>
           <w:rPr>
@@ -718,7 +718,7 @@
           <w14:ligatures w14:val="standardContextual"/>
         </w:rPr>
       </w:pPr>
-      <w:hyperlink w:anchor="_Toc242223216" w:history="1">
+      <w:hyperlink w:anchor="_Toc242224220" w:history="1">
         <w:r>
           <w:rPr>
             <w:rStyle w:val="Hyperlink"/>
@@ -745,7 +745,7 @@
             <w:noProof/>
             <w:webHidden/>
           </w:rPr>
-          <w:instrText xml:space="preserve"> PAGEREF _Toc242223216 \h </w:instrText>
+          <w:instrText xml:space="preserve"> PAGEREF _Toc242224220 \h </w:instrText>
         </w:r>
         <w:r>
           <w:rPr>
@@ -790,7 +790,7 @@
           <w14:ligatures w14:val="standardContextual"/>
         </w:rPr>
       </w:pPr>
-      <w:hyperlink w:anchor="_Toc242223217" w:history="1">
+      <w:hyperlink w:anchor="_Toc242224221" w:history="1">
         <w:r>
           <w:rPr>
             <w:rStyle w:val="Hyperlink"/>
@@ -817,7 +817,7 @@
             <w:noProof/>
             <w:webHidden/>
           </w:rPr>
-          <w:instrText xml:space="preserve"> PAGEREF _Toc242223217 \h </w:instrText>
+          <w:instrText xml:space="preserve"> PAGEREF _Toc242224221 \h </w:instrText>
         </w:r>
         <w:r>
           <w:rPr>
@@ -862,7 +862,7 @@
           <w14:ligatures w14:val="standardContextual"/>
         </w:rPr>
       </w:pPr>
-      <w:hyperlink w:anchor="_Toc242223218" w:history="1">
+      <w:hyperlink w:anchor="_Toc242224222" w:history="1">
         <w:r>
           <w:rPr>
             <w:rStyle w:val="Hyperlink"/>
@@ -889,7 +889,7 @@
             <w:noProof/>
             <w:webHidden/>
           </w:rPr>
-          <w:instrText xml:space="preserve"> PAGEREF _Toc242223218 \h </w:instrText>
+          <w:instrText xml:space="preserve"> PAGEREF _Toc242224222 \h </w:instrText>
         </w:r>
         <w:r>
           <w:rPr>
@@ -934,7 +934,7 @@
           <w14:ligatures w14:val="standardContextual"/>
         </w:rPr>
       </w:pPr>
-      <w:hyperlink w:anchor="_Toc242223219" w:history="1">
+      <w:hyperlink w:anchor="_Toc242224223" w:history="1">
         <w:r>
           <w:rPr>
             <w:rStyle w:val="Hyperlink"/>
@@ -961,7 +961,7 @@
             <w:noProof/>
             <w:webHidden/>
           </w:rPr>
-          <w:instrText xml:space="preserve"> PAGEREF _Toc242223219 \h </w:instrText>
+          <w:instrText xml:space="preserve"> PAGEREF _Toc242224223 \h </w:instrText>
         </w:r>
         <w:r>
           <w:rPr>
@@ -1006,7 +1006,7 @@
           <w14:ligatures w14:val="standardContextual"/>
         </w:rPr>
       </w:pPr>
-      <w:hyperlink w:anchor="_Toc242223220" w:history="1">
+      <w:hyperlink w:anchor="_Toc242224224" w:history="1">
         <w:r>
           <w:rPr>
             <w:rStyle w:val="Hyperlink"/>
@@ -1033,7 +1033,7 @@
             <w:noProof/>
             <w:webHidden/>
           </w:rPr>
-          <w:instrText xml:space="preserve"> PAGEREF _Toc242223220 \h </w:instrText>
+          <w:instrText xml:space="preserve"> PAGEREF _Toc242224224 \h </w:instrText>
         </w:r>
         <w:r>
           <w:rPr>
@@ -1078,7 +1078,7 @@
           <w14:ligatures w14:val="standardContextual"/>
         </w:rPr>
       </w:pPr>
-      <w:hyperlink w:anchor="_Toc242223221" w:history="1">
+      <w:hyperlink w:anchor="_Toc242224225" w:history="1">
         <w:r>
           <w:rPr>
             <w:rStyle w:val="Hyperlink"/>
@@ -1105,7 +1105,7 @@
             <w:noProof/>
             <w:webHidden/>
           </w:rPr>
-          <w:instrText xml:space="preserve"> PAGEREF _Toc242223221 \h </w:instrText>
+          <w:instrText xml:space="preserve"> PAGEREF _Toc242224225 \h </w:instrText>
         </w:r>
         <w:r>
           <w:rPr>
@@ -1150,7 +1150,7 @@
           <w14:ligatures w14:val="standardContextual"/>
         </w:rPr>
       </w:pPr>
-      <w:hyperlink w:anchor="_Toc242223222" w:history="1">
+      <w:hyperlink w:anchor="_Toc242224226" w:history="1">
         <w:r>
           <w:rPr>
             <w:rStyle w:val="Hyperlink"/>
@@ -1177,7 +1177,7 @@
             <w:noProof/>
             <w:webHidden/>
           </w:rPr>
-          <w:instrText xml:space="preserve"> PAGEREF _Toc242223222 \h </w:instrText>
+          <w:instrText xml:space="preserve"> PAGEREF _Toc242224226 \h </w:instrText>
         </w:r>
         <w:r>
           <w:rPr>
@@ -1222,7 +1222,7 @@
           <w14:ligatures w14:val="standardContextual"/>
         </w:rPr>
       </w:pPr>
-      <w:hyperlink w:anchor="_Toc242223223" w:history="1">
+      <w:hyperlink w:anchor="_Toc242224227" w:history="1">
         <w:r>
           <w:rPr>
             <w:rStyle w:val="Hyperlink"/>
@@ -1249,7 +1249,7 @@
             <w:noProof/>
             <w:webHidden/>
           </w:rPr>
-          <w:instrText xml:space="preserve"> PAGEREF _Toc242223223 \h </w:instrText>
+          <w:instrText xml:space="preserve"> PAGEREF _Toc242224227 \h </w:instrText>
         </w:r>
         <w:r>
           <w:rPr>
@@ -1294,7 +1294,7 @@
           <w14:ligatures w14:val="standardContextual"/>
         </w:rPr>
       </w:pPr>
-      <w:hyperlink w:anchor="_Toc242223224" w:history="1">
+      <w:hyperlink w:anchor="_Toc242224228" w:history="1">
         <w:r>
           <w:rPr>
             <w:rStyle w:val="Hyperlink"/>
@@ -1321,7 +1321,7 @@
             <w:noProof/>
             <w:webHidden/>
           </w:rPr>
-          <w:instrText xml:space="preserve"> PAGEREF _Toc242223224 \h </w:instrText>
+          <w:instrText xml:space="preserve"> PAGEREF _Toc242224228 \h </w:instrText>
         </w:r>
         <w:r>
           <w:rPr>
@@ -1366,7 +1366,7 @@
           <w14:ligatures w14:val="standardContextual"/>
         </w:rPr>
       </w:pPr>
-      <w:hyperlink w:anchor="_Toc242223225" w:history="1">
+      <w:hyperlink w:anchor="_Toc242224229" w:history="1">
         <w:r>
           <w:rPr>
             <w:rStyle w:val="Hyperlink"/>
@@ -1393,7 +1393,7 @@
             <w:noProof/>
             <w:webHidden/>
           </w:rPr>
-          <w:instrText xml:space="preserve"> PAGEREF _Toc242223225 \h </w:instrText>
+          <w:instrText xml:space="preserve"> PAGEREF _Toc242224229 \h </w:instrText>
         </w:r>
         <w:r>
           <w:rPr>
@@ -1438,7 +1438,7 @@
           <w14:ligatures w14:val="standardContextual"/>
         </w:rPr>
       </w:pPr>
-      <w:hyperlink w:anchor="_Toc242223226" w:history="1">
+      <w:hyperlink w:anchor="_Toc242224230" w:history="1">
         <w:r>
           <w:rPr>
             <w:rStyle w:val="Hyperlink"/>
@@ -1465,7 +1465,7 @@
             <w:noProof/>
             <w:webHidden/>
           </w:rPr>
-          <w:instrText xml:space="preserve"> PAGEREF _Toc242223226 \h </w:instrText>
+          <w:instrText xml:space="preserve"> PAGEREF _Toc242224230 \h </w:instrText>
         </w:r>
         <w:r>
           <w:rPr>
@@ -1510,7 +1510,7 @@
           <w14:ligatures w14:val="standardContextual"/>
         </w:rPr>
       </w:pPr>
-      <w:hyperlink w:anchor="_Toc242223227" w:history="1">
+      <w:hyperlink w:anchor="_Toc242224231" w:history="1">
         <w:r>
           <w:rPr>
             <w:rStyle w:val="Hyperlink"/>
@@ -1537,7 +1537,7 @@
             <w:noProof/>
             <w:webHidden/>
           </w:rPr>
-          <w:instrText xml:space="preserve"> PAGEREF _Toc242223227 \h </w:instrText>
+          <w:instrText xml:space="preserve"> PAGEREF _Toc242224231 \h </w:instrText>
         </w:r>
         <w:r>
           <w:rPr>
@@ -1582,7 +1582,7 @@
           <w14:ligatures w14:val="standardContextual"/>
         </w:rPr>
       </w:pPr>
-      <w:hyperlink w:anchor="_Toc242223228" w:history="1">
+      <w:hyperlink w:anchor="_Toc242224232" w:history="1">
         <w:r>
           <w:rPr>
             <w:rStyle w:val="Hyperlink"/>
@@ -1609,7 +1609,7 @@
             <w:noProof/>
             <w:webHidden/>
           </w:rPr>
-          <w:instrText xml:space="preserve"> PAGEREF _Toc242223228 \h </w:instrText>
+          <w:instrText xml:space="preserve"> PAGEREF _Toc242224232 \h </w:instrText>
         </w:r>
         <w:r>
           <w:rPr>
@@ -1654,7 +1654,7 @@
           <w14:ligatures w14:val="standardContextual"/>
         </w:rPr>
       </w:pPr>
-      <w:hyperlink w:anchor="_Toc242223229" w:history="1">
+      <w:hyperlink w:anchor="_Toc242224233" w:history="1">
         <w:r>
           <w:rPr>
             <w:rStyle w:val="Hyperlink"/>
@@ -1681,7 +1681,7 @@
             <w:noProof/>
             <w:webHidden/>
           </w:rPr>
-          <w:instrText xml:space="preserve"> PAGEREF _Toc242223229 \h </w:instrText>
+          <w:instrText xml:space="preserve"> PAGEREF _Toc242224233 \h </w:instrText>
         </w:r>
         <w:r>
           <w:rPr>
@@ -1726,7 +1726,7 @@
           <w14:ligatures w14:val="standardContextual"/>
         </w:rPr>
       </w:pPr>
-      <w:hyperlink w:anchor="_Toc242223230" w:history="1">
+      <w:hyperlink w:anchor="_Toc242224234" w:history="1">
         <w:r>
           <w:rPr>
             <w:rStyle w:val="Hyperlink"/>
@@ -1753,7 +1753,7 @@
             <w:noProof/>
             <w:webHidden/>
           </w:rPr>
-          <w:instrText xml:space="preserve"> PAGEREF _Toc242223230 \h </w:instrText>
+          <w:instrText xml:space="preserve"> PAGEREF _Toc242224234 \h </w:instrText>
         </w:r>
         <w:r>
           <w:rPr>
@@ -1798,7 +1798,7 @@
           <w14:ligatures w14:val="standardContextual"/>
         </w:rPr>
       </w:pPr>
-      <w:hyperlink w:anchor="_Toc242223231" w:history="1">
+      <w:hyperlink w:anchor="_Toc242224235" w:history="1">
         <w:r>
           <w:rPr>
             <w:rStyle w:val="Hyperlink"/>
@@ -1825,7 +1825,7 @@
             <w:noProof/>
             <w:webHidden/>
           </w:rPr>
-          <w:instrText xml:space="preserve"> PAGEREF _Toc242223231 \h </w:instrText>
+          <w:instrText xml:space="preserve"> PAGEREF _Toc242224235 \h </w:instrText>
         </w:r>
         <w:r>
           <w:rPr>
@@ -1870,7 +1870,7 @@
           <w14:ligatures w14:val="standardContextual"/>
         </w:rPr>
       </w:pPr>
-      <w:hyperlink w:anchor="_Toc242223232" w:history="1">
+      <w:hyperlink w:anchor="_Toc242224236" w:history="1">
         <w:r>
           <w:rPr>
             <w:rStyle w:val="Hyperlink"/>
@@ -1897,7 +1897,7 @@
             <w:noProof/>
             <w:webHidden/>
           </w:rPr>
-          <w:instrText xml:space="preserve"> PAGEREF _Toc242223232 \h </w:instrText>
+          <w:instrText xml:space="preserve"> PAGEREF _Toc242224236 \h </w:instrText>
         </w:r>
         <w:r>
           <w:rPr>
@@ -1942,7 +1942,7 @@
           <w14:ligatures w14:val="standardContextual"/>
         </w:rPr>
       </w:pPr>
-      <w:hyperlink w:anchor="_Toc242223233" w:history="1">
+      <w:hyperlink w:anchor="_Toc242224237" w:history="1">
         <w:r>
           <w:rPr>
             <w:rStyle w:val="Hyperlink"/>
@@ -1969,7 +1969,7 @@
             <w:noProof/>
             <w:webHidden/>
           </w:rPr>
-          <w:instrText xml:space="preserve"> PAGEREF _Toc242223233 \h </w:instrText>
+          <w:instrText xml:space="preserve"> PAGEREF _Toc242224237 \h </w:instrText>
         </w:r>
         <w:r>
           <w:rPr>
@@ -2014,7 +2014,7 @@
           <w14:ligatures w14:val="standardContextual"/>
         </w:rPr>
       </w:pPr>
-      <w:hyperlink w:anchor="_Toc242223234" w:history="1">
+      <w:hyperlink w:anchor="_Toc242224238" w:history="1">
         <w:r>
           <w:rPr>
             <w:rStyle w:val="Hyperlink"/>
@@ -2041,7 +2041,7 @@
             <w:noProof/>
             <w:webHidden/>
           </w:rPr>
-          <w:instrText xml:space="preserve"> PAGEREF _Toc242223234 \h </w:instrText>
+          <w:instrText xml:space="preserve"> PAGEREF _Toc242224238 \h </w:instrText>
         </w:r>
         <w:r>
           <w:rPr>
@@ -2086,7 +2086,7 @@
           <w14:ligatures w14:val="standardContextual"/>
         </w:rPr>
       </w:pPr>
-      <w:hyperlink w:anchor="_Toc242223235" w:history="1">
+      <w:hyperlink w:anchor="_Toc242224239" w:history="1">
         <w:r>
           <w:rPr>
             <w:rStyle w:val="Hyperlink"/>
@@ -2113,7 +2113,7 @@
             <w:noProof/>
             <w:webHidden/>
           </w:rPr>
-          <w:instrText xml:space="preserve"> PAGEREF _Toc242223235 \h </w:instrText>
+          <w:instrText xml:space="preserve"> PAGEREF _Toc242224239 \h </w:instrText>
         </w:r>
         <w:r>
           <w:rPr>
@@ -2158,7 +2158,7 @@
           <w14:ligatures w14:val="standardContextual"/>
         </w:rPr>
       </w:pPr>
-      <w:hyperlink w:anchor="_Toc242223236" w:history="1">
+      <w:hyperlink w:anchor="_Toc242224240" w:history="1">
         <w:r>
           <w:rPr>
             <w:rStyle w:val="Hyperlink"/>
@@ -2185,7 +2185,7 @@
             <w:noProof/>
             <w:webHidden/>
           </w:rPr>
-          <w:instrText xml:space="preserve"> PAGEREF _Toc242223236 \h </w:instrText>
+          <w:instrText xml:space="preserve"> PAGEREF _Toc242224240 \h </w:instrText>
         </w:r>
         <w:r>
           <w:rPr>
@@ -2230,7 +2230,7 @@
           <w14:ligatures w14:val="standardContextual"/>
         </w:rPr>
       </w:pPr>
-      <w:hyperlink w:anchor="_Toc242223237" w:history="1">
+      <w:hyperlink w:anchor="_Toc242224241" w:history="1">
         <w:r>
           <w:rPr>
             <w:rStyle w:val="Hyperlink"/>
@@ -2257,7 +2257,7 @@
             <w:noProof/>
             <w:webHidden/>
           </w:rPr>
-          <w:instrText xml:space="preserve"> PAGEREF _Toc242223237 \h </w:instrText>
+          <w:instrText xml:space="preserve"> PAGEREF _Toc242224241 \h </w:instrText>
         </w:r>
         <w:r>
           <w:rPr>
@@ -2302,7 +2302,7 @@
           <w14:ligatures w14:val="standardContextual"/>
         </w:rPr>
       </w:pPr>
-      <w:hyperlink w:anchor="_Toc242223238" w:history="1">
+      <w:hyperlink w:anchor="_Toc242224242" w:history="1">
         <w:r>
           <w:rPr>
             <w:rStyle w:val="Hyperlink"/>
@@ -2329,7 +2329,7 @@
             <w:noProof/>
             <w:webHidden/>
           </w:rPr>
-          <w:instrText xml:space="preserve"> PAGEREF _Toc242223238 \h </w:instrText>
+          <w:instrText xml:space="preserve"> PAGEREF _Toc242224242 \h </w:instrText>
         </w:r>
         <w:r>
           <w:rPr>
@@ -2374,7 +2374,7 @@
           <w14:ligatures w14:val="standardContextual"/>
         </w:rPr>
       </w:pPr>
-      <w:hyperlink w:anchor="_Toc242223239" w:history="1">
+      <w:hyperlink w:anchor="_Toc242224243" w:history="1">
         <w:r>
           <w:rPr>
             <w:rStyle w:val="Hyperlink"/>
@@ -2401,7 +2401,7 @@
             <w:noProof/>
             <w:webHidden/>
           </w:rPr>
-          <w:instrText xml:space="preserve"> PAGEREF _Toc242223239 \h </w:instrText>
+          <w:instrText xml:space="preserve"> PAGEREF _Toc242224243 \h </w:instrText>
         </w:r>
         <w:r>
           <w:rPr>
@@ -2446,7 +2446,7 @@
           <w14:ligatures w14:val="standardContextual"/>
         </w:rPr>
       </w:pPr>
-      <w:hyperlink w:anchor="_Toc242223240" w:history="1">
+      <w:hyperlink w:anchor="_Toc242224244" w:history="1">
         <w:r>
           <w:rPr>
             <w:rStyle w:val="Hyperlink"/>
@@ -2473,7 +2473,7 @@
             <w:noProof/>
             <w:webHidden/>
           </w:rPr>
-          <w:instrText xml:space="preserve"> PAGEREF _Toc242223240 \h </w:instrText>
+          <w:instrText xml:space="preserve"> PAGEREF _Toc242224244 \h </w:instrText>
         </w:r>
         <w:r>
           <w:rPr>
@@ -2518,7 +2518,7 @@
           <w14:ligatures w14:val="standardContextual"/>
         </w:rPr>
       </w:pPr>
-      <w:hyperlink w:anchor="_Toc242223241" w:history="1">
+      <w:hyperlink w:anchor="_Toc242224245" w:history="1">
         <w:r>
           <w:rPr>
             <w:rStyle w:val="Hyperlink"/>
@@ -2545,7 +2545,7 @@
             <w:noProof/>
             <w:webHidden/>
           </w:rPr>
-          <w:instrText xml:space="preserve"> PAGEREF _Toc242223241 \h </w:instrText>
+          <w:instrText xml:space="preserve"> PAGEREF _Toc242224245 \h </w:instrText>
         </w:r>
         <w:r>
           <w:rPr>
@@ -2590,7 +2590,7 @@
           <w14:ligatures w14:val="standardContextual"/>
         </w:rPr>
       </w:pPr>
-      <w:hyperlink w:anchor="_Toc242223242" w:history="1">
+      <w:hyperlink w:anchor="_Toc242224246" w:history="1">
         <w:r>
           <w:rPr>
             <w:rStyle w:val="Hyperlink"/>
@@ -2617,7 +2617,7 @@
             <w:noProof/>
             <w:webHidden/>
           </w:rPr>
-          <w:instrText xml:space="preserve"> PAGEREF _Toc242223242 \h </w:instrText>
+          <w:instrText xml:space="preserve"> PAGEREF _Toc242224246 \h </w:instrText>
         </w:r>
         <w:r>
           <w:rPr>
@@ -2662,7 +2662,7 @@
           <w14:ligatures w14:val="standardContextual"/>
         </w:rPr>
       </w:pPr>
-      <w:hyperlink w:anchor="_Toc242223243" w:history="1">
+      <w:hyperlink w:anchor="_Toc242224247" w:history="1">
         <w:r>
           <w:rPr>
             <w:rStyle w:val="Hyperlink"/>
@@ -2689,7 +2689,7 @@
             <w:noProof/>
             <w:webHidden/>
           </w:rPr>
-          <w:instrText xml:space="preserve"> PAGEREF _Toc242223243 \h </w:instrText>
+          <w:instrText xml:space="preserve"> PAGEREF _Toc242224247 \h </w:instrText>
         </w:r>
         <w:r>
           <w:rPr>
@@ -2734,7 +2734,7 @@
           <w14:ligatures w14:val="standardContextual"/>
         </w:rPr>
       </w:pPr>
-      <w:hyperlink w:anchor="_Toc242223244" w:history="1">
+      <w:hyperlink w:anchor="_Toc242224248" w:history="1">
         <w:r>
           <w:rPr>
             <w:rStyle w:val="Hyperlink"/>
@@ -2761,7 +2761,7 @@
             <w:noProof/>
             <w:webHidden/>
           </w:rPr>
-          <w:instrText xml:space="preserve"> PAGEREF _Toc242223244 \h </w:instrText>
+          <w:instrText xml:space="preserve"> PAGEREF _Toc242224248 \h </w:instrText>
         </w:r>
         <w:r>
           <w:rPr>
@@ -2806,7 +2806,7 @@
           <w14:ligatures w14:val="standardContextual"/>
         </w:rPr>
       </w:pPr>
-      <w:hyperlink w:anchor="_Toc242223245" w:history="1">
+      <w:hyperlink w:anchor="_Toc242224249" w:history="1">
         <w:r>
           <w:rPr>
             <w:rStyle w:val="Hyperlink"/>
@@ -2833,7 +2833,7 @@
             <w:noProof/>
             <w:webHidden/>
           </w:rPr>
-          <w:instrText xml:space="preserve"> PAGEREF _Toc242223245 \h </w:instrText>
+          <w:instrText xml:space="preserve"> PAGEREF _Toc242224249 \h </w:instrText>
         </w:r>
         <w:r>
           <w:rPr>
@@ -2878,7 +2878,7 @@
           <w14:ligatures w14:val="standardContextual"/>
         </w:rPr>
       </w:pPr>
-      <w:hyperlink w:anchor="_Toc242223246" w:history="1">
+      <w:hyperlink w:anchor="_Toc242224250" w:history="1">
         <w:r>
           <w:rPr>
             <w:rStyle w:val="Hyperlink"/>
@@ -2905,7 +2905,7 @@
             <w:noProof/>
             <w:webHidden/>
           </w:rPr>
-          <w:instrText xml:space="preserve"> PAGEREF _Toc242223246 \h </w:instrText>
+          <w:instrText xml:space="preserve"> PAGEREF _Toc242224250 \h </w:instrText>
         </w:r>
         <w:r>
           <w:rPr>
@@ -2950,7 +2950,7 @@
           <w14:ligatures w14:val="standardContextual"/>
         </w:rPr>
       </w:pPr>
-      <w:hyperlink w:anchor="_Toc242223247" w:history="1">
+      <w:hyperlink w:anchor="_Toc242224251" w:history="1">
         <w:r>
           <w:rPr>
             <w:rStyle w:val="Hyperlink"/>
@@ -2977,7 +2977,7 @@
             <w:noProof/>
             <w:webHidden/>
           </w:rPr>
-          <w:instrText xml:space="preserve"> PAGEREF _Toc242223247 \h </w:instrText>
+          <w:instrText xml:space="preserve"> PAGEREF _Toc242224251 \h </w:instrText>
         </w:r>
         <w:r>
           <w:rPr>
@@ -3050,7 +3050,7 @@
       <w:r>
         <w:fldChar w:fldCharType="separate"/>
       </w:r>
-      <w:hyperlink w:anchor="_Toc242223248" w:history="1">
+      <w:hyperlink w:anchor="_Toc242224252" w:history="1">
         <w:r>
           <w:rPr>
             <w:rStyle w:val="Hyperlink"/>
@@ -3077,7 +3077,7 @@
             <w:noProof/>
             <w:webHidden/>
           </w:rPr>
-          <w:instrText xml:space="preserve"> PAGEREF _Toc242223248 \h </w:instrText>
+          <w:instrText xml:space="preserve"> PAGEREF _Toc242224252 \h </w:instrText>
         </w:r>
         <w:r>
           <w:rPr>
@@ -3122,7 +3122,7 @@
           <w14:ligatures w14:val="standardContextual"/>
         </w:rPr>
       </w:pPr>
-      <w:hyperlink w:anchor="_Toc242223249" w:history="1">
+      <w:hyperlink w:anchor="_Toc242224253" w:history="1">
         <w:r>
           <w:rPr>
             <w:rStyle w:val="Hyperlink"/>
@@ -3149,7 +3149,7 @@
             <w:noProof/>
             <w:webHidden/>
           </w:rPr>
-          <w:instrText xml:space="preserve"> PAGEREF _Toc242223249 \h </w:instrText>
+          <w:instrText xml:space="preserve"> PAGEREF _Toc242224253 \h </w:instrText>
         </w:r>
         <w:r>
           <w:rPr>
@@ -3194,7 +3194,7 @@
           <w14:ligatures w14:val="standardContextual"/>
         </w:rPr>
       </w:pPr>
-      <w:hyperlink w:anchor="_Toc242223250" w:history="1">
+      <w:hyperlink w:anchor="_Toc242224254" w:history="1">
         <w:r>
           <w:rPr>
             <w:rStyle w:val="Hyperlink"/>
@@ -3221,7 +3221,7 @@
             <w:noProof/>
             <w:webHidden/>
           </w:rPr>
-          <w:instrText xml:space="preserve"> PAGEREF _Toc242223250 \h </w:instrText>
+          <w:instrText xml:space="preserve"> PAGEREF _Toc242224254 \h </w:instrText>
         </w:r>
         <w:r>
           <w:rPr>
@@ -3266,7 +3266,7 @@
           <w14:ligatures w14:val="standardContextual"/>
         </w:rPr>
       </w:pPr>
-      <w:hyperlink w:anchor="_Toc242223251" w:history="1">
+      <w:hyperlink w:anchor="_Toc242224255" w:history="1">
         <w:r>
           <w:rPr>
             <w:rStyle w:val="Hyperlink"/>
@@ -3293,7 +3293,7 @@
             <w:noProof/>
             <w:webHidden/>
           </w:rPr>
-          <w:instrText xml:space="preserve"> PAGEREF _Toc242223251 \h </w:instrText>
+          <w:instrText xml:space="preserve"> PAGEREF _Toc242224255 \h </w:instrText>
         </w:r>
         <w:r>
           <w:rPr>
@@ -3338,7 +3338,7 @@
           <w14:ligatures w14:val="standardContextual"/>
         </w:rPr>
       </w:pPr>
-      <w:hyperlink w:anchor="_Toc242223252" w:history="1">
+      <w:hyperlink w:anchor="_Toc242224256" w:history="1">
         <w:r>
           <w:rPr>
             <w:rStyle w:val="Hyperlink"/>
@@ -3365,7 +3365,7 @@
             <w:noProof/>
             <w:webHidden/>
           </w:rPr>
-          <w:instrText xml:space="preserve"> PAGEREF _Toc242223252 \h </w:instrText>
+          <w:instrText xml:space="preserve"> PAGEREF _Toc242224256 \h </w:instrText>
         </w:r>
         <w:r>
           <w:rPr>
@@ -3410,7 +3410,7 @@
           <w14:ligatures w14:val="standardContextual"/>
         </w:rPr>
       </w:pPr>
-      <w:hyperlink w:anchor="_Toc242223253" w:history="1">
+      <w:hyperlink w:anchor="_Toc242224257" w:history="1">
         <w:r>
           <w:rPr>
             <w:rStyle w:val="Hyperlink"/>
@@ -3437,7 +3437,7 @@
             <w:noProof/>
             <w:webHidden/>
           </w:rPr>
-          <w:instrText xml:space="preserve"> PAGEREF _Toc242223253 \h </w:instrText>
+          <w:instrText xml:space="preserve"> PAGEREF _Toc242224257 \h </w:instrText>
         </w:r>
         <w:r>
           <w:rPr>
@@ -3482,7 +3482,7 @@
           <w14:ligatures w14:val="standardContextual"/>
         </w:rPr>
       </w:pPr>
-      <w:hyperlink w:anchor="_Toc242223254" w:history="1">
+      <w:hyperlink w:anchor="_Toc242224258" w:history="1">
         <w:r>
           <w:rPr>
             <w:rStyle w:val="Hyperlink"/>
@@ -3509,7 +3509,7 @@
             <w:noProof/>
             <w:webHidden/>
           </w:rPr>
-          <w:instrText xml:space="preserve"> PAGEREF _Toc242223254 \h </w:instrText>
+          <w:instrText xml:space="preserve"> PAGEREF _Toc242224258 \h </w:instrText>
         </w:r>
         <w:r>
           <w:rPr>
@@ -3554,7 +3554,7 @@
           <w14:ligatures w14:val="standardContextual"/>
         </w:rPr>
       </w:pPr>
-      <w:hyperlink w:anchor="_Toc242223255" w:history="1">
+      <w:hyperlink w:anchor="_Toc242224259" w:history="1">
         <w:r>
           <w:rPr>
             <w:rStyle w:val="Hyperlink"/>
@@ -3581,7 +3581,7 @@
             <w:noProof/>
             <w:webHidden/>
           </w:rPr>
-          <w:instrText xml:space="preserve"> PAGEREF _Toc242223255 \h </w:instrText>
+          <w:instrText xml:space="preserve"> PAGEREF _Toc242224259 \h </w:instrText>
         </w:r>
         <w:r>
           <w:rPr>
@@ -3626,7 +3626,7 @@
           <w14:ligatures w14:val="standardContextual"/>
         </w:rPr>
       </w:pPr>
-      <w:hyperlink w:anchor="_Toc242223256" w:history="1">
+      <w:hyperlink w:anchor="_Toc242224260" w:history="1">
         <w:r>
           <w:rPr>
             <w:rStyle w:val="Hyperlink"/>
@@ -3653,7 +3653,7 @@
             <w:noProof/>
             <w:webHidden/>
           </w:rPr>
-          <w:instrText xml:space="preserve"> PAGEREF _Toc242223256 \h </w:instrText>
+          <w:instrText xml:space="preserve"> PAGEREF _Toc242224260 \h </w:instrText>
         </w:r>
         <w:r>
           <w:rPr>
@@ -3698,7 +3698,7 @@
       <w:pPr>
         <w:pStyle w:val="Heading1"/>
       </w:pPr>
-      <w:bookmarkStart w:id="0" w:name="_Toc242223207"/>
+      <w:bookmarkStart w:id="0" w:name="_Toc242224211"/>
       <w:r>
         <w:lastRenderedPageBreak/>
         <w:t>Execution and files</w:t>
@@ -3739,14 +3739,14 @@
     </w:p>
     <w:p>
       <w:r>
-        <w:t>Open a task notebook in Google Colab and upload the files requested by its first cell: Task 01, WordOccurrenceDataset.txt; Task 02, MatData.txt; Task 03, passwords.txt and expected_passwords.txt; Task 04, lodepng.cpp and lodepng.h. Task 04 downloads download.png from its public URL. Run all cells to compile the program and display the output. Use a T4 GPU for the CUDA tasks. All four notebook links allow anyone with the link to view and copy the code. The GitHub project contains the source and resources.</w:t>
+        <w:t>All four Colab notebooks are shared as Viewer with anyone who has the link. Save a copy in your own Google Drive to run the cells. Upload the files requested by the first cell: Task 01, WordOccurrenceDataset.txt; Task 02, MatData.txt; Task 03, passwords.txt and expected_passwords.txt; Task 04, lodepng.cpp and lodepng.h. Task 04 downloads download.png from its public URL. Run all cells to compile the program and display the output. Select a T4 GPU for the CUDA tasks. The public GitHub download page contains the input files, source code, saved outputs and recordings.</w:t>
       </w:r>
     </w:p>
     <w:p>
       <w:pPr>
         <w:pStyle w:val="Heading1"/>
       </w:pPr>
-      <w:bookmarkStart w:id="1" w:name="_Toc242223208"/>
+      <w:bookmarkStart w:id="1" w:name="_Toc242224212"/>
       <w:r>
         <w:t>Validation result</w:t>
       </w:r>
@@ -3762,7 +3762,7 @@
         <w:pStyle w:val="Heading1"/>
         <w:pageBreakBefore/>
       </w:pPr>
-      <w:bookmarkStart w:id="2" w:name="_Toc242223209"/>
+      <w:bookmarkStart w:id="2" w:name="_Toc242224213"/>
       <w:r>
         <w:lastRenderedPageBreak/>
         <w:t>Task 01 Word Occurrence Counting using Multithreading</w:t>
@@ -3795,7 +3795,7 @@
       <w:pPr>
         <w:pStyle w:val="Heading2"/>
       </w:pPr>
-      <w:bookmarkStart w:id="3" w:name="_Toc242223210"/>
+      <w:bookmarkStart w:id="3" w:name="_Toc242224214"/>
       <w:r>
         <w:t>Objective</w:t>
       </w:r>
@@ -3810,7 +3810,7 @@
       <w:pPr>
         <w:pStyle w:val="Heading2"/>
       </w:pPr>
-      <w:bookmarkStart w:id="4" w:name="_Toc242223211"/>
+      <w:bookmarkStart w:id="4" w:name="_Toc242224215"/>
       <w:r>
         <w:t>Implementation</w:t>
       </w:r>
@@ -3835,7 +3835,7 @@
       <w:pPr>
         <w:pStyle w:val="Heading2"/>
       </w:pPr>
-      <w:bookmarkStart w:id="5" w:name="_Toc242223212"/>
+      <w:bookmarkStart w:id="5" w:name="_Toc242224216"/>
       <w:r>
         <w:lastRenderedPageBreak/>
         <w:t>Code I implemented</w:t>
@@ -3893,7 +3893,7 @@
         <w:pStyle w:val="Caption"/>
         <w:keepNext/>
       </w:pPr>
-      <w:bookmarkStart w:id="6" w:name="_Toc242223248"/>
+      <w:bookmarkStart w:id="6" w:name="_Toc242224252"/>
       <w:r>
         <w:t xml:space="preserve">Figure </w:t>
       </w:r>
@@ -3924,7 +3924,7 @@
       <w:pPr>
         <w:pStyle w:val="Heading2"/>
       </w:pPr>
-      <w:bookmarkStart w:id="7" w:name="_Toc242223213"/>
+      <w:bookmarkStart w:id="7" w:name="_Toc242224217"/>
       <w:r>
         <w:t>Synchronisation and memory</w:t>
       </w:r>
@@ -3944,7 +3944,7 @@
       <w:pPr>
         <w:pStyle w:val="Heading2"/>
       </w:pPr>
-      <w:bookmarkStart w:id="8" w:name="_Toc242223214"/>
+      <w:bookmarkStart w:id="8" w:name="_Toc242224218"/>
       <w:r>
         <w:lastRenderedPageBreak/>
         <w:t>Build and run</w:t>
@@ -3977,7 +3977,7 @@
       <w:pPr>
         <w:pStyle w:val="Heading2"/>
       </w:pPr>
-      <w:bookmarkStart w:id="9" w:name="_Toc242223215"/>
+      <w:bookmarkStart w:id="9" w:name="_Toc242224219"/>
       <w:r>
         <w:t>Results and tests</w:t>
       </w:r>
@@ -4002,7 +4002,7 @@
       <w:pPr>
         <w:pStyle w:val="Heading2"/>
       </w:pPr>
-      <w:bookmarkStart w:id="10" w:name="_Toc242223216"/>
+      <w:bookmarkStart w:id="10" w:name="_Toc242224220"/>
       <w:r>
         <w:t>Performance and limits</w:t>
       </w:r>
@@ -4023,7 +4023,7 @@
         <w:pStyle w:val="Heading2"/>
         <w:pageBreakBefore/>
       </w:pPr>
-      <w:bookmarkStart w:id="11" w:name="_Toc242223217"/>
+      <w:bookmarkStart w:id="11" w:name="_Toc242224221"/>
       <w:r>
         <w:lastRenderedPageBreak/>
         <w:t>Colab execution evidence</w:t>
@@ -4081,7 +4081,7 @@
         <w:pStyle w:val="Caption"/>
         <w:keepNext/>
       </w:pPr>
-      <w:bookmarkStart w:id="12" w:name="_Toc242223249"/>
+      <w:bookmarkStart w:id="12" w:name="_Toc242224253"/>
       <w:r>
         <w:t xml:space="preserve">Figure </w:t>
       </w:r>
@@ -4108,7 +4108,7 @@
         <w:pStyle w:val="Heading1"/>
         <w:pageBreakBefore/>
       </w:pPr>
-      <w:bookmarkStart w:id="13" w:name="_Toc242223218"/>
+      <w:bookmarkStart w:id="13" w:name="_Toc242224222"/>
       <w:r>
         <w:lastRenderedPageBreak/>
         <w:t>Task 02 Multiple operations with Matrices using multithreading</w:t>
@@ -4141,7 +4141,7 @@
       <w:pPr>
         <w:pStyle w:val="Heading2"/>
       </w:pPr>
-      <w:bookmarkStart w:id="14" w:name="_Toc242223219"/>
+      <w:bookmarkStart w:id="14" w:name="_Toc242224223"/>
       <w:r>
         <w:t>Objective</w:t>
       </w:r>
@@ -4156,7 +4156,7 @@
       <w:pPr>
         <w:pStyle w:val="Heading2"/>
       </w:pPr>
-      <w:bookmarkStart w:id="15" w:name="_Toc242223220"/>
+      <w:bookmarkStart w:id="15" w:name="_Toc242224224"/>
       <w:r>
         <w:t>Implementation</w:t>
       </w:r>
@@ -4181,7 +4181,7 @@
       <w:pPr>
         <w:pStyle w:val="Heading2"/>
       </w:pPr>
-      <w:bookmarkStart w:id="16" w:name="_Toc242223221"/>
+      <w:bookmarkStart w:id="16" w:name="_Toc242224225"/>
       <w:r>
         <w:lastRenderedPageBreak/>
         <w:t>Code I implemented</w:t>
@@ -4239,7 +4239,7 @@
         <w:pStyle w:val="Caption"/>
         <w:keepNext/>
       </w:pPr>
-      <w:bookmarkStart w:id="17" w:name="_Toc242223250"/>
+      <w:bookmarkStart w:id="17" w:name="_Toc242224254"/>
       <w:r>
         <w:t xml:space="preserve">Figure </w:t>
       </w:r>
@@ -4270,7 +4270,7 @@
       <w:pPr>
         <w:pStyle w:val="Heading2"/>
       </w:pPr>
-      <w:bookmarkStart w:id="18" w:name="_Toc242223222"/>
+      <w:bookmarkStart w:id="18" w:name="_Toc242224226"/>
       <w:r>
         <w:t>Synchronisation and memory</w:t>
       </w:r>
@@ -4295,7 +4295,7 @@
       <w:pPr>
         <w:pStyle w:val="Heading2"/>
       </w:pPr>
-      <w:bookmarkStart w:id="19" w:name="_Toc242223223"/>
+      <w:bookmarkStart w:id="19" w:name="_Toc242224227"/>
       <w:r>
         <w:lastRenderedPageBreak/>
         <w:t>Build and run</w:t>
@@ -4328,7 +4328,7 @@
       <w:pPr>
         <w:pStyle w:val="Heading2"/>
       </w:pPr>
-      <w:bookmarkStart w:id="20" w:name="_Toc242223224"/>
+      <w:bookmarkStart w:id="20" w:name="_Toc242224228"/>
       <w:r>
         <w:t>Results and tests</w:t>
       </w:r>
@@ -4413,7 +4413,7 @@
       <w:pPr>
         <w:pStyle w:val="Heading2"/>
       </w:pPr>
-      <w:bookmarkStart w:id="21" w:name="_Toc242223225"/>
+      <w:bookmarkStart w:id="21" w:name="_Toc242224229"/>
       <w:r>
         <w:t>Performance and limits</w:t>
       </w:r>
@@ -4434,7 +4434,7 @@
         <w:pStyle w:val="Heading2"/>
         <w:pageBreakBefore/>
       </w:pPr>
-      <w:bookmarkStart w:id="22" w:name="_Toc242223226"/>
+      <w:bookmarkStart w:id="22" w:name="_Toc242224230"/>
       <w:r>
         <w:lastRenderedPageBreak/>
         <w:t>Colab execution evidence</w:t>
@@ -4492,7 +4492,7 @@
         <w:pStyle w:val="Caption"/>
         <w:keepNext/>
       </w:pPr>
-      <w:bookmarkStart w:id="23" w:name="_Toc242223251"/>
+      <w:bookmarkStart w:id="23" w:name="_Toc242224255"/>
       <w:r>
         <w:t xml:space="preserve">Figure </w:t>
       </w:r>
@@ -4519,7 +4519,7 @@
         <w:pStyle w:val="Heading1"/>
         <w:pageBreakBefore/>
       </w:pPr>
-      <w:bookmarkStart w:id="24" w:name="_Toc242223227"/>
+      <w:bookmarkStart w:id="24" w:name="_Toc242224231"/>
       <w:r>
         <w:lastRenderedPageBreak/>
         <w:t>Task 03 Password Cracking with Files using CUDA</w:t>
@@ -4552,7 +4552,7 @@
       <w:pPr>
         <w:pStyle w:val="Heading2"/>
       </w:pPr>
-      <w:bookmarkStart w:id="25" w:name="_Toc242223228"/>
+      <w:bookmarkStart w:id="25" w:name="_Toc242224232"/>
       <w:r>
         <w:t>Objective</w:t>
       </w:r>
@@ -4567,7 +4567,7 @@
       <w:pPr>
         <w:pStyle w:val="Heading2"/>
       </w:pPr>
-      <w:bookmarkStart w:id="26" w:name="_Toc242223229"/>
+      <w:bookmarkStart w:id="26" w:name="_Toc242224233"/>
       <w:r>
         <w:t>Implementation</w:t>
       </w:r>
@@ -4597,7 +4597,7 @@
       <w:pPr>
         <w:pStyle w:val="Heading2"/>
       </w:pPr>
-      <w:bookmarkStart w:id="27" w:name="_Toc242223230"/>
+      <w:bookmarkStart w:id="27" w:name="_Toc242224234"/>
       <w:r>
         <w:lastRenderedPageBreak/>
         <w:t>Code I implemented</w:t>
@@ -4655,7 +4655,7 @@
         <w:pStyle w:val="Caption"/>
         <w:keepNext/>
       </w:pPr>
-      <w:bookmarkStart w:id="28" w:name="_Toc242223252"/>
+      <w:bookmarkStart w:id="28" w:name="_Toc242224256"/>
       <w:r>
         <w:t xml:space="preserve">Figure </w:t>
       </w:r>
@@ -4686,7 +4686,7 @@
       <w:pPr>
         <w:pStyle w:val="Heading2"/>
       </w:pPr>
-      <w:bookmarkStart w:id="29" w:name="_Toc242223231"/>
+      <w:bookmarkStart w:id="29" w:name="_Toc242224235"/>
       <w:r>
         <w:t>Synchronisation and memory</w:t>
       </w:r>
@@ -4706,7 +4706,7 @@
       <w:pPr>
         <w:pStyle w:val="Heading2"/>
       </w:pPr>
-      <w:bookmarkStart w:id="30" w:name="_Toc242223232"/>
+      <w:bookmarkStart w:id="30" w:name="_Toc242224236"/>
       <w:r>
         <w:lastRenderedPageBreak/>
         <w:t>Build and run</w:t>
@@ -4739,7 +4739,7 @@
       <w:pPr>
         <w:pStyle w:val="Heading2"/>
       </w:pPr>
-      <w:bookmarkStart w:id="31" w:name="_Toc242223233"/>
+      <w:bookmarkStart w:id="31" w:name="_Toc242224237"/>
       <w:r>
         <w:t>Results and tests</w:t>
       </w:r>
@@ -4868,7 +4868,7 @@
       <w:pPr>
         <w:pStyle w:val="Heading2"/>
       </w:pPr>
-      <w:bookmarkStart w:id="32" w:name="_Toc242223234"/>
+      <w:bookmarkStart w:id="32" w:name="_Toc242224238"/>
       <w:r>
         <w:t>Performance and limits</w:t>
       </w:r>
@@ -4889,7 +4889,7 @@
         <w:pStyle w:val="Heading2"/>
         <w:pageBreakBefore/>
       </w:pPr>
-      <w:bookmarkStart w:id="33" w:name="_Toc242223235"/>
+      <w:bookmarkStart w:id="33" w:name="_Toc242224239"/>
       <w:r>
         <w:lastRenderedPageBreak/>
         <w:t>Colab execution evidence</w:t>
@@ -4947,7 +4947,7 @@
         <w:pStyle w:val="Caption"/>
         <w:keepNext/>
       </w:pPr>
-      <w:bookmarkStart w:id="34" w:name="_Toc242223253"/>
+      <w:bookmarkStart w:id="34" w:name="_Toc242224257"/>
       <w:r>
         <w:t xml:space="preserve">Figure </w:t>
       </w:r>
@@ -4974,7 +4974,7 @@
         <w:pStyle w:val="Heading1"/>
         <w:pageBreakBefore/>
       </w:pPr>
-      <w:bookmarkStart w:id="35" w:name="_Toc242223236"/>
+      <w:bookmarkStart w:id="35" w:name="_Toc242224240"/>
       <w:r>
         <w:lastRenderedPageBreak/>
         <w:t>Task 04</w:t>
@@ -5011,7 +5011,7 @@
       <w:pPr>
         <w:pStyle w:val="Heading2"/>
       </w:pPr>
-      <w:bookmarkStart w:id="36" w:name="_Toc242223237"/>
+      <w:bookmarkStart w:id="36" w:name="_Toc242224241"/>
       <w:r>
         <w:t>Objective</w:t>
       </w:r>
@@ -5026,7 +5026,7 @@
       <w:pPr>
         <w:pStyle w:val="Heading2"/>
       </w:pPr>
-      <w:bookmarkStart w:id="37" w:name="_Toc242223238"/>
+      <w:bookmarkStart w:id="37" w:name="_Toc242224242"/>
       <w:r>
         <w:t>Implementation</w:t>
       </w:r>
@@ -5056,7 +5056,7 @@
       <w:pPr>
         <w:pStyle w:val="Heading2"/>
       </w:pPr>
-      <w:bookmarkStart w:id="38" w:name="_Toc242223239"/>
+      <w:bookmarkStart w:id="38" w:name="_Toc242224243"/>
       <w:r>
         <w:lastRenderedPageBreak/>
         <w:t>Code I implemented</w:t>
@@ -5114,7 +5114,7 @@
         <w:pStyle w:val="Caption"/>
         <w:keepNext/>
       </w:pPr>
-      <w:bookmarkStart w:id="39" w:name="_Toc242223254"/>
+      <w:bookmarkStart w:id="39" w:name="_Toc242224258"/>
       <w:r>
         <w:t xml:space="preserve">Figure </w:t>
       </w:r>
@@ -5145,7 +5145,7 @@
       <w:pPr>
         <w:pStyle w:val="Heading2"/>
       </w:pPr>
-      <w:bookmarkStart w:id="40" w:name="_Toc242223240"/>
+      <w:bookmarkStart w:id="40" w:name="_Toc242224244"/>
       <w:r>
         <w:t>Synchronisation and memory</w:t>
       </w:r>
@@ -5171,7 +5171,7 @@
       <w:pPr>
         <w:pStyle w:val="Heading2"/>
       </w:pPr>
-      <w:bookmarkStart w:id="41" w:name="_Toc242223241"/>
+      <w:bookmarkStart w:id="41" w:name="_Toc242224245"/>
       <w:r>
         <w:t>Build and run</w:t>
       </w:r>
@@ -5214,7 +5214,7 @@
       <w:pPr>
         <w:pStyle w:val="Heading2"/>
       </w:pPr>
-      <w:bookmarkStart w:id="42" w:name="_Toc242223242"/>
+      <w:bookmarkStart w:id="42" w:name="_Toc242224246"/>
       <w:r>
         <w:t>Results and tests</w:t>
       </w:r>
@@ -5239,7 +5239,7 @@
       <w:pPr>
         <w:pStyle w:val="Heading2"/>
       </w:pPr>
-      <w:bookmarkStart w:id="43" w:name="_Toc242223243"/>
+      <w:bookmarkStart w:id="43" w:name="_Toc242224247"/>
       <w:r>
         <w:t>Performance and limits</w:t>
       </w:r>
@@ -5260,7 +5260,7 @@
         <w:pStyle w:val="Heading2"/>
         <w:pageBreakBefore/>
       </w:pPr>
-      <w:bookmarkStart w:id="44" w:name="_Toc242223244"/>
+      <w:bookmarkStart w:id="44" w:name="_Toc242224248"/>
       <w:r>
         <w:lastRenderedPageBreak/>
         <w:t>Colab execution evidence</w:t>
@@ -5318,7 +5318,7 @@
         <w:pStyle w:val="Caption"/>
         <w:keepNext/>
       </w:pPr>
-      <w:bookmarkStart w:id="45" w:name="_Toc242223255"/>
+      <w:bookmarkStart w:id="45" w:name="_Toc242224259"/>
       <w:r>
         <w:t xml:space="preserve">Figure </w:t>
       </w:r>
@@ -5345,7 +5345,7 @@
         <w:pStyle w:val="Heading2"/>
         <w:pageBreakBefore/>
       </w:pPr>
-      <w:bookmarkStart w:id="46" w:name="_Toc242223245"/>
+      <w:bookmarkStart w:id="46" w:name="_Toc242224249"/>
       <w:r>
         <w:lastRenderedPageBreak/>
         <w:t>Task 04 image outputs</w:t>
@@ -5403,7 +5403,7 @@
         <w:pStyle w:val="Caption"/>
         <w:keepNext/>
       </w:pPr>
-      <w:bookmarkStart w:id="47" w:name="_Toc242223256"/>
+      <w:bookmarkStart w:id="47" w:name="_Toc242224260"/>
       <w:r>
         <w:t xml:space="preserve">Figure </w:t>
       </w:r>
@@ -5430,7 +5430,7 @@
         <w:pStyle w:val="Heading1"/>
         <w:pageBreakBefore/>
       </w:pPr>
-      <w:bookmarkStart w:id="48" w:name="_Toc242223246"/>
+      <w:bookmarkStart w:id="48" w:name="_Toc242224250"/>
       <w:r>
         <w:lastRenderedPageBreak/>
         <w:t>Evidence and submission</w:t>
@@ -5449,14 +5449,14 @@
     </w:p>
     <w:p>
       <w:r>
-        <w:t>Each task is packaged separately with its C or CUDA source, notebook and resources. A complete portfolio archive also contains this report and all four task folders. Video evidence is kept locally in the evidence directory; large recording files are excluded from Git history.</w:t>
+        <w:t>Each task is packaged separately with its C or CUDA source, notebook and resources. The public GitHub download page provides this Word report, the complete submission archive, the four task archives and all four execution recordings. Anyone with the link can download these files without requesting access.</w:t>
       </w:r>
     </w:p>
     <w:p>
       <w:pPr>
         <w:pStyle w:val="Heading1"/>
       </w:pPr>
-      <w:bookmarkStart w:id="49" w:name="_Toc242223247"/>
+      <w:bookmarkStart w:id="49" w:name="_Toc242224251"/>
       <w:r>
         <w:t>References</w:t>
       </w:r>
@@ -5484,7 +5484,7 @@
     </w:p>
     <w:p>
       <w:r>
-        <w:t>Lecturer source collection. code sir.txt; CryptForCuda.c; PasswordGeneratorToText.c; OMPMatSumFromFile.c.txt; Negative.cu; last-class SobelEdge.cu PNG/grayscale example supplied as pasted text. Supplied teaching examples.</w:t>
+        <w:t>Lecturer source collection. code sir.txt; CryptForCuda.c; PasswordGeneratorToText.c; OMPMatSumFromFile.c.txt; Negative.cu; last-class SobelEdge.cu PNG/grayscale example. Supplied teaching examples.</w:t>
       </w:r>
     </w:p>
     <w:p>

</xml_diff>

<commit_message>
Load Colab task resources automatically from public GitHub
</commit_message>
<xml_diff>
--- a/2638120_Thaslim_Mohammed_Sahl_High_Performance_Computing.docx
+++ b/2638120_Thaslim_Mohammed_Sahl_High_Performance_Computing.docx
@@ -70,7 +70,7 @@
       <w:r>
         <w:fldChar w:fldCharType="separate"/>
       </w:r>
-      <w:hyperlink w:anchor="_Toc242224211" w:history="1">
+      <w:hyperlink w:anchor="_Toc242266769" w:history="1">
         <w:r>
           <w:rPr>
             <w:rStyle w:val="Hyperlink"/>
@@ -97,7 +97,7 @@
             <w:noProof/>
             <w:webHidden/>
           </w:rPr>
-          <w:instrText xml:space="preserve"> PAGEREF _Toc242224211 \h </w:instrText>
+          <w:instrText xml:space="preserve"> PAGEREF _Toc242266769 \h </w:instrText>
         </w:r>
         <w:r>
           <w:rPr>
@@ -142,7 +142,7 @@
           <w14:ligatures w14:val="standardContextual"/>
         </w:rPr>
       </w:pPr>
-      <w:hyperlink w:anchor="_Toc242224212" w:history="1">
+      <w:hyperlink w:anchor="_Toc242266770" w:history="1">
         <w:r>
           <w:rPr>
             <w:rStyle w:val="Hyperlink"/>
@@ -169,7 +169,7 @@
             <w:noProof/>
             <w:webHidden/>
           </w:rPr>
-          <w:instrText xml:space="preserve"> PAGEREF _Toc242224212 \h </w:instrText>
+          <w:instrText xml:space="preserve"> PAGEREF _Toc242266770 \h </w:instrText>
         </w:r>
         <w:r>
           <w:rPr>
@@ -214,7 +214,7 @@
           <w14:ligatures w14:val="standardContextual"/>
         </w:rPr>
       </w:pPr>
-      <w:hyperlink w:anchor="_Toc242224213" w:history="1">
+      <w:hyperlink w:anchor="_Toc242266771" w:history="1">
         <w:r>
           <w:rPr>
             <w:rStyle w:val="Hyperlink"/>
@@ -241,7 +241,7 @@
             <w:noProof/>
             <w:webHidden/>
           </w:rPr>
-          <w:instrText xml:space="preserve"> PAGEREF _Toc242224213 \h </w:instrText>
+          <w:instrText xml:space="preserve"> PAGEREF _Toc242266771 \h </w:instrText>
         </w:r>
         <w:r>
           <w:rPr>
@@ -286,7 +286,7 @@
           <w14:ligatures w14:val="standardContextual"/>
         </w:rPr>
       </w:pPr>
-      <w:hyperlink w:anchor="_Toc242224214" w:history="1">
+      <w:hyperlink w:anchor="_Toc242266772" w:history="1">
         <w:r>
           <w:rPr>
             <w:rStyle w:val="Hyperlink"/>
@@ -313,7 +313,7 @@
             <w:noProof/>
             <w:webHidden/>
           </w:rPr>
-          <w:instrText xml:space="preserve"> PAGEREF _Toc242224214 \h </w:instrText>
+          <w:instrText xml:space="preserve"> PAGEREF _Toc242266772 \h </w:instrText>
         </w:r>
         <w:r>
           <w:rPr>
@@ -358,7 +358,7 @@
           <w14:ligatures w14:val="standardContextual"/>
         </w:rPr>
       </w:pPr>
-      <w:hyperlink w:anchor="_Toc242224215" w:history="1">
+      <w:hyperlink w:anchor="_Toc242266773" w:history="1">
         <w:r>
           <w:rPr>
             <w:rStyle w:val="Hyperlink"/>
@@ -385,7 +385,7 @@
             <w:noProof/>
             <w:webHidden/>
           </w:rPr>
-          <w:instrText xml:space="preserve"> PAGEREF _Toc242224215 \h </w:instrText>
+          <w:instrText xml:space="preserve"> PAGEREF _Toc242266773 \h </w:instrText>
         </w:r>
         <w:r>
           <w:rPr>
@@ -430,7 +430,7 @@
           <w14:ligatures w14:val="standardContextual"/>
         </w:rPr>
       </w:pPr>
-      <w:hyperlink w:anchor="_Toc242224216" w:history="1">
+      <w:hyperlink w:anchor="_Toc242266774" w:history="1">
         <w:r>
           <w:rPr>
             <w:rStyle w:val="Hyperlink"/>
@@ -457,7 +457,7 @@
             <w:noProof/>
             <w:webHidden/>
           </w:rPr>
-          <w:instrText xml:space="preserve"> PAGEREF _Toc242224216 \h </w:instrText>
+          <w:instrText xml:space="preserve"> PAGEREF _Toc242266774 \h </w:instrText>
         </w:r>
         <w:r>
           <w:rPr>
@@ -502,7 +502,7 @@
           <w14:ligatures w14:val="standardContextual"/>
         </w:rPr>
       </w:pPr>
-      <w:hyperlink w:anchor="_Toc242224217" w:history="1">
+      <w:hyperlink w:anchor="_Toc242266775" w:history="1">
         <w:r>
           <w:rPr>
             <w:rStyle w:val="Hyperlink"/>
@@ -529,7 +529,7 @@
             <w:noProof/>
             <w:webHidden/>
           </w:rPr>
-          <w:instrText xml:space="preserve"> PAGEREF _Toc242224217 \h </w:instrText>
+          <w:instrText xml:space="preserve"> PAGEREF _Toc242266775 \h </w:instrText>
         </w:r>
         <w:r>
           <w:rPr>
@@ -574,7 +574,7 @@
           <w14:ligatures w14:val="standardContextual"/>
         </w:rPr>
       </w:pPr>
-      <w:hyperlink w:anchor="_Toc242224218" w:history="1">
+      <w:hyperlink w:anchor="_Toc242266776" w:history="1">
         <w:r>
           <w:rPr>
             <w:rStyle w:val="Hyperlink"/>
@@ -601,7 +601,7 @@
             <w:noProof/>
             <w:webHidden/>
           </w:rPr>
-          <w:instrText xml:space="preserve"> PAGEREF _Toc242224218 \h </w:instrText>
+          <w:instrText xml:space="preserve"> PAGEREF _Toc242266776 \h </w:instrText>
         </w:r>
         <w:r>
           <w:rPr>
@@ -646,7 +646,7 @@
           <w14:ligatures w14:val="standardContextual"/>
         </w:rPr>
       </w:pPr>
-      <w:hyperlink w:anchor="_Toc242224219" w:history="1">
+      <w:hyperlink w:anchor="_Toc242266777" w:history="1">
         <w:r>
           <w:rPr>
             <w:rStyle w:val="Hyperlink"/>
@@ -673,7 +673,7 @@
             <w:noProof/>
             <w:webHidden/>
           </w:rPr>
-          <w:instrText xml:space="preserve"> PAGEREF _Toc242224219 \h </w:instrText>
+          <w:instrText xml:space="preserve"> PAGEREF _Toc242266777 \h </w:instrText>
         </w:r>
         <w:r>
           <w:rPr>
@@ -718,7 +718,7 @@
           <w14:ligatures w14:val="standardContextual"/>
         </w:rPr>
       </w:pPr>
-      <w:hyperlink w:anchor="_Toc242224220" w:history="1">
+      <w:hyperlink w:anchor="_Toc242266778" w:history="1">
         <w:r>
           <w:rPr>
             <w:rStyle w:val="Hyperlink"/>
@@ -745,7 +745,7 @@
             <w:noProof/>
             <w:webHidden/>
           </w:rPr>
-          <w:instrText xml:space="preserve"> PAGEREF _Toc242224220 \h </w:instrText>
+          <w:instrText xml:space="preserve"> PAGEREF _Toc242266778 \h </w:instrText>
         </w:r>
         <w:r>
           <w:rPr>
@@ -790,7 +790,7 @@
           <w14:ligatures w14:val="standardContextual"/>
         </w:rPr>
       </w:pPr>
-      <w:hyperlink w:anchor="_Toc242224221" w:history="1">
+      <w:hyperlink w:anchor="_Toc242266779" w:history="1">
         <w:r>
           <w:rPr>
             <w:rStyle w:val="Hyperlink"/>
@@ -817,7 +817,7 @@
             <w:noProof/>
             <w:webHidden/>
           </w:rPr>
-          <w:instrText xml:space="preserve"> PAGEREF _Toc242224221 \h </w:instrText>
+          <w:instrText xml:space="preserve"> PAGEREF _Toc242266779 \h </w:instrText>
         </w:r>
         <w:r>
           <w:rPr>
@@ -862,7 +862,7 @@
           <w14:ligatures w14:val="standardContextual"/>
         </w:rPr>
       </w:pPr>
-      <w:hyperlink w:anchor="_Toc242224222" w:history="1">
+      <w:hyperlink w:anchor="_Toc242266780" w:history="1">
         <w:r>
           <w:rPr>
             <w:rStyle w:val="Hyperlink"/>
@@ -889,7 +889,7 @@
             <w:noProof/>
             <w:webHidden/>
           </w:rPr>
-          <w:instrText xml:space="preserve"> PAGEREF _Toc242224222 \h </w:instrText>
+          <w:instrText xml:space="preserve"> PAGEREF _Toc242266780 \h </w:instrText>
         </w:r>
         <w:r>
           <w:rPr>
@@ -934,7 +934,7 @@
           <w14:ligatures w14:val="standardContextual"/>
         </w:rPr>
       </w:pPr>
-      <w:hyperlink w:anchor="_Toc242224223" w:history="1">
+      <w:hyperlink w:anchor="_Toc242266781" w:history="1">
         <w:r>
           <w:rPr>
             <w:rStyle w:val="Hyperlink"/>
@@ -961,7 +961,7 @@
             <w:noProof/>
             <w:webHidden/>
           </w:rPr>
-          <w:instrText xml:space="preserve"> PAGEREF _Toc242224223 \h </w:instrText>
+          <w:instrText xml:space="preserve"> PAGEREF _Toc242266781 \h </w:instrText>
         </w:r>
         <w:r>
           <w:rPr>
@@ -1006,7 +1006,7 @@
           <w14:ligatures w14:val="standardContextual"/>
         </w:rPr>
       </w:pPr>
-      <w:hyperlink w:anchor="_Toc242224224" w:history="1">
+      <w:hyperlink w:anchor="_Toc242266782" w:history="1">
         <w:r>
           <w:rPr>
             <w:rStyle w:val="Hyperlink"/>
@@ -1033,7 +1033,7 @@
             <w:noProof/>
             <w:webHidden/>
           </w:rPr>
-          <w:instrText xml:space="preserve"> PAGEREF _Toc242224224 \h </w:instrText>
+          <w:instrText xml:space="preserve"> PAGEREF _Toc242266782 \h </w:instrText>
         </w:r>
         <w:r>
           <w:rPr>
@@ -1078,7 +1078,7 @@
           <w14:ligatures w14:val="standardContextual"/>
         </w:rPr>
       </w:pPr>
-      <w:hyperlink w:anchor="_Toc242224225" w:history="1">
+      <w:hyperlink w:anchor="_Toc242266783" w:history="1">
         <w:r>
           <w:rPr>
             <w:rStyle w:val="Hyperlink"/>
@@ -1105,7 +1105,7 @@
             <w:noProof/>
             <w:webHidden/>
           </w:rPr>
-          <w:instrText xml:space="preserve"> PAGEREF _Toc242224225 \h </w:instrText>
+          <w:instrText xml:space="preserve"> PAGEREF _Toc242266783 \h </w:instrText>
         </w:r>
         <w:r>
           <w:rPr>
@@ -1150,7 +1150,7 @@
           <w14:ligatures w14:val="standardContextual"/>
         </w:rPr>
       </w:pPr>
-      <w:hyperlink w:anchor="_Toc242224226" w:history="1">
+      <w:hyperlink w:anchor="_Toc242266784" w:history="1">
         <w:r>
           <w:rPr>
             <w:rStyle w:val="Hyperlink"/>
@@ -1177,7 +1177,7 @@
             <w:noProof/>
             <w:webHidden/>
           </w:rPr>
-          <w:instrText xml:space="preserve"> PAGEREF _Toc242224226 \h </w:instrText>
+          <w:instrText xml:space="preserve"> PAGEREF _Toc242266784 \h </w:instrText>
         </w:r>
         <w:r>
           <w:rPr>
@@ -1222,7 +1222,7 @@
           <w14:ligatures w14:val="standardContextual"/>
         </w:rPr>
       </w:pPr>
-      <w:hyperlink w:anchor="_Toc242224227" w:history="1">
+      <w:hyperlink w:anchor="_Toc242266785" w:history="1">
         <w:r>
           <w:rPr>
             <w:rStyle w:val="Hyperlink"/>
@@ -1249,7 +1249,7 @@
             <w:noProof/>
             <w:webHidden/>
           </w:rPr>
-          <w:instrText xml:space="preserve"> PAGEREF _Toc242224227 \h </w:instrText>
+          <w:instrText xml:space="preserve"> PAGEREF _Toc242266785 \h </w:instrText>
         </w:r>
         <w:r>
           <w:rPr>
@@ -1294,7 +1294,7 @@
           <w14:ligatures w14:val="standardContextual"/>
         </w:rPr>
       </w:pPr>
-      <w:hyperlink w:anchor="_Toc242224228" w:history="1">
+      <w:hyperlink w:anchor="_Toc242266786" w:history="1">
         <w:r>
           <w:rPr>
             <w:rStyle w:val="Hyperlink"/>
@@ -1321,7 +1321,7 @@
             <w:noProof/>
             <w:webHidden/>
           </w:rPr>
-          <w:instrText xml:space="preserve"> PAGEREF _Toc242224228 \h </w:instrText>
+          <w:instrText xml:space="preserve"> PAGEREF _Toc242266786 \h </w:instrText>
         </w:r>
         <w:r>
           <w:rPr>
@@ -1366,7 +1366,7 @@
           <w14:ligatures w14:val="standardContextual"/>
         </w:rPr>
       </w:pPr>
-      <w:hyperlink w:anchor="_Toc242224229" w:history="1">
+      <w:hyperlink w:anchor="_Toc242266787" w:history="1">
         <w:r>
           <w:rPr>
             <w:rStyle w:val="Hyperlink"/>
@@ -1393,7 +1393,7 @@
             <w:noProof/>
             <w:webHidden/>
           </w:rPr>
-          <w:instrText xml:space="preserve"> PAGEREF _Toc242224229 \h </w:instrText>
+          <w:instrText xml:space="preserve"> PAGEREF _Toc242266787 \h </w:instrText>
         </w:r>
         <w:r>
           <w:rPr>
@@ -1438,7 +1438,7 @@
           <w14:ligatures w14:val="standardContextual"/>
         </w:rPr>
       </w:pPr>
-      <w:hyperlink w:anchor="_Toc242224230" w:history="1">
+      <w:hyperlink w:anchor="_Toc242266788" w:history="1">
         <w:r>
           <w:rPr>
             <w:rStyle w:val="Hyperlink"/>
@@ -1465,7 +1465,7 @@
             <w:noProof/>
             <w:webHidden/>
           </w:rPr>
-          <w:instrText xml:space="preserve"> PAGEREF _Toc242224230 \h </w:instrText>
+          <w:instrText xml:space="preserve"> PAGEREF _Toc242266788 \h </w:instrText>
         </w:r>
         <w:r>
           <w:rPr>
@@ -1510,7 +1510,7 @@
           <w14:ligatures w14:val="standardContextual"/>
         </w:rPr>
       </w:pPr>
-      <w:hyperlink w:anchor="_Toc242224231" w:history="1">
+      <w:hyperlink w:anchor="_Toc242266789" w:history="1">
         <w:r>
           <w:rPr>
             <w:rStyle w:val="Hyperlink"/>
@@ -1537,7 +1537,7 @@
             <w:noProof/>
             <w:webHidden/>
           </w:rPr>
-          <w:instrText xml:space="preserve"> PAGEREF _Toc242224231 \h </w:instrText>
+          <w:instrText xml:space="preserve"> PAGEREF _Toc242266789 \h </w:instrText>
         </w:r>
         <w:r>
           <w:rPr>
@@ -1582,7 +1582,7 @@
           <w14:ligatures w14:val="standardContextual"/>
         </w:rPr>
       </w:pPr>
-      <w:hyperlink w:anchor="_Toc242224232" w:history="1">
+      <w:hyperlink w:anchor="_Toc242266790" w:history="1">
         <w:r>
           <w:rPr>
             <w:rStyle w:val="Hyperlink"/>
@@ -1609,7 +1609,7 @@
             <w:noProof/>
             <w:webHidden/>
           </w:rPr>
-          <w:instrText xml:space="preserve"> PAGEREF _Toc242224232 \h </w:instrText>
+          <w:instrText xml:space="preserve"> PAGEREF _Toc242266790 \h </w:instrText>
         </w:r>
         <w:r>
           <w:rPr>
@@ -1654,7 +1654,7 @@
           <w14:ligatures w14:val="standardContextual"/>
         </w:rPr>
       </w:pPr>
-      <w:hyperlink w:anchor="_Toc242224233" w:history="1">
+      <w:hyperlink w:anchor="_Toc242266791" w:history="1">
         <w:r>
           <w:rPr>
             <w:rStyle w:val="Hyperlink"/>
@@ -1681,7 +1681,7 @@
             <w:noProof/>
             <w:webHidden/>
           </w:rPr>
-          <w:instrText xml:space="preserve"> PAGEREF _Toc242224233 \h </w:instrText>
+          <w:instrText xml:space="preserve"> PAGEREF _Toc242266791 \h </w:instrText>
         </w:r>
         <w:r>
           <w:rPr>
@@ -1726,7 +1726,7 @@
           <w14:ligatures w14:val="standardContextual"/>
         </w:rPr>
       </w:pPr>
-      <w:hyperlink w:anchor="_Toc242224234" w:history="1">
+      <w:hyperlink w:anchor="_Toc242266792" w:history="1">
         <w:r>
           <w:rPr>
             <w:rStyle w:val="Hyperlink"/>
@@ -1753,7 +1753,7 @@
             <w:noProof/>
             <w:webHidden/>
           </w:rPr>
-          <w:instrText xml:space="preserve"> PAGEREF _Toc242224234 \h </w:instrText>
+          <w:instrText xml:space="preserve"> PAGEREF _Toc242266792 \h </w:instrText>
         </w:r>
         <w:r>
           <w:rPr>
@@ -1798,7 +1798,7 @@
           <w14:ligatures w14:val="standardContextual"/>
         </w:rPr>
       </w:pPr>
-      <w:hyperlink w:anchor="_Toc242224235" w:history="1">
+      <w:hyperlink w:anchor="_Toc242266793" w:history="1">
         <w:r>
           <w:rPr>
             <w:rStyle w:val="Hyperlink"/>
@@ -1825,7 +1825,7 @@
             <w:noProof/>
             <w:webHidden/>
           </w:rPr>
-          <w:instrText xml:space="preserve"> PAGEREF _Toc242224235 \h </w:instrText>
+          <w:instrText xml:space="preserve"> PAGEREF _Toc242266793 \h </w:instrText>
         </w:r>
         <w:r>
           <w:rPr>
@@ -1870,7 +1870,7 @@
           <w14:ligatures w14:val="standardContextual"/>
         </w:rPr>
       </w:pPr>
-      <w:hyperlink w:anchor="_Toc242224236" w:history="1">
+      <w:hyperlink w:anchor="_Toc242266794" w:history="1">
         <w:r>
           <w:rPr>
             <w:rStyle w:val="Hyperlink"/>
@@ -1897,7 +1897,7 @@
             <w:noProof/>
             <w:webHidden/>
           </w:rPr>
-          <w:instrText xml:space="preserve"> PAGEREF _Toc242224236 \h </w:instrText>
+          <w:instrText xml:space="preserve"> PAGEREF _Toc242266794 \h </w:instrText>
         </w:r>
         <w:r>
           <w:rPr>
@@ -1942,7 +1942,7 @@
           <w14:ligatures w14:val="standardContextual"/>
         </w:rPr>
       </w:pPr>
-      <w:hyperlink w:anchor="_Toc242224237" w:history="1">
+      <w:hyperlink w:anchor="_Toc242266795" w:history="1">
         <w:r>
           <w:rPr>
             <w:rStyle w:val="Hyperlink"/>
@@ -1969,7 +1969,7 @@
             <w:noProof/>
             <w:webHidden/>
           </w:rPr>
-          <w:instrText xml:space="preserve"> PAGEREF _Toc242224237 \h </w:instrText>
+          <w:instrText xml:space="preserve"> PAGEREF _Toc242266795 \h </w:instrText>
         </w:r>
         <w:r>
           <w:rPr>
@@ -2014,7 +2014,7 @@
           <w14:ligatures w14:val="standardContextual"/>
         </w:rPr>
       </w:pPr>
-      <w:hyperlink w:anchor="_Toc242224238" w:history="1">
+      <w:hyperlink w:anchor="_Toc242266796" w:history="1">
         <w:r>
           <w:rPr>
             <w:rStyle w:val="Hyperlink"/>
@@ -2041,7 +2041,7 @@
             <w:noProof/>
             <w:webHidden/>
           </w:rPr>
-          <w:instrText xml:space="preserve"> PAGEREF _Toc242224238 \h </w:instrText>
+          <w:instrText xml:space="preserve"> PAGEREF _Toc242266796 \h </w:instrText>
         </w:r>
         <w:r>
           <w:rPr>
@@ -2086,7 +2086,7 @@
           <w14:ligatures w14:val="standardContextual"/>
         </w:rPr>
       </w:pPr>
-      <w:hyperlink w:anchor="_Toc242224239" w:history="1">
+      <w:hyperlink w:anchor="_Toc242266797" w:history="1">
         <w:r>
           <w:rPr>
             <w:rStyle w:val="Hyperlink"/>
@@ -2113,7 +2113,7 @@
             <w:noProof/>
             <w:webHidden/>
           </w:rPr>
-          <w:instrText xml:space="preserve"> PAGEREF _Toc242224239 \h </w:instrText>
+          <w:instrText xml:space="preserve"> PAGEREF _Toc242266797 \h </w:instrText>
         </w:r>
         <w:r>
           <w:rPr>
@@ -2158,7 +2158,7 @@
           <w14:ligatures w14:val="standardContextual"/>
         </w:rPr>
       </w:pPr>
-      <w:hyperlink w:anchor="_Toc242224240" w:history="1">
+      <w:hyperlink w:anchor="_Toc242266798" w:history="1">
         <w:r>
           <w:rPr>
             <w:rStyle w:val="Hyperlink"/>
@@ -2185,7 +2185,7 @@
             <w:noProof/>
             <w:webHidden/>
           </w:rPr>
-          <w:instrText xml:space="preserve"> PAGEREF _Toc242224240 \h </w:instrText>
+          <w:instrText xml:space="preserve"> PAGEREF _Toc242266798 \h </w:instrText>
         </w:r>
         <w:r>
           <w:rPr>
@@ -2230,7 +2230,7 @@
           <w14:ligatures w14:val="standardContextual"/>
         </w:rPr>
       </w:pPr>
-      <w:hyperlink w:anchor="_Toc242224241" w:history="1">
+      <w:hyperlink w:anchor="_Toc242266799" w:history="1">
         <w:r>
           <w:rPr>
             <w:rStyle w:val="Hyperlink"/>
@@ -2257,7 +2257,7 @@
             <w:noProof/>
             <w:webHidden/>
           </w:rPr>
-          <w:instrText xml:space="preserve"> PAGEREF _Toc242224241 \h </w:instrText>
+          <w:instrText xml:space="preserve"> PAGEREF _Toc242266799 \h </w:instrText>
         </w:r>
         <w:r>
           <w:rPr>
@@ -2302,7 +2302,7 @@
           <w14:ligatures w14:val="standardContextual"/>
         </w:rPr>
       </w:pPr>
-      <w:hyperlink w:anchor="_Toc242224242" w:history="1">
+      <w:hyperlink w:anchor="_Toc242266800" w:history="1">
         <w:r>
           <w:rPr>
             <w:rStyle w:val="Hyperlink"/>
@@ -2329,7 +2329,7 @@
             <w:noProof/>
             <w:webHidden/>
           </w:rPr>
-          <w:instrText xml:space="preserve"> PAGEREF _Toc242224242 \h </w:instrText>
+          <w:instrText xml:space="preserve"> PAGEREF _Toc242266800 \h </w:instrText>
         </w:r>
         <w:r>
           <w:rPr>
@@ -2374,7 +2374,7 @@
           <w14:ligatures w14:val="standardContextual"/>
         </w:rPr>
       </w:pPr>
-      <w:hyperlink w:anchor="_Toc242224243" w:history="1">
+      <w:hyperlink w:anchor="_Toc242266801" w:history="1">
         <w:r>
           <w:rPr>
             <w:rStyle w:val="Hyperlink"/>
@@ -2401,7 +2401,7 @@
             <w:noProof/>
             <w:webHidden/>
           </w:rPr>
-          <w:instrText xml:space="preserve"> PAGEREF _Toc242224243 \h </w:instrText>
+          <w:instrText xml:space="preserve"> PAGEREF _Toc242266801 \h </w:instrText>
         </w:r>
         <w:r>
           <w:rPr>
@@ -2446,7 +2446,7 @@
           <w14:ligatures w14:val="standardContextual"/>
         </w:rPr>
       </w:pPr>
-      <w:hyperlink w:anchor="_Toc242224244" w:history="1">
+      <w:hyperlink w:anchor="_Toc242266802" w:history="1">
         <w:r>
           <w:rPr>
             <w:rStyle w:val="Hyperlink"/>
@@ -2473,7 +2473,7 @@
             <w:noProof/>
             <w:webHidden/>
           </w:rPr>
-          <w:instrText xml:space="preserve"> PAGEREF _Toc242224244 \h </w:instrText>
+          <w:instrText xml:space="preserve"> PAGEREF _Toc242266802 \h </w:instrText>
         </w:r>
         <w:r>
           <w:rPr>
@@ -2518,7 +2518,7 @@
           <w14:ligatures w14:val="standardContextual"/>
         </w:rPr>
       </w:pPr>
-      <w:hyperlink w:anchor="_Toc242224245" w:history="1">
+      <w:hyperlink w:anchor="_Toc242266803" w:history="1">
         <w:r>
           <w:rPr>
             <w:rStyle w:val="Hyperlink"/>
@@ -2545,7 +2545,7 @@
             <w:noProof/>
             <w:webHidden/>
           </w:rPr>
-          <w:instrText xml:space="preserve"> PAGEREF _Toc242224245 \h </w:instrText>
+          <w:instrText xml:space="preserve"> PAGEREF _Toc242266803 \h </w:instrText>
         </w:r>
         <w:r>
           <w:rPr>
@@ -2590,7 +2590,7 @@
           <w14:ligatures w14:val="standardContextual"/>
         </w:rPr>
       </w:pPr>
-      <w:hyperlink w:anchor="_Toc242224246" w:history="1">
+      <w:hyperlink w:anchor="_Toc242266804" w:history="1">
         <w:r>
           <w:rPr>
             <w:rStyle w:val="Hyperlink"/>
@@ -2617,7 +2617,7 @@
             <w:noProof/>
             <w:webHidden/>
           </w:rPr>
-          <w:instrText xml:space="preserve"> PAGEREF _Toc242224246 \h </w:instrText>
+          <w:instrText xml:space="preserve"> PAGEREF _Toc242266804 \h </w:instrText>
         </w:r>
         <w:r>
           <w:rPr>
@@ -2662,7 +2662,7 @@
           <w14:ligatures w14:val="standardContextual"/>
         </w:rPr>
       </w:pPr>
-      <w:hyperlink w:anchor="_Toc242224247" w:history="1">
+      <w:hyperlink w:anchor="_Toc242266805" w:history="1">
         <w:r>
           <w:rPr>
             <w:rStyle w:val="Hyperlink"/>
@@ -2689,7 +2689,7 @@
             <w:noProof/>
             <w:webHidden/>
           </w:rPr>
-          <w:instrText xml:space="preserve"> PAGEREF _Toc242224247 \h </w:instrText>
+          <w:instrText xml:space="preserve"> PAGEREF _Toc242266805 \h </w:instrText>
         </w:r>
         <w:r>
           <w:rPr>
@@ -2734,7 +2734,7 @@
           <w14:ligatures w14:val="standardContextual"/>
         </w:rPr>
       </w:pPr>
-      <w:hyperlink w:anchor="_Toc242224248" w:history="1">
+      <w:hyperlink w:anchor="_Toc242266806" w:history="1">
         <w:r>
           <w:rPr>
             <w:rStyle w:val="Hyperlink"/>
@@ -2761,7 +2761,7 @@
             <w:noProof/>
             <w:webHidden/>
           </w:rPr>
-          <w:instrText xml:space="preserve"> PAGEREF _Toc242224248 \h </w:instrText>
+          <w:instrText xml:space="preserve"> PAGEREF _Toc242266806 \h </w:instrText>
         </w:r>
         <w:r>
           <w:rPr>
@@ -2806,7 +2806,7 @@
           <w14:ligatures w14:val="standardContextual"/>
         </w:rPr>
       </w:pPr>
-      <w:hyperlink w:anchor="_Toc242224249" w:history="1">
+      <w:hyperlink w:anchor="_Toc242266807" w:history="1">
         <w:r>
           <w:rPr>
             <w:rStyle w:val="Hyperlink"/>
@@ -2833,7 +2833,7 @@
             <w:noProof/>
             <w:webHidden/>
           </w:rPr>
-          <w:instrText xml:space="preserve"> PAGEREF _Toc242224249 \h </w:instrText>
+          <w:instrText xml:space="preserve"> PAGEREF _Toc242266807 \h </w:instrText>
         </w:r>
         <w:r>
           <w:rPr>
@@ -2878,7 +2878,7 @@
           <w14:ligatures w14:val="standardContextual"/>
         </w:rPr>
       </w:pPr>
-      <w:hyperlink w:anchor="_Toc242224250" w:history="1">
+      <w:hyperlink w:anchor="_Toc242266808" w:history="1">
         <w:r>
           <w:rPr>
             <w:rStyle w:val="Hyperlink"/>
@@ -2905,7 +2905,7 @@
             <w:noProof/>
             <w:webHidden/>
           </w:rPr>
-          <w:instrText xml:space="preserve"> PAGEREF _Toc242224250 \h </w:instrText>
+          <w:instrText xml:space="preserve"> PAGEREF _Toc242266808 \h </w:instrText>
         </w:r>
         <w:r>
           <w:rPr>
@@ -2950,7 +2950,7 @@
           <w14:ligatures w14:val="standardContextual"/>
         </w:rPr>
       </w:pPr>
-      <w:hyperlink w:anchor="_Toc242224251" w:history="1">
+      <w:hyperlink w:anchor="_Toc242266809" w:history="1">
         <w:r>
           <w:rPr>
             <w:rStyle w:val="Hyperlink"/>
@@ -2977,7 +2977,7 @@
             <w:noProof/>
             <w:webHidden/>
           </w:rPr>
-          <w:instrText xml:space="preserve"> PAGEREF _Toc242224251 \h </w:instrText>
+          <w:instrText xml:space="preserve"> PAGEREF _Toc242266809 \h </w:instrText>
         </w:r>
         <w:r>
           <w:rPr>
@@ -3050,7 +3050,7 @@
       <w:r>
         <w:fldChar w:fldCharType="separate"/>
       </w:r>
-      <w:hyperlink w:anchor="_Toc242224252" w:history="1">
+      <w:hyperlink w:anchor="_Toc242266810" w:history="1">
         <w:r>
           <w:rPr>
             <w:rStyle w:val="Hyperlink"/>
@@ -3077,7 +3077,7 @@
             <w:noProof/>
             <w:webHidden/>
           </w:rPr>
-          <w:instrText xml:space="preserve"> PAGEREF _Toc242224252 \h </w:instrText>
+          <w:instrText xml:space="preserve"> PAGEREF _Toc242266810 \h </w:instrText>
         </w:r>
         <w:r>
           <w:rPr>
@@ -3122,7 +3122,7 @@
           <w14:ligatures w14:val="standardContextual"/>
         </w:rPr>
       </w:pPr>
-      <w:hyperlink w:anchor="_Toc242224253" w:history="1">
+      <w:hyperlink w:anchor="_Toc242266811" w:history="1">
         <w:r>
           <w:rPr>
             <w:rStyle w:val="Hyperlink"/>
@@ -3149,7 +3149,7 @@
             <w:noProof/>
             <w:webHidden/>
           </w:rPr>
-          <w:instrText xml:space="preserve"> PAGEREF _Toc242224253 \h </w:instrText>
+          <w:instrText xml:space="preserve"> PAGEREF _Toc242266811 \h </w:instrText>
         </w:r>
         <w:r>
           <w:rPr>
@@ -3194,7 +3194,7 @@
           <w14:ligatures w14:val="standardContextual"/>
         </w:rPr>
       </w:pPr>
-      <w:hyperlink w:anchor="_Toc242224254" w:history="1">
+      <w:hyperlink w:anchor="_Toc242266812" w:history="1">
         <w:r>
           <w:rPr>
             <w:rStyle w:val="Hyperlink"/>
@@ -3221,7 +3221,7 @@
             <w:noProof/>
             <w:webHidden/>
           </w:rPr>
-          <w:instrText xml:space="preserve"> PAGEREF _Toc242224254 \h </w:instrText>
+          <w:instrText xml:space="preserve"> PAGEREF _Toc242266812 \h </w:instrText>
         </w:r>
         <w:r>
           <w:rPr>
@@ -3266,7 +3266,7 @@
           <w14:ligatures w14:val="standardContextual"/>
         </w:rPr>
       </w:pPr>
-      <w:hyperlink w:anchor="_Toc242224255" w:history="1">
+      <w:hyperlink w:anchor="_Toc242266813" w:history="1">
         <w:r>
           <w:rPr>
             <w:rStyle w:val="Hyperlink"/>
@@ -3293,7 +3293,7 @@
             <w:noProof/>
             <w:webHidden/>
           </w:rPr>
-          <w:instrText xml:space="preserve"> PAGEREF _Toc242224255 \h </w:instrText>
+          <w:instrText xml:space="preserve"> PAGEREF _Toc242266813 \h </w:instrText>
         </w:r>
         <w:r>
           <w:rPr>
@@ -3338,7 +3338,7 @@
           <w14:ligatures w14:val="standardContextual"/>
         </w:rPr>
       </w:pPr>
-      <w:hyperlink w:anchor="_Toc242224256" w:history="1">
+      <w:hyperlink w:anchor="_Toc242266814" w:history="1">
         <w:r>
           <w:rPr>
             <w:rStyle w:val="Hyperlink"/>
@@ -3365,7 +3365,7 @@
             <w:noProof/>
             <w:webHidden/>
           </w:rPr>
-          <w:instrText xml:space="preserve"> PAGEREF _Toc242224256 \h </w:instrText>
+          <w:instrText xml:space="preserve"> PAGEREF _Toc242266814 \h </w:instrText>
         </w:r>
         <w:r>
           <w:rPr>
@@ -3410,7 +3410,7 @@
           <w14:ligatures w14:val="standardContextual"/>
         </w:rPr>
       </w:pPr>
-      <w:hyperlink w:anchor="_Toc242224257" w:history="1">
+      <w:hyperlink w:anchor="_Toc242266815" w:history="1">
         <w:r>
           <w:rPr>
             <w:rStyle w:val="Hyperlink"/>
@@ -3437,7 +3437,7 @@
             <w:noProof/>
             <w:webHidden/>
           </w:rPr>
-          <w:instrText xml:space="preserve"> PAGEREF _Toc242224257 \h </w:instrText>
+          <w:instrText xml:space="preserve"> PAGEREF _Toc242266815 \h </w:instrText>
         </w:r>
         <w:r>
           <w:rPr>
@@ -3482,7 +3482,7 @@
           <w14:ligatures w14:val="standardContextual"/>
         </w:rPr>
       </w:pPr>
-      <w:hyperlink w:anchor="_Toc242224258" w:history="1">
+      <w:hyperlink w:anchor="_Toc242266816" w:history="1">
         <w:r>
           <w:rPr>
             <w:rStyle w:val="Hyperlink"/>
@@ -3509,7 +3509,7 @@
             <w:noProof/>
             <w:webHidden/>
           </w:rPr>
-          <w:instrText xml:space="preserve"> PAGEREF _Toc242224258 \h </w:instrText>
+          <w:instrText xml:space="preserve"> PAGEREF _Toc242266816 \h </w:instrText>
         </w:r>
         <w:r>
           <w:rPr>
@@ -3554,7 +3554,7 @@
           <w14:ligatures w14:val="standardContextual"/>
         </w:rPr>
       </w:pPr>
-      <w:hyperlink w:anchor="_Toc242224259" w:history="1">
+      <w:hyperlink w:anchor="_Toc242266817" w:history="1">
         <w:r>
           <w:rPr>
             <w:rStyle w:val="Hyperlink"/>
@@ -3581,7 +3581,7 @@
             <w:noProof/>
             <w:webHidden/>
           </w:rPr>
-          <w:instrText xml:space="preserve"> PAGEREF _Toc242224259 \h </w:instrText>
+          <w:instrText xml:space="preserve"> PAGEREF _Toc242266817 \h </w:instrText>
         </w:r>
         <w:r>
           <w:rPr>
@@ -3626,7 +3626,7 @@
           <w14:ligatures w14:val="standardContextual"/>
         </w:rPr>
       </w:pPr>
-      <w:hyperlink w:anchor="_Toc242224260" w:history="1">
+      <w:hyperlink w:anchor="_Toc242266818" w:history="1">
         <w:r>
           <w:rPr>
             <w:rStyle w:val="Hyperlink"/>
@@ -3653,7 +3653,7 @@
             <w:noProof/>
             <w:webHidden/>
           </w:rPr>
-          <w:instrText xml:space="preserve"> PAGEREF _Toc242224260 \h </w:instrText>
+          <w:instrText xml:space="preserve"> PAGEREF _Toc242266818 \h </w:instrText>
         </w:r>
         <w:r>
           <w:rPr>
@@ -3698,7 +3698,7 @@
       <w:pPr>
         <w:pStyle w:val="Heading1"/>
       </w:pPr>
-      <w:bookmarkStart w:id="0" w:name="_Toc242224211"/>
+      <w:bookmarkStart w:id="0" w:name="_Toc242266769"/>
       <w:r>
         <w:lastRenderedPageBreak/>
         <w:t>Execution and files</w:t>
@@ -3712,7 +3712,7 @@
     </w:p>
     <w:p>
       <w:r>
-        <w:t>Task folders follow the Practical Task and Task 01 to Task 04 organisation. Output names used here are result.txt for word counts, results.txt for matrices, decrypted.txt for passwords, and outImg_ prefixed PNGs for edges. Task 04 adds outImg_Gx_ and outImg_Gy_ PNGs so all four illustrated views can be shown. No input resource requires mounting a private Google Drive folder.</w:t>
+        <w:t>Task folders follow the Practical Task and Task 01 to Task 04 organisation. Output names used here are result.txt for word counts, results.txt for matrices, decrypted.txt for passwords, and outImg_ prefixed PNGs for edges. Task 04 adds outImg_Gx_ and outImg_Gy_ PNGs so all four illustrated views can be shown. The notebook downloads its input files automatically.</w:t>
       </w:r>
     </w:p>
     <w:p>
@@ -3739,14 +3739,14 @@
     </w:p>
     <w:p>
       <w:r>
-        <w:t>All four Colab notebooks are shared as Viewer with anyone who has the link. Save a copy in your own Google Drive to run the cells. Upload the files requested by the first cell: Task 01, WordOccurrenceDataset.txt; Task 02, MatData.txt; Task 03, passwords.txt and expected_passwords.txt; Task 04, lodepng.cpp and lodepng.h. Task 04 downloads download.png from its public URL. Run all cells to compile the program and display the output. Select a T4 GPU for the CUDA tasks. The public GitHub download page contains the input files, source code, saved outputs and recordings.</w:t>
+        <w:t>All four Colab notebooks can be viewed by anyone with the link. Save a copy in your own Google Drive and select Run all. The first cell downloads the required files automatically from the public GitHub project, including the datasets, LodePNG files and Task 04 image. The notebooks can start from a fresh runtime without manual file uploads, a GitHub login or a Google Drive mount. Tasks 01 and 02 use the CPU; select a T4 GPU for Tasks 03 and 04. The public download page contains the report, source code, inputs, saved outputs and recordings.</w:t>
       </w:r>
     </w:p>
     <w:p>
       <w:pPr>
         <w:pStyle w:val="Heading1"/>
       </w:pPr>
-      <w:bookmarkStart w:id="1" w:name="_Toc242224212"/>
+      <w:bookmarkStart w:id="1" w:name="_Toc242266770"/>
       <w:r>
         <w:t>Validation result</w:t>
       </w:r>
@@ -3762,7 +3762,7 @@
         <w:pStyle w:val="Heading1"/>
         <w:pageBreakBefore/>
       </w:pPr>
-      <w:bookmarkStart w:id="2" w:name="_Toc242224213"/>
+      <w:bookmarkStart w:id="2" w:name="_Toc242266771"/>
       <w:r>
         <w:lastRenderedPageBreak/>
         <w:t>Task 01 Word Occurrence Counting using Multithreading</w:t>
@@ -3795,7 +3795,7 @@
       <w:pPr>
         <w:pStyle w:val="Heading2"/>
       </w:pPr>
-      <w:bookmarkStart w:id="3" w:name="_Toc242224214"/>
+      <w:bookmarkStart w:id="3" w:name="_Toc242266772"/>
       <w:r>
         <w:t>Objective</w:t>
       </w:r>
@@ -3810,7 +3810,7 @@
       <w:pPr>
         <w:pStyle w:val="Heading2"/>
       </w:pPr>
-      <w:bookmarkStart w:id="4" w:name="_Toc242224215"/>
+      <w:bookmarkStart w:id="4" w:name="_Toc242266773"/>
       <w:r>
         <w:t>Implementation</w:t>
       </w:r>
@@ -3835,7 +3835,7 @@
       <w:pPr>
         <w:pStyle w:val="Heading2"/>
       </w:pPr>
-      <w:bookmarkStart w:id="5" w:name="_Toc242224216"/>
+      <w:bookmarkStart w:id="5" w:name="_Toc242266774"/>
       <w:r>
         <w:lastRenderedPageBreak/>
         <w:t>Code I implemented</w:t>
@@ -3893,7 +3893,7 @@
         <w:pStyle w:val="Caption"/>
         <w:keepNext/>
       </w:pPr>
-      <w:bookmarkStart w:id="6" w:name="_Toc242224252"/>
+      <w:bookmarkStart w:id="6" w:name="_Toc242266810"/>
       <w:r>
         <w:t xml:space="preserve">Figure </w:t>
       </w:r>
@@ -3924,7 +3924,7 @@
       <w:pPr>
         <w:pStyle w:val="Heading2"/>
       </w:pPr>
-      <w:bookmarkStart w:id="7" w:name="_Toc242224217"/>
+      <w:bookmarkStart w:id="7" w:name="_Toc242266775"/>
       <w:r>
         <w:t>Synchronisation and memory</w:t>
       </w:r>
@@ -3944,7 +3944,7 @@
       <w:pPr>
         <w:pStyle w:val="Heading2"/>
       </w:pPr>
-      <w:bookmarkStart w:id="8" w:name="_Toc242224218"/>
+      <w:bookmarkStart w:id="8" w:name="_Toc242266776"/>
       <w:r>
         <w:lastRenderedPageBreak/>
         <w:t>Build and run</w:t>
@@ -3977,7 +3977,7 @@
       <w:pPr>
         <w:pStyle w:val="Heading2"/>
       </w:pPr>
-      <w:bookmarkStart w:id="9" w:name="_Toc242224219"/>
+      <w:bookmarkStart w:id="9" w:name="_Toc242266777"/>
       <w:r>
         <w:t>Results and tests</w:t>
       </w:r>
@@ -4002,7 +4002,7 @@
       <w:pPr>
         <w:pStyle w:val="Heading2"/>
       </w:pPr>
-      <w:bookmarkStart w:id="10" w:name="_Toc242224220"/>
+      <w:bookmarkStart w:id="10" w:name="_Toc242266778"/>
       <w:r>
         <w:t>Performance and limits</w:t>
       </w:r>
@@ -4023,7 +4023,7 @@
         <w:pStyle w:val="Heading2"/>
         <w:pageBreakBefore/>
       </w:pPr>
-      <w:bookmarkStart w:id="11" w:name="_Toc242224221"/>
+      <w:bookmarkStart w:id="11" w:name="_Toc242266779"/>
       <w:r>
         <w:lastRenderedPageBreak/>
         <w:t>Colab execution evidence</w:t>
@@ -4081,7 +4081,7 @@
         <w:pStyle w:val="Caption"/>
         <w:keepNext/>
       </w:pPr>
-      <w:bookmarkStart w:id="12" w:name="_Toc242224253"/>
+      <w:bookmarkStart w:id="12" w:name="_Toc242266811"/>
       <w:r>
         <w:t xml:space="preserve">Figure </w:t>
       </w:r>
@@ -4108,7 +4108,7 @@
         <w:pStyle w:val="Heading1"/>
         <w:pageBreakBefore/>
       </w:pPr>
-      <w:bookmarkStart w:id="13" w:name="_Toc242224222"/>
+      <w:bookmarkStart w:id="13" w:name="_Toc242266780"/>
       <w:r>
         <w:lastRenderedPageBreak/>
         <w:t>Task 02 Multiple operations with Matrices using multithreading</w:t>
@@ -4141,7 +4141,7 @@
       <w:pPr>
         <w:pStyle w:val="Heading2"/>
       </w:pPr>
-      <w:bookmarkStart w:id="14" w:name="_Toc242224223"/>
+      <w:bookmarkStart w:id="14" w:name="_Toc242266781"/>
       <w:r>
         <w:t>Objective</w:t>
       </w:r>
@@ -4156,7 +4156,7 @@
       <w:pPr>
         <w:pStyle w:val="Heading2"/>
       </w:pPr>
-      <w:bookmarkStart w:id="15" w:name="_Toc242224224"/>
+      <w:bookmarkStart w:id="15" w:name="_Toc242266782"/>
       <w:r>
         <w:t>Implementation</w:t>
       </w:r>
@@ -4181,7 +4181,7 @@
       <w:pPr>
         <w:pStyle w:val="Heading2"/>
       </w:pPr>
-      <w:bookmarkStart w:id="16" w:name="_Toc242224225"/>
+      <w:bookmarkStart w:id="16" w:name="_Toc242266783"/>
       <w:r>
         <w:lastRenderedPageBreak/>
         <w:t>Code I implemented</w:t>
@@ -4239,7 +4239,7 @@
         <w:pStyle w:val="Caption"/>
         <w:keepNext/>
       </w:pPr>
-      <w:bookmarkStart w:id="17" w:name="_Toc242224254"/>
+      <w:bookmarkStart w:id="17" w:name="_Toc242266812"/>
       <w:r>
         <w:t xml:space="preserve">Figure </w:t>
       </w:r>
@@ -4270,7 +4270,7 @@
       <w:pPr>
         <w:pStyle w:val="Heading2"/>
       </w:pPr>
-      <w:bookmarkStart w:id="18" w:name="_Toc242224226"/>
+      <w:bookmarkStart w:id="18" w:name="_Toc242266784"/>
       <w:r>
         <w:t>Synchronisation and memory</w:t>
       </w:r>
@@ -4295,7 +4295,7 @@
       <w:pPr>
         <w:pStyle w:val="Heading2"/>
       </w:pPr>
-      <w:bookmarkStart w:id="19" w:name="_Toc242224227"/>
+      <w:bookmarkStart w:id="19" w:name="_Toc242266785"/>
       <w:r>
         <w:lastRenderedPageBreak/>
         <w:t>Build and run</w:t>
@@ -4328,7 +4328,7 @@
       <w:pPr>
         <w:pStyle w:val="Heading2"/>
       </w:pPr>
-      <w:bookmarkStart w:id="20" w:name="_Toc242224228"/>
+      <w:bookmarkStart w:id="20" w:name="_Toc242266786"/>
       <w:r>
         <w:t>Results and tests</w:t>
       </w:r>
@@ -4413,7 +4413,7 @@
       <w:pPr>
         <w:pStyle w:val="Heading2"/>
       </w:pPr>
-      <w:bookmarkStart w:id="21" w:name="_Toc242224229"/>
+      <w:bookmarkStart w:id="21" w:name="_Toc242266787"/>
       <w:r>
         <w:t>Performance and limits</w:t>
       </w:r>
@@ -4434,7 +4434,7 @@
         <w:pStyle w:val="Heading2"/>
         <w:pageBreakBefore/>
       </w:pPr>
-      <w:bookmarkStart w:id="22" w:name="_Toc242224230"/>
+      <w:bookmarkStart w:id="22" w:name="_Toc242266788"/>
       <w:r>
         <w:lastRenderedPageBreak/>
         <w:t>Colab execution evidence</w:t>
@@ -4492,7 +4492,7 @@
         <w:pStyle w:val="Caption"/>
         <w:keepNext/>
       </w:pPr>
-      <w:bookmarkStart w:id="23" w:name="_Toc242224255"/>
+      <w:bookmarkStart w:id="23" w:name="_Toc242266813"/>
       <w:r>
         <w:t xml:space="preserve">Figure </w:t>
       </w:r>
@@ -4519,7 +4519,7 @@
         <w:pStyle w:val="Heading1"/>
         <w:pageBreakBefore/>
       </w:pPr>
-      <w:bookmarkStart w:id="24" w:name="_Toc242224231"/>
+      <w:bookmarkStart w:id="24" w:name="_Toc242266789"/>
       <w:r>
         <w:lastRenderedPageBreak/>
         <w:t>Task 03 Password Cracking with Files using CUDA</w:t>
@@ -4552,7 +4552,7 @@
       <w:pPr>
         <w:pStyle w:val="Heading2"/>
       </w:pPr>
-      <w:bookmarkStart w:id="25" w:name="_Toc242224232"/>
+      <w:bookmarkStart w:id="25" w:name="_Toc242266790"/>
       <w:r>
         <w:t>Objective</w:t>
       </w:r>
@@ -4567,7 +4567,7 @@
       <w:pPr>
         <w:pStyle w:val="Heading2"/>
       </w:pPr>
-      <w:bookmarkStart w:id="26" w:name="_Toc242224233"/>
+      <w:bookmarkStart w:id="26" w:name="_Toc242266791"/>
       <w:r>
         <w:t>Implementation</w:t>
       </w:r>
@@ -4597,7 +4597,7 @@
       <w:pPr>
         <w:pStyle w:val="Heading2"/>
       </w:pPr>
-      <w:bookmarkStart w:id="27" w:name="_Toc242224234"/>
+      <w:bookmarkStart w:id="27" w:name="_Toc242266792"/>
       <w:r>
         <w:lastRenderedPageBreak/>
         <w:t>Code I implemented</w:t>
@@ -4655,7 +4655,7 @@
         <w:pStyle w:val="Caption"/>
         <w:keepNext/>
       </w:pPr>
-      <w:bookmarkStart w:id="28" w:name="_Toc242224256"/>
+      <w:bookmarkStart w:id="28" w:name="_Toc242266814"/>
       <w:r>
         <w:t xml:space="preserve">Figure </w:t>
       </w:r>
@@ -4686,7 +4686,7 @@
       <w:pPr>
         <w:pStyle w:val="Heading2"/>
       </w:pPr>
-      <w:bookmarkStart w:id="29" w:name="_Toc242224235"/>
+      <w:bookmarkStart w:id="29" w:name="_Toc242266793"/>
       <w:r>
         <w:t>Synchronisation and memory</w:t>
       </w:r>
@@ -4706,7 +4706,7 @@
       <w:pPr>
         <w:pStyle w:val="Heading2"/>
       </w:pPr>
-      <w:bookmarkStart w:id="30" w:name="_Toc242224236"/>
+      <w:bookmarkStart w:id="30" w:name="_Toc242266794"/>
       <w:r>
         <w:lastRenderedPageBreak/>
         <w:t>Build and run</w:t>
@@ -4739,7 +4739,7 @@
       <w:pPr>
         <w:pStyle w:val="Heading2"/>
       </w:pPr>
-      <w:bookmarkStart w:id="31" w:name="_Toc242224237"/>
+      <w:bookmarkStart w:id="31" w:name="_Toc242266795"/>
       <w:r>
         <w:t>Results and tests</w:t>
       </w:r>
@@ -4868,7 +4868,7 @@
       <w:pPr>
         <w:pStyle w:val="Heading2"/>
       </w:pPr>
-      <w:bookmarkStart w:id="32" w:name="_Toc242224238"/>
+      <w:bookmarkStart w:id="32" w:name="_Toc242266796"/>
       <w:r>
         <w:t>Performance and limits</w:t>
       </w:r>
@@ -4889,7 +4889,7 @@
         <w:pStyle w:val="Heading2"/>
         <w:pageBreakBefore/>
       </w:pPr>
-      <w:bookmarkStart w:id="33" w:name="_Toc242224239"/>
+      <w:bookmarkStart w:id="33" w:name="_Toc242266797"/>
       <w:r>
         <w:lastRenderedPageBreak/>
         <w:t>Colab execution evidence</w:t>
@@ -4947,7 +4947,7 @@
         <w:pStyle w:val="Caption"/>
         <w:keepNext/>
       </w:pPr>
-      <w:bookmarkStart w:id="34" w:name="_Toc242224257"/>
+      <w:bookmarkStart w:id="34" w:name="_Toc242266815"/>
       <w:r>
         <w:t xml:space="preserve">Figure </w:t>
       </w:r>
@@ -4974,7 +4974,7 @@
         <w:pStyle w:val="Heading1"/>
         <w:pageBreakBefore/>
       </w:pPr>
-      <w:bookmarkStart w:id="35" w:name="_Toc242224240"/>
+      <w:bookmarkStart w:id="35" w:name="_Toc242266798"/>
       <w:r>
         <w:lastRenderedPageBreak/>
         <w:t>Task 04</w:t>
@@ -5011,7 +5011,7 @@
       <w:pPr>
         <w:pStyle w:val="Heading2"/>
       </w:pPr>
-      <w:bookmarkStart w:id="36" w:name="_Toc242224241"/>
+      <w:bookmarkStart w:id="36" w:name="_Toc242266799"/>
       <w:r>
         <w:t>Objective</w:t>
       </w:r>
@@ -5026,7 +5026,7 @@
       <w:pPr>
         <w:pStyle w:val="Heading2"/>
       </w:pPr>
-      <w:bookmarkStart w:id="37" w:name="_Toc242224242"/>
+      <w:bookmarkStart w:id="37" w:name="_Toc242266800"/>
       <w:r>
         <w:t>Implementation</w:t>
       </w:r>
@@ -5034,7 +5034,7 @@
     </w:p>
     <w:p>
       <w:r>
-        <w:t>The notebook uses wget to download download.png (300x300) from the public image URL in the lecturer's last-class code and checks its SHA-256 checksum before use. The input needs no GitHub login or Drive mount. After lodepng.cpp and lodepng.h are uploaded, LodePNG decodes the file into an RGBA host array, with its original licence notices retained.</w:t>
+        <w:t>The notebook automatically downloads lodepng.cpp, lodepng.h and download.png (300x300) from the public GitHub project. The image is an unchanged copy of the public input in the last-class teaching example. The files are taken from a fixed project revision, so every fresh runtime uses the same inputs. LodePNG decodes the image into an RGBA host array, with its original licence notices retained.</w:t>
       </w:r>
     </w:p>
     <w:p>
@@ -5056,7 +5056,7 @@
       <w:pPr>
         <w:pStyle w:val="Heading2"/>
       </w:pPr>
-      <w:bookmarkStart w:id="38" w:name="_Toc242224243"/>
+      <w:bookmarkStart w:id="38" w:name="_Toc242266801"/>
       <w:r>
         <w:lastRenderedPageBreak/>
         <w:t>Code I implemented</w:t>
@@ -5114,7 +5114,7 @@
         <w:pStyle w:val="Caption"/>
         <w:keepNext/>
       </w:pPr>
-      <w:bookmarkStart w:id="39" w:name="_Toc242224258"/>
+      <w:bookmarkStart w:id="39" w:name="_Toc242266816"/>
       <w:r>
         <w:t xml:space="preserve">Figure </w:t>
       </w:r>
@@ -5145,7 +5145,7 @@
       <w:pPr>
         <w:pStyle w:val="Heading2"/>
       </w:pPr>
-      <w:bookmarkStart w:id="40" w:name="_Toc242224244"/>
+      <w:bookmarkStart w:id="40" w:name="_Toc242266802"/>
       <w:r>
         <w:t>Synchronisation and memory</w:t>
       </w:r>
@@ -5171,7 +5171,7 @@
       <w:pPr>
         <w:pStyle w:val="Heading2"/>
       </w:pPr>
-      <w:bookmarkStart w:id="41" w:name="_Toc242224245"/>
+      <w:bookmarkStart w:id="41" w:name="_Toc242266803"/>
       <w:r>
         <w:t>Build and run</w:t>
       </w:r>
@@ -5214,7 +5214,7 @@
       <w:pPr>
         <w:pStyle w:val="Heading2"/>
       </w:pPr>
-      <w:bookmarkStart w:id="42" w:name="_Toc242224246"/>
+      <w:bookmarkStart w:id="42" w:name="_Toc242266804"/>
       <w:r>
         <w:t>Results and tests</w:t>
       </w:r>
@@ -5239,7 +5239,7 @@
       <w:pPr>
         <w:pStyle w:val="Heading2"/>
       </w:pPr>
-      <w:bookmarkStart w:id="43" w:name="_Toc242224247"/>
+      <w:bookmarkStart w:id="43" w:name="_Toc242266805"/>
       <w:r>
         <w:t>Performance and limits</w:t>
       </w:r>
@@ -5260,7 +5260,7 @@
         <w:pStyle w:val="Heading2"/>
         <w:pageBreakBefore/>
       </w:pPr>
-      <w:bookmarkStart w:id="44" w:name="_Toc242224248"/>
+      <w:bookmarkStart w:id="44" w:name="_Toc242266806"/>
       <w:r>
         <w:lastRenderedPageBreak/>
         <w:t>Colab execution evidence</w:t>
@@ -5318,7 +5318,7 @@
         <w:pStyle w:val="Caption"/>
         <w:keepNext/>
       </w:pPr>
-      <w:bookmarkStart w:id="45" w:name="_Toc242224259"/>
+      <w:bookmarkStart w:id="45" w:name="_Toc242266817"/>
       <w:r>
         <w:t xml:space="preserve">Figure </w:t>
       </w:r>
@@ -5345,7 +5345,7 @@
         <w:pStyle w:val="Heading2"/>
         <w:pageBreakBefore/>
       </w:pPr>
-      <w:bookmarkStart w:id="46" w:name="_Toc242224249"/>
+      <w:bookmarkStart w:id="46" w:name="_Toc242266807"/>
       <w:r>
         <w:lastRenderedPageBreak/>
         <w:t>Task 04 image outputs</w:t>
@@ -5403,7 +5403,7 @@
         <w:pStyle w:val="Caption"/>
         <w:keepNext/>
       </w:pPr>
-      <w:bookmarkStart w:id="47" w:name="_Toc242224260"/>
+      <w:bookmarkStart w:id="47" w:name="_Toc242266818"/>
       <w:r>
         <w:t xml:space="preserve">Figure </w:t>
       </w:r>
@@ -5430,7 +5430,7 @@
         <w:pStyle w:val="Heading1"/>
         <w:pageBreakBefore/>
       </w:pPr>
-      <w:bookmarkStart w:id="48" w:name="_Toc242224250"/>
+      <w:bookmarkStart w:id="48" w:name="_Toc242266808"/>
       <w:r>
         <w:lastRenderedPageBreak/>
         <w:t>Evidence and submission</w:t>
@@ -5456,7 +5456,7 @@
       <w:pPr>
         <w:pStyle w:val="Heading1"/>
       </w:pPr>
-      <w:bookmarkStart w:id="49" w:name="_Toc242224251"/>
+      <w:bookmarkStart w:id="49" w:name="_Toc242266809"/>
       <w:r>
         <w:t>References</w:t>
       </w:r>

</xml_diff>

<commit_message>
Use T4 Colab runtimes for all four assignment tasks
</commit_message>
<xml_diff>
--- a/2638120_Thaslim_Mohammed_Sahl_High_Performance_Computing.docx
+++ b/2638120_Thaslim_Mohammed_Sahl_High_Performance_Computing.docx
@@ -70,7 +70,7 @@
       <w:r>
         <w:fldChar w:fldCharType="separate"/>
       </w:r>
-      <w:hyperlink w:anchor="_Toc242266769" w:history="1">
+      <w:hyperlink w:anchor="_Toc242268602" w:history="1">
         <w:r>
           <w:rPr>
             <w:rStyle w:val="Hyperlink"/>
@@ -97,7 +97,7 @@
             <w:noProof/>
             <w:webHidden/>
           </w:rPr>
-          <w:instrText xml:space="preserve"> PAGEREF _Toc242266769 \h </w:instrText>
+          <w:instrText xml:space="preserve"> PAGEREF _Toc242268602 \h </w:instrText>
         </w:r>
         <w:r>
           <w:rPr>
@@ -142,7 +142,7 @@
           <w14:ligatures w14:val="standardContextual"/>
         </w:rPr>
       </w:pPr>
-      <w:hyperlink w:anchor="_Toc242266770" w:history="1">
+      <w:hyperlink w:anchor="_Toc242268603" w:history="1">
         <w:r>
           <w:rPr>
             <w:rStyle w:val="Hyperlink"/>
@@ -169,7 +169,7 @@
             <w:noProof/>
             <w:webHidden/>
           </w:rPr>
-          <w:instrText xml:space="preserve"> PAGEREF _Toc242266770 \h </w:instrText>
+          <w:instrText xml:space="preserve"> PAGEREF _Toc242268603 \h </w:instrText>
         </w:r>
         <w:r>
           <w:rPr>
@@ -214,7 +214,7 @@
           <w14:ligatures w14:val="standardContextual"/>
         </w:rPr>
       </w:pPr>
-      <w:hyperlink w:anchor="_Toc242266771" w:history="1">
+      <w:hyperlink w:anchor="_Toc242268604" w:history="1">
         <w:r>
           <w:rPr>
             <w:rStyle w:val="Hyperlink"/>
@@ -241,7 +241,7 @@
             <w:noProof/>
             <w:webHidden/>
           </w:rPr>
-          <w:instrText xml:space="preserve"> PAGEREF _Toc242266771 \h </w:instrText>
+          <w:instrText xml:space="preserve"> PAGEREF _Toc242268604 \h </w:instrText>
         </w:r>
         <w:r>
           <w:rPr>
@@ -286,7 +286,7 @@
           <w14:ligatures w14:val="standardContextual"/>
         </w:rPr>
       </w:pPr>
-      <w:hyperlink w:anchor="_Toc242266772" w:history="1">
+      <w:hyperlink w:anchor="_Toc242268605" w:history="1">
         <w:r>
           <w:rPr>
             <w:rStyle w:val="Hyperlink"/>
@@ -313,7 +313,7 @@
             <w:noProof/>
             <w:webHidden/>
           </w:rPr>
-          <w:instrText xml:space="preserve"> PAGEREF _Toc242266772 \h </w:instrText>
+          <w:instrText xml:space="preserve"> PAGEREF _Toc242268605 \h </w:instrText>
         </w:r>
         <w:r>
           <w:rPr>
@@ -358,7 +358,7 @@
           <w14:ligatures w14:val="standardContextual"/>
         </w:rPr>
       </w:pPr>
-      <w:hyperlink w:anchor="_Toc242266773" w:history="1">
+      <w:hyperlink w:anchor="_Toc242268606" w:history="1">
         <w:r>
           <w:rPr>
             <w:rStyle w:val="Hyperlink"/>
@@ -385,7 +385,7 @@
             <w:noProof/>
             <w:webHidden/>
           </w:rPr>
-          <w:instrText xml:space="preserve"> PAGEREF _Toc242266773 \h </w:instrText>
+          <w:instrText xml:space="preserve"> PAGEREF _Toc242268606 \h </w:instrText>
         </w:r>
         <w:r>
           <w:rPr>
@@ -430,7 +430,7 @@
           <w14:ligatures w14:val="standardContextual"/>
         </w:rPr>
       </w:pPr>
-      <w:hyperlink w:anchor="_Toc242266774" w:history="1">
+      <w:hyperlink w:anchor="_Toc242268607" w:history="1">
         <w:r>
           <w:rPr>
             <w:rStyle w:val="Hyperlink"/>
@@ -457,7 +457,7 @@
             <w:noProof/>
             <w:webHidden/>
           </w:rPr>
-          <w:instrText xml:space="preserve"> PAGEREF _Toc242266774 \h </w:instrText>
+          <w:instrText xml:space="preserve"> PAGEREF _Toc242268607 \h </w:instrText>
         </w:r>
         <w:r>
           <w:rPr>
@@ -502,7 +502,7 @@
           <w14:ligatures w14:val="standardContextual"/>
         </w:rPr>
       </w:pPr>
-      <w:hyperlink w:anchor="_Toc242266775" w:history="1">
+      <w:hyperlink w:anchor="_Toc242268608" w:history="1">
         <w:r>
           <w:rPr>
             <w:rStyle w:val="Hyperlink"/>
@@ -529,7 +529,7 @@
             <w:noProof/>
             <w:webHidden/>
           </w:rPr>
-          <w:instrText xml:space="preserve"> PAGEREF _Toc242266775 \h </w:instrText>
+          <w:instrText xml:space="preserve"> PAGEREF _Toc242268608 \h </w:instrText>
         </w:r>
         <w:r>
           <w:rPr>
@@ -574,7 +574,7 @@
           <w14:ligatures w14:val="standardContextual"/>
         </w:rPr>
       </w:pPr>
-      <w:hyperlink w:anchor="_Toc242266776" w:history="1">
+      <w:hyperlink w:anchor="_Toc242268609" w:history="1">
         <w:r>
           <w:rPr>
             <w:rStyle w:val="Hyperlink"/>
@@ -601,7 +601,7 @@
             <w:noProof/>
             <w:webHidden/>
           </w:rPr>
-          <w:instrText xml:space="preserve"> PAGEREF _Toc242266776 \h </w:instrText>
+          <w:instrText xml:space="preserve"> PAGEREF _Toc242268609 \h </w:instrText>
         </w:r>
         <w:r>
           <w:rPr>
@@ -646,7 +646,7 @@
           <w14:ligatures w14:val="standardContextual"/>
         </w:rPr>
       </w:pPr>
-      <w:hyperlink w:anchor="_Toc242266777" w:history="1">
+      <w:hyperlink w:anchor="_Toc242268610" w:history="1">
         <w:r>
           <w:rPr>
             <w:rStyle w:val="Hyperlink"/>
@@ -673,7 +673,7 @@
             <w:noProof/>
             <w:webHidden/>
           </w:rPr>
-          <w:instrText xml:space="preserve"> PAGEREF _Toc242266777 \h </w:instrText>
+          <w:instrText xml:space="preserve"> PAGEREF _Toc242268610 \h </w:instrText>
         </w:r>
         <w:r>
           <w:rPr>
@@ -718,7 +718,7 @@
           <w14:ligatures w14:val="standardContextual"/>
         </w:rPr>
       </w:pPr>
-      <w:hyperlink w:anchor="_Toc242266778" w:history="1">
+      <w:hyperlink w:anchor="_Toc242268611" w:history="1">
         <w:r>
           <w:rPr>
             <w:rStyle w:val="Hyperlink"/>
@@ -745,7 +745,7 @@
             <w:noProof/>
             <w:webHidden/>
           </w:rPr>
-          <w:instrText xml:space="preserve"> PAGEREF _Toc242266778 \h </w:instrText>
+          <w:instrText xml:space="preserve"> PAGEREF _Toc242268611 \h </w:instrText>
         </w:r>
         <w:r>
           <w:rPr>
@@ -790,7 +790,7 @@
           <w14:ligatures w14:val="standardContextual"/>
         </w:rPr>
       </w:pPr>
-      <w:hyperlink w:anchor="_Toc242266779" w:history="1">
+      <w:hyperlink w:anchor="_Toc242268612" w:history="1">
         <w:r>
           <w:rPr>
             <w:rStyle w:val="Hyperlink"/>
@@ -817,7 +817,7 @@
             <w:noProof/>
             <w:webHidden/>
           </w:rPr>
-          <w:instrText xml:space="preserve"> PAGEREF _Toc242266779 \h </w:instrText>
+          <w:instrText xml:space="preserve"> PAGEREF _Toc242268612 \h </w:instrText>
         </w:r>
         <w:r>
           <w:rPr>
@@ -862,7 +862,7 @@
           <w14:ligatures w14:val="standardContextual"/>
         </w:rPr>
       </w:pPr>
-      <w:hyperlink w:anchor="_Toc242266780" w:history="1">
+      <w:hyperlink w:anchor="_Toc242268613" w:history="1">
         <w:r>
           <w:rPr>
             <w:rStyle w:val="Hyperlink"/>
@@ -889,7 +889,7 @@
             <w:noProof/>
             <w:webHidden/>
           </w:rPr>
-          <w:instrText xml:space="preserve"> PAGEREF _Toc242266780 \h </w:instrText>
+          <w:instrText xml:space="preserve"> PAGEREF _Toc242268613 \h </w:instrText>
         </w:r>
         <w:r>
           <w:rPr>
@@ -934,7 +934,7 @@
           <w14:ligatures w14:val="standardContextual"/>
         </w:rPr>
       </w:pPr>
-      <w:hyperlink w:anchor="_Toc242266781" w:history="1">
+      <w:hyperlink w:anchor="_Toc242268614" w:history="1">
         <w:r>
           <w:rPr>
             <w:rStyle w:val="Hyperlink"/>
@@ -961,7 +961,7 @@
             <w:noProof/>
             <w:webHidden/>
           </w:rPr>
-          <w:instrText xml:space="preserve"> PAGEREF _Toc242266781 \h </w:instrText>
+          <w:instrText xml:space="preserve"> PAGEREF _Toc242268614 \h </w:instrText>
         </w:r>
         <w:r>
           <w:rPr>
@@ -1006,7 +1006,7 @@
           <w14:ligatures w14:val="standardContextual"/>
         </w:rPr>
       </w:pPr>
-      <w:hyperlink w:anchor="_Toc242266782" w:history="1">
+      <w:hyperlink w:anchor="_Toc242268615" w:history="1">
         <w:r>
           <w:rPr>
             <w:rStyle w:val="Hyperlink"/>
@@ -1033,7 +1033,7 @@
             <w:noProof/>
             <w:webHidden/>
           </w:rPr>
-          <w:instrText xml:space="preserve"> PAGEREF _Toc242266782 \h </w:instrText>
+          <w:instrText xml:space="preserve"> PAGEREF _Toc242268615 \h </w:instrText>
         </w:r>
         <w:r>
           <w:rPr>
@@ -1078,7 +1078,7 @@
           <w14:ligatures w14:val="standardContextual"/>
         </w:rPr>
       </w:pPr>
-      <w:hyperlink w:anchor="_Toc242266783" w:history="1">
+      <w:hyperlink w:anchor="_Toc242268616" w:history="1">
         <w:r>
           <w:rPr>
             <w:rStyle w:val="Hyperlink"/>
@@ -1105,7 +1105,7 @@
             <w:noProof/>
             <w:webHidden/>
           </w:rPr>
-          <w:instrText xml:space="preserve"> PAGEREF _Toc242266783 \h </w:instrText>
+          <w:instrText xml:space="preserve"> PAGEREF _Toc242268616 \h </w:instrText>
         </w:r>
         <w:r>
           <w:rPr>
@@ -1150,7 +1150,7 @@
           <w14:ligatures w14:val="standardContextual"/>
         </w:rPr>
       </w:pPr>
-      <w:hyperlink w:anchor="_Toc242266784" w:history="1">
+      <w:hyperlink w:anchor="_Toc242268617" w:history="1">
         <w:r>
           <w:rPr>
             <w:rStyle w:val="Hyperlink"/>
@@ -1177,7 +1177,7 @@
             <w:noProof/>
             <w:webHidden/>
           </w:rPr>
-          <w:instrText xml:space="preserve"> PAGEREF _Toc242266784 \h </w:instrText>
+          <w:instrText xml:space="preserve"> PAGEREF _Toc242268617 \h </w:instrText>
         </w:r>
         <w:r>
           <w:rPr>
@@ -1222,7 +1222,7 @@
           <w14:ligatures w14:val="standardContextual"/>
         </w:rPr>
       </w:pPr>
-      <w:hyperlink w:anchor="_Toc242266785" w:history="1">
+      <w:hyperlink w:anchor="_Toc242268618" w:history="1">
         <w:r>
           <w:rPr>
             <w:rStyle w:val="Hyperlink"/>
@@ -1249,7 +1249,7 @@
             <w:noProof/>
             <w:webHidden/>
           </w:rPr>
-          <w:instrText xml:space="preserve"> PAGEREF _Toc242266785 \h </w:instrText>
+          <w:instrText xml:space="preserve"> PAGEREF _Toc242268618 \h </w:instrText>
         </w:r>
         <w:r>
           <w:rPr>
@@ -1294,7 +1294,7 @@
           <w14:ligatures w14:val="standardContextual"/>
         </w:rPr>
       </w:pPr>
-      <w:hyperlink w:anchor="_Toc242266786" w:history="1">
+      <w:hyperlink w:anchor="_Toc242268619" w:history="1">
         <w:r>
           <w:rPr>
             <w:rStyle w:val="Hyperlink"/>
@@ -1321,7 +1321,7 @@
             <w:noProof/>
             <w:webHidden/>
           </w:rPr>
-          <w:instrText xml:space="preserve"> PAGEREF _Toc242266786 \h </w:instrText>
+          <w:instrText xml:space="preserve"> PAGEREF _Toc242268619 \h </w:instrText>
         </w:r>
         <w:r>
           <w:rPr>
@@ -1366,7 +1366,7 @@
           <w14:ligatures w14:val="standardContextual"/>
         </w:rPr>
       </w:pPr>
-      <w:hyperlink w:anchor="_Toc242266787" w:history="1">
+      <w:hyperlink w:anchor="_Toc242268620" w:history="1">
         <w:r>
           <w:rPr>
             <w:rStyle w:val="Hyperlink"/>
@@ -1393,7 +1393,7 @@
             <w:noProof/>
             <w:webHidden/>
           </w:rPr>
-          <w:instrText xml:space="preserve"> PAGEREF _Toc242266787 \h </w:instrText>
+          <w:instrText xml:space="preserve"> PAGEREF _Toc242268620 \h </w:instrText>
         </w:r>
         <w:r>
           <w:rPr>
@@ -1438,7 +1438,7 @@
           <w14:ligatures w14:val="standardContextual"/>
         </w:rPr>
       </w:pPr>
-      <w:hyperlink w:anchor="_Toc242266788" w:history="1">
+      <w:hyperlink w:anchor="_Toc242268621" w:history="1">
         <w:r>
           <w:rPr>
             <w:rStyle w:val="Hyperlink"/>
@@ -1465,7 +1465,7 @@
             <w:noProof/>
             <w:webHidden/>
           </w:rPr>
-          <w:instrText xml:space="preserve"> PAGEREF _Toc242266788 \h </w:instrText>
+          <w:instrText xml:space="preserve"> PAGEREF _Toc242268621 \h </w:instrText>
         </w:r>
         <w:r>
           <w:rPr>
@@ -1510,7 +1510,7 @@
           <w14:ligatures w14:val="standardContextual"/>
         </w:rPr>
       </w:pPr>
-      <w:hyperlink w:anchor="_Toc242266789" w:history="1">
+      <w:hyperlink w:anchor="_Toc242268622" w:history="1">
         <w:r>
           <w:rPr>
             <w:rStyle w:val="Hyperlink"/>
@@ -1537,7 +1537,7 @@
             <w:noProof/>
             <w:webHidden/>
           </w:rPr>
-          <w:instrText xml:space="preserve"> PAGEREF _Toc242266789 \h </w:instrText>
+          <w:instrText xml:space="preserve"> PAGEREF _Toc242268622 \h </w:instrText>
         </w:r>
         <w:r>
           <w:rPr>
@@ -1582,7 +1582,7 @@
           <w14:ligatures w14:val="standardContextual"/>
         </w:rPr>
       </w:pPr>
-      <w:hyperlink w:anchor="_Toc242266790" w:history="1">
+      <w:hyperlink w:anchor="_Toc242268623" w:history="1">
         <w:r>
           <w:rPr>
             <w:rStyle w:val="Hyperlink"/>
@@ -1609,7 +1609,7 @@
             <w:noProof/>
             <w:webHidden/>
           </w:rPr>
-          <w:instrText xml:space="preserve"> PAGEREF _Toc242266790 \h </w:instrText>
+          <w:instrText xml:space="preserve"> PAGEREF _Toc242268623 \h </w:instrText>
         </w:r>
         <w:r>
           <w:rPr>
@@ -1654,7 +1654,7 @@
           <w14:ligatures w14:val="standardContextual"/>
         </w:rPr>
       </w:pPr>
-      <w:hyperlink w:anchor="_Toc242266791" w:history="1">
+      <w:hyperlink w:anchor="_Toc242268624" w:history="1">
         <w:r>
           <w:rPr>
             <w:rStyle w:val="Hyperlink"/>
@@ -1681,7 +1681,7 @@
             <w:noProof/>
             <w:webHidden/>
           </w:rPr>
-          <w:instrText xml:space="preserve"> PAGEREF _Toc242266791 \h </w:instrText>
+          <w:instrText xml:space="preserve"> PAGEREF _Toc242268624 \h </w:instrText>
         </w:r>
         <w:r>
           <w:rPr>
@@ -1726,7 +1726,7 @@
           <w14:ligatures w14:val="standardContextual"/>
         </w:rPr>
       </w:pPr>
-      <w:hyperlink w:anchor="_Toc242266792" w:history="1">
+      <w:hyperlink w:anchor="_Toc242268625" w:history="1">
         <w:r>
           <w:rPr>
             <w:rStyle w:val="Hyperlink"/>
@@ -1753,7 +1753,7 @@
             <w:noProof/>
             <w:webHidden/>
           </w:rPr>
-          <w:instrText xml:space="preserve"> PAGEREF _Toc242266792 \h </w:instrText>
+          <w:instrText xml:space="preserve"> PAGEREF _Toc242268625 \h </w:instrText>
         </w:r>
         <w:r>
           <w:rPr>
@@ -1798,7 +1798,7 @@
           <w14:ligatures w14:val="standardContextual"/>
         </w:rPr>
       </w:pPr>
-      <w:hyperlink w:anchor="_Toc242266793" w:history="1">
+      <w:hyperlink w:anchor="_Toc242268626" w:history="1">
         <w:r>
           <w:rPr>
             <w:rStyle w:val="Hyperlink"/>
@@ -1825,7 +1825,7 @@
             <w:noProof/>
             <w:webHidden/>
           </w:rPr>
-          <w:instrText xml:space="preserve"> PAGEREF _Toc242266793 \h </w:instrText>
+          <w:instrText xml:space="preserve"> PAGEREF _Toc242268626 \h </w:instrText>
         </w:r>
         <w:r>
           <w:rPr>
@@ -1870,7 +1870,7 @@
           <w14:ligatures w14:val="standardContextual"/>
         </w:rPr>
       </w:pPr>
-      <w:hyperlink w:anchor="_Toc242266794" w:history="1">
+      <w:hyperlink w:anchor="_Toc242268627" w:history="1">
         <w:r>
           <w:rPr>
             <w:rStyle w:val="Hyperlink"/>
@@ -1897,7 +1897,7 @@
             <w:noProof/>
             <w:webHidden/>
           </w:rPr>
-          <w:instrText xml:space="preserve"> PAGEREF _Toc242266794 \h </w:instrText>
+          <w:instrText xml:space="preserve"> PAGEREF _Toc242268627 \h </w:instrText>
         </w:r>
         <w:r>
           <w:rPr>
@@ -1942,7 +1942,7 @@
           <w14:ligatures w14:val="standardContextual"/>
         </w:rPr>
       </w:pPr>
-      <w:hyperlink w:anchor="_Toc242266795" w:history="1">
+      <w:hyperlink w:anchor="_Toc242268628" w:history="1">
         <w:r>
           <w:rPr>
             <w:rStyle w:val="Hyperlink"/>
@@ -1969,7 +1969,7 @@
             <w:noProof/>
             <w:webHidden/>
           </w:rPr>
-          <w:instrText xml:space="preserve"> PAGEREF _Toc242266795 \h </w:instrText>
+          <w:instrText xml:space="preserve"> PAGEREF _Toc242268628 \h </w:instrText>
         </w:r>
         <w:r>
           <w:rPr>
@@ -2014,7 +2014,7 @@
           <w14:ligatures w14:val="standardContextual"/>
         </w:rPr>
       </w:pPr>
-      <w:hyperlink w:anchor="_Toc242266796" w:history="1">
+      <w:hyperlink w:anchor="_Toc242268629" w:history="1">
         <w:r>
           <w:rPr>
             <w:rStyle w:val="Hyperlink"/>
@@ -2041,7 +2041,7 @@
             <w:noProof/>
             <w:webHidden/>
           </w:rPr>
-          <w:instrText xml:space="preserve"> PAGEREF _Toc242266796 \h </w:instrText>
+          <w:instrText xml:space="preserve"> PAGEREF _Toc242268629 \h </w:instrText>
         </w:r>
         <w:r>
           <w:rPr>
@@ -2086,7 +2086,7 @@
           <w14:ligatures w14:val="standardContextual"/>
         </w:rPr>
       </w:pPr>
-      <w:hyperlink w:anchor="_Toc242266797" w:history="1">
+      <w:hyperlink w:anchor="_Toc242268630" w:history="1">
         <w:r>
           <w:rPr>
             <w:rStyle w:val="Hyperlink"/>
@@ -2113,7 +2113,7 @@
             <w:noProof/>
             <w:webHidden/>
           </w:rPr>
-          <w:instrText xml:space="preserve"> PAGEREF _Toc242266797 \h </w:instrText>
+          <w:instrText xml:space="preserve"> PAGEREF _Toc242268630 \h </w:instrText>
         </w:r>
         <w:r>
           <w:rPr>
@@ -2158,7 +2158,7 @@
           <w14:ligatures w14:val="standardContextual"/>
         </w:rPr>
       </w:pPr>
-      <w:hyperlink w:anchor="_Toc242266798" w:history="1">
+      <w:hyperlink w:anchor="_Toc242268631" w:history="1">
         <w:r>
           <w:rPr>
             <w:rStyle w:val="Hyperlink"/>
@@ -2185,7 +2185,7 @@
             <w:noProof/>
             <w:webHidden/>
           </w:rPr>
-          <w:instrText xml:space="preserve"> PAGEREF _Toc242266798 \h </w:instrText>
+          <w:instrText xml:space="preserve"> PAGEREF _Toc242268631 \h </w:instrText>
         </w:r>
         <w:r>
           <w:rPr>
@@ -2230,7 +2230,7 @@
           <w14:ligatures w14:val="standardContextual"/>
         </w:rPr>
       </w:pPr>
-      <w:hyperlink w:anchor="_Toc242266799" w:history="1">
+      <w:hyperlink w:anchor="_Toc242268632" w:history="1">
         <w:r>
           <w:rPr>
             <w:rStyle w:val="Hyperlink"/>
@@ -2257,7 +2257,7 @@
             <w:noProof/>
             <w:webHidden/>
           </w:rPr>
-          <w:instrText xml:space="preserve"> PAGEREF _Toc242266799 \h </w:instrText>
+          <w:instrText xml:space="preserve"> PAGEREF _Toc242268632 \h </w:instrText>
         </w:r>
         <w:r>
           <w:rPr>
@@ -2302,7 +2302,7 @@
           <w14:ligatures w14:val="standardContextual"/>
         </w:rPr>
       </w:pPr>
-      <w:hyperlink w:anchor="_Toc242266800" w:history="1">
+      <w:hyperlink w:anchor="_Toc242268633" w:history="1">
         <w:r>
           <w:rPr>
             <w:rStyle w:val="Hyperlink"/>
@@ -2329,7 +2329,7 @@
             <w:noProof/>
             <w:webHidden/>
           </w:rPr>
-          <w:instrText xml:space="preserve"> PAGEREF _Toc242266800 \h </w:instrText>
+          <w:instrText xml:space="preserve"> PAGEREF _Toc242268633 \h </w:instrText>
         </w:r>
         <w:r>
           <w:rPr>
@@ -2374,7 +2374,7 @@
           <w14:ligatures w14:val="standardContextual"/>
         </w:rPr>
       </w:pPr>
-      <w:hyperlink w:anchor="_Toc242266801" w:history="1">
+      <w:hyperlink w:anchor="_Toc242268634" w:history="1">
         <w:r>
           <w:rPr>
             <w:rStyle w:val="Hyperlink"/>
@@ -2401,7 +2401,7 @@
             <w:noProof/>
             <w:webHidden/>
           </w:rPr>
-          <w:instrText xml:space="preserve"> PAGEREF _Toc242266801 \h </w:instrText>
+          <w:instrText xml:space="preserve"> PAGEREF _Toc242268634 \h </w:instrText>
         </w:r>
         <w:r>
           <w:rPr>
@@ -2446,7 +2446,7 @@
           <w14:ligatures w14:val="standardContextual"/>
         </w:rPr>
       </w:pPr>
-      <w:hyperlink w:anchor="_Toc242266802" w:history="1">
+      <w:hyperlink w:anchor="_Toc242268635" w:history="1">
         <w:r>
           <w:rPr>
             <w:rStyle w:val="Hyperlink"/>
@@ -2473,7 +2473,7 @@
             <w:noProof/>
             <w:webHidden/>
           </w:rPr>
-          <w:instrText xml:space="preserve"> PAGEREF _Toc242266802 \h </w:instrText>
+          <w:instrText xml:space="preserve"> PAGEREF _Toc242268635 \h </w:instrText>
         </w:r>
         <w:r>
           <w:rPr>
@@ -2518,7 +2518,7 @@
           <w14:ligatures w14:val="standardContextual"/>
         </w:rPr>
       </w:pPr>
-      <w:hyperlink w:anchor="_Toc242266803" w:history="1">
+      <w:hyperlink w:anchor="_Toc242268636" w:history="1">
         <w:r>
           <w:rPr>
             <w:rStyle w:val="Hyperlink"/>
@@ -2545,7 +2545,7 @@
             <w:noProof/>
             <w:webHidden/>
           </w:rPr>
-          <w:instrText xml:space="preserve"> PAGEREF _Toc242266803 \h </w:instrText>
+          <w:instrText xml:space="preserve"> PAGEREF _Toc242268636 \h </w:instrText>
         </w:r>
         <w:r>
           <w:rPr>
@@ -2590,7 +2590,7 @@
           <w14:ligatures w14:val="standardContextual"/>
         </w:rPr>
       </w:pPr>
-      <w:hyperlink w:anchor="_Toc242266804" w:history="1">
+      <w:hyperlink w:anchor="_Toc242268637" w:history="1">
         <w:r>
           <w:rPr>
             <w:rStyle w:val="Hyperlink"/>
@@ -2617,7 +2617,7 @@
             <w:noProof/>
             <w:webHidden/>
           </w:rPr>
-          <w:instrText xml:space="preserve"> PAGEREF _Toc242266804 \h </w:instrText>
+          <w:instrText xml:space="preserve"> PAGEREF _Toc242268637 \h </w:instrText>
         </w:r>
         <w:r>
           <w:rPr>
@@ -2662,7 +2662,7 @@
           <w14:ligatures w14:val="standardContextual"/>
         </w:rPr>
       </w:pPr>
-      <w:hyperlink w:anchor="_Toc242266805" w:history="1">
+      <w:hyperlink w:anchor="_Toc242268638" w:history="1">
         <w:r>
           <w:rPr>
             <w:rStyle w:val="Hyperlink"/>
@@ -2689,7 +2689,7 @@
             <w:noProof/>
             <w:webHidden/>
           </w:rPr>
-          <w:instrText xml:space="preserve"> PAGEREF _Toc242266805 \h </w:instrText>
+          <w:instrText xml:space="preserve"> PAGEREF _Toc242268638 \h </w:instrText>
         </w:r>
         <w:r>
           <w:rPr>
@@ -2734,7 +2734,7 @@
           <w14:ligatures w14:val="standardContextual"/>
         </w:rPr>
       </w:pPr>
-      <w:hyperlink w:anchor="_Toc242266806" w:history="1">
+      <w:hyperlink w:anchor="_Toc242268639" w:history="1">
         <w:r>
           <w:rPr>
             <w:rStyle w:val="Hyperlink"/>
@@ -2761,7 +2761,7 @@
             <w:noProof/>
             <w:webHidden/>
           </w:rPr>
-          <w:instrText xml:space="preserve"> PAGEREF _Toc242266806 \h </w:instrText>
+          <w:instrText xml:space="preserve"> PAGEREF _Toc242268639 \h </w:instrText>
         </w:r>
         <w:r>
           <w:rPr>
@@ -2806,7 +2806,7 @@
           <w14:ligatures w14:val="standardContextual"/>
         </w:rPr>
       </w:pPr>
-      <w:hyperlink w:anchor="_Toc242266807" w:history="1">
+      <w:hyperlink w:anchor="_Toc242268640" w:history="1">
         <w:r>
           <w:rPr>
             <w:rStyle w:val="Hyperlink"/>
@@ -2833,7 +2833,7 @@
             <w:noProof/>
             <w:webHidden/>
           </w:rPr>
-          <w:instrText xml:space="preserve"> PAGEREF _Toc242266807 \h </w:instrText>
+          <w:instrText xml:space="preserve"> PAGEREF _Toc242268640 \h </w:instrText>
         </w:r>
         <w:r>
           <w:rPr>
@@ -2878,7 +2878,7 @@
           <w14:ligatures w14:val="standardContextual"/>
         </w:rPr>
       </w:pPr>
-      <w:hyperlink w:anchor="_Toc242266808" w:history="1">
+      <w:hyperlink w:anchor="_Toc242268641" w:history="1">
         <w:r>
           <w:rPr>
             <w:rStyle w:val="Hyperlink"/>
@@ -2905,7 +2905,7 @@
             <w:noProof/>
             <w:webHidden/>
           </w:rPr>
-          <w:instrText xml:space="preserve"> PAGEREF _Toc242266808 \h </w:instrText>
+          <w:instrText xml:space="preserve"> PAGEREF _Toc242268641 \h </w:instrText>
         </w:r>
         <w:r>
           <w:rPr>
@@ -2950,7 +2950,7 @@
           <w14:ligatures w14:val="standardContextual"/>
         </w:rPr>
       </w:pPr>
-      <w:hyperlink w:anchor="_Toc242266809" w:history="1">
+      <w:hyperlink w:anchor="_Toc242268642" w:history="1">
         <w:r>
           <w:rPr>
             <w:rStyle w:val="Hyperlink"/>
@@ -2977,7 +2977,7 @@
             <w:noProof/>
             <w:webHidden/>
           </w:rPr>
-          <w:instrText xml:space="preserve"> PAGEREF _Toc242266809 \h </w:instrText>
+          <w:instrText xml:space="preserve"> PAGEREF _Toc242268642 \h </w:instrText>
         </w:r>
         <w:r>
           <w:rPr>
@@ -3050,7 +3050,7 @@
       <w:r>
         <w:fldChar w:fldCharType="separate"/>
       </w:r>
-      <w:hyperlink w:anchor="_Toc242266810" w:history="1">
+      <w:hyperlink w:anchor="_Toc242268643" w:history="1">
         <w:r>
           <w:rPr>
             <w:rStyle w:val="Hyperlink"/>
@@ -3077,7 +3077,7 @@
             <w:noProof/>
             <w:webHidden/>
           </w:rPr>
-          <w:instrText xml:space="preserve"> PAGEREF _Toc242266810 \h </w:instrText>
+          <w:instrText xml:space="preserve"> PAGEREF _Toc242268643 \h </w:instrText>
         </w:r>
         <w:r>
           <w:rPr>
@@ -3122,7 +3122,7 @@
           <w14:ligatures w14:val="standardContextual"/>
         </w:rPr>
       </w:pPr>
-      <w:hyperlink w:anchor="_Toc242266811" w:history="1">
+      <w:hyperlink w:anchor="_Toc242268644" w:history="1">
         <w:r>
           <w:rPr>
             <w:rStyle w:val="Hyperlink"/>
@@ -3149,7 +3149,7 @@
             <w:noProof/>
             <w:webHidden/>
           </w:rPr>
-          <w:instrText xml:space="preserve"> PAGEREF _Toc242266811 \h </w:instrText>
+          <w:instrText xml:space="preserve"> PAGEREF _Toc242268644 \h </w:instrText>
         </w:r>
         <w:r>
           <w:rPr>
@@ -3194,7 +3194,7 @@
           <w14:ligatures w14:val="standardContextual"/>
         </w:rPr>
       </w:pPr>
-      <w:hyperlink w:anchor="_Toc242266812" w:history="1">
+      <w:hyperlink w:anchor="_Toc242268645" w:history="1">
         <w:r>
           <w:rPr>
             <w:rStyle w:val="Hyperlink"/>
@@ -3221,7 +3221,7 @@
             <w:noProof/>
             <w:webHidden/>
           </w:rPr>
-          <w:instrText xml:space="preserve"> PAGEREF _Toc242266812 \h </w:instrText>
+          <w:instrText xml:space="preserve"> PAGEREF _Toc242268645 \h </w:instrText>
         </w:r>
         <w:r>
           <w:rPr>
@@ -3266,7 +3266,7 @@
           <w14:ligatures w14:val="standardContextual"/>
         </w:rPr>
       </w:pPr>
-      <w:hyperlink w:anchor="_Toc242266813" w:history="1">
+      <w:hyperlink w:anchor="_Toc242268646" w:history="1">
         <w:r>
           <w:rPr>
             <w:rStyle w:val="Hyperlink"/>
@@ -3293,7 +3293,7 @@
             <w:noProof/>
             <w:webHidden/>
           </w:rPr>
-          <w:instrText xml:space="preserve"> PAGEREF _Toc242266813 \h </w:instrText>
+          <w:instrText xml:space="preserve"> PAGEREF _Toc242268646 \h </w:instrText>
         </w:r>
         <w:r>
           <w:rPr>
@@ -3338,7 +3338,7 @@
           <w14:ligatures w14:val="standardContextual"/>
         </w:rPr>
       </w:pPr>
-      <w:hyperlink w:anchor="_Toc242266814" w:history="1">
+      <w:hyperlink w:anchor="_Toc242268647" w:history="1">
         <w:r>
           <w:rPr>
             <w:rStyle w:val="Hyperlink"/>
@@ -3365,7 +3365,7 @@
             <w:noProof/>
             <w:webHidden/>
           </w:rPr>
-          <w:instrText xml:space="preserve"> PAGEREF _Toc242266814 \h </w:instrText>
+          <w:instrText xml:space="preserve"> PAGEREF _Toc242268647 \h </w:instrText>
         </w:r>
         <w:r>
           <w:rPr>
@@ -3410,7 +3410,7 @@
           <w14:ligatures w14:val="standardContextual"/>
         </w:rPr>
       </w:pPr>
-      <w:hyperlink w:anchor="_Toc242266815" w:history="1">
+      <w:hyperlink w:anchor="_Toc242268648" w:history="1">
         <w:r>
           <w:rPr>
             <w:rStyle w:val="Hyperlink"/>
@@ -3437,7 +3437,7 @@
             <w:noProof/>
             <w:webHidden/>
           </w:rPr>
-          <w:instrText xml:space="preserve"> PAGEREF _Toc242266815 \h </w:instrText>
+          <w:instrText xml:space="preserve"> PAGEREF _Toc242268648 \h </w:instrText>
         </w:r>
         <w:r>
           <w:rPr>
@@ -3482,7 +3482,7 @@
           <w14:ligatures w14:val="standardContextual"/>
         </w:rPr>
       </w:pPr>
-      <w:hyperlink w:anchor="_Toc242266816" w:history="1">
+      <w:hyperlink w:anchor="_Toc242268649" w:history="1">
         <w:r>
           <w:rPr>
             <w:rStyle w:val="Hyperlink"/>
@@ -3509,7 +3509,7 @@
             <w:noProof/>
             <w:webHidden/>
           </w:rPr>
-          <w:instrText xml:space="preserve"> PAGEREF _Toc242266816 \h </w:instrText>
+          <w:instrText xml:space="preserve"> PAGEREF _Toc242268649 \h </w:instrText>
         </w:r>
         <w:r>
           <w:rPr>
@@ -3554,7 +3554,7 @@
           <w14:ligatures w14:val="standardContextual"/>
         </w:rPr>
       </w:pPr>
-      <w:hyperlink w:anchor="_Toc242266817" w:history="1">
+      <w:hyperlink w:anchor="_Toc242268650" w:history="1">
         <w:r>
           <w:rPr>
             <w:rStyle w:val="Hyperlink"/>
@@ -3581,7 +3581,7 @@
             <w:noProof/>
             <w:webHidden/>
           </w:rPr>
-          <w:instrText xml:space="preserve"> PAGEREF _Toc242266817 \h </w:instrText>
+          <w:instrText xml:space="preserve"> PAGEREF _Toc242268650 \h </w:instrText>
         </w:r>
         <w:r>
           <w:rPr>
@@ -3626,7 +3626,7 @@
           <w14:ligatures w14:val="standardContextual"/>
         </w:rPr>
       </w:pPr>
-      <w:hyperlink w:anchor="_Toc242266818" w:history="1">
+      <w:hyperlink w:anchor="_Toc242268651" w:history="1">
         <w:r>
           <w:rPr>
             <w:rStyle w:val="Hyperlink"/>
@@ -3653,7 +3653,7 @@
             <w:noProof/>
             <w:webHidden/>
           </w:rPr>
-          <w:instrText xml:space="preserve"> PAGEREF _Toc242266818 \h </w:instrText>
+          <w:instrText xml:space="preserve"> PAGEREF _Toc242268651 \h </w:instrText>
         </w:r>
         <w:r>
           <w:rPr>
@@ -3698,7 +3698,7 @@
       <w:pPr>
         <w:pStyle w:val="Heading1"/>
       </w:pPr>
-      <w:bookmarkStart w:id="0" w:name="_Toc242266769"/>
+      <w:bookmarkStart w:id="0" w:name="_Toc242268602"/>
       <w:r>
         <w:lastRenderedPageBreak/>
         <w:t>Execution and files</w:t>
@@ -3739,14 +3739,14 @@
     </w:p>
     <w:p>
       <w:r>
-        <w:t>All four Colab notebooks can be viewed by anyone with the link. Save a copy in your own Google Drive and select Run all. The first cell downloads the required files automatically from the public GitHub project, including the datasets, LodePNG files and Task 04 image. The notebooks can start from a fresh runtime without manual file uploads, a GitHub login or a Google Drive mount. Tasks 01 and 02 use the CPU; select a T4 GPU for Tasks 03 and 04. The public download page contains the report, source code, inputs, saved outputs and recordings.</w:t>
+        <w:t>All four Colab notebooks can be viewed by anyone with the link. Save a copy in your own Google Drive and select Run all. The first cell downloads the required files automatically from the public GitHub project, including the datasets, LodePNG files and Task 04 image. The notebooks can start from a fresh runtime without manual file uploads, a GitHub login or a Google Drive mount. Select Python 3 with a T4 GPU for all four notebooks. Tasks 01 and 02 compute on the CPU; Tasks 03 and 04 use the GPU. The public download page contains the report, source code, inputs, saved outputs and recordings.</w:t>
       </w:r>
     </w:p>
     <w:p>
       <w:pPr>
         <w:pStyle w:val="Heading1"/>
       </w:pPr>
-      <w:bookmarkStart w:id="1" w:name="_Toc242266770"/>
+      <w:bookmarkStart w:id="1" w:name="_Toc242268603"/>
       <w:r>
         <w:t>Validation result</w:t>
       </w:r>
@@ -3762,7 +3762,7 @@
         <w:pStyle w:val="Heading1"/>
         <w:pageBreakBefore/>
       </w:pPr>
-      <w:bookmarkStart w:id="2" w:name="_Toc242266771"/>
+      <w:bookmarkStart w:id="2" w:name="_Toc242268604"/>
       <w:r>
         <w:lastRenderedPageBreak/>
         <w:t>Task 01 Word Occurrence Counting using Multithreading</w:t>
@@ -3795,7 +3795,7 @@
       <w:pPr>
         <w:pStyle w:val="Heading2"/>
       </w:pPr>
-      <w:bookmarkStart w:id="3" w:name="_Toc242266772"/>
+      <w:bookmarkStart w:id="3" w:name="_Toc242268605"/>
       <w:r>
         <w:t>Objective</w:t>
       </w:r>
@@ -3810,7 +3810,7 @@
       <w:pPr>
         <w:pStyle w:val="Heading2"/>
       </w:pPr>
-      <w:bookmarkStart w:id="4" w:name="_Toc242266773"/>
+      <w:bookmarkStart w:id="4" w:name="_Toc242268606"/>
       <w:r>
         <w:t>Implementation</w:t>
       </w:r>
@@ -3835,7 +3835,7 @@
       <w:pPr>
         <w:pStyle w:val="Heading2"/>
       </w:pPr>
-      <w:bookmarkStart w:id="5" w:name="_Toc242266774"/>
+      <w:bookmarkStart w:id="5" w:name="_Toc242268607"/>
       <w:r>
         <w:lastRenderedPageBreak/>
         <w:t>Code I implemented</w:t>
@@ -3893,7 +3893,7 @@
         <w:pStyle w:val="Caption"/>
         <w:keepNext/>
       </w:pPr>
-      <w:bookmarkStart w:id="6" w:name="_Toc242266810"/>
+      <w:bookmarkStart w:id="6" w:name="_Toc242268643"/>
       <w:r>
         <w:t xml:space="preserve">Figure </w:t>
       </w:r>
@@ -3924,7 +3924,7 @@
       <w:pPr>
         <w:pStyle w:val="Heading2"/>
       </w:pPr>
-      <w:bookmarkStart w:id="7" w:name="_Toc242266775"/>
+      <w:bookmarkStart w:id="7" w:name="_Toc242268608"/>
       <w:r>
         <w:t>Synchronisation and memory</w:t>
       </w:r>
@@ -3944,7 +3944,7 @@
       <w:pPr>
         <w:pStyle w:val="Heading2"/>
       </w:pPr>
-      <w:bookmarkStart w:id="8" w:name="_Toc242266776"/>
+      <w:bookmarkStart w:id="8" w:name="_Toc242268609"/>
       <w:r>
         <w:lastRenderedPageBreak/>
         <w:t>Build and run</w:t>
@@ -3977,7 +3977,7 @@
       <w:pPr>
         <w:pStyle w:val="Heading2"/>
       </w:pPr>
-      <w:bookmarkStart w:id="9" w:name="_Toc242266777"/>
+      <w:bookmarkStart w:id="9" w:name="_Toc242268610"/>
       <w:r>
         <w:t>Results and tests</w:t>
       </w:r>
@@ -4002,7 +4002,7 @@
       <w:pPr>
         <w:pStyle w:val="Heading2"/>
       </w:pPr>
-      <w:bookmarkStart w:id="10" w:name="_Toc242266778"/>
+      <w:bookmarkStart w:id="10" w:name="_Toc242268611"/>
       <w:r>
         <w:t>Performance and limits</w:t>
       </w:r>
@@ -4023,7 +4023,7 @@
         <w:pStyle w:val="Heading2"/>
         <w:pageBreakBefore/>
       </w:pPr>
-      <w:bookmarkStart w:id="11" w:name="_Toc242266779"/>
+      <w:bookmarkStart w:id="11" w:name="_Toc242268612"/>
       <w:r>
         <w:lastRenderedPageBreak/>
         <w:t>Colab execution evidence</w:t>
@@ -4081,7 +4081,7 @@
         <w:pStyle w:val="Caption"/>
         <w:keepNext/>
       </w:pPr>
-      <w:bookmarkStart w:id="12" w:name="_Toc242266811"/>
+      <w:bookmarkStart w:id="12" w:name="_Toc242268644"/>
       <w:r>
         <w:t xml:space="preserve">Figure </w:t>
       </w:r>
@@ -4108,7 +4108,7 @@
         <w:pStyle w:val="Heading1"/>
         <w:pageBreakBefore/>
       </w:pPr>
-      <w:bookmarkStart w:id="13" w:name="_Toc242266780"/>
+      <w:bookmarkStart w:id="13" w:name="_Toc242268613"/>
       <w:r>
         <w:lastRenderedPageBreak/>
         <w:t>Task 02 Multiple operations with Matrices using multithreading</w:t>
@@ -4141,7 +4141,7 @@
       <w:pPr>
         <w:pStyle w:val="Heading2"/>
       </w:pPr>
-      <w:bookmarkStart w:id="14" w:name="_Toc242266781"/>
+      <w:bookmarkStart w:id="14" w:name="_Toc242268614"/>
       <w:r>
         <w:t>Objective</w:t>
       </w:r>
@@ -4156,7 +4156,7 @@
       <w:pPr>
         <w:pStyle w:val="Heading2"/>
       </w:pPr>
-      <w:bookmarkStart w:id="15" w:name="_Toc242266782"/>
+      <w:bookmarkStart w:id="15" w:name="_Toc242268615"/>
       <w:r>
         <w:t>Implementation</w:t>
       </w:r>
@@ -4181,7 +4181,7 @@
       <w:pPr>
         <w:pStyle w:val="Heading2"/>
       </w:pPr>
-      <w:bookmarkStart w:id="16" w:name="_Toc242266783"/>
+      <w:bookmarkStart w:id="16" w:name="_Toc242268616"/>
       <w:r>
         <w:lastRenderedPageBreak/>
         <w:t>Code I implemented</w:t>
@@ -4239,7 +4239,7 @@
         <w:pStyle w:val="Caption"/>
         <w:keepNext/>
       </w:pPr>
-      <w:bookmarkStart w:id="17" w:name="_Toc242266812"/>
+      <w:bookmarkStart w:id="17" w:name="_Toc242268645"/>
       <w:r>
         <w:t xml:space="preserve">Figure </w:t>
       </w:r>
@@ -4270,7 +4270,7 @@
       <w:pPr>
         <w:pStyle w:val="Heading2"/>
       </w:pPr>
-      <w:bookmarkStart w:id="18" w:name="_Toc242266784"/>
+      <w:bookmarkStart w:id="18" w:name="_Toc242268617"/>
       <w:r>
         <w:t>Synchronisation and memory</w:t>
       </w:r>
@@ -4295,7 +4295,7 @@
       <w:pPr>
         <w:pStyle w:val="Heading2"/>
       </w:pPr>
-      <w:bookmarkStart w:id="19" w:name="_Toc242266785"/>
+      <w:bookmarkStart w:id="19" w:name="_Toc242268618"/>
       <w:r>
         <w:lastRenderedPageBreak/>
         <w:t>Build and run</w:t>
@@ -4328,7 +4328,7 @@
       <w:pPr>
         <w:pStyle w:val="Heading2"/>
       </w:pPr>
-      <w:bookmarkStart w:id="20" w:name="_Toc242266786"/>
+      <w:bookmarkStart w:id="20" w:name="_Toc242268619"/>
       <w:r>
         <w:t>Results and tests</w:t>
       </w:r>
@@ -4413,7 +4413,7 @@
       <w:pPr>
         <w:pStyle w:val="Heading2"/>
       </w:pPr>
-      <w:bookmarkStart w:id="21" w:name="_Toc242266787"/>
+      <w:bookmarkStart w:id="21" w:name="_Toc242268620"/>
       <w:r>
         <w:t>Performance and limits</w:t>
       </w:r>
@@ -4434,7 +4434,7 @@
         <w:pStyle w:val="Heading2"/>
         <w:pageBreakBefore/>
       </w:pPr>
-      <w:bookmarkStart w:id="22" w:name="_Toc242266788"/>
+      <w:bookmarkStart w:id="22" w:name="_Toc242268621"/>
       <w:r>
         <w:lastRenderedPageBreak/>
         <w:t>Colab execution evidence</w:t>
@@ -4492,7 +4492,7 @@
         <w:pStyle w:val="Caption"/>
         <w:keepNext/>
       </w:pPr>
-      <w:bookmarkStart w:id="23" w:name="_Toc242266813"/>
+      <w:bookmarkStart w:id="23" w:name="_Toc242268646"/>
       <w:r>
         <w:t xml:space="preserve">Figure </w:t>
       </w:r>
@@ -4519,7 +4519,7 @@
         <w:pStyle w:val="Heading1"/>
         <w:pageBreakBefore/>
       </w:pPr>
-      <w:bookmarkStart w:id="24" w:name="_Toc242266789"/>
+      <w:bookmarkStart w:id="24" w:name="_Toc242268622"/>
       <w:r>
         <w:lastRenderedPageBreak/>
         <w:t>Task 03 Password Cracking with Files using CUDA</w:t>
@@ -4552,7 +4552,7 @@
       <w:pPr>
         <w:pStyle w:val="Heading2"/>
       </w:pPr>
-      <w:bookmarkStart w:id="25" w:name="_Toc242266790"/>
+      <w:bookmarkStart w:id="25" w:name="_Toc242268623"/>
       <w:r>
         <w:t>Objective</w:t>
       </w:r>
@@ -4567,7 +4567,7 @@
       <w:pPr>
         <w:pStyle w:val="Heading2"/>
       </w:pPr>
-      <w:bookmarkStart w:id="26" w:name="_Toc242266791"/>
+      <w:bookmarkStart w:id="26" w:name="_Toc242268624"/>
       <w:r>
         <w:t>Implementation</w:t>
       </w:r>
@@ -4597,7 +4597,7 @@
       <w:pPr>
         <w:pStyle w:val="Heading2"/>
       </w:pPr>
-      <w:bookmarkStart w:id="27" w:name="_Toc242266792"/>
+      <w:bookmarkStart w:id="27" w:name="_Toc242268625"/>
       <w:r>
         <w:lastRenderedPageBreak/>
         <w:t>Code I implemented</w:t>
@@ -4655,7 +4655,7 @@
         <w:pStyle w:val="Caption"/>
         <w:keepNext/>
       </w:pPr>
-      <w:bookmarkStart w:id="28" w:name="_Toc242266814"/>
+      <w:bookmarkStart w:id="28" w:name="_Toc242268647"/>
       <w:r>
         <w:t xml:space="preserve">Figure </w:t>
       </w:r>
@@ -4686,7 +4686,7 @@
       <w:pPr>
         <w:pStyle w:val="Heading2"/>
       </w:pPr>
-      <w:bookmarkStart w:id="29" w:name="_Toc242266793"/>
+      <w:bookmarkStart w:id="29" w:name="_Toc242268626"/>
       <w:r>
         <w:t>Synchronisation and memory</w:t>
       </w:r>
@@ -4706,7 +4706,7 @@
       <w:pPr>
         <w:pStyle w:val="Heading2"/>
       </w:pPr>
-      <w:bookmarkStart w:id="30" w:name="_Toc242266794"/>
+      <w:bookmarkStart w:id="30" w:name="_Toc242268627"/>
       <w:r>
         <w:lastRenderedPageBreak/>
         <w:t>Build and run</w:t>
@@ -4739,7 +4739,7 @@
       <w:pPr>
         <w:pStyle w:val="Heading2"/>
       </w:pPr>
-      <w:bookmarkStart w:id="31" w:name="_Toc242266795"/>
+      <w:bookmarkStart w:id="31" w:name="_Toc242268628"/>
       <w:r>
         <w:t>Results and tests</w:t>
       </w:r>
@@ -4868,7 +4868,7 @@
       <w:pPr>
         <w:pStyle w:val="Heading2"/>
       </w:pPr>
-      <w:bookmarkStart w:id="32" w:name="_Toc242266796"/>
+      <w:bookmarkStart w:id="32" w:name="_Toc242268629"/>
       <w:r>
         <w:t>Performance and limits</w:t>
       </w:r>
@@ -4889,7 +4889,7 @@
         <w:pStyle w:val="Heading2"/>
         <w:pageBreakBefore/>
       </w:pPr>
-      <w:bookmarkStart w:id="33" w:name="_Toc242266797"/>
+      <w:bookmarkStart w:id="33" w:name="_Toc242268630"/>
       <w:r>
         <w:lastRenderedPageBreak/>
         <w:t>Colab execution evidence</w:t>
@@ -4947,7 +4947,7 @@
         <w:pStyle w:val="Caption"/>
         <w:keepNext/>
       </w:pPr>
-      <w:bookmarkStart w:id="34" w:name="_Toc242266815"/>
+      <w:bookmarkStart w:id="34" w:name="_Toc242268648"/>
       <w:r>
         <w:t xml:space="preserve">Figure </w:t>
       </w:r>
@@ -4974,7 +4974,7 @@
         <w:pStyle w:val="Heading1"/>
         <w:pageBreakBefore/>
       </w:pPr>
-      <w:bookmarkStart w:id="35" w:name="_Toc242266798"/>
+      <w:bookmarkStart w:id="35" w:name="_Toc242268631"/>
       <w:r>
         <w:lastRenderedPageBreak/>
         <w:t>Task 04</w:t>
@@ -5011,7 +5011,7 @@
       <w:pPr>
         <w:pStyle w:val="Heading2"/>
       </w:pPr>
-      <w:bookmarkStart w:id="36" w:name="_Toc242266799"/>
+      <w:bookmarkStart w:id="36" w:name="_Toc242268632"/>
       <w:r>
         <w:t>Objective</w:t>
       </w:r>
@@ -5026,7 +5026,7 @@
       <w:pPr>
         <w:pStyle w:val="Heading2"/>
       </w:pPr>
-      <w:bookmarkStart w:id="37" w:name="_Toc242266800"/>
+      <w:bookmarkStart w:id="37" w:name="_Toc242268633"/>
       <w:r>
         <w:t>Implementation</w:t>
       </w:r>
@@ -5056,7 +5056,7 @@
       <w:pPr>
         <w:pStyle w:val="Heading2"/>
       </w:pPr>
-      <w:bookmarkStart w:id="38" w:name="_Toc242266801"/>
+      <w:bookmarkStart w:id="38" w:name="_Toc242268634"/>
       <w:r>
         <w:lastRenderedPageBreak/>
         <w:t>Code I implemented</w:t>
@@ -5114,7 +5114,7 @@
         <w:pStyle w:val="Caption"/>
         <w:keepNext/>
       </w:pPr>
-      <w:bookmarkStart w:id="39" w:name="_Toc242266816"/>
+      <w:bookmarkStart w:id="39" w:name="_Toc242268649"/>
       <w:r>
         <w:t xml:space="preserve">Figure </w:t>
       </w:r>
@@ -5145,7 +5145,7 @@
       <w:pPr>
         <w:pStyle w:val="Heading2"/>
       </w:pPr>
-      <w:bookmarkStart w:id="40" w:name="_Toc242266802"/>
+      <w:bookmarkStart w:id="40" w:name="_Toc242268635"/>
       <w:r>
         <w:t>Synchronisation and memory</w:t>
       </w:r>
@@ -5171,7 +5171,7 @@
       <w:pPr>
         <w:pStyle w:val="Heading2"/>
       </w:pPr>
-      <w:bookmarkStart w:id="41" w:name="_Toc242266803"/>
+      <w:bookmarkStart w:id="41" w:name="_Toc242268636"/>
       <w:r>
         <w:t>Build and run</w:t>
       </w:r>
@@ -5214,7 +5214,7 @@
       <w:pPr>
         <w:pStyle w:val="Heading2"/>
       </w:pPr>
-      <w:bookmarkStart w:id="42" w:name="_Toc242266804"/>
+      <w:bookmarkStart w:id="42" w:name="_Toc242268637"/>
       <w:r>
         <w:t>Results and tests</w:t>
       </w:r>
@@ -5239,7 +5239,7 @@
       <w:pPr>
         <w:pStyle w:val="Heading2"/>
       </w:pPr>
-      <w:bookmarkStart w:id="43" w:name="_Toc242266805"/>
+      <w:bookmarkStart w:id="43" w:name="_Toc242268638"/>
       <w:r>
         <w:t>Performance and limits</w:t>
       </w:r>
@@ -5260,7 +5260,7 @@
         <w:pStyle w:val="Heading2"/>
         <w:pageBreakBefore/>
       </w:pPr>
-      <w:bookmarkStart w:id="44" w:name="_Toc242266806"/>
+      <w:bookmarkStart w:id="44" w:name="_Toc242268639"/>
       <w:r>
         <w:lastRenderedPageBreak/>
         <w:t>Colab execution evidence</w:t>
@@ -5318,7 +5318,7 @@
         <w:pStyle w:val="Caption"/>
         <w:keepNext/>
       </w:pPr>
-      <w:bookmarkStart w:id="45" w:name="_Toc242266817"/>
+      <w:bookmarkStart w:id="45" w:name="_Toc242268650"/>
       <w:r>
         <w:t xml:space="preserve">Figure </w:t>
       </w:r>
@@ -5345,7 +5345,7 @@
         <w:pStyle w:val="Heading2"/>
         <w:pageBreakBefore/>
       </w:pPr>
-      <w:bookmarkStart w:id="46" w:name="_Toc242266807"/>
+      <w:bookmarkStart w:id="46" w:name="_Toc242268640"/>
       <w:r>
         <w:lastRenderedPageBreak/>
         <w:t>Task 04 image outputs</w:t>
@@ -5403,7 +5403,7 @@
         <w:pStyle w:val="Caption"/>
         <w:keepNext/>
       </w:pPr>
-      <w:bookmarkStart w:id="47" w:name="_Toc242266818"/>
+      <w:bookmarkStart w:id="47" w:name="_Toc242268651"/>
       <w:r>
         <w:t xml:space="preserve">Figure </w:t>
       </w:r>
@@ -5430,7 +5430,7 @@
         <w:pStyle w:val="Heading1"/>
         <w:pageBreakBefore/>
       </w:pPr>
-      <w:bookmarkStart w:id="48" w:name="_Toc242266808"/>
+      <w:bookmarkStart w:id="48" w:name="_Toc242268641"/>
       <w:r>
         <w:lastRenderedPageBreak/>
         <w:t>Evidence and submission</w:t>
@@ -5456,7 +5456,7 @@
       <w:pPr>
         <w:pStyle w:val="Heading1"/>
       </w:pPr>
-      <w:bookmarkStart w:id="49" w:name="_Toc242266809"/>
+      <w:bookmarkStart w:id="49" w:name="_Toc242268642"/>
       <w:r>
         <w:t>References</w:t>
       </w:r>

</xml_diff>

<commit_message>
Add student cover and declaration to the report
</commit_message>
<xml_diff>
--- a/2638120_Thaslim_Mohammed_Sahl_High_Performance_Computing.docx
+++ b/2638120_Thaslim_Mohammed_Sahl_High_Performance_Computing.docx
@@ -4,36 +4,589 @@
   <w:body>
     <w:p>
       <w:pPr>
-        <w:pStyle w:val="Title"/>
-      </w:pPr>
-      <w:r>
-        <w:t>High Performance Computing portfolio</w:t>
-      </w:r>
-    </w:p>
-    <w:p>
-      <w:r>
-        <w:t>6CS005 2025/26 assessment</w:t>
-      </w:r>
-    </w:p>
-    <w:p>
-      <w:r>
-        <w:t>Thaslim Mohammed Sahl</w:t>
-      </w:r>
-      <w:r>
-        <w:br/>
-        <w:t>Student number 2638120</w:t>
-      </w:r>
-      <w:r>
-        <w:br/>
-        <w:t>7 October 2026</w:t>
-      </w:r>
-    </w:p>
-    <w:p>
-      <w:r>
-        <w:t>This portfolio implements the four tasks in the current assessment brief using Pthreads, OpenMP and CUDA. Each task has a separate source file, Colab notebook and output resources. Correctness is checked against independent reference calculations and invalid-input tests, with actual execution evidence from a Python 3 Colab runtime using a Tesla T4 GPU.</w:t>
-      </w:r>
-    </w:p>
-    <w:p>
+        <w:spacing w:after="1100" w:line="240" w:lineRule="auto"/>
+      </w:pPr>
+      <w:r>
+        <w:rPr>
+          <w:noProof/>
+        </w:rPr>
+        <w:drawing>
+          <wp:inline distT="0" distB="0" distL="0" distR="0" wp14:anchorId="65E98D2A" wp14:editId="4BD967B0">
+            <wp:extent cx="6217920" cy="1359431"/>
+            <wp:effectExtent l="0" t="0" r="0" b="0"/>
+            <wp:docPr id="22" name="Picture 22"/>
+            <wp:cNvGraphicFramePr>
+              <a:graphicFrameLocks xmlns:a="http://schemas.openxmlformats.org/drawingml/2006/main" noChangeAspect="1"/>
+            </wp:cNvGraphicFramePr>
+            <a:graphic xmlns:a="http://schemas.openxmlformats.org/drawingml/2006/main">
+              <a:graphicData uri="http://schemas.openxmlformats.org/drawingml/2006/picture">
+                <pic:pic xmlns:pic="http://schemas.openxmlformats.org/drawingml/2006/picture">
+                  <pic:nvPicPr>
+                    <pic:cNvPr id="0" name="faculty_banner.png"/>
+                    <pic:cNvPicPr/>
+                  </pic:nvPicPr>
+                  <pic:blipFill>
+                    <a:blip r:embed="rId8"/>
+                    <a:stretch>
+                      <a:fillRect/>
+                    </a:stretch>
+                  </pic:blipFill>
+                  <pic:spPr>
+                    <a:xfrm>
+                      <a:off x="0" y="0"/>
+                      <a:ext cx="6217920" cy="1359431"/>
+                    </a:xfrm>
+                    <a:prstGeom prst="rect">
+                      <a:avLst/>
+                    </a:prstGeom>
+                  </pic:spPr>
+                </pic:pic>
+              </a:graphicData>
+            </a:graphic>
+          </wp:inline>
+        </w:drawing>
+      </w:r>
+    </w:p>
+    <w:tbl>
+      <w:tblPr>
+        <w:tblW w:w="0" w:type="auto"/>
+        <w:jc w:val="center"/>
+        <w:tblBorders>
+          <w:top w:val="dotted" w:sz="4" w:space="0" w:color="999999"/>
+          <w:left w:val="dotted" w:sz="4" w:space="0" w:color="999999"/>
+          <w:bottom w:val="dotted" w:sz="4" w:space="0" w:color="999999"/>
+          <w:right w:val="dotted" w:sz="4" w:space="0" w:color="999999"/>
+          <w:insideH w:val="dotted" w:sz="4" w:space="0" w:color="999999"/>
+          <w:insideV w:val="dotted" w:sz="4" w:space="0" w:color="999999"/>
+        </w:tblBorders>
+        <w:tblLayout w:type="fixed"/>
+        <w:tblLook w:val="04A0" w:firstRow="1" w:lastRow="0" w:firstColumn="1" w:lastColumn="0" w:noHBand="0" w:noVBand="1"/>
+      </w:tblPr>
+      <w:tblGrid>
+        <w:gridCol w:w="2851"/>
+        <w:gridCol w:w="6941"/>
+      </w:tblGrid>
+      <w:tr>
+        <w:trPr>
+          <w:cantSplit/>
+          <w:trHeight w:val="778"/>
+          <w:jc w:val="center"/>
+        </w:trPr>
+        <w:tc>
+          <w:tcPr>
+            <w:tcW w:w="2851" w:type="dxa"/>
+            <w:tcMar>
+              <w:top w:w="65" w:type="dxa"/>
+              <w:left w:w="35" w:type="dxa"/>
+              <w:bottom w:w="65" w:type="dxa"/>
+              <w:right w:w="35" w:type="dxa"/>
+            </w:tcMar>
+            <w:vAlign w:val="center"/>
+          </w:tcPr>
+          <w:p>
+            <w:pPr>
+              <w:spacing w:after="0" w:line="252" w:lineRule="auto"/>
+            </w:pPr>
+            <w:r>
+              <w:rPr>
+                <w:b/>
+              </w:rPr>
+              <w:t>Student Name:</w:t>
+            </w:r>
+          </w:p>
+        </w:tc>
+        <w:tc>
+          <w:tcPr>
+            <w:tcW w:w="6941" w:type="dxa"/>
+            <w:tcMar>
+              <w:top w:w="65" w:type="dxa"/>
+              <w:left w:w="35" w:type="dxa"/>
+              <w:bottom w:w="65" w:type="dxa"/>
+              <w:right w:w="35" w:type="dxa"/>
+            </w:tcMar>
+            <w:vAlign w:val="center"/>
+          </w:tcPr>
+          <w:p>
+            <w:pPr>
+              <w:spacing w:after="0" w:line="252" w:lineRule="auto"/>
+            </w:pPr>
+            <w:r>
+              <w:t>Thaslim Mohammed Sahl</w:t>
+            </w:r>
+          </w:p>
+        </w:tc>
+      </w:tr>
+      <w:tr>
+        <w:trPr>
+          <w:cantSplit/>
+          <w:trHeight w:val="778"/>
+          <w:jc w:val="center"/>
+        </w:trPr>
+        <w:tc>
+          <w:tcPr>
+            <w:tcW w:w="2851" w:type="dxa"/>
+            <w:tcMar>
+              <w:top w:w="65" w:type="dxa"/>
+              <w:left w:w="35" w:type="dxa"/>
+              <w:bottom w:w="65" w:type="dxa"/>
+              <w:right w:w="35" w:type="dxa"/>
+            </w:tcMar>
+            <w:vAlign w:val="center"/>
+          </w:tcPr>
+          <w:p>
+            <w:pPr>
+              <w:spacing w:after="0" w:line="252" w:lineRule="auto"/>
+            </w:pPr>
+            <w:r>
+              <w:rPr>
+                <w:b/>
+              </w:rPr>
+              <w:t>Student Number:</w:t>
+            </w:r>
+          </w:p>
+        </w:tc>
+        <w:tc>
+          <w:tcPr>
+            <w:tcW w:w="6941" w:type="dxa"/>
+            <w:tcMar>
+              <w:top w:w="65" w:type="dxa"/>
+              <w:left w:w="35" w:type="dxa"/>
+              <w:bottom w:w="65" w:type="dxa"/>
+              <w:right w:w="35" w:type="dxa"/>
+            </w:tcMar>
+            <w:vAlign w:val="center"/>
+          </w:tcPr>
+          <w:p>
+            <w:pPr>
+              <w:spacing w:after="0" w:line="252" w:lineRule="auto"/>
+            </w:pPr>
+            <w:r>
+              <w:t>2638120</w:t>
+            </w:r>
+          </w:p>
+        </w:tc>
+      </w:tr>
+      <w:tr>
+        <w:trPr>
+          <w:cantSplit/>
+          <w:trHeight w:val="778"/>
+          <w:jc w:val="center"/>
+        </w:trPr>
+        <w:tc>
+          <w:tcPr>
+            <w:tcW w:w="2851" w:type="dxa"/>
+            <w:tcMar>
+              <w:top w:w="65" w:type="dxa"/>
+              <w:left w:w="35" w:type="dxa"/>
+              <w:bottom w:w="65" w:type="dxa"/>
+              <w:right w:w="35" w:type="dxa"/>
+            </w:tcMar>
+            <w:vAlign w:val="center"/>
+          </w:tcPr>
+          <w:p>
+            <w:pPr>
+              <w:spacing w:after="0" w:line="252" w:lineRule="auto"/>
+            </w:pPr>
+            <w:r>
+              <w:rPr>
+                <w:b/>
+              </w:rPr>
+              <w:t>Module Code:</w:t>
+            </w:r>
+          </w:p>
+        </w:tc>
+        <w:tc>
+          <w:tcPr>
+            <w:tcW w:w="6941" w:type="dxa"/>
+            <w:tcMar>
+              <w:top w:w="65" w:type="dxa"/>
+              <w:left w:w="35" w:type="dxa"/>
+              <w:bottom w:w="65" w:type="dxa"/>
+              <w:right w:w="35" w:type="dxa"/>
+            </w:tcMar>
+            <w:vAlign w:val="center"/>
+          </w:tcPr>
+          <w:p>
+            <w:pPr>
+              <w:spacing w:after="0" w:line="252" w:lineRule="auto"/>
+            </w:pPr>
+            <w:r>
+              <w:t>6CS005</w:t>
+            </w:r>
+          </w:p>
+        </w:tc>
+      </w:tr>
+      <w:tr>
+        <w:trPr>
+          <w:cantSplit/>
+          <w:trHeight w:val="778"/>
+          <w:jc w:val="center"/>
+        </w:trPr>
+        <w:tc>
+          <w:tcPr>
+            <w:tcW w:w="2851" w:type="dxa"/>
+            <w:tcMar>
+              <w:top w:w="65" w:type="dxa"/>
+              <w:left w:w="35" w:type="dxa"/>
+              <w:bottom w:w="65" w:type="dxa"/>
+              <w:right w:w="35" w:type="dxa"/>
+            </w:tcMar>
+            <w:vAlign w:val="center"/>
+          </w:tcPr>
+          <w:p>
+            <w:pPr>
+              <w:spacing w:after="0" w:line="252" w:lineRule="auto"/>
+            </w:pPr>
+            <w:r>
+              <w:rPr>
+                <w:b/>
+              </w:rPr>
+              <w:t>Module Name:</w:t>
+            </w:r>
+          </w:p>
+        </w:tc>
+        <w:tc>
+          <w:tcPr>
+            <w:tcW w:w="6941" w:type="dxa"/>
+            <w:tcMar>
+              <w:top w:w="65" w:type="dxa"/>
+              <w:left w:w="35" w:type="dxa"/>
+              <w:bottom w:w="65" w:type="dxa"/>
+              <w:right w:w="35" w:type="dxa"/>
+            </w:tcMar>
+            <w:vAlign w:val="center"/>
+          </w:tcPr>
+          <w:p>
+            <w:pPr>
+              <w:spacing w:after="0" w:line="252" w:lineRule="auto"/>
+            </w:pPr>
+            <w:r>
+              <w:t>High-Performance Computing</w:t>
+            </w:r>
+          </w:p>
+        </w:tc>
+      </w:tr>
+      <w:tr>
+        <w:trPr>
+          <w:cantSplit/>
+          <w:trHeight w:val="778"/>
+          <w:jc w:val="center"/>
+        </w:trPr>
+        <w:tc>
+          <w:tcPr>
+            <w:tcW w:w="2851" w:type="dxa"/>
+            <w:tcMar>
+              <w:top w:w="65" w:type="dxa"/>
+              <w:left w:w="35" w:type="dxa"/>
+              <w:bottom w:w="65" w:type="dxa"/>
+              <w:right w:w="35" w:type="dxa"/>
+            </w:tcMar>
+            <w:vAlign w:val="center"/>
+          </w:tcPr>
+          <w:p>
+            <w:pPr>
+              <w:spacing w:after="0" w:line="252" w:lineRule="auto"/>
+            </w:pPr>
+            <w:r>
+              <w:rPr>
+                <w:b/>
+              </w:rPr>
+              <w:t>Module Leader Name:</w:t>
+            </w:r>
+          </w:p>
+        </w:tc>
+        <w:tc>
+          <w:tcPr>
+            <w:tcW w:w="6941" w:type="dxa"/>
+            <w:tcMar>
+              <w:top w:w="65" w:type="dxa"/>
+              <w:left w:w="35" w:type="dxa"/>
+              <w:bottom w:w="65" w:type="dxa"/>
+              <w:right w:w="35" w:type="dxa"/>
+            </w:tcMar>
+            <w:vAlign w:val="center"/>
+          </w:tcPr>
+          <w:p>
+            <w:pPr>
+              <w:spacing w:after="0" w:line="252" w:lineRule="auto"/>
+            </w:pPr>
+            <w:r>
+              <w:t>Dr. Kasun Jinasena</w:t>
+            </w:r>
+          </w:p>
+        </w:tc>
+      </w:tr>
+      <w:tr>
+        <w:trPr>
+          <w:cantSplit/>
+          <w:trHeight w:val="778"/>
+          <w:jc w:val="center"/>
+        </w:trPr>
+        <w:tc>
+          <w:tcPr>
+            <w:tcW w:w="2851" w:type="dxa"/>
+            <w:tcMar>
+              <w:top w:w="65" w:type="dxa"/>
+              <w:left w:w="35" w:type="dxa"/>
+              <w:bottom w:w="65" w:type="dxa"/>
+              <w:right w:w="35" w:type="dxa"/>
+            </w:tcMar>
+            <w:vAlign w:val="center"/>
+          </w:tcPr>
+          <w:p>
+            <w:pPr>
+              <w:spacing w:after="0" w:line="252" w:lineRule="auto"/>
+            </w:pPr>
+            <w:r>
+              <w:rPr>
+                <w:b/>
+              </w:rPr>
+              <w:t>Reader Name:</w:t>
+            </w:r>
+          </w:p>
+        </w:tc>
+        <w:tc>
+          <w:tcPr>
+            <w:tcW w:w="6941" w:type="dxa"/>
+            <w:tcMar>
+              <w:top w:w="65" w:type="dxa"/>
+              <w:left w:w="35" w:type="dxa"/>
+              <w:bottom w:w="65" w:type="dxa"/>
+              <w:right w:w="35" w:type="dxa"/>
+            </w:tcMar>
+            <w:vAlign w:val="center"/>
+          </w:tcPr>
+          <w:p>
+            <w:pPr>
+              <w:spacing w:after="0" w:line="252" w:lineRule="auto"/>
+            </w:pPr>
+            <w:r>
+              <w:t>Dr. Kasun Jinasena</w:t>
+            </w:r>
+          </w:p>
+        </w:tc>
+      </w:tr>
+      <w:tr>
+        <w:trPr>
+          <w:cantSplit/>
+          <w:trHeight w:val="778"/>
+          <w:jc w:val="center"/>
+        </w:trPr>
+        <w:tc>
+          <w:tcPr>
+            <w:tcW w:w="2851" w:type="dxa"/>
+            <w:tcMar>
+              <w:top w:w="65" w:type="dxa"/>
+              <w:left w:w="35" w:type="dxa"/>
+              <w:bottom w:w="65" w:type="dxa"/>
+              <w:right w:w="35" w:type="dxa"/>
+            </w:tcMar>
+            <w:vAlign w:val="center"/>
+          </w:tcPr>
+          <w:p>
+            <w:pPr>
+              <w:spacing w:after="0" w:line="252" w:lineRule="auto"/>
+            </w:pPr>
+            <w:r>
+              <w:rPr>
+                <w:b/>
+              </w:rPr>
+              <w:t>Submission Date:</w:t>
+            </w:r>
+          </w:p>
+        </w:tc>
+        <w:tc>
+          <w:tcPr>
+            <w:tcW w:w="6941" w:type="dxa"/>
+            <w:tcMar>
+              <w:top w:w="65" w:type="dxa"/>
+              <w:left w:w="35" w:type="dxa"/>
+              <w:bottom w:w="65" w:type="dxa"/>
+              <w:right w:w="35" w:type="dxa"/>
+            </w:tcMar>
+            <w:vAlign w:val="center"/>
+          </w:tcPr>
+          <w:p>
+            <w:pPr>
+              <w:spacing w:after="0" w:line="252" w:lineRule="auto"/>
+            </w:pPr>
+            <w:r>
+              <w:t>11th October 2026</w:t>
+            </w:r>
+          </w:p>
+        </w:tc>
+      </w:tr>
+      <w:tr>
+        <w:trPr>
+          <w:cantSplit/>
+          <w:trHeight w:val="778"/>
+          <w:jc w:val="center"/>
+        </w:trPr>
+        <w:tc>
+          <w:tcPr>
+            <w:tcW w:w="2851" w:type="dxa"/>
+            <w:tcMar>
+              <w:top w:w="65" w:type="dxa"/>
+              <w:left w:w="35" w:type="dxa"/>
+              <w:bottom w:w="65" w:type="dxa"/>
+              <w:right w:w="35" w:type="dxa"/>
+            </w:tcMar>
+            <w:vAlign w:val="center"/>
+          </w:tcPr>
+          <w:p>
+            <w:pPr>
+              <w:spacing w:after="0" w:line="252" w:lineRule="auto"/>
+            </w:pPr>
+            <w:r>
+              <w:rPr>
+                <w:b/>
+              </w:rPr>
+              <w:t>Award Title:</w:t>
+            </w:r>
+          </w:p>
+        </w:tc>
+        <w:tc>
+          <w:tcPr>
+            <w:tcW w:w="6941" w:type="dxa"/>
+            <w:tcMar>
+              <w:top w:w="65" w:type="dxa"/>
+              <w:left w:w="35" w:type="dxa"/>
+              <w:bottom w:w="65" w:type="dxa"/>
+              <w:right w:w="35" w:type="dxa"/>
+            </w:tcMar>
+            <w:vAlign w:val="center"/>
+          </w:tcPr>
+          <w:p>
+            <w:pPr>
+              <w:spacing w:after="0" w:line="252" w:lineRule="auto"/>
+            </w:pPr>
+            <w:r>
+              <w:t>Top-Up BSc (Hons) in Computer Science (Software Engineering)</w:t>
+            </w:r>
+          </w:p>
+        </w:tc>
+      </w:tr>
+    </w:tbl>
+    <w:p>
+      <w:pPr>
+        <w:spacing w:before="1520" w:after="0" w:line="240" w:lineRule="auto"/>
+      </w:pPr>
+      <w:r>
+        <w:rPr>
+          <w:noProof/>
+        </w:rPr>
+        <w:drawing>
+          <wp:inline distT="0" distB="0" distL="0" distR="0" wp14:anchorId="6E6BA633" wp14:editId="32D3D582">
+            <wp:extent cx="6217920" cy="354634"/>
+            <wp:effectExtent l="0" t="0" r="0" b="0"/>
+            <wp:docPr id="23" name="Picture 23"/>
+            <wp:cNvGraphicFramePr>
+              <a:graphicFrameLocks xmlns:a="http://schemas.openxmlformats.org/drawingml/2006/main" noChangeAspect="1"/>
+            </wp:cNvGraphicFramePr>
+            <a:graphic xmlns:a="http://schemas.openxmlformats.org/drawingml/2006/main">
+              <a:graphicData uri="http://schemas.openxmlformats.org/drawingml/2006/picture">
+                <pic:pic xmlns:pic="http://schemas.openxmlformats.org/drawingml/2006/picture">
+                  <pic:nvPicPr>
+                    <pic:cNvPr id="0" name="school_banner.png"/>
+                    <pic:cNvPicPr/>
+                  </pic:nvPicPr>
+                  <pic:blipFill>
+                    <a:blip r:embed="rId9"/>
+                    <a:stretch>
+                      <a:fillRect/>
+                    </a:stretch>
+                  </pic:blipFill>
+                  <pic:spPr>
+                    <a:xfrm>
+                      <a:off x="0" y="0"/>
+                      <a:ext cx="6217920" cy="354634"/>
+                    </a:xfrm>
+                    <a:prstGeom prst="rect">
+                      <a:avLst/>
+                    </a:prstGeom>
+                  </pic:spPr>
+                </pic:pic>
+              </a:graphicData>
+            </a:graphic>
+          </wp:inline>
+        </w:drawing>
+      </w:r>
+    </w:p>
+    <w:p>
+      <w:pPr>
+        <w:pageBreakBefore/>
+        <w:spacing w:after="600" w:line="276" w:lineRule="auto"/>
+      </w:pPr>
+      <w:r>
+        <w:rPr>
+          <w:b/>
+          <w:color w:val="2F5496"/>
+          <w:sz w:val="40"/>
+        </w:rPr>
+        <w:lastRenderedPageBreak/>
+        <w:t>Declaration</w:t>
+      </w:r>
+    </w:p>
+    <w:p>
+      <w:pPr>
+        <w:spacing w:after="560" w:line="276" w:lineRule="auto"/>
+      </w:pPr>
+      <w:r>
+        <w:t>Presented in partial fulfilment of the assessment requirements for the above award.</w:t>
+      </w:r>
+    </w:p>
+    <w:p>
+      <w:pPr>
+        <w:spacing w:after="560" w:line="276" w:lineRule="auto"/>
+      </w:pPr>
+      <w:r>
+        <w:t>I take responsibility for this submission and for the explanations and results presented in this report. The report uses the supplied teaching materials and source code, together with the sources and assistance used in preparing and checking the work. These must be acknowledged in accordance with the University's assessment requirements.</w:t>
+      </w:r>
+    </w:p>
+    <w:p>
+      <w:pPr>
+        <w:spacing w:after="640" w:line="276" w:lineRule="auto"/>
+      </w:pPr>
+      <w:r>
+        <w:t>I understand that the author retains copyright in the submitted work and that the University may use the work for assessment and related academic purposes in accordance with its regulations.</w:t>
+      </w:r>
+    </w:p>
+    <w:p>
+      <w:pPr>
+        <w:spacing w:after="240" w:line="276" w:lineRule="auto"/>
+      </w:pPr>
+      <w:r>
+        <w:t>Student Name: Thaslim Mohammed Sahl</w:t>
+      </w:r>
+    </w:p>
+    <w:p>
+      <w:pPr>
+        <w:spacing w:after="360" w:line="276" w:lineRule="auto"/>
+      </w:pPr>
+      <w:r>
+        <w:t>Student Number: 2638120</w:t>
+      </w:r>
+    </w:p>
+    <w:p>
+      <w:pPr>
+        <w:spacing w:after="320" w:line="276" w:lineRule="auto"/>
+      </w:pPr>
+      <w:r>
+        <w:t>Signature of the Student: __________________________________</w:t>
+      </w:r>
+    </w:p>
+    <w:p>
+      <w:pPr>
+        <w:spacing w:after="0" w:line="276" w:lineRule="auto"/>
+      </w:pPr>
+      <w:r>
+        <w:t>Date: ____________________</w:t>
+      </w:r>
+    </w:p>
+    <w:p>
+      <w:pPr>
+        <w:spacing w:after="0" w:line="276" w:lineRule="auto"/>
+      </w:pPr>
       <w:r>
         <w:br w:type="page"/>
       </w:r>
@@ -70,7 +623,7 @@
       <w:r>
         <w:fldChar w:fldCharType="separate"/>
       </w:r>
-      <w:hyperlink w:anchor="_Toc242268602" w:history="1">
+      <w:hyperlink w:anchor="_Toc242564995" w:history="1">
         <w:r>
           <w:rPr>
             <w:rStyle w:val="Hyperlink"/>
@@ -97,7 +650,7 @@
             <w:noProof/>
             <w:webHidden/>
           </w:rPr>
-          <w:instrText xml:space="preserve"> PAGEREF _Toc242268602 \h </w:instrText>
+          <w:instrText xml:space="preserve"> PAGEREF _Toc242564995 \h </w:instrText>
         </w:r>
         <w:r>
           <w:rPr>
@@ -117,7 +670,7 @@
             <w:noProof/>
             <w:webHidden/>
           </w:rPr>
-          <w:t>5</w:t>
+          <w:t>6</w:t>
         </w:r>
         <w:r>
           <w:rPr>
@@ -142,7 +695,7 @@
           <w14:ligatures w14:val="standardContextual"/>
         </w:rPr>
       </w:pPr>
-      <w:hyperlink w:anchor="_Toc242268603" w:history="1">
+      <w:hyperlink w:anchor="_Toc242564996" w:history="1">
         <w:r>
           <w:rPr>
             <w:rStyle w:val="Hyperlink"/>
@@ -169,7 +722,7 @@
             <w:noProof/>
             <w:webHidden/>
           </w:rPr>
-          <w:instrText xml:space="preserve"> PAGEREF _Toc242268603 \h </w:instrText>
+          <w:instrText xml:space="preserve"> PAGEREF _Toc242564996 \h </w:instrText>
         </w:r>
         <w:r>
           <w:rPr>
@@ -189,7 +742,7 @@
             <w:noProof/>
             <w:webHidden/>
           </w:rPr>
-          <w:t>5</w:t>
+          <w:t>6</w:t>
         </w:r>
         <w:r>
           <w:rPr>
@@ -214,7 +767,7 @@
           <w14:ligatures w14:val="standardContextual"/>
         </w:rPr>
       </w:pPr>
-      <w:hyperlink w:anchor="_Toc242268604" w:history="1">
+      <w:hyperlink w:anchor="_Toc242564997" w:history="1">
         <w:r>
           <w:rPr>
             <w:rStyle w:val="Hyperlink"/>
@@ -241,7 +794,7 @@
             <w:noProof/>
             <w:webHidden/>
           </w:rPr>
-          <w:instrText xml:space="preserve"> PAGEREF _Toc242268604 \h </w:instrText>
+          <w:instrText xml:space="preserve"> PAGEREF _Toc242564997 \h </w:instrText>
         </w:r>
         <w:r>
           <w:rPr>
@@ -261,7 +814,7 @@
             <w:noProof/>
             <w:webHidden/>
           </w:rPr>
-          <w:t>6</w:t>
+          <w:t>7</w:t>
         </w:r>
         <w:r>
           <w:rPr>
@@ -286,7 +839,7 @@
           <w14:ligatures w14:val="standardContextual"/>
         </w:rPr>
       </w:pPr>
-      <w:hyperlink w:anchor="_Toc242268605" w:history="1">
+      <w:hyperlink w:anchor="_Toc242564998" w:history="1">
         <w:r>
           <w:rPr>
             <w:rStyle w:val="Hyperlink"/>
@@ -313,7 +866,7 @@
             <w:noProof/>
             <w:webHidden/>
           </w:rPr>
-          <w:instrText xml:space="preserve"> PAGEREF _Toc242268605 \h </w:instrText>
+          <w:instrText xml:space="preserve"> PAGEREF _Toc242564998 \h </w:instrText>
         </w:r>
         <w:r>
           <w:rPr>
@@ -333,7 +886,7 @@
             <w:noProof/>
             <w:webHidden/>
           </w:rPr>
-          <w:t>6</w:t>
+          <w:t>7</w:t>
         </w:r>
         <w:r>
           <w:rPr>
@@ -358,7 +911,7 @@
           <w14:ligatures w14:val="standardContextual"/>
         </w:rPr>
       </w:pPr>
-      <w:hyperlink w:anchor="_Toc242268606" w:history="1">
+      <w:hyperlink w:anchor="_Toc242564999" w:history="1">
         <w:r>
           <w:rPr>
             <w:rStyle w:val="Hyperlink"/>
@@ -385,7 +938,7 @@
             <w:noProof/>
             <w:webHidden/>
           </w:rPr>
-          <w:instrText xml:space="preserve"> PAGEREF _Toc242268606 \h </w:instrText>
+          <w:instrText xml:space="preserve"> PAGEREF _Toc242564999 \h </w:instrText>
         </w:r>
         <w:r>
           <w:rPr>
@@ -405,7 +958,7 @@
             <w:noProof/>
             <w:webHidden/>
           </w:rPr>
-          <w:t>6</w:t>
+          <w:t>7</w:t>
         </w:r>
         <w:r>
           <w:rPr>
@@ -430,7 +983,7 @@
           <w14:ligatures w14:val="standardContextual"/>
         </w:rPr>
       </w:pPr>
-      <w:hyperlink w:anchor="_Toc242268607" w:history="1">
+      <w:hyperlink w:anchor="_Toc242565000" w:history="1">
         <w:r>
           <w:rPr>
             <w:rStyle w:val="Hyperlink"/>
@@ -457,7 +1010,7 @@
             <w:noProof/>
             <w:webHidden/>
           </w:rPr>
-          <w:instrText xml:space="preserve"> PAGEREF _Toc242268607 \h </w:instrText>
+          <w:instrText xml:space="preserve"> PAGEREF _Toc242565000 \h </w:instrText>
         </w:r>
         <w:r>
           <w:rPr>
@@ -502,7 +1055,7 @@
           <w14:ligatures w14:val="standardContextual"/>
         </w:rPr>
       </w:pPr>
-      <w:hyperlink w:anchor="_Toc242268608" w:history="1">
+      <w:hyperlink w:anchor="_Toc242565001" w:history="1">
         <w:r>
           <w:rPr>
             <w:rStyle w:val="Hyperlink"/>
@@ -529,7 +1082,7 @@
             <w:noProof/>
             <w:webHidden/>
           </w:rPr>
-          <w:instrText xml:space="preserve"> PAGEREF _Toc242268608 \h </w:instrText>
+          <w:instrText xml:space="preserve"> PAGEREF _Toc242565001 \h </w:instrText>
         </w:r>
         <w:r>
           <w:rPr>
@@ -549,7 +1102,7 @@
             <w:noProof/>
             <w:webHidden/>
           </w:rPr>
-          <w:t>7</w:t>
+          <w:t>8</w:t>
         </w:r>
         <w:r>
           <w:rPr>
@@ -574,7 +1127,7 @@
           <w14:ligatures w14:val="standardContextual"/>
         </w:rPr>
       </w:pPr>
-      <w:hyperlink w:anchor="_Toc242268609" w:history="1">
+      <w:hyperlink w:anchor="_Toc242565002" w:history="1">
         <w:r>
           <w:rPr>
             <w:rStyle w:val="Hyperlink"/>
@@ -601,7 +1154,7 @@
             <w:noProof/>
             <w:webHidden/>
           </w:rPr>
-          <w:instrText xml:space="preserve"> PAGEREF _Toc242268609 \h </w:instrText>
+          <w:instrText xml:space="preserve"> PAGEREF _Toc242565002 \h </w:instrText>
         </w:r>
         <w:r>
           <w:rPr>
@@ -646,7 +1199,7 @@
           <w14:ligatures w14:val="standardContextual"/>
         </w:rPr>
       </w:pPr>
-      <w:hyperlink w:anchor="_Toc242268610" w:history="1">
+      <w:hyperlink w:anchor="_Toc242565003" w:history="1">
         <w:r>
           <w:rPr>
             <w:rStyle w:val="Hyperlink"/>
@@ -673,7 +1226,7 @@
             <w:noProof/>
             <w:webHidden/>
           </w:rPr>
-          <w:instrText xml:space="preserve"> PAGEREF _Toc242268610 \h </w:instrText>
+          <w:instrText xml:space="preserve"> PAGEREF _Toc242565003 \h </w:instrText>
         </w:r>
         <w:r>
           <w:rPr>
@@ -718,7 +1271,7 @@
           <w14:ligatures w14:val="standardContextual"/>
         </w:rPr>
       </w:pPr>
-      <w:hyperlink w:anchor="_Toc242268611" w:history="1">
+      <w:hyperlink w:anchor="_Toc242565004" w:history="1">
         <w:r>
           <w:rPr>
             <w:rStyle w:val="Hyperlink"/>
@@ -745,7 +1298,7 @@
             <w:noProof/>
             <w:webHidden/>
           </w:rPr>
-          <w:instrText xml:space="preserve"> PAGEREF _Toc242268611 \h </w:instrText>
+          <w:instrText xml:space="preserve"> PAGEREF _Toc242565004 \h </w:instrText>
         </w:r>
         <w:r>
           <w:rPr>
@@ -790,7 +1343,7 @@
           <w14:ligatures w14:val="standardContextual"/>
         </w:rPr>
       </w:pPr>
-      <w:hyperlink w:anchor="_Toc242268612" w:history="1">
+      <w:hyperlink w:anchor="_Toc242565005" w:history="1">
         <w:r>
           <w:rPr>
             <w:rStyle w:val="Hyperlink"/>
@@ -817,7 +1370,7 @@
             <w:noProof/>
             <w:webHidden/>
           </w:rPr>
-          <w:instrText xml:space="preserve"> PAGEREF _Toc242268612 \h </w:instrText>
+          <w:instrText xml:space="preserve"> PAGEREF _Toc242565005 \h </w:instrText>
         </w:r>
         <w:r>
           <w:rPr>
@@ -838,6 +1391,78 @@
             <w:webHidden/>
           </w:rPr>
           <w:t>9</w:t>
+        </w:r>
+        <w:r>
+          <w:rPr>
+            <w:noProof/>
+            <w:webHidden/>
+          </w:rPr>
+          <w:fldChar w:fldCharType="end"/>
+        </w:r>
+      </w:hyperlink>
+    </w:p>
+    <w:p>
+      <w:pPr>
+        <w:pStyle w:val="TOC2"/>
+        <w:tabs>
+          <w:tab w:val="right" w:leader="dot" w:pos="9782"/>
+        </w:tabs>
+        <w:rPr>
+          <w:rFonts w:asciiTheme="minorHAnsi" w:eastAsiaTheme="minorEastAsia" w:hAnsiTheme="minorHAnsi" w:cstheme="minorBidi"/>
+          <w:noProof/>
+          <w:kern w:val="2"/>
+          <w:szCs w:val="24"/>
+          <w14:ligatures w14:val="standardContextual"/>
+        </w:rPr>
+      </w:pPr>
+      <w:hyperlink w:anchor="_Toc242565006" w:history="1">
+        <w:r>
+          <w:rPr>
+            <w:rStyle w:val="Hyperlink"/>
+            <w:noProof/>
+          </w:rPr>
+          <w:t>Automatic resource download</w:t>
+        </w:r>
+        <w:r>
+          <w:rPr>
+            <w:noProof/>
+            <w:webHidden/>
+          </w:rPr>
+          <w:tab/>
+        </w:r>
+        <w:r>
+          <w:rPr>
+            <w:noProof/>
+            <w:webHidden/>
+          </w:rPr>
+          <w:fldChar w:fldCharType="begin"/>
+        </w:r>
+        <w:r>
+          <w:rPr>
+            <w:noProof/>
+            <w:webHidden/>
+          </w:rPr>
+          <w:instrText xml:space="preserve"> PAGEREF _Toc242565006 \h </w:instrText>
+        </w:r>
+        <w:r>
+          <w:rPr>
+            <w:noProof/>
+            <w:webHidden/>
+          </w:rPr>
+        </w:r>
+        <w:r>
+          <w:rPr>
+            <w:noProof/>
+            <w:webHidden/>
+          </w:rPr>
+          <w:fldChar w:fldCharType="separate"/>
+        </w:r>
+        <w:r>
+          <w:rPr>
+            <w:noProof/>
+            <w:webHidden/>
+          </w:rPr>
+          <w:t>10</w:t>
         </w:r>
         <w:r>
           <w:rPr>
@@ -862,7 +1487,7 @@
           <w14:ligatures w14:val="standardContextual"/>
         </w:rPr>
       </w:pPr>
-      <w:hyperlink w:anchor="_Toc242268613" w:history="1">
+      <w:hyperlink w:anchor="_Toc242565007" w:history="1">
         <w:r>
           <w:rPr>
             <w:rStyle w:val="Hyperlink"/>
@@ -889,7 +1514,7 @@
             <w:noProof/>
             <w:webHidden/>
           </w:rPr>
-          <w:instrText xml:space="preserve"> PAGEREF _Toc242268613 \h </w:instrText>
+          <w:instrText xml:space="preserve"> PAGEREF _Toc242565007 \h </w:instrText>
         </w:r>
         <w:r>
           <w:rPr>
@@ -909,7 +1534,7 @@
             <w:noProof/>
             <w:webHidden/>
           </w:rPr>
-          <w:t>10</w:t>
+          <w:t>11</w:t>
         </w:r>
         <w:r>
           <w:rPr>
@@ -934,7 +1559,7 @@
           <w14:ligatures w14:val="standardContextual"/>
         </w:rPr>
       </w:pPr>
-      <w:hyperlink w:anchor="_Toc242268614" w:history="1">
+      <w:hyperlink w:anchor="_Toc242565008" w:history="1">
         <w:r>
           <w:rPr>
             <w:rStyle w:val="Hyperlink"/>
@@ -961,7 +1586,7 @@
             <w:noProof/>
             <w:webHidden/>
           </w:rPr>
-          <w:instrText xml:space="preserve"> PAGEREF _Toc242268614 \h </w:instrText>
+          <w:instrText xml:space="preserve"> PAGEREF _Toc242565008 \h </w:instrText>
         </w:r>
         <w:r>
           <w:rPr>
@@ -981,7 +1606,7 @@
             <w:noProof/>
             <w:webHidden/>
           </w:rPr>
-          <w:t>10</w:t>
+          <w:t>11</w:t>
         </w:r>
         <w:r>
           <w:rPr>
@@ -1006,7 +1631,7 @@
           <w14:ligatures w14:val="standardContextual"/>
         </w:rPr>
       </w:pPr>
-      <w:hyperlink w:anchor="_Toc242268615" w:history="1">
+      <w:hyperlink w:anchor="_Toc242565009" w:history="1">
         <w:r>
           <w:rPr>
             <w:rStyle w:val="Hyperlink"/>
@@ -1033,7 +1658,7 @@
             <w:noProof/>
             <w:webHidden/>
           </w:rPr>
-          <w:instrText xml:space="preserve"> PAGEREF _Toc242268615 \h </w:instrText>
+          <w:instrText xml:space="preserve"> PAGEREF _Toc242565009 \h </w:instrText>
         </w:r>
         <w:r>
           <w:rPr>
@@ -1053,7 +1678,7 @@
             <w:noProof/>
             <w:webHidden/>
           </w:rPr>
-          <w:t>10</w:t>
+          <w:t>11</w:t>
         </w:r>
         <w:r>
           <w:rPr>
@@ -1078,7 +1703,7 @@
           <w14:ligatures w14:val="standardContextual"/>
         </w:rPr>
       </w:pPr>
-      <w:hyperlink w:anchor="_Toc242268616" w:history="1">
+      <w:hyperlink w:anchor="_Toc242565010" w:history="1">
         <w:r>
           <w:rPr>
             <w:rStyle w:val="Hyperlink"/>
@@ -1105,7 +1730,7 @@
             <w:noProof/>
             <w:webHidden/>
           </w:rPr>
-          <w:instrText xml:space="preserve"> PAGEREF _Toc242268616 \h </w:instrText>
+          <w:instrText xml:space="preserve"> PAGEREF _Toc242565010 \h </w:instrText>
         </w:r>
         <w:r>
           <w:rPr>
@@ -1150,7 +1775,7 @@
           <w14:ligatures w14:val="standardContextual"/>
         </w:rPr>
       </w:pPr>
-      <w:hyperlink w:anchor="_Toc242268617" w:history="1">
+      <w:hyperlink w:anchor="_Toc242565011" w:history="1">
         <w:r>
           <w:rPr>
             <w:rStyle w:val="Hyperlink"/>
@@ -1177,7 +1802,7 @@
             <w:noProof/>
             <w:webHidden/>
           </w:rPr>
-          <w:instrText xml:space="preserve"> PAGEREF _Toc242268617 \h </w:instrText>
+          <w:instrText xml:space="preserve"> PAGEREF _Toc242565011 \h </w:instrText>
         </w:r>
         <w:r>
           <w:rPr>
@@ -1197,7 +1822,7 @@
             <w:noProof/>
             <w:webHidden/>
           </w:rPr>
-          <w:t>11</w:t>
+          <w:t>12</w:t>
         </w:r>
         <w:r>
           <w:rPr>
@@ -1222,7 +1847,7 @@
           <w14:ligatures w14:val="standardContextual"/>
         </w:rPr>
       </w:pPr>
-      <w:hyperlink w:anchor="_Toc242268618" w:history="1">
+      <w:hyperlink w:anchor="_Toc242565012" w:history="1">
         <w:r>
           <w:rPr>
             <w:rStyle w:val="Hyperlink"/>
@@ -1249,7 +1874,7 @@
             <w:noProof/>
             <w:webHidden/>
           </w:rPr>
-          <w:instrText xml:space="preserve"> PAGEREF _Toc242268618 \h </w:instrText>
+          <w:instrText xml:space="preserve"> PAGEREF _Toc242565012 \h </w:instrText>
         </w:r>
         <w:r>
           <w:rPr>
@@ -1294,7 +1919,7 @@
           <w14:ligatures w14:val="standardContextual"/>
         </w:rPr>
       </w:pPr>
-      <w:hyperlink w:anchor="_Toc242268619" w:history="1">
+      <w:hyperlink w:anchor="_Toc242565013" w:history="1">
         <w:r>
           <w:rPr>
             <w:rStyle w:val="Hyperlink"/>
@@ -1321,7 +1946,7 @@
             <w:noProof/>
             <w:webHidden/>
           </w:rPr>
-          <w:instrText xml:space="preserve"> PAGEREF _Toc242268619 \h </w:instrText>
+          <w:instrText xml:space="preserve"> PAGEREF _Toc242565013 \h </w:instrText>
         </w:r>
         <w:r>
           <w:rPr>
@@ -1366,7 +1991,7 @@
           <w14:ligatures w14:val="standardContextual"/>
         </w:rPr>
       </w:pPr>
-      <w:hyperlink w:anchor="_Toc242268620" w:history="1">
+      <w:hyperlink w:anchor="_Toc242565014" w:history="1">
         <w:r>
           <w:rPr>
             <w:rStyle w:val="Hyperlink"/>
@@ -1393,7 +2018,7 @@
             <w:noProof/>
             <w:webHidden/>
           </w:rPr>
-          <w:instrText xml:space="preserve"> PAGEREF _Toc242268620 \h </w:instrText>
+          <w:instrText xml:space="preserve"> PAGEREF _Toc242565014 \h </w:instrText>
         </w:r>
         <w:r>
           <w:rPr>
@@ -1413,7 +2038,7 @@
             <w:noProof/>
             <w:webHidden/>
           </w:rPr>
-          <w:t>12</w:t>
+          <w:t>13</w:t>
         </w:r>
         <w:r>
           <w:rPr>
@@ -1438,7 +2063,7 @@
           <w14:ligatures w14:val="standardContextual"/>
         </w:rPr>
       </w:pPr>
-      <w:hyperlink w:anchor="_Toc242268621" w:history="1">
+      <w:hyperlink w:anchor="_Toc242565015" w:history="1">
         <w:r>
           <w:rPr>
             <w:rStyle w:val="Hyperlink"/>
@@ -1465,7 +2090,7 @@
             <w:noProof/>
             <w:webHidden/>
           </w:rPr>
-          <w:instrText xml:space="preserve"> PAGEREF _Toc242268621 \h </w:instrText>
+          <w:instrText xml:space="preserve"> PAGEREF _Toc242565015 \h </w:instrText>
         </w:r>
         <w:r>
           <w:rPr>
@@ -1485,7 +2110,79 @@
             <w:noProof/>
             <w:webHidden/>
           </w:rPr>
-          <w:t>13</w:t>
+          <w:t>14</w:t>
+        </w:r>
+        <w:r>
+          <w:rPr>
+            <w:noProof/>
+            <w:webHidden/>
+          </w:rPr>
+          <w:fldChar w:fldCharType="end"/>
+        </w:r>
+      </w:hyperlink>
+    </w:p>
+    <w:p>
+      <w:pPr>
+        <w:pStyle w:val="TOC2"/>
+        <w:tabs>
+          <w:tab w:val="right" w:leader="dot" w:pos="9782"/>
+        </w:tabs>
+        <w:rPr>
+          <w:rFonts w:asciiTheme="minorHAnsi" w:eastAsiaTheme="minorEastAsia" w:hAnsiTheme="minorHAnsi" w:cstheme="minorBidi"/>
+          <w:noProof/>
+          <w:kern w:val="2"/>
+          <w:szCs w:val="24"/>
+          <w14:ligatures w14:val="standardContextual"/>
+        </w:rPr>
+      </w:pPr>
+      <w:hyperlink w:anchor="_Toc242565016" w:history="1">
+        <w:r>
+          <w:rPr>
+            <w:rStyle w:val="Hyperlink"/>
+            <w:noProof/>
+          </w:rPr>
+          <w:t>Automatic resource download</w:t>
+        </w:r>
+        <w:r>
+          <w:rPr>
+            <w:noProof/>
+            <w:webHidden/>
+          </w:rPr>
+          <w:tab/>
+        </w:r>
+        <w:r>
+          <w:rPr>
+            <w:noProof/>
+            <w:webHidden/>
+          </w:rPr>
+          <w:fldChar w:fldCharType="begin"/>
+        </w:r>
+        <w:r>
+          <w:rPr>
+            <w:noProof/>
+            <w:webHidden/>
+          </w:rPr>
+          <w:instrText xml:space="preserve"> PAGEREF _Toc242565016 \h </w:instrText>
+        </w:r>
+        <w:r>
+          <w:rPr>
+            <w:noProof/>
+            <w:webHidden/>
+          </w:rPr>
+        </w:r>
+        <w:r>
+          <w:rPr>
+            <w:noProof/>
+            <w:webHidden/>
+          </w:rPr>
+          <w:fldChar w:fldCharType="separate"/>
+        </w:r>
+        <w:r>
+          <w:rPr>
+            <w:noProof/>
+            <w:webHidden/>
+          </w:rPr>
+          <w:t>15</w:t>
         </w:r>
         <w:r>
           <w:rPr>
@@ -1510,7 +2207,7 @@
           <w14:ligatures w14:val="standardContextual"/>
         </w:rPr>
       </w:pPr>
-      <w:hyperlink w:anchor="_Toc242268622" w:history="1">
+      <w:hyperlink w:anchor="_Toc242565017" w:history="1">
         <w:r>
           <w:rPr>
             <w:rStyle w:val="Hyperlink"/>
@@ -1537,7 +2234,7 @@
             <w:noProof/>
             <w:webHidden/>
           </w:rPr>
-          <w:instrText xml:space="preserve"> PAGEREF _Toc242268622 \h </w:instrText>
+          <w:instrText xml:space="preserve"> PAGEREF _Toc242565017 \h </w:instrText>
         </w:r>
         <w:r>
           <w:rPr>
@@ -1557,7 +2254,7 @@
             <w:noProof/>
             <w:webHidden/>
           </w:rPr>
-          <w:t>14</w:t>
+          <w:t>16</w:t>
         </w:r>
         <w:r>
           <w:rPr>
@@ -1582,7 +2279,7 @@
           <w14:ligatures w14:val="standardContextual"/>
         </w:rPr>
       </w:pPr>
-      <w:hyperlink w:anchor="_Toc242268623" w:history="1">
+      <w:hyperlink w:anchor="_Toc242565018" w:history="1">
         <w:r>
           <w:rPr>
             <w:rStyle w:val="Hyperlink"/>
@@ -1609,7 +2306,7 @@
             <w:noProof/>
             <w:webHidden/>
           </w:rPr>
-          <w:instrText xml:space="preserve"> PAGEREF _Toc242268623 \h </w:instrText>
+          <w:instrText xml:space="preserve"> PAGEREF _Toc242565018 \h </w:instrText>
         </w:r>
         <w:r>
           <w:rPr>
@@ -1629,7 +2326,7 @@
             <w:noProof/>
             <w:webHidden/>
           </w:rPr>
-          <w:t>14</w:t>
+          <w:t>16</w:t>
         </w:r>
         <w:r>
           <w:rPr>
@@ -1654,7 +2351,7 @@
           <w14:ligatures w14:val="standardContextual"/>
         </w:rPr>
       </w:pPr>
-      <w:hyperlink w:anchor="_Toc242268624" w:history="1">
+      <w:hyperlink w:anchor="_Toc242565019" w:history="1">
         <w:r>
           <w:rPr>
             <w:rStyle w:val="Hyperlink"/>
@@ -1681,7 +2378,7 @@
             <w:noProof/>
             <w:webHidden/>
           </w:rPr>
-          <w:instrText xml:space="preserve"> PAGEREF _Toc242268624 \h </w:instrText>
+          <w:instrText xml:space="preserve"> PAGEREF _Toc242565019 \h </w:instrText>
         </w:r>
         <w:r>
           <w:rPr>
@@ -1701,7 +2398,7 @@
             <w:noProof/>
             <w:webHidden/>
           </w:rPr>
-          <w:t>14</w:t>
+          <w:t>16</w:t>
         </w:r>
         <w:r>
           <w:rPr>
@@ -1726,7 +2423,7 @@
           <w14:ligatures w14:val="standardContextual"/>
         </w:rPr>
       </w:pPr>
-      <w:hyperlink w:anchor="_Toc242268625" w:history="1">
+      <w:hyperlink w:anchor="_Toc242565020" w:history="1">
         <w:r>
           <w:rPr>
             <w:rStyle w:val="Hyperlink"/>
@@ -1753,7 +2450,7 @@
             <w:noProof/>
             <w:webHidden/>
           </w:rPr>
-          <w:instrText xml:space="preserve"> PAGEREF _Toc242268625 \h </w:instrText>
+          <w:instrText xml:space="preserve"> PAGEREF _Toc242565020 \h </w:instrText>
         </w:r>
         <w:r>
           <w:rPr>
@@ -1773,7 +2470,7 @@
             <w:noProof/>
             <w:webHidden/>
           </w:rPr>
-          <w:t>15</w:t>
+          <w:t>17</w:t>
         </w:r>
         <w:r>
           <w:rPr>
@@ -1798,7 +2495,7 @@
           <w14:ligatures w14:val="standardContextual"/>
         </w:rPr>
       </w:pPr>
-      <w:hyperlink w:anchor="_Toc242268626" w:history="1">
+      <w:hyperlink w:anchor="_Toc242565021" w:history="1">
         <w:r>
           <w:rPr>
             <w:rStyle w:val="Hyperlink"/>
@@ -1825,7 +2522,7 @@
             <w:noProof/>
             <w:webHidden/>
           </w:rPr>
-          <w:instrText xml:space="preserve"> PAGEREF _Toc242268626 \h </w:instrText>
+          <w:instrText xml:space="preserve"> PAGEREF _Toc242565021 \h </w:instrText>
         </w:r>
         <w:r>
           <w:rPr>
@@ -1845,7 +2542,7 @@
             <w:noProof/>
             <w:webHidden/>
           </w:rPr>
-          <w:t>15</w:t>
+          <w:t>17</w:t>
         </w:r>
         <w:r>
           <w:rPr>
@@ -1870,7 +2567,7 @@
           <w14:ligatures w14:val="standardContextual"/>
         </w:rPr>
       </w:pPr>
-      <w:hyperlink w:anchor="_Toc242268627" w:history="1">
+      <w:hyperlink w:anchor="_Toc242565022" w:history="1">
         <w:r>
           <w:rPr>
             <w:rStyle w:val="Hyperlink"/>
@@ -1897,7 +2594,7 @@
             <w:noProof/>
             <w:webHidden/>
           </w:rPr>
-          <w:instrText xml:space="preserve"> PAGEREF _Toc242268627 \h </w:instrText>
+          <w:instrText xml:space="preserve"> PAGEREF _Toc242565022 \h </w:instrText>
         </w:r>
         <w:r>
           <w:rPr>
@@ -1917,7 +2614,7 @@
             <w:noProof/>
             <w:webHidden/>
           </w:rPr>
-          <w:t>16</w:t>
+          <w:t>17</w:t>
         </w:r>
         <w:r>
           <w:rPr>
@@ -1942,7 +2639,7 @@
           <w14:ligatures w14:val="standardContextual"/>
         </w:rPr>
       </w:pPr>
-      <w:hyperlink w:anchor="_Toc242268628" w:history="1">
+      <w:hyperlink w:anchor="_Toc242565023" w:history="1">
         <w:r>
           <w:rPr>
             <w:rStyle w:val="Hyperlink"/>
@@ -1969,7 +2666,7 @@
             <w:noProof/>
             <w:webHidden/>
           </w:rPr>
-          <w:instrText xml:space="preserve"> PAGEREF _Toc242268628 \h </w:instrText>
+          <w:instrText xml:space="preserve"> PAGEREF _Toc242565023 \h </w:instrText>
         </w:r>
         <w:r>
           <w:rPr>
@@ -1989,7 +2686,7 @@
             <w:noProof/>
             <w:webHidden/>
           </w:rPr>
-          <w:t>16</w:t>
+          <w:t>17</w:t>
         </w:r>
         <w:r>
           <w:rPr>
@@ -2014,7 +2711,7 @@
           <w14:ligatures w14:val="standardContextual"/>
         </w:rPr>
       </w:pPr>
-      <w:hyperlink w:anchor="_Toc242268629" w:history="1">
+      <w:hyperlink w:anchor="_Toc242565024" w:history="1">
         <w:r>
           <w:rPr>
             <w:rStyle w:val="Hyperlink"/>
@@ -2041,7 +2738,7 @@
             <w:noProof/>
             <w:webHidden/>
           </w:rPr>
-          <w:instrText xml:space="preserve"> PAGEREF _Toc242268629 \h </w:instrText>
+          <w:instrText xml:space="preserve"> PAGEREF _Toc242565024 \h </w:instrText>
         </w:r>
         <w:r>
           <w:rPr>
@@ -2061,7 +2758,7 @@
             <w:noProof/>
             <w:webHidden/>
           </w:rPr>
-          <w:t>16</w:t>
+          <w:t>18</w:t>
         </w:r>
         <w:r>
           <w:rPr>
@@ -2086,7 +2783,7 @@
           <w14:ligatures w14:val="standardContextual"/>
         </w:rPr>
       </w:pPr>
-      <w:hyperlink w:anchor="_Toc242268630" w:history="1">
+      <w:hyperlink w:anchor="_Toc242565025" w:history="1">
         <w:r>
           <w:rPr>
             <w:rStyle w:val="Hyperlink"/>
@@ -2113,7 +2810,7 @@
             <w:noProof/>
             <w:webHidden/>
           </w:rPr>
-          <w:instrText xml:space="preserve"> PAGEREF _Toc242268630 \h </w:instrText>
+          <w:instrText xml:space="preserve"> PAGEREF _Toc242565025 \h </w:instrText>
         </w:r>
         <w:r>
           <w:rPr>
@@ -2133,7 +2830,7 @@
             <w:noProof/>
             <w:webHidden/>
           </w:rPr>
-          <w:t>17</w:t>
+          <w:t>19</w:t>
         </w:r>
         <w:r>
           <w:rPr>
@@ -2158,7 +2855,7 @@
           <w14:ligatures w14:val="standardContextual"/>
         </w:rPr>
       </w:pPr>
-      <w:hyperlink w:anchor="_Toc242268631" w:history="1">
+      <w:hyperlink w:anchor="_Toc242565026" w:history="1">
         <w:r>
           <w:rPr>
             <w:rStyle w:val="Hyperlink"/>
@@ -2185,7 +2882,7 @@
             <w:noProof/>
             <w:webHidden/>
           </w:rPr>
-          <w:instrText xml:space="preserve"> PAGEREF _Toc242268631 \h </w:instrText>
+          <w:instrText xml:space="preserve"> PAGEREF _Toc242565026 \h </w:instrText>
         </w:r>
         <w:r>
           <w:rPr>
@@ -2205,7 +2902,7 @@
             <w:noProof/>
             <w:webHidden/>
           </w:rPr>
-          <w:t>18</w:t>
+          <w:t>20</w:t>
         </w:r>
         <w:r>
           <w:rPr>
@@ -2230,7 +2927,7 @@
           <w14:ligatures w14:val="standardContextual"/>
         </w:rPr>
       </w:pPr>
-      <w:hyperlink w:anchor="_Toc242268632" w:history="1">
+      <w:hyperlink w:anchor="_Toc242565027" w:history="1">
         <w:r>
           <w:rPr>
             <w:rStyle w:val="Hyperlink"/>
@@ -2257,7 +2954,7 @@
             <w:noProof/>
             <w:webHidden/>
           </w:rPr>
-          <w:instrText xml:space="preserve"> PAGEREF _Toc242268632 \h </w:instrText>
+          <w:instrText xml:space="preserve"> PAGEREF _Toc242565027 \h </w:instrText>
         </w:r>
         <w:r>
           <w:rPr>
@@ -2277,7 +2974,7 @@
             <w:noProof/>
             <w:webHidden/>
           </w:rPr>
-          <w:t>18</w:t>
+          <w:t>20</w:t>
         </w:r>
         <w:r>
           <w:rPr>
@@ -2302,7 +2999,7 @@
           <w14:ligatures w14:val="standardContextual"/>
         </w:rPr>
       </w:pPr>
-      <w:hyperlink w:anchor="_Toc242268633" w:history="1">
+      <w:hyperlink w:anchor="_Toc242565028" w:history="1">
         <w:r>
           <w:rPr>
             <w:rStyle w:val="Hyperlink"/>
@@ -2329,7 +3026,7 @@
             <w:noProof/>
             <w:webHidden/>
           </w:rPr>
-          <w:instrText xml:space="preserve"> PAGEREF _Toc242268633 \h </w:instrText>
+          <w:instrText xml:space="preserve"> PAGEREF _Toc242565028 \h </w:instrText>
         </w:r>
         <w:r>
           <w:rPr>
@@ -2349,7 +3046,7 @@
             <w:noProof/>
             <w:webHidden/>
           </w:rPr>
-          <w:t>18</w:t>
+          <w:t>20</w:t>
         </w:r>
         <w:r>
           <w:rPr>
@@ -2374,7 +3071,7 @@
           <w14:ligatures w14:val="standardContextual"/>
         </w:rPr>
       </w:pPr>
-      <w:hyperlink w:anchor="_Toc242268634" w:history="1">
+      <w:hyperlink w:anchor="_Toc242565029" w:history="1">
         <w:r>
           <w:rPr>
             <w:rStyle w:val="Hyperlink"/>
@@ -2401,7 +3098,7 @@
             <w:noProof/>
             <w:webHidden/>
           </w:rPr>
-          <w:instrText xml:space="preserve"> PAGEREF _Toc242268634 \h </w:instrText>
+          <w:instrText xml:space="preserve"> PAGEREF _Toc242565029 \h </w:instrText>
         </w:r>
         <w:r>
           <w:rPr>
@@ -2421,7 +3118,7 @@
             <w:noProof/>
             <w:webHidden/>
           </w:rPr>
-          <w:t>19</w:t>
+          <w:t>21</w:t>
         </w:r>
         <w:r>
           <w:rPr>
@@ -2446,7 +3143,7 @@
           <w14:ligatures w14:val="standardContextual"/>
         </w:rPr>
       </w:pPr>
-      <w:hyperlink w:anchor="_Toc242268635" w:history="1">
+      <w:hyperlink w:anchor="_Toc242565030" w:history="1">
         <w:r>
           <w:rPr>
             <w:rStyle w:val="Hyperlink"/>
@@ -2473,7 +3170,7 @@
             <w:noProof/>
             <w:webHidden/>
           </w:rPr>
-          <w:instrText xml:space="preserve"> PAGEREF _Toc242268635 \h </w:instrText>
+          <w:instrText xml:space="preserve"> PAGEREF _Toc242565030 \h </w:instrText>
         </w:r>
         <w:r>
           <w:rPr>
@@ -2493,7 +3190,7 @@
             <w:noProof/>
             <w:webHidden/>
           </w:rPr>
-          <w:t>19</w:t>
+          <w:t>21</w:t>
         </w:r>
         <w:r>
           <w:rPr>
@@ -2518,7 +3215,7 @@
           <w14:ligatures w14:val="standardContextual"/>
         </w:rPr>
       </w:pPr>
-      <w:hyperlink w:anchor="_Toc242268636" w:history="1">
+      <w:hyperlink w:anchor="_Toc242565031" w:history="1">
         <w:r>
           <w:rPr>
             <w:rStyle w:val="Hyperlink"/>
@@ -2545,7 +3242,7 @@
             <w:noProof/>
             <w:webHidden/>
           </w:rPr>
-          <w:instrText xml:space="preserve"> PAGEREF _Toc242268636 \h </w:instrText>
+          <w:instrText xml:space="preserve"> PAGEREF _Toc242565031 \h </w:instrText>
         </w:r>
         <w:r>
           <w:rPr>
@@ -2565,7 +3262,7 @@
             <w:noProof/>
             <w:webHidden/>
           </w:rPr>
-          <w:t>20</w:t>
+          <w:t>21</w:t>
         </w:r>
         <w:r>
           <w:rPr>
@@ -2590,7 +3287,7 @@
           <w14:ligatures w14:val="standardContextual"/>
         </w:rPr>
       </w:pPr>
-      <w:hyperlink w:anchor="_Toc242268637" w:history="1">
+      <w:hyperlink w:anchor="_Toc242565032" w:history="1">
         <w:r>
           <w:rPr>
             <w:rStyle w:val="Hyperlink"/>
@@ -2617,7 +3314,7 @@
             <w:noProof/>
             <w:webHidden/>
           </w:rPr>
-          <w:instrText xml:space="preserve"> PAGEREF _Toc242268637 \h </w:instrText>
+          <w:instrText xml:space="preserve"> PAGEREF _Toc242565032 \h </w:instrText>
         </w:r>
         <w:r>
           <w:rPr>
@@ -2637,7 +3334,7 @@
             <w:noProof/>
             <w:webHidden/>
           </w:rPr>
-          <w:t>20</w:t>
+          <w:t>21</w:t>
         </w:r>
         <w:r>
           <w:rPr>
@@ -2662,7 +3359,7 @@
           <w14:ligatures w14:val="standardContextual"/>
         </w:rPr>
       </w:pPr>
-      <w:hyperlink w:anchor="_Toc242268638" w:history="1">
+      <w:hyperlink w:anchor="_Toc242565033" w:history="1">
         <w:r>
           <w:rPr>
             <w:rStyle w:val="Hyperlink"/>
@@ -2689,7 +3386,7 @@
             <w:noProof/>
             <w:webHidden/>
           </w:rPr>
-          <w:instrText xml:space="preserve"> PAGEREF _Toc242268638 \h </w:instrText>
+          <w:instrText xml:space="preserve"> PAGEREF _Toc242565033 \h </w:instrText>
         </w:r>
         <w:r>
           <w:rPr>
@@ -2709,7 +3406,7 @@
             <w:noProof/>
             <w:webHidden/>
           </w:rPr>
-          <w:t>20</w:t>
+          <w:t>22</w:t>
         </w:r>
         <w:r>
           <w:rPr>
@@ -2734,7 +3431,7 @@
           <w14:ligatures w14:val="standardContextual"/>
         </w:rPr>
       </w:pPr>
-      <w:hyperlink w:anchor="_Toc242268639" w:history="1">
+      <w:hyperlink w:anchor="_Toc242565034" w:history="1">
         <w:r>
           <w:rPr>
             <w:rStyle w:val="Hyperlink"/>
@@ -2761,7 +3458,7 @@
             <w:noProof/>
             <w:webHidden/>
           </w:rPr>
-          <w:instrText xml:space="preserve"> PAGEREF _Toc242268639 \h </w:instrText>
+          <w:instrText xml:space="preserve"> PAGEREF _Toc242565034 \h </w:instrText>
         </w:r>
         <w:r>
           <w:rPr>
@@ -2781,7 +3478,7 @@
             <w:noProof/>
             <w:webHidden/>
           </w:rPr>
-          <w:t>21</w:t>
+          <w:t>23</w:t>
         </w:r>
         <w:r>
           <w:rPr>
@@ -2806,7 +3503,7 @@
           <w14:ligatures w14:val="standardContextual"/>
         </w:rPr>
       </w:pPr>
-      <w:hyperlink w:anchor="_Toc242268640" w:history="1">
+      <w:hyperlink w:anchor="_Toc242565035" w:history="1">
         <w:r>
           <w:rPr>
             <w:rStyle w:val="Hyperlink"/>
@@ -2833,7 +3530,7 @@
             <w:noProof/>
             <w:webHidden/>
           </w:rPr>
-          <w:instrText xml:space="preserve"> PAGEREF _Toc242268640 \h </w:instrText>
+          <w:instrText xml:space="preserve"> PAGEREF _Toc242565035 \h </w:instrText>
         </w:r>
         <w:r>
           <w:rPr>
@@ -2853,7 +3550,79 @@
             <w:noProof/>
             <w:webHidden/>
           </w:rPr>
-          <w:t>22</w:t>
+          <w:t>24</w:t>
+        </w:r>
+        <w:r>
+          <w:rPr>
+            <w:noProof/>
+            <w:webHidden/>
+          </w:rPr>
+          <w:fldChar w:fldCharType="end"/>
+        </w:r>
+      </w:hyperlink>
+    </w:p>
+    <w:p>
+      <w:pPr>
+        <w:pStyle w:val="TOC2"/>
+        <w:tabs>
+          <w:tab w:val="right" w:leader="dot" w:pos="9782"/>
+        </w:tabs>
+        <w:rPr>
+          <w:rFonts w:asciiTheme="minorHAnsi" w:eastAsiaTheme="minorEastAsia" w:hAnsiTheme="minorHAnsi" w:cstheme="minorBidi"/>
+          <w:noProof/>
+          <w:kern w:val="2"/>
+          <w:szCs w:val="24"/>
+          <w14:ligatures w14:val="standardContextual"/>
+        </w:rPr>
+      </w:pPr>
+      <w:hyperlink w:anchor="_Toc242565036" w:history="1">
+        <w:r>
+          <w:rPr>
+            <w:rStyle w:val="Hyperlink"/>
+            <w:noProof/>
+          </w:rPr>
+          <w:t>Task 04 validation evidence</w:t>
+        </w:r>
+        <w:r>
+          <w:rPr>
+            <w:noProof/>
+            <w:webHidden/>
+          </w:rPr>
+          <w:tab/>
+        </w:r>
+        <w:r>
+          <w:rPr>
+            <w:noProof/>
+            <w:webHidden/>
+          </w:rPr>
+          <w:fldChar w:fldCharType="begin"/>
+        </w:r>
+        <w:r>
+          <w:rPr>
+            <w:noProof/>
+            <w:webHidden/>
+          </w:rPr>
+          <w:instrText xml:space="preserve"> PAGEREF _Toc242565036 \h </w:instrText>
+        </w:r>
+        <w:r>
+          <w:rPr>
+            <w:noProof/>
+            <w:webHidden/>
+          </w:rPr>
+        </w:r>
+        <w:r>
+          <w:rPr>
+            <w:noProof/>
+            <w:webHidden/>
+          </w:rPr>
+          <w:fldChar w:fldCharType="separate"/>
+        </w:r>
+        <w:r>
+          <w:rPr>
+            <w:noProof/>
+            <w:webHidden/>
+          </w:rPr>
+          <w:t>25</w:t>
         </w:r>
         <w:r>
           <w:rPr>
@@ -2878,7 +3647,7 @@
           <w14:ligatures w14:val="standardContextual"/>
         </w:rPr>
       </w:pPr>
-      <w:hyperlink w:anchor="_Toc242268641" w:history="1">
+      <w:hyperlink w:anchor="_Toc242565037" w:history="1">
         <w:r>
           <w:rPr>
             <w:rStyle w:val="Hyperlink"/>
@@ -2905,7 +3674,7 @@
             <w:noProof/>
             <w:webHidden/>
           </w:rPr>
-          <w:instrText xml:space="preserve"> PAGEREF _Toc242268641 \h </w:instrText>
+          <w:instrText xml:space="preserve"> PAGEREF _Toc242565037 \h </w:instrText>
         </w:r>
         <w:r>
           <w:rPr>
@@ -2925,7 +3694,7 @@
             <w:noProof/>
             <w:webHidden/>
           </w:rPr>
-          <w:t>23</w:t>
+          <w:t>26</w:t>
         </w:r>
         <w:r>
           <w:rPr>
@@ -2950,7 +3719,7 @@
           <w14:ligatures w14:val="standardContextual"/>
         </w:rPr>
       </w:pPr>
-      <w:hyperlink w:anchor="_Toc242268642" w:history="1">
+      <w:hyperlink w:anchor="_Toc242565038" w:history="1">
         <w:r>
           <w:rPr>
             <w:rStyle w:val="Hyperlink"/>
@@ -2977,7 +3746,7 @@
             <w:noProof/>
             <w:webHidden/>
           </w:rPr>
-          <w:instrText xml:space="preserve"> PAGEREF _Toc242268642 \h </w:instrText>
+          <w:instrText xml:space="preserve"> PAGEREF _Toc242565038 \h </w:instrText>
         </w:r>
         <w:r>
           <w:rPr>
@@ -2997,7 +3766,7 @@
             <w:noProof/>
             <w:webHidden/>
           </w:rPr>
-          <w:t>23</w:t>
+          <w:t>26</w:t>
         </w:r>
         <w:r>
           <w:rPr>
@@ -3050,7 +3819,7 @@
       <w:r>
         <w:fldChar w:fldCharType="separate"/>
       </w:r>
-      <w:hyperlink w:anchor="_Toc242268643" w:history="1">
+      <w:hyperlink w:anchor="_Toc242565039" w:history="1">
         <w:r>
           <w:rPr>
             <w:rStyle w:val="Hyperlink"/>
@@ -3077,7 +3846,7 @@
             <w:noProof/>
             <w:webHidden/>
           </w:rPr>
-          <w:instrText xml:space="preserve"> PAGEREF _Toc242268643 \h </w:instrText>
+          <w:instrText xml:space="preserve"> PAGEREF _Toc242565039 \h </w:instrText>
         </w:r>
         <w:r>
           <w:rPr>
@@ -3122,7 +3891,7 @@
           <w14:ligatures w14:val="standardContextual"/>
         </w:rPr>
       </w:pPr>
-      <w:hyperlink w:anchor="_Toc242268644" w:history="1">
+      <w:hyperlink w:anchor="_Toc242565040" w:history="1">
         <w:r>
           <w:rPr>
             <w:rStyle w:val="Hyperlink"/>
@@ -3149,7 +3918,7 @@
             <w:noProof/>
             <w:webHidden/>
           </w:rPr>
-          <w:instrText xml:space="preserve"> PAGEREF _Toc242268644 \h </w:instrText>
+          <w:instrText xml:space="preserve"> PAGEREF _Toc242565040 \h </w:instrText>
         </w:r>
         <w:r>
           <w:rPr>
@@ -3194,13 +3963,13 @@
           <w14:ligatures w14:val="standardContextual"/>
         </w:rPr>
       </w:pPr>
-      <w:hyperlink w:anchor="_Toc242268645" w:history="1">
+      <w:hyperlink w:anchor="_Toc242565041" w:history="1">
         <w:r>
           <w:rPr>
             <w:rStyle w:val="Hyperlink"/>
             <w:noProof/>
           </w:rPr>
-          <w:t>Figure 3. Colab code for parallel matrix rows and local product accumulation.</w:t>
+          <w:t>Figure 3. Task 01 automatic GitHub resource download in the T4 runtime.</w:t>
         </w:r>
         <w:r>
           <w:rPr>
@@ -3221,7 +3990,7 @@
             <w:noProof/>
             <w:webHidden/>
           </w:rPr>
-          <w:instrText xml:space="preserve"> PAGEREF _Toc242268645 \h </w:instrText>
+          <w:instrText xml:space="preserve"> PAGEREF _Toc242565041 \h </w:instrText>
         </w:r>
         <w:r>
           <w:rPr>
@@ -3241,7 +4010,7 @@
             <w:noProof/>
             <w:webHidden/>
           </w:rPr>
-          <w:t>11</w:t>
+          <w:t>10</w:t>
         </w:r>
         <w:r>
           <w:rPr>
@@ -3266,13 +4035,13 @@
           <w14:ligatures w14:val="standardContextual"/>
         </w:rPr>
       </w:pPr>
-      <w:hyperlink w:anchor="_Toc242268646" w:history="1">
+      <w:hyperlink w:anchor="_Toc242565042" w:history="1">
         <w:r>
           <w:rPr>
             <w:rStyle w:val="Hyperlink"/>
             <w:noProof/>
           </w:rPr>
-          <w:t>Figure 4. Task 02 matrix operations in Google Colab.</w:t>
+          <w:t>Figure 4. Colab code for parallel matrix rows and local product accumulation.</w:t>
         </w:r>
         <w:r>
           <w:rPr>
@@ -3293,7 +4062,7 @@
             <w:noProof/>
             <w:webHidden/>
           </w:rPr>
-          <w:instrText xml:space="preserve"> PAGEREF _Toc242268646 \h </w:instrText>
+          <w:instrText xml:space="preserve"> PAGEREF _Toc242565042 \h </w:instrText>
         </w:r>
         <w:r>
           <w:rPr>
@@ -3313,7 +4082,7 @@
             <w:noProof/>
             <w:webHidden/>
           </w:rPr>
-          <w:t>13</w:t>
+          <w:t>11</w:t>
         </w:r>
         <w:r>
           <w:rPr>
@@ -3338,13 +4107,13 @@
           <w14:ligatures w14:val="standardContextual"/>
         </w:rPr>
       </w:pPr>
-      <w:hyperlink w:anchor="_Toc242268647" w:history="1">
+      <w:hyperlink w:anchor="_Toc242565043" w:history="1">
         <w:r>
           <w:rPr>
             <w:rStyle w:val="Hyperlink"/>
             <w:noProof/>
           </w:rPr>
-          <w:t>Figure 5. Colab code for password indexing and candidate search.</w:t>
+          <w:t>Figure 5. Task 02 matrix operations in Google Colab.</w:t>
         </w:r>
         <w:r>
           <w:rPr>
@@ -3365,7 +4134,7 @@
             <w:noProof/>
             <w:webHidden/>
           </w:rPr>
-          <w:instrText xml:space="preserve"> PAGEREF _Toc242268647 \h </w:instrText>
+          <w:instrText xml:space="preserve"> PAGEREF _Toc242565043 \h </w:instrText>
         </w:r>
         <w:r>
           <w:rPr>
@@ -3385,7 +4154,7 @@
             <w:noProof/>
             <w:webHidden/>
           </w:rPr>
-          <w:t>15</w:t>
+          <w:t>14</w:t>
         </w:r>
         <w:r>
           <w:rPr>
@@ -3410,13 +4179,13 @@
           <w14:ligatures w14:val="standardContextual"/>
         </w:rPr>
       </w:pPr>
-      <w:hyperlink w:anchor="_Toc242268648" w:history="1">
+      <w:hyperlink w:anchor="_Toc242565044" w:history="1">
         <w:r>
           <w:rPr>
             <w:rStyle w:val="Hyperlink"/>
             <w:noProof/>
           </w:rPr>
-          <w:t>Figure 6. Task 03 CUDA password recovery in Google Colab.</w:t>
+          <w:t>Figure 6. Task 02 automatic GitHub resource download in the T4 runtime.</w:t>
         </w:r>
         <w:r>
           <w:rPr>
@@ -3437,7 +4206,7 @@
             <w:noProof/>
             <w:webHidden/>
           </w:rPr>
-          <w:instrText xml:space="preserve"> PAGEREF _Toc242268648 \h </w:instrText>
+          <w:instrText xml:space="preserve"> PAGEREF _Toc242565044 \h </w:instrText>
         </w:r>
         <w:r>
           <w:rPr>
@@ -3457,7 +4226,7 @@
             <w:noProof/>
             <w:webHidden/>
           </w:rPr>
-          <w:t>17</w:t>
+          <w:t>15</w:t>
         </w:r>
         <w:r>
           <w:rPr>
@@ -3482,13 +4251,13 @@
           <w14:ligatures w14:val="standardContextual"/>
         </w:rPr>
       </w:pPr>
-      <w:hyperlink w:anchor="_Toc242268649" w:history="1">
+      <w:hyperlink w:anchor="_Toc242565045" w:history="1">
         <w:r>
           <w:rPr>
             <w:rStyle w:val="Hyperlink"/>
             <w:noProof/>
           </w:rPr>
-          <w:t>Figure 7. Colab code for pixel indexing, Sobel gradients and edge magnitude.</w:t>
+          <w:t>Figure 7. Colab code for password indexing and candidate search.</w:t>
         </w:r>
         <w:r>
           <w:rPr>
@@ -3509,7 +4278,7 @@
             <w:noProof/>
             <w:webHidden/>
           </w:rPr>
-          <w:instrText xml:space="preserve"> PAGEREF _Toc242268649 \h </w:instrText>
+          <w:instrText xml:space="preserve"> PAGEREF _Toc242565045 \h </w:instrText>
         </w:r>
         <w:r>
           <w:rPr>
@@ -3529,7 +4298,7 @@
             <w:noProof/>
             <w:webHidden/>
           </w:rPr>
-          <w:t>19</w:t>
+          <w:t>17</w:t>
         </w:r>
         <w:r>
           <w:rPr>
@@ -3554,13 +4323,13 @@
           <w14:ligatures w14:val="standardContextual"/>
         </w:rPr>
       </w:pPr>
-      <w:hyperlink w:anchor="_Toc242268650" w:history="1">
+      <w:hyperlink w:anchor="_Toc242565046" w:history="1">
         <w:r>
           <w:rPr>
             <w:rStyle w:val="Hyperlink"/>
             <w:noProof/>
           </w:rPr>
-          <w:t>Figure 8. Task 04 single-image CUDA execution in Google Colab.</w:t>
+          <w:t>Figure 8. Task 03 CUDA password recovery in Google Colab.</w:t>
         </w:r>
         <w:r>
           <w:rPr>
@@ -3581,7 +4350,7 @@
             <w:noProof/>
             <w:webHidden/>
           </w:rPr>
-          <w:instrText xml:space="preserve"> PAGEREF _Toc242268650 \h </w:instrText>
+          <w:instrText xml:space="preserve"> PAGEREF _Toc242565046 \h </w:instrText>
         </w:r>
         <w:r>
           <w:rPr>
@@ -3601,7 +4370,7 @@
             <w:noProof/>
             <w:webHidden/>
           </w:rPr>
-          <w:t>21</w:t>
+          <w:t>19</w:t>
         </w:r>
         <w:r>
           <w:rPr>
@@ -3626,13 +4395,13 @@
           <w14:ligatures w14:val="standardContextual"/>
         </w:rPr>
       </w:pPr>
-      <w:hyperlink w:anchor="_Toc242268651" w:history="1">
+      <w:hyperlink w:anchor="_Toc242565047" w:history="1">
         <w:r>
           <w:rPr>
             <w:rStyle w:val="Hyperlink"/>
             <w:noProof/>
           </w:rPr>
-          <w:t>Figure 9. Four views of the same download.png input displayed in Google Colab.</w:t>
+          <w:t>Figure 9. Colab code for pixel indexing, Sobel gradients and edge magnitude.</w:t>
         </w:r>
         <w:r>
           <w:rPr>
@@ -3653,7 +4422,7 @@
             <w:noProof/>
             <w:webHidden/>
           </w:rPr>
-          <w:instrText xml:space="preserve"> PAGEREF _Toc242268651 \h </w:instrText>
+          <w:instrText xml:space="preserve"> PAGEREF _Toc242565047 \h </w:instrText>
         </w:r>
         <w:r>
           <w:rPr>
@@ -3673,7 +4442,7 @@
             <w:noProof/>
             <w:webHidden/>
           </w:rPr>
-          <w:t>22</w:t>
+          <w:t>21</w:t>
         </w:r>
         <w:r>
           <w:rPr>
@@ -3685,6 +4454,222 @@
       </w:hyperlink>
     </w:p>
     <w:p>
+      <w:pPr>
+        <w:pStyle w:val="TableofFigures"/>
+        <w:tabs>
+          <w:tab w:val="right" w:leader="dot" w:pos="9782"/>
+        </w:tabs>
+        <w:rPr>
+          <w:rFonts w:asciiTheme="minorHAnsi" w:eastAsiaTheme="minorEastAsia" w:hAnsiTheme="minorHAnsi" w:cstheme="minorBidi"/>
+          <w:noProof/>
+          <w:kern w:val="2"/>
+          <w:szCs w:val="24"/>
+          <w14:ligatures w14:val="standardContextual"/>
+        </w:rPr>
+      </w:pPr>
+      <w:hyperlink w:anchor="_Toc242565048" w:history="1">
+        <w:r>
+          <w:rPr>
+            <w:rStyle w:val="Hyperlink"/>
+            <w:noProof/>
+          </w:rPr>
+          <w:t>Figure 10. Task 04 single-image CUDA execution in Google Colab.</w:t>
+        </w:r>
+        <w:r>
+          <w:rPr>
+            <w:noProof/>
+            <w:webHidden/>
+          </w:rPr>
+          <w:tab/>
+        </w:r>
+        <w:r>
+          <w:rPr>
+            <w:noProof/>
+            <w:webHidden/>
+          </w:rPr>
+          <w:fldChar w:fldCharType="begin"/>
+        </w:r>
+        <w:r>
+          <w:rPr>
+            <w:noProof/>
+            <w:webHidden/>
+          </w:rPr>
+          <w:instrText xml:space="preserve"> PAGEREF _Toc242565048 \h </w:instrText>
+        </w:r>
+        <w:r>
+          <w:rPr>
+            <w:noProof/>
+            <w:webHidden/>
+          </w:rPr>
+        </w:r>
+        <w:r>
+          <w:rPr>
+            <w:noProof/>
+            <w:webHidden/>
+          </w:rPr>
+          <w:fldChar w:fldCharType="separate"/>
+        </w:r>
+        <w:r>
+          <w:rPr>
+            <w:noProof/>
+            <w:webHidden/>
+          </w:rPr>
+          <w:t>23</w:t>
+        </w:r>
+        <w:r>
+          <w:rPr>
+            <w:noProof/>
+            <w:webHidden/>
+          </w:rPr>
+          <w:fldChar w:fldCharType="end"/>
+        </w:r>
+      </w:hyperlink>
+    </w:p>
+    <w:p>
+      <w:pPr>
+        <w:pStyle w:val="TableofFigures"/>
+        <w:tabs>
+          <w:tab w:val="right" w:leader="dot" w:pos="9782"/>
+        </w:tabs>
+        <w:rPr>
+          <w:rFonts w:asciiTheme="minorHAnsi" w:eastAsiaTheme="minorEastAsia" w:hAnsiTheme="minorHAnsi" w:cstheme="minorBidi"/>
+          <w:noProof/>
+          <w:kern w:val="2"/>
+          <w:szCs w:val="24"/>
+          <w14:ligatures w14:val="standardContextual"/>
+        </w:rPr>
+      </w:pPr>
+      <w:hyperlink w:anchor="_Toc242565049" w:history="1">
+        <w:r>
+          <w:rPr>
+            <w:rStyle w:val="Hyperlink"/>
+            <w:noProof/>
+          </w:rPr>
+          <w:t>Figure 11. Four views of the same download.png input displayed in Google Colab.</w:t>
+        </w:r>
+        <w:r>
+          <w:rPr>
+            <w:noProof/>
+            <w:webHidden/>
+          </w:rPr>
+          <w:tab/>
+        </w:r>
+        <w:r>
+          <w:rPr>
+            <w:noProof/>
+            <w:webHidden/>
+          </w:rPr>
+          <w:fldChar w:fldCharType="begin"/>
+        </w:r>
+        <w:r>
+          <w:rPr>
+            <w:noProof/>
+            <w:webHidden/>
+          </w:rPr>
+          <w:instrText xml:space="preserve"> PAGEREF _Toc242565049 \h </w:instrText>
+        </w:r>
+        <w:r>
+          <w:rPr>
+            <w:noProof/>
+            <w:webHidden/>
+          </w:rPr>
+        </w:r>
+        <w:r>
+          <w:rPr>
+            <w:noProof/>
+            <w:webHidden/>
+          </w:rPr>
+          <w:fldChar w:fldCharType="separate"/>
+        </w:r>
+        <w:r>
+          <w:rPr>
+            <w:noProof/>
+            <w:webHidden/>
+          </w:rPr>
+          <w:t>24</w:t>
+        </w:r>
+        <w:r>
+          <w:rPr>
+            <w:noProof/>
+            <w:webHidden/>
+          </w:rPr>
+          <w:fldChar w:fldCharType="end"/>
+        </w:r>
+      </w:hyperlink>
+    </w:p>
+    <w:p>
+      <w:pPr>
+        <w:pStyle w:val="TableofFigures"/>
+        <w:tabs>
+          <w:tab w:val="right" w:leader="dot" w:pos="9782"/>
+        </w:tabs>
+        <w:rPr>
+          <w:rFonts w:asciiTheme="minorHAnsi" w:eastAsiaTheme="minorEastAsia" w:hAnsiTheme="minorHAnsi" w:cstheme="minorBidi"/>
+          <w:noProof/>
+          <w:kern w:val="2"/>
+          <w:szCs w:val="24"/>
+          <w14:ligatures w14:val="standardContextual"/>
+        </w:rPr>
+      </w:pPr>
+      <w:hyperlink w:anchor="_Toc242565050" w:history="1">
+        <w:r>
+          <w:rPr>
+            <w:rStyle w:val="Hyperlink"/>
+            <w:noProof/>
+          </w:rPr>
+          <w:t>Figure 12. Task 04 validation results in Google Colab.</w:t>
+        </w:r>
+        <w:r>
+          <w:rPr>
+            <w:noProof/>
+            <w:webHidden/>
+          </w:rPr>
+          <w:tab/>
+        </w:r>
+        <w:r>
+          <w:rPr>
+            <w:noProof/>
+            <w:webHidden/>
+          </w:rPr>
+          <w:fldChar w:fldCharType="begin"/>
+        </w:r>
+        <w:r>
+          <w:rPr>
+            <w:noProof/>
+            <w:webHidden/>
+          </w:rPr>
+          <w:instrText xml:space="preserve"> PAGEREF _Toc242565050 \h </w:instrText>
+        </w:r>
+        <w:r>
+          <w:rPr>
+            <w:noProof/>
+            <w:webHidden/>
+          </w:rPr>
+        </w:r>
+        <w:r>
+          <w:rPr>
+            <w:noProof/>
+            <w:webHidden/>
+          </w:rPr>
+          <w:fldChar w:fldCharType="separate"/>
+        </w:r>
+        <w:r>
+          <w:rPr>
+            <w:noProof/>
+            <w:webHidden/>
+          </w:rPr>
+          <w:t>25</w:t>
+        </w:r>
+        <w:r>
+          <w:rPr>
+            <w:noProof/>
+            <w:webHidden/>
+          </w:rPr>
+          <w:fldChar w:fldCharType="end"/>
+        </w:r>
+      </w:hyperlink>
+    </w:p>
+    <w:p>
       <w:r>
         <w:fldChar w:fldCharType="end"/>
       </w:r>
@@ -3698,7 +4683,7 @@
       <w:pPr>
         <w:pStyle w:val="Heading1"/>
       </w:pPr>
-      <w:bookmarkStart w:id="0" w:name="_Toc242268602"/>
+      <w:bookmarkStart w:id="0" w:name="_Toc242564995"/>
       <w:r>
         <w:lastRenderedPageBreak/>
         <w:t>Execution and files</w:t>
@@ -3707,6 +4692,11 @@
     </w:p>
     <w:p>
       <w:r>
+        <w:t>This portfolio implements the four tasks in the current assessment brief using Pthreads, OpenMP and CUDA. Each task has a separate source file, Colab notebook and output resources. Correctness is checked against independent reference calculations and invalid-input tests, with actual execution evidence from a Python 3 Colab runtime using a Tesla T4 GPU.</w:t>
+      </w:r>
+    </w:p>
+    <w:p>
+      <w:r>
         <w:t>The programs use the file-handling, dynamic allocation, thread structures, mutexes, parallel loops, CUDA index calculation, and explicit host-device transfer patterns from the supplied weeks and code sir.txt. Python performs setup, fixture generation, verification and display. The assessed computations are in C and CUDA; the CUDA sources remain separate .cu files.</w:t>
       </w:r>
     </w:p>
@@ -3716,7 +4706,7 @@
       </w:r>
     </w:p>
     <w:p>
-      <w:hyperlink r:id="rId8">
+      <w:hyperlink r:id="rId10">
         <w:r>
           <w:rPr>
             <w:color w:val="164B6B"/>
@@ -3727,7 +4717,7 @@
       </w:hyperlink>
     </w:p>
     <w:p>
-      <w:hyperlink r:id="rId9">
+      <w:hyperlink r:id="rId11">
         <w:r>
           <w:rPr>
             <w:color w:val="164B6B"/>
@@ -3746,7 +4736,7 @@
       <w:pPr>
         <w:pStyle w:val="Heading1"/>
       </w:pPr>
-      <w:bookmarkStart w:id="1" w:name="_Toc242268603"/>
+      <w:bookmarkStart w:id="1" w:name="_Toc242564996"/>
       <w:r>
         <w:t>Validation result</w:t>
       </w:r>
@@ -3762,7 +4752,7 @@
         <w:pStyle w:val="Heading1"/>
         <w:pageBreakBefore/>
       </w:pPr>
-      <w:bookmarkStart w:id="2" w:name="_Toc242268604"/>
+      <w:bookmarkStart w:id="2" w:name="_Toc242564997"/>
       <w:r>
         <w:lastRenderedPageBreak/>
         <w:t>Task 01 Word Occurrence Counting using Multithreading</w:t>
@@ -3770,7 +4760,7 @@
       <w:bookmarkEnd w:id="2"/>
     </w:p>
     <w:p>
-      <w:hyperlink r:id="rId10">
+      <w:hyperlink r:id="rId12">
         <w:r>
           <w:rPr>
             <w:color w:val="164B6B"/>
@@ -3781,7 +4771,7 @@
       </w:hyperlink>
     </w:p>
     <w:p>
-      <w:hyperlink r:id="rId11">
+      <w:hyperlink r:id="rId13">
         <w:r>
           <w:rPr>
             <w:color w:val="164B6B"/>
@@ -3795,7 +4785,7 @@
       <w:pPr>
         <w:pStyle w:val="Heading2"/>
       </w:pPr>
-      <w:bookmarkStart w:id="3" w:name="_Toc242268605"/>
+      <w:bookmarkStart w:id="3" w:name="_Toc242564998"/>
       <w:r>
         <w:t>Objective</w:t>
       </w:r>
@@ -3810,7 +4800,7 @@
       <w:pPr>
         <w:pStyle w:val="Heading2"/>
       </w:pPr>
-      <w:bookmarkStart w:id="4" w:name="_Toc242268606"/>
+      <w:bookmarkStart w:id="4" w:name="_Toc242564999"/>
       <w:r>
         <w:t>Implementation</w:t>
       </w:r>
@@ -3835,9 +4825,8 @@
       <w:pPr>
         <w:pStyle w:val="Heading2"/>
       </w:pPr>
-      <w:bookmarkStart w:id="5" w:name="_Toc242268607"/>
-      <w:r>
-        <w:lastRenderedPageBreak/>
+      <w:bookmarkStart w:id="5" w:name="_Toc242565000"/>
+      <w:r>
         <w:t>Code I implemented</w:t>
       </w:r>
       <w:bookmarkEnd w:id="5"/>
@@ -3852,10 +4841,10 @@
           <w:noProof/>
         </w:rPr>
         <w:drawing>
-          <wp:inline distT="0" distB="0" distL="0" distR="0" wp14:anchorId="1C14DB47" wp14:editId="672CF7A6">
-            <wp:extent cx="6217920" cy="4707854"/>
+          <wp:inline distT="0" distB="0" distL="0" distR="0" wp14:anchorId="74D9B7F2" wp14:editId="5F72A231">
+            <wp:extent cx="6217920" cy="2517820"/>
             <wp:effectExtent l="0" t="0" r="0" b="0"/>
-            <wp:docPr id="1" name="Picture 1" descr="Figure 1. Colab code for mutex-protected slice allocation in countWords."/>
+            <wp:docPr id="12" name="Task_01_Code_Colab.png" descr="Figure 1. Colab code for mutex-protected slice allocation in countWords."/>
             <wp:cNvGraphicFramePr>
               <a:graphicFrameLocks xmlns:a="http://schemas.openxmlformats.org/drawingml/2006/main" noChangeAspect="1"/>
             </wp:cNvGraphicFramePr>
@@ -3863,11 +4852,11 @@
               <a:graphicData uri="http://schemas.openxmlformats.org/drawingml/2006/picture">
                 <pic:pic xmlns:pic="http://schemas.openxmlformats.org/drawingml/2006/picture">
                   <pic:nvPicPr>
-                    <pic:cNvPr id="0" name="Task_01_Code_Colab.jpg"/>
+                    <pic:cNvPr id="0" name="image.png"/>
                     <pic:cNvPicPr/>
                   </pic:nvPicPr>
                   <pic:blipFill>
-                    <a:blip r:embed="rId12"/>
+                    <a:blip r:embed="rId14"/>
                     <a:stretch>
                       <a:fillRect/>
                     </a:stretch>
@@ -3875,7 +4864,7 @@
                   <pic:spPr>
                     <a:xfrm>
                       <a:off x="0" y="0"/>
-                      <a:ext cx="6217920" cy="4707854"/>
+                      <a:ext cx="6217920" cy="2517820"/>
                     </a:xfrm>
                     <a:prstGeom prst="rect">
                       <a:avLst/>
@@ -3893,7 +4882,7 @@
         <w:pStyle w:val="Caption"/>
         <w:keepNext/>
       </w:pPr>
-      <w:bookmarkStart w:id="6" w:name="_Toc242268643"/>
+      <w:bookmarkStart w:id="6" w:name="_Toc242565039"/>
       <w:r>
         <w:t xml:space="preserve">Figure </w:t>
       </w:r>
@@ -3912,7 +4901,11 @@
     </w:p>
     <w:p>
       <w:r>
-        <w:t>I implemented dynamic work allocation with Pthreads. Each worker locks the shared cursor only while claiming its next slice, extends the slice to avoid splitting a word, then unlocks it before scanning the text. Word counts are stored in each worker's own collection before the results are merged.</w:t>
+        <w:t xml:space="preserve">I implemented dynamic work allocation with Pthreads. Each worker locks the shared cursor only while claiming its next slice, extends the slice to avoid splitting a word, then unlocks it before </w:t>
+      </w:r>
+      <w:r>
+        <w:lastRenderedPageBreak/>
+        <w:t>scanning the text. Word counts are stored in each worker's own collection before the results are merged.</w:t>
       </w:r>
     </w:p>
     <w:p>
@@ -3924,7 +4917,7 @@
       <w:pPr>
         <w:pStyle w:val="Heading2"/>
       </w:pPr>
-      <w:bookmarkStart w:id="7" w:name="_Toc242268608"/>
+      <w:bookmarkStart w:id="7" w:name="_Toc242565001"/>
       <w:r>
         <w:t>Synchronisation and memory</w:t>
       </w:r>
@@ -3944,9 +4937,8 @@
       <w:pPr>
         <w:pStyle w:val="Heading2"/>
       </w:pPr>
-      <w:bookmarkStart w:id="8" w:name="_Toc242268609"/>
-      <w:r>
-        <w:lastRenderedPageBreak/>
+      <w:bookmarkStart w:id="8" w:name="_Toc242565002"/>
+      <w:r>
         <w:t>Build and run</w:t>
       </w:r>
       <w:bookmarkEnd w:id="8"/>
@@ -3977,7 +4969,7 @@
       <w:pPr>
         <w:pStyle w:val="Heading2"/>
       </w:pPr>
-      <w:bookmarkStart w:id="9" w:name="_Toc242268610"/>
+      <w:bookmarkStart w:id="9" w:name="_Toc242565003"/>
       <w:r>
         <w:t>Results and tests</w:t>
       </w:r>
@@ -4002,7 +4994,7 @@
       <w:pPr>
         <w:pStyle w:val="Heading2"/>
       </w:pPr>
-      <w:bookmarkStart w:id="10" w:name="_Toc242268611"/>
+      <w:bookmarkStart w:id="10" w:name="_Toc242565004"/>
       <w:r>
         <w:t>Performance and limits</w:t>
       </w:r>
@@ -4023,7 +5015,7 @@
         <w:pStyle w:val="Heading2"/>
         <w:pageBreakBefore/>
       </w:pPr>
-      <w:bookmarkStart w:id="11" w:name="_Toc242268612"/>
+      <w:bookmarkStart w:id="11" w:name="_Toc242565005"/>
       <w:r>
         <w:lastRenderedPageBreak/>
         <w:t>Colab execution evidence</w:t>
@@ -4040,10 +5032,10 @@
           <w:noProof/>
         </w:rPr>
         <w:drawing>
-          <wp:inline distT="0" distB="0" distL="0" distR="0" wp14:anchorId="432598BC" wp14:editId="146140B0">
-            <wp:extent cx="5250887" cy="4892040"/>
+          <wp:inline distT="0" distB="0" distL="0" distR="0" wp14:anchorId="4BC52591" wp14:editId="653EF780">
+            <wp:extent cx="6217920" cy="2638307"/>
             <wp:effectExtent l="0" t="0" r="0" b="0"/>
-            <wp:docPr id="2" name="Picture 2" descr="Figure 2. Task 01 word occurrence results in Google Colab."/>
+            <wp:docPr id="13" name="Task_01_Colab.png" descr="Figure 2. Task 01 word occurrence results in Google Colab."/>
             <wp:cNvGraphicFramePr>
               <a:graphicFrameLocks xmlns:a="http://schemas.openxmlformats.org/drawingml/2006/main" noChangeAspect="1"/>
             </wp:cNvGraphicFramePr>
@@ -4051,11 +5043,11 @@
               <a:graphicData uri="http://schemas.openxmlformats.org/drawingml/2006/picture">
                 <pic:pic xmlns:pic="http://schemas.openxmlformats.org/drawingml/2006/picture">
                   <pic:nvPicPr>
-                    <pic:cNvPr id="0" name="Task_01_Colab.jpg"/>
+                    <pic:cNvPr id="0" name="image.png"/>
                     <pic:cNvPicPr/>
                   </pic:nvPicPr>
                   <pic:blipFill>
-                    <a:blip r:embed="rId13"/>
+                    <a:blip r:embed="rId15"/>
                     <a:stretch>
                       <a:fillRect/>
                     </a:stretch>
@@ -4063,7 +5055,7 @@
                   <pic:spPr>
                     <a:xfrm>
                       <a:off x="0" y="0"/>
-                      <a:ext cx="5250887" cy="4892040"/>
+                      <a:ext cx="6217920" cy="2638307"/>
                     </a:xfrm>
                     <a:prstGeom prst="rect">
                       <a:avLst/>
@@ -4081,7 +5073,7 @@
         <w:pStyle w:val="Caption"/>
         <w:keepNext/>
       </w:pPr>
-      <w:bookmarkStart w:id="12" w:name="_Toc242268644"/>
+      <w:bookmarkStart w:id="12" w:name="_Toc242565040"/>
       <w:r>
         <w:t xml:space="preserve">Figure </w:t>
       </w:r>
@@ -4105,88 +5097,15 @@
     </w:p>
     <w:p>
       <w:pPr>
-        <w:pStyle w:val="Heading1"/>
+        <w:pStyle w:val="Heading2"/>
         <w:pageBreakBefore/>
       </w:pPr>
-      <w:bookmarkStart w:id="13" w:name="_Toc242268613"/>
+      <w:bookmarkStart w:id="13" w:name="_Toc242565006"/>
       <w:r>
         <w:lastRenderedPageBreak/>
-        <w:t>Task 02 Multiple operations with Matrices using multithreading</w:t>
+        <w:t>Automatic resource download</w:t>
       </w:r>
       <w:bookmarkEnd w:id="13"/>
-    </w:p>
-    <w:p>
-      <w:hyperlink r:id="rId14">
-        <w:r>
-          <w:rPr>
-            <w:color w:val="164B6B"/>
-            <w:u w:val="single"/>
-          </w:rPr>
-          <w:t>Task 02 source notebook in Colab</w:t>
-        </w:r>
-      </w:hyperlink>
-    </w:p>
-    <w:p>
-      <w:hyperlink r:id="rId15">
-        <w:r>
-          <w:rPr>
-            <w:color w:val="164B6B"/>
-            <w:u w:val="single"/>
-          </w:rPr>
-          <w:t>Executed Task 02 Colab notebook</w:t>
-        </w:r>
-      </w:hyperlink>
-    </w:p>
-    <w:p>
-      <w:pPr>
-        <w:pStyle w:val="Heading2"/>
-      </w:pPr>
-      <w:bookmarkStart w:id="14" w:name="_Toc242268614"/>
-      <w:r>
-        <w:t>Objective</w:t>
-      </w:r>
-      <w:bookmarkEnd w:id="14"/>
-    </w:p>
-    <w:p>
-      <w:r>
-        <w:t>Read the input path from argv[1] and the requested OpenMP thread count from argv[2]. Process matrices as consecutive pairs and write the full set of valid results and inapplicable-operation messages to results.txt.</w:t>
-      </w:r>
-    </w:p>
-    <w:p>
-      <w:pPr>
-        <w:pStyle w:val="Heading2"/>
-      </w:pPr>
-      <w:bookmarkStart w:id="15" w:name="_Toc242268615"/>
-      <w:r>
-        <w:t>Implementation</w:t>
-      </w:r>
-      <w:bookmarkEnd w:id="15"/>
-    </w:p>
-    <w:p>
-      <w:r>
-        <w:t>The input uses a rows,cols header followed by exactly rows lines of comma-separated numeric values. Blank lines are permitted between matrices. fopen, fscanf, fprintf and fclose perform file I/O. fscanf reads characters into a growable line buffer, so row boundaries remain significant. strtol and strtod validate headers and complete numeric tokens.</w:t>
-      </w:r>
-    </w:p>
-    <w:p>
-      <w:r>
-        <w:t>Matrices use malloc for the row pointer array and each row of doubles, following the lecturer's matrix examples. The complete file is validated before results.txt is opened. Input errors identify the matrix, row or line, and allocated data is released. An odd matrix count is rejected because it cannot form complete pairs.</w:t>
-      </w:r>
-    </w:p>
-    <w:p>
-      <w:r>
-        <w:t>For equal shapes the program computes A+B, A-B, A.*B and A./B. A zero divisor produces NaN in that cell. Both transposes are always computed. A*B is computed only when A.cols equals B.rows; its cell is the dot product sum over k. Every unavailable operation gets one clear message and the remaining operations continue.</w:t>
-      </w:r>
-    </w:p>
-    <w:p>
-      <w:pPr>
-        <w:pStyle w:val="Heading2"/>
-      </w:pPr>
-      <w:bookmarkStart w:id="16" w:name="_Toc242268616"/>
-      <w:r>
-        <w:lastRenderedPageBreak/>
-        <w:t>Code I implemented</w:t>
-      </w:r>
-      <w:bookmarkEnd w:id="16"/>
     </w:p>
     <w:p>
       <w:pPr>
@@ -4198,10 +5117,10 @@
           <w:noProof/>
         </w:rPr>
         <w:drawing>
-          <wp:inline distT="0" distB="0" distL="0" distR="0" wp14:anchorId="71FB51FD" wp14:editId="51853DA3">
-            <wp:extent cx="6217920" cy="3661664"/>
+          <wp:inline distT="0" distB="0" distL="0" distR="0" wp14:anchorId="34F13CBC" wp14:editId="25B3B6A4">
+            <wp:extent cx="5163006" cy="4892040"/>
             <wp:effectExtent l="0" t="0" r="0" b="0"/>
-            <wp:docPr id="3" name="Picture 3" descr="Figure 3. Colab code for parallel matrix rows and local product accumulation."/>
+            <wp:docPr id="3" name="Picture 3" descr="Figure 3. Task 01 automatic GitHub resource download in the T4 runtime."/>
             <wp:cNvGraphicFramePr>
               <a:graphicFrameLocks xmlns:a="http://schemas.openxmlformats.org/drawingml/2006/main" noChangeAspect="1"/>
             </wp:cNvGraphicFramePr>
@@ -4209,7 +5128,7 @@
               <a:graphicData uri="http://schemas.openxmlformats.org/drawingml/2006/picture">
                 <pic:pic xmlns:pic="http://schemas.openxmlformats.org/drawingml/2006/picture">
                   <pic:nvPicPr>
-                    <pic:cNvPr id="0" name="Task_02_Code_Colab.jpg"/>
+                    <pic:cNvPr id="0" name="Task_01_Setup_Colab.jpg"/>
                     <pic:cNvPicPr/>
                   </pic:nvPicPr>
                   <pic:blipFill>
@@ -4221,7 +5140,7 @@
                   <pic:spPr>
                     <a:xfrm>
                       <a:off x="0" y="0"/>
-                      <a:ext cx="6217920" cy="3661664"/>
+                      <a:ext cx="5163006" cy="4892040"/>
                     </a:xfrm>
                     <a:prstGeom prst="rect">
                       <a:avLst/>
@@ -4239,7 +5158,7 @@
         <w:pStyle w:val="Caption"/>
         <w:keepNext/>
       </w:pPr>
-      <w:bookmarkStart w:id="17" w:name="_Toc242268645"/>
+      <w:bookmarkStart w:id="14" w:name="_Toc242565041"/>
       <w:r>
         <w:t xml:space="preserve">Figure </w:t>
       </w:r>
@@ -4252,194 +5171,98 @@
         </w:r>
       </w:fldSimple>
       <w:r>
-        <w:t>. Colab code for parallel matrix rows and local product accumulation.</w:t>
+        <w:t>. Task 01 automatic GitHub resource download in the T4 runtime.</w:t>
+      </w:r>
+      <w:bookmarkEnd w:id="14"/>
+    </w:p>
+    <w:p>
+      <w:r>
+        <w:t>The setup cell downloads WordOccurrenceDataset.txt from a fixed public GitHub revision into the Colab runtime. The next cell writes WordOccurrence.c. Both cells show completed execution checks, and the status bar identifies T4 with Python 3. No Google Drive mount or manual file upload is required. The complete five-cell notebook was rerun successfully with 120,000 total words and 94 unique words.</w:t>
+      </w:r>
+    </w:p>
+    <w:p>
+      <w:pPr>
+        <w:pStyle w:val="Heading1"/>
+        <w:pageBreakBefore/>
+      </w:pPr>
+      <w:bookmarkStart w:id="15" w:name="_Toc242565007"/>
+      <w:r>
+        <w:lastRenderedPageBreak/>
+        <w:t>Task 02 Multiple operations with Matrices using multithreading</w:t>
+      </w:r>
+      <w:bookmarkEnd w:id="15"/>
+    </w:p>
+    <w:p>
+      <w:hyperlink r:id="rId17">
+        <w:r>
+          <w:rPr>
+            <w:color w:val="164B6B"/>
+            <w:u w:val="single"/>
+          </w:rPr>
+          <w:t>Task 02 source notebook in Colab</w:t>
+        </w:r>
+      </w:hyperlink>
+    </w:p>
+    <w:p>
+      <w:hyperlink r:id="rId18">
+        <w:r>
+          <w:rPr>
+            <w:color w:val="164B6B"/>
+            <w:u w:val="single"/>
+          </w:rPr>
+          <w:t>Executed Task 02 Colab notebook</w:t>
+        </w:r>
+      </w:hyperlink>
+    </w:p>
+    <w:p>
+      <w:pPr>
+        <w:pStyle w:val="Heading2"/>
+      </w:pPr>
+      <w:bookmarkStart w:id="16" w:name="_Toc242565008"/>
+      <w:r>
+        <w:t>Objective</w:t>
+      </w:r>
+      <w:bookmarkEnd w:id="16"/>
+    </w:p>
+    <w:p>
+      <w:r>
+        <w:t>Read the input path from argv[1] and the requested OpenMP thread count from argv[2]. Process matrices as consecutive pairs and write the full set of valid results and inapplicable-operation messages to results.txt.</w:t>
+      </w:r>
+    </w:p>
+    <w:p>
+      <w:pPr>
+        <w:pStyle w:val="Heading2"/>
+      </w:pPr>
+      <w:bookmarkStart w:id="17" w:name="_Toc242565009"/>
+      <w:r>
+        <w:t>Implementation</w:t>
       </w:r>
       <w:bookmarkEnd w:id="17"/>
     </w:p>
     <w:p>
       <w:r>
-        <w:t>I implemented the matrix operations inside an OpenMP parallel region. Static scheduling gives different output rows to different threads, with the thread count capped by the number of rows. Each matrix-product cell uses its own local sum, so workers write separate result cells without sharing an accumulator.</w:t>
-      </w:r>
-    </w:p>
-    <w:p>
-      <w:r>
-        <w:t>Source excerpt: MatrixOperations.c, operation, lines 188 to 210. The full source remains in MatrixOperations.c.</w:t>
+        <w:t>The input uses a rows,cols header followed by exactly rows lines of comma-separated numeric values. Blank lines are permitted between matrices. fopen, fscanf, fprintf and fclose perform file I/O. fscanf reads characters into a growable line buffer, so row boundaries remain significant. strtol and strtod validate headers and complete numeric tokens.</w:t>
+      </w:r>
+    </w:p>
+    <w:p>
+      <w:r>
+        <w:t>Matrices use malloc for the row pointer array and each row of doubles, following the lecturer's matrix examples. The complete file is validated before results.txt is opened. Input errors identify the matrix, row or line, and allocated data is released. An odd matrix count is rejected because it cannot form complete pairs.</w:t>
+      </w:r>
+    </w:p>
+    <w:p>
+      <w:r>
+        <w:t>For equal shapes the program computes A+B, A-B, A.*B and A./B. A zero divisor produces NaN in that cell. Both transposes are always computed. A*B is computed only when A.cols equals B.rows; its cell is the dot product sum over k. Every unavailable operation gets one clear message and the remaining operations continue.</w:t>
       </w:r>
     </w:p>
     <w:p>
       <w:pPr>
         <w:pStyle w:val="Heading2"/>
       </w:pPr>
-      <w:bookmarkStart w:id="18" w:name="_Toc242268617"/>
-      <w:r>
-        <w:t>Synchronisation and memory</w:t>
+      <w:bookmarkStart w:id="18" w:name="_Toc242565010"/>
+      <w:r>
+        <w:t>Code I implemented</w:t>
       </w:r>
       <w:bookmarkEnd w:id="18"/>
-    </w:p>
-    <w:p>
-      <w:r>
-        <w:t>For each operation the result row count is the number of outer loop iterations. The thread cap is min(requested_threads, result_rows). This prevents more requested workers than result rows. The program prints the requested, capped and actual OpenMP team sizes.</w:t>
-      </w:r>
-    </w:p>
-    <w:p>
-      <w:r>
-        <w:t>The outer row loop uses omp for with a static schedule. The input matrices are shared and read-only. Iteration variables and the dot-product sum are local to the calculation, and each output cell has one writer. The implicit barrier completes the computation before fprintf reads the result. A shared reduction is unnecessary because the sum belongs to one cell, not to the whole result.</w:t>
-      </w:r>
-    </w:p>
-    <w:p>
-      <w:r>
-        <w:t>Every output includes the pair identifier, operation name and dimensions, followed by comma-separated rows. Results use 17 significant digits to preserve double precision. Row allocations are freed individually before the pointer array is freed. Overflow checks precede allocations.</w:t>
-      </w:r>
-    </w:p>
-    <w:p>
-      <w:pPr>
-        <w:pStyle w:val="Heading2"/>
-      </w:pPr>
-      <w:bookmarkStart w:id="19" w:name="_Toc242268618"/>
-      <w:r>
-        <w:lastRenderedPageBreak/>
-        <w:t>Build and run</w:t>
-      </w:r>
-      <w:bookmarkEnd w:id="19"/>
-    </w:p>
-    <w:p>
-      <w:pPr>
-        <w:spacing w:after="0"/>
-      </w:pPr>
-      <w:r>
-        <w:rPr>
-          <w:sz w:val="20"/>
-        </w:rPr>
-        <w:t>gcc -std=c11 -O2 -fopenmp MatrixOperations.c -lm -o MatrixOperations</w:t>
-      </w:r>
-    </w:p>
-    <w:p>
-      <w:pPr>
-        <w:spacing w:after="0"/>
-      </w:pPr>
-      <w:r>
-        <w:rPr>
-          <w:sz w:val="20"/>
-        </w:rPr>
-        <w:t>./MatrixOperations MatData.txt 4</w:t>
-      </w:r>
-    </w:p>
-    <w:p>
-      <w:pPr>
-        <w:pStyle w:val="Heading2"/>
-      </w:pPr>
-      <w:bookmarkStart w:id="20" w:name="_Toc242268619"/>
-      <w:r>
-        <w:t>Results and tests</w:t>
-      </w:r>
-      <w:bookmarkEnd w:id="20"/>
-    </w:p>
-    <w:p>
-      <w:r>
-        <w:t>All 50 supplied matrices were processed as 25 pairs. Every applicable output from requested thread counts of 1, 4 and 64 matched NumPy, using relative tolerance 1e-12 and absolute tolerance 1e-10. The checker also verified operation messages, pair order, dimensions and thread caps.</w:t>
-      </w:r>
-    </w:p>
-    <w:p>
-      <w:r>
-        <w:t>Additional fixtures covered square matrices, rectangular matrix products, pairs with different shapes, one-row matrices and division by zero. Thirteen invalid files tested empty input, odd counts, bad headers, missing or extra row values, non-numeric tokens, NaN, infinity and numeric overflow. Missing files and invalid thread arguments were also rejected.</w:t>
-      </w:r>
-    </w:p>
-    <w:p>
-      <w:r>
-        <w:t>AddressSanitizer and UndefinedBehaviorSanitizer passed on the supplied file with 64 requested threads. Pair 1 has two 3x4 matrices: element-wise operations and both transposes are valid, while the matrix product is not. Pair 2 has 4x6 and 6x2 matrices: the product and transposes are valid, while the four element-wise operations are not.</w:t>
-      </w:r>
-    </w:p>
-    <w:p>
-      <w:pPr>
-        <w:spacing w:after="0"/>
-      </w:pPr>
-      <w:r>
-        <w:rPr>
-          <w:sz w:val="20"/>
-        </w:rPr>
-        <w:t>Pair 1: A=3,4 B=3,4</w:t>
-      </w:r>
-    </w:p>
-    <w:p>
-      <w:pPr>
-        <w:spacing w:after="0"/>
-      </w:pPr>
-      <w:r>
-        <w:rPr>
-          <w:sz w:val="20"/>
-        </w:rPr>
-        <w:t>Transpose A - 4,3</w:t>
-      </w:r>
-    </w:p>
-    <w:p>
-      <w:pPr>
-        <w:spacing w:after="0"/>
-      </w:pPr>
-      <w:r>
-        <w:rPr>
-          <w:sz w:val="20"/>
-        </w:rPr>
-        <w:t>Matrix multiplication cannot be done (A.cols != B.rows).</w:t>
-      </w:r>
-    </w:p>
-    <w:p>
-      <w:pPr>
-        <w:spacing w:after="0"/>
-      </w:pPr>
-      <w:r>
-        <w:rPr>
-          <w:sz w:val="20"/>
-        </w:rPr>
-        <w:t>Pair 2: A=4,6 B=6,2</w:t>
-      </w:r>
-    </w:p>
-    <w:p>
-      <w:pPr>
-        <w:spacing w:after="0"/>
-      </w:pPr>
-      <w:r>
-        <w:rPr>
-          <w:sz w:val="20"/>
-        </w:rPr>
-        <w:t>Matrix multiplication - 4,2</w:t>
-      </w:r>
-    </w:p>
-    <w:p>
-      <w:r>
-        <w:t>Selected output headings from the two different operation-applicability cases. Full numeric matrices are in results.txt.</w:t>
-      </w:r>
-    </w:p>
-    <w:p>
-      <w:pPr>
-        <w:pStyle w:val="Heading2"/>
-      </w:pPr>
-      <w:bookmarkStart w:id="21" w:name="_Toc242268620"/>
-      <w:r>
-        <w:t>Performance and limits</w:t>
-      </w:r>
-      <w:bookmarkEnd w:id="21"/>
-    </w:p>
-    <w:p>
-      <w:r>
-        <w:t>A matrix product of m x k and k x n requires O(mkn) arithmetic. Element-wise operations and transposes require O(mn). All input matrices remain in host memory until validation and processing finish; result memory is allocated one operation at a time.</w:t>
-      </w:r>
-    </w:p>
-    <w:p>
-      <w:r>
-        <w:t>Many supplied matrices are small. Opening an OpenMP team for a short loop can cost more than its arithmetic. This implementation follows the required thread cap and records actual team sizes, but a small workload does not establish a speed advantage. Parsing, output formatting, and file writes remain serial.</w:t>
-      </w:r>
-    </w:p>
-    <w:p>
-      <w:pPr>
-        <w:pStyle w:val="Heading2"/>
-        <w:pageBreakBefore/>
-      </w:pPr>
-      <w:bookmarkStart w:id="22" w:name="_Toc242268621"/>
-      <w:r>
-        <w:lastRenderedPageBreak/>
-        <w:t>Colab execution evidence</w:t>
-      </w:r>
-      <w:bookmarkEnd w:id="22"/>
     </w:p>
     <w:p>
       <w:pPr>
@@ -4451,10 +5274,10 @@
           <w:noProof/>
         </w:rPr>
         <w:drawing>
-          <wp:inline distT="0" distB="0" distL="0" distR="0" wp14:anchorId="7F9A7140" wp14:editId="62F798B0">
-            <wp:extent cx="5250887" cy="4892040"/>
+          <wp:inline distT="0" distB="0" distL="0" distR="0" wp14:anchorId="3BA9E2CF" wp14:editId="7F6EFBF5">
+            <wp:extent cx="6217920" cy="2163808"/>
             <wp:effectExtent l="0" t="0" r="0" b="0"/>
-            <wp:docPr id="4" name="Picture 4" descr="Figure 4. Task 02 matrix operations in Google Colab."/>
+            <wp:docPr id="14" name="Task_02_Code_Colab.png" descr="Figure 4. Colab code for parallel matrix rows and local product accumulation."/>
             <wp:cNvGraphicFramePr>
               <a:graphicFrameLocks xmlns:a="http://schemas.openxmlformats.org/drawingml/2006/main" noChangeAspect="1"/>
             </wp:cNvGraphicFramePr>
@@ -4462,11 +5285,11 @@
               <a:graphicData uri="http://schemas.openxmlformats.org/drawingml/2006/picture">
                 <pic:pic xmlns:pic="http://schemas.openxmlformats.org/drawingml/2006/picture">
                   <pic:nvPicPr>
-                    <pic:cNvPr id="0" name="Task_02_Colab.jpg"/>
+                    <pic:cNvPr id="0" name="image.png"/>
                     <pic:cNvPicPr/>
                   </pic:nvPicPr>
                   <pic:blipFill>
-                    <a:blip r:embed="rId17"/>
+                    <a:blip r:embed="rId19"/>
                     <a:stretch>
                       <a:fillRect/>
                     </a:stretch>
@@ -4474,7 +5297,7 @@
                   <pic:spPr>
                     <a:xfrm>
                       <a:off x="0" y="0"/>
-                      <a:ext cx="5250887" cy="4892040"/>
+                      <a:ext cx="6217920" cy="2163808"/>
                     </a:xfrm>
                     <a:prstGeom prst="rect">
                       <a:avLst/>
@@ -4492,7 +5315,7 @@
         <w:pStyle w:val="Caption"/>
         <w:keepNext/>
       </w:pPr>
-      <w:bookmarkStart w:id="23" w:name="_Toc242268646"/>
+      <w:bookmarkStart w:id="19" w:name="_Toc242565042"/>
       <w:r>
         <w:t xml:space="preserve">Figure </w:t>
       </w:r>
@@ -4505,104 +5328,198 @@
         </w:r>
       </w:fldSimple>
       <w:r>
-        <w:t>. Task 02 matrix operations in Google Colab.</w:t>
+        <w:t>. Colab code for parallel matrix rows and local product accumulation.</w:t>
+      </w:r>
+      <w:bookmarkEnd w:id="19"/>
+    </w:p>
+    <w:p>
+      <w:r>
+        <w:t xml:space="preserve">I implemented the matrix operations inside an OpenMP parallel region. Static scheduling gives different output rows to different threads, with the thread count capped by the number of rows. Each </w:t>
+      </w:r>
+      <w:r>
+        <w:lastRenderedPageBreak/>
+        <w:t>matrix-product cell uses its own local sum, so workers write separate result cells without sharing an accumulator.</w:t>
+      </w:r>
+    </w:p>
+    <w:p>
+      <w:r>
+        <w:t>Source excerpt: MatrixOperations.c, operation, lines 188 to 210. The full source remains in MatrixOperations.c.</w:t>
+      </w:r>
+    </w:p>
+    <w:p>
+      <w:pPr>
+        <w:pStyle w:val="Heading2"/>
+      </w:pPr>
+      <w:bookmarkStart w:id="20" w:name="_Toc242565011"/>
+      <w:r>
+        <w:t>Synchronisation and memory</w:t>
+      </w:r>
+      <w:bookmarkEnd w:id="20"/>
+    </w:p>
+    <w:p>
+      <w:r>
+        <w:t>For each operation the result row count is the number of outer loop iterations. The thread cap is min(requested_threads, result_rows). This prevents more requested workers than result rows. The program prints the requested, capped and actual OpenMP team sizes.</w:t>
+      </w:r>
+    </w:p>
+    <w:p>
+      <w:r>
+        <w:t>The outer row loop uses omp for with a static schedule. The input matrices are shared and read-only. Iteration variables and the dot-product sum are local to the calculation, and each output cell has one writer. The implicit barrier completes the computation before fprintf reads the result. A shared reduction is unnecessary because the sum belongs to one cell, not to the whole result.</w:t>
+      </w:r>
+    </w:p>
+    <w:p>
+      <w:r>
+        <w:t>Every output includes the pair identifier, operation name and dimensions, followed by comma-separated rows. Results use 17 significant digits to preserve double precision. Row allocations are freed individually before the pointer array is freed. Overflow checks precede allocations.</w:t>
+      </w:r>
+    </w:p>
+    <w:p>
+      <w:pPr>
+        <w:pStyle w:val="Heading2"/>
+      </w:pPr>
+      <w:bookmarkStart w:id="21" w:name="_Toc242565012"/>
+      <w:r>
+        <w:t>Build and run</w:t>
+      </w:r>
+      <w:bookmarkEnd w:id="21"/>
+    </w:p>
+    <w:p>
+      <w:pPr>
+        <w:spacing w:after="0"/>
+      </w:pPr>
+      <w:r>
+        <w:rPr>
+          <w:sz w:val="20"/>
+        </w:rPr>
+        <w:t>gcc -std=c11 -O2 -fopenmp MatrixOperations.c -lm -o MatrixOperations</w:t>
+      </w:r>
+    </w:p>
+    <w:p>
+      <w:pPr>
+        <w:spacing w:after="0"/>
+      </w:pPr>
+      <w:r>
+        <w:rPr>
+          <w:sz w:val="20"/>
+        </w:rPr>
+        <w:t>./MatrixOperations MatData.txt 4</w:t>
+      </w:r>
+    </w:p>
+    <w:p>
+      <w:pPr>
+        <w:pStyle w:val="Heading2"/>
+      </w:pPr>
+      <w:bookmarkStart w:id="22" w:name="_Toc242565013"/>
+      <w:r>
+        <w:t>Results and tests</w:t>
+      </w:r>
+      <w:bookmarkEnd w:id="22"/>
+    </w:p>
+    <w:p>
+      <w:r>
+        <w:t>All 50 supplied matrices were processed as 25 pairs. Every applicable output from requested thread counts of 1, 4 and 64 matched NumPy, using relative tolerance 1e-12 and absolute tolerance 1e-10. The checker also verified operation messages, pair order, dimensions and thread caps.</w:t>
+      </w:r>
+    </w:p>
+    <w:p>
+      <w:r>
+        <w:t>Additional fixtures covered square matrices, rectangular matrix products, pairs with different shapes, one-row matrices and division by zero. Thirteen invalid files tested empty input, odd counts, bad headers, missing or extra row values, non-numeric tokens, NaN, infinity and numeric overflow. Missing files and invalid thread arguments were also rejected.</w:t>
+      </w:r>
+    </w:p>
+    <w:p>
+      <w:r>
+        <w:t>AddressSanitizer and UndefinedBehaviorSanitizer passed on the supplied file with 64 requested threads. Pair 1 has two 3x4 matrices: element-wise operations and both transposes are valid, while the matrix product is not. Pair 2 has 4x6 and 6x2 matrices: the product and transposes are valid, while the four element-wise operations are not.</w:t>
+      </w:r>
+    </w:p>
+    <w:p>
+      <w:pPr>
+        <w:spacing w:after="0"/>
+      </w:pPr>
+      <w:r>
+        <w:rPr>
+          <w:sz w:val="20"/>
+        </w:rPr>
+        <w:t>Pair 1: A=3,4 B=3,4</w:t>
+      </w:r>
+    </w:p>
+    <w:p>
+      <w:pPr>
+        <w:spacing w:after="0"/>
+      </w:pPr>
+      <w:r>
+        <w:rPr>
+          <w:sz w:val="20"/>
+        </w:rPr>
+        <w:t>Transpose A - 4,3</w:t>
+      </w:r>
+    </w:p>
+    <w:p>
+      <w:pPr>
+        <w:spacing w:after="0"/>
+      </w:pPr>
+      <w:r>
+        <w:rPr>
+          <w:sz w:val="20"/>
+        </w:rPr>
+        <w:t>Matrix multiplication cannot be done (A.cols != B.rows).</w:t>
+      </w:r>
+    </w:p>
+    <w:p>
+      <w:pPr>
+        <w:spacing w:after="0"/>
+      </w:pPr>
+      <w:r>
+        <w:rPr>
+          <w:sz w:val="20"/>
+        </w:rPr>
+        <w:t>Pair 2: A=4,6 B=6,2</w:t>
+      </w:r>
+    </w:p>
+    <w:p>
+      <w:pPr>
+        <w:spacing w:after="0"/>
+      </w:pPr>
+      <w:r>
+        <w:rPr>
+          <w:sz w:val="20"/>
+        </w:rPr>
+        <w:t>Matrix multiplication - 4,2</w:t>
+      </w:r>
+    </w:p>
+    <w:p>
+      <w:r>
+        <w:t>Selected output headings from the two different operation-applicability cases. Full numeric matrices are in results.txt.</w:t>
+      </w:r>
+    </w:p>
+    <w:p>
+      <w:pPr>
+        <w:pStyle w:val="Heading2"/>
+      </w:pPr>
+      <w:bookmarkStart w:id="23" w:name="_Toc242565014"/>
+      <w:r>
+        <w:lastRenderedPageBreak/>
+        <w:t>Performance and limits</w:t>
       </w:r>
       <w:bookmarkEnd w:id="23"/>
     </w:p>
     <w:p>
       <w:r>
-        <w:t>The visible summary reports 50 matrices processed as 25 pairs and names results.txt. The output preview below contains numeric matrix rows and a matrix multiplication heading with its result dimensions. This confirms that the program writes matrix results to the required file. The separate NumPy comparisons verify every applicable operation, including rows that are outside this screenshot.</w:t>
-      </w:r>
-    </w:p>
-    <w:p>
-      <w:pPr>
-        <w:pStyle w:val="Heading1"/>
+        <w:t>A matrix product of m x k and k x n requires O(mkn) arithmetic. Element-wise operations and transposes require O(mn). All input matrices remain in host memory until validation and processing finish; result memory is allocated one operation at a time.</w:t>
+      </w:r>
+    </w:p>
+    <w:p>
+      <w:r>
+        <w:t>Many supplied matrices are small. Opening an OpenMP team for a short loop can cost more than its arithmetic. This implementation follows the required thread cap and records actual team sizes, but a small workload does not establish a speed advantage. Parsing, output formatting, and file writes remain serial.</w:t>
+      </w:r>
+    </w:p>
+    <w:p>
+      <w:pPr>
+        <w:pStyle w:val="Heading2"/>
         <w:pageBreakBefore/>
       </w:pPr>
-      <w:bookmarkStart w:id="24" w:name="_Toc242268622"/>
+      <w:bookmarkStart w:id="24" w:name="_Toc242565015"/>
       <w:r>
         <w:lastRenderedPageBreak/>
-        <w:t>Task 03 Password Cracking with Files using CUDA</w:t>
+        <w:t>Colab execution evidence</w:t>
       </w:r>
       <w:bookmarkEnd w:id="24"/>
-    </w:p>
-    <w:p>
-      <w:hyperlink r:id="rId18">
-        <w:r>
-          <w:rPr>
-            <w:color w:val="164B6B"/>
-            <w:u w:val="single"/>
-          </w:rPr>
-          <w:t>Task 03 source notebook in Colab</w:t>
-        </w:r>
-      </w:hyperlink>
-    </w:p>
-    <w:p>
-      <w:hyperlink r:id="rId19">
-        <w:r>
-          <w:rPr>
-            <w:color w:val="164B6B"/>
-            <w:u w:val="single"/>
-          </w:rPr>
-          <w:t>Executed Task 03 Colab notebook</w:t>
-        </w:r>
-      </w:hyperlink>
-    </w:p>
-    <w:p>
-      <w:pPr>
-        <w:pStyle w:val="Heading2"/>
-      </w:pPr>
-      <w:bookmarkStart w:id="25" w:name="_Toc242268623"/>
-      <w:r>
-        <w:t>Objective</w:t>
-      </w:r>
-      <w:bookmarkEnd w:id="25"/>
-    </w:p>
-    <w:p>
-      <w:r>
-        <w:t>Read every encrypted line from the command-line file, recover its two lowercase letters and two digits on the GPU, and write one plaintext answer per line to decrypted.txt in the original order.</w:t>
-      </w:r>
-    </w:p>
-    <w:p>
-      <w:pPr>
-        <w:pStyle w:val="Heading2"/>
-      </w:pPr>
-      <w:bookmarkStart w:id="26" w:name="_Toc242268624"/>
-      <w:r>
-        <w:t>Implementation</w:t>
-      </w:r>
-      <w:bookmarkEnd w:id="26"/>
-    </w:p>
-    <w:p>
-      <w:r>
-        <w:t>The supplied CryptForCuda.c transformation creates ten encrypted characters from four raw characters. Its additions, subtractions, and boundary adjustments are retained exactly. The boundary adjustment is not replaced with conventional modulo wrapping. The device function writes into a caller-owned char[11] buffer, avoiding the shared static buffer used in the original serial example.</w:t>
-      </w:r>
-    </w:p>
-    <w:p>
-      <w:r>
-        <w:t>The host validates each line as six lowercase letters followed by four digits. It allocates 11*N encrypted bytes, 5*N plaintext bytes, and N*sizeof(int) status bytes, and copies the encrypted array to device memory. The x thread index is blockIdx.x * blockDim.x + threadIdx.x; a boundary guard excludes padded threads.</w:t>
-      </w:r>
-    </w:p>
-    <w:p>
-      <w:r>
-        <w:t>One CUDA thread owns one encrypted password. Nested loops generate the 26*26 letter pairs. The first six encrypted characters depend only on the letters, so a non-matching pair is rejected before trying the 100 digit pairs. A complete ten-character comparison determines success. This retains the lecturer's candidate-encryption logic while removing digit trials that cannot succeed.</w:t>
-      </w:r>
-    </w:p>
-    <w:p>
-      <w:r>
-        <w:t>For 10,000 records the launch is 40 x blocks with 256 threads per block. Smaller inputs use a smaller block size and at least two x blocks. Larger inputs derive the number of blocks from the record count and device limit. Each thread writes only its own result and status, so no global success flag or atomic operation is needed.</w:t>
-      </w:r>
-    </w:p>
-    <w:p>
-      <w:pPr>
-        <w:pStyle w:val="Heading2"/>
-      </w:pPr>
-      <w:bookmarkStart w:id="27" w:name="_Toc242268625"/>
-      <w:r>
-        <w:lastRenderedPageBreak/>
-        <w:t>Code I implemented</w:t>
-      </w:r>
-      <w:bookmarkEnd w:id="27"/>
     </w:p>
     <w:p>
       <w:pPr>
@@ -4614,10 +5531,10 @@
           <w:noProof/>
         </w:rPr>
         <w:drawing>
-          <wp:inline distT="0" distB="0" distL="0" distR="0" wp14:anchorId="4FA97C44" wp14:editId="34111EDC">
-            <wp:extent cx="6217920" cy="4374554"/>
+          <wp:inline distT="0" distB="0" distL="0" distR="0" wp14:anchorId="5FC4E142" wp14:editId="1F02998A">
+            <wp:extent cx="6217920" cy="2136646"/>
             <wp:effectExtent l="0" t="0" r="0" b="0"/>
-            <wp:docPr id="5" name="Picture 5" descr="Figure 5. Colab code for password indexing and candidate search."/>
+            <wp:docPr id="15" name="Task_02_Colab.png" descr="Figure 5. Task 02 matrix operations in Google Colab."/>
             <wp:cNvGraphicFramePr>
               <a:graphicFrameLocks xmlns:a="http://schemas.openxmlformats.org/drawingml/2006/main" noChangeAspect="1"/>
             </wp:cNvGraphicFramePr>
@@ -4625,7 +5542,7 @@
               <a:graphicData uri="http://schemas.openxmlformats.org/drawingml/2006/picture">
                 <pic:pic xmlns:pic="http://schemas.openxmlformats.org/drawingml/2006/picture">
                   <pic:nvPicPr>
-                    <pic:cNvPr id="0" name="Task_03_Code_Colab.jpg"/>
+                    <pic:cNvPr id="0" name="image.png"/>
                     <pic:cNvPicPr/>
                   </pic:nvPicPr>
                   <pic:blipFill>
@@ -4637,7 +5554,7 @@
                   <pic:spPr>
                     <a:xfrm>
                       <a:off x="0" y="0"/>
-                      <a:ext cx="6217920" cy="4374554"/>
+                      <a:ext cx="6217920" cy="2136646"/>
                     </a:xfrm>
                     <a:prstGeom prst="rect">
                       <a:avLst/>
@@ -4655,7 +5572,7 @@
         <w:pStyle w:val="Caption"/>
         <w:keepNext/>
       </w:pPr>
-      <w:bookmarkStart w:id="28" w:name="_Toc242268647"/>
+      <w:bookmarkStart w:id="25" w:name="_Toc242565043"/>
       <w:r>
         <w:t xml:space="preserve">Figure </w:t>
       </w:r>
@@ -4668,220 +5585,13 @@
         </w:r>
       </w:fldSimple>
       <w:r>
-        <w:t>. Colab code for password indexing and candidate search.</w:t>
-      </w:r>
-      <w:bookmarkEnd w:id="28"/>
-    </w:p>
-    <w:p>
-      <w:r>
-        <w:t>I implemented a CUDA kernel in which each thread processes one encrypted password. The thread checks its index, uses its own candidate buffers and rejects letter pairs that fail to match the first six encrypted characters before trying digit pairs. A full match is copied to that thread's separate output slot.</w:t>
-      </w:r>
-    </w:p>
-    <w:p>
-      <w:r>
-        <w:t>Source excerpt: PWCrack.cu, crackPasswords, lines 40 to 64. The full source remains in PWCrack.cu.</w:t>
-      </w:r>
-    </w:p>
-    <w:p>
-      <w:pPr>
-        <w:pStyle w:val="Heading2"/>
-      </w:pPr>
-      <w:bookmarkStart w:id="29" w:name="_Toc242268626"/>
-      <w:r>
-        <w:t>Synchronisation and memory</w:t>
-      </w:r>
-      <w:bookmarkEnd w:id="29"/>
-    </w:p>
-    <w:p>
-      <w:r>
-        <w:t>The CPU copies plaintext and status arrays back after checking the kernel launch and completion. Every recovered plaintext is re-encrypted on the host and compared with its original encrypted line before it is accepted. An uncrackable but syntactically valid record writes NOT_FOUND in its position and returns exit code 2.</w:t>
-      </w:r>
-    </w:p>
-    <w:p>
-      <w:r>
-        <w:t>Input ordering is preserved by the fixed offsets record*11 and record*5. Every CUDA allocation, transfer, event, execution check and deallocation reports errors. Device buffers and events are released, and all host arrays are freed, including failure paths.</w:t>
-      </w:r>
-    </w:p>
-    <w:p>
-      <w:pPr>
-        <w:pStyle w:val="Heading2"/>
-      </w:pPr>
-      <w:bookmarkStart w:id="30" w:name="_Toc242268627"/>
-      <w:r>
-        <w:lastRenderedPageBreak/>
-        <w:t>Build and run</w:t>
-      </w:r>
-      <w:bookmarkEnd w:id="30"/>
-    </w:p>
-    <w:p>
-      <w:pPr>
-        <w:spacing w:after="0"/>
-      </w:pPr>
-      <w:r>
-        <w:rPr>
-          <w:sz w:val="20"/>
-        </w:rPr>
-        <w:t>nvcc -O2 -arch=sm_75 PWCrack.cu -o PWCrack</w:t>
-      </w:r>
-    </w:p>
-    <w:p>
-      <w:pPr>
-        <w:spacing w:after="0"/>
-      </w:pPr>
-      <w:r>
-        <w:rPr>
-          <w:sz w:val="20"/>
-        </w:rPr>
-        <w:t>./PWCrack passwords.txt</w:t>
-      </w:r>
-    </w:p>
-    <w:p>
-      <w:pPr>
-        <w:pStyle w:val="Heading2"/>
-      </w:pPr>
-      <w:bookmarkStart w:id="31" w:name="_Toc242268628"/>
-      <w:r>
-        <w:t>Results and tests</w:t>
-      </w:r>
-      <w:bookmarkEnd w:id="31"/>
-    </w:p>
-    <w:p>
-      <w:r>
-        <w:t>The normal dataset contains 10,000 synthetic passwords created with seed 6005 and the supplied encryption logic. It includes boundary cases such as aa00, zz99, az09 and za90. All 10,000 recovered values matched the known plaintext file exactly.</w:t>
-      </w:r>
-    </w:p>
-    <w:p>
-      <w:r>
-        <w:t>An exhaustive independent test generated all 67,600 possible raw passwords, checked that their encrypted values were distinct within this domain, and recovered every one in order. Input sizes of 1, 2 and 257 tested launch padding and multiple blocks. A separate test compiled and ran the lecturer's PasswordGeneratorToText.c and recovered its 25 generated records.</w:t>
-      </w:r>
-    </w:p>
-    <w:p>
-      <w:r>
-        <w:t>Empty files, short lines, long lines, uppercase characters, invalid digits and blank lines were rejected. The valid-shaped string aaaaaa0000 had no candidate and correctly produced NOT_FOUND. The recorded kernel time for 10,000 records was 0.303 ms on the Tesla T4; file reads, allocation, transfers and output writes are excluded from that event timing.</w:t>
-      </w:r>
-    </w:p>
-    <w:p>
-      <w:pPr>
-        <w:spacing w:after="0"/>
-      </w:pPr>
-      <w:r>
-        <w:rPr>
-          <w:sz w:val="20"/>
-        </w:rPr>
-        <w:t>GPU: Tesla T4</w:t>
-      </w:r>
-    </w:p>
-    <w:p>
-      <w:pPr>
-        <w:spacing w:after="0"/>
-      </w:pPr>
-      <w:r>
-        <w:rPr>
-          <w:sz w:val="20"/>
-        </w:rPr>
-        <w:t>Passwords: 10000; x blocks: 40; threads per block: 256</w:t>
-      </w:r>
-    </w:p>
-    <w:p>
-      <w:pPr>
-        <w:spacing w:after="0"/>
-      </w:pPr>
-      <w:r>
-        <w:rPr>
-          <w:sz w:val="20"/>
-        </w:rPr>
-        <w:t>CUDA kernel time: 0.303 ms</w:t>
-      </w:r>
-    </w:p>
-    <w:p>
-      <w:pPr>
-        <w:spacing w:after="0"/>
-      </w:pPr>
-      <w:r>
-        <w:rPr>
-          <w:sz w:val="20"/>
-        </w:rPr>
-        <w:t>Line 1: ccbddb2244 -&gt; aa00</w:t>
-      </w:r>
-    </w:p>
-    <w:p>
-      <w:pPr>
-        <w:spacing w:after="0"/>
-      </w:pPr>
-      <w:r>
-        <w:rPr>
-          <w:sz w:val="20"/>
-        </w:rPr>
-        <w:t>Line 2: cxbdwy2745 -&gt; zz99</w:t>
-      </w:r>
-    </w:p>
-    <w:p>
-      <w:pPr>
-        <w:spacing w:after="0"/>
-      </w:pPr>
-      <w:r>
-        <w:rPr>
-          <w:sz w:val="20"/>
-        </w:rPr>
-        <w:t>Line 3: ccbdwy2245 -&gt; az09</w:t>
-      </w:r>
-    </w:p>
-    <w:p>
-      <w:pPr>
-        <w:spacing w:after="0"/>
-      </w:pPr>
-      <w:r>
-        <w:rPr>
-          <w:sz w:val="20"/>
-        </w:rPr>
-        <w:t>Line 4: cxbddb2744 -&gt; za90</w:t>
-      </w:r>
-    </w:p>
-    <w:p>
-      <w:pPr>
-        <w:spacing w:after="0"/>
-      </w:pPr>
-      <w:r>
-        <w:rPr>
-          <w:sz w:val="20"/>
-        </w:rPr>
-        <w:t>Line 5: ccbeca3162 -&gt; ab12</w:t>
-      </w:r>
-    </w:p>
-    <w:p>
-      <w:pPr>
-        <w:spacing w:after="0"/>
-      </w:pPr>
-      <w:r>
-        <w:rPr>
-          <w:sz w:val="20"/>
-        </w:rPr>
-        <w:t>Line 6: oknqkm7312 -&gt; mn56</w:t>
-      </w:r>
-    </w:p>
-    <w:p>
-      <w:r>
-        <w:t>Actual CUDA execution excerpt. The full file has 10,000 recovered plaintext lines.</w:t>
-      </w:r>
-    </w:p>
-    <w:p>
-      <w:pPr>
-        <w:pStyle w:val="Heading2"/>
-      </w:pPr>
-      <w:bookmarkStart w:id="32" w:name="_Toc242268629"/>
-      <w:r>
-        <w:t>Performance and limits</w:t>
-      </w:r>
-      <w:bookmarkEnd w:id="32"/>
-    </w:p>
-    <w:p>
-      <w:r>
-        <w:t>This is the assessment's synthetic character transformation, not an attack on a real authentication service. Candidate filtering is valid because encrypted positions 0..5 depend only on the two letters. Without this property, the same pruning would not be valid.</w:t>
-      </w:r>
-    </w:p>
-    <w:p>
-      <w:r>
-        <w:t>All records are held in host and device memory at once. Memory demand therefore grows linearly with file size, and files that cannot be allocated fail clearly. Kernel time alone must not be reported as end-to-end application time or compared with a CPU program that includes file I/O.</w:t>
+        <w:t>. Task 02 matrix operations in Google Colab.</w:t>
+      </w:r>
+      <w:bookmarkEnd w:id="25"/>
+    </w:p>
+    <w:p>
+      <w:r>
+        <w:t>The screenshot displays part of the results.txt output for Pair 1, including addition, subtraction, element-wise multiplication and element-wise division. The complete run processed 50 matrices as 25 pairs. The separate NumPy comparisons verify every applicable operation, including matrix products and rows outside this screenshot.</w:t>
       </w:r>
     </w:p>
     <w:p>
@@ -4889,12 +5599,12 @@
         <w:pStyle w:val="Heading2"/>
         <w:pageBreakBefore/>
       </w:pPr>
-      <w:bookmarkStart w:id="33" w:name="_Toc242268630"/>
+      <w:bookmarkStart w:id="26" w:name="_Toc242565016"/>
       <w:r>
         <w:lastRenderedPageBreak/>
-        <w:t>Colab execution evidence</w:t>
-      </w:r>
-      <w:bookmarkEnd w:id="33"/>
+        <w:t>Automatic resource download</w:t>
+      </w:r>
+      <w:bookmarkEnd w:id="26"/>
     </w:p>
     <w:p>
       <w:pPr>
@@ -4906,10 +5616,10 @@
           <w:noProof/>
         </w:rPr>
         <w:drawing>
-          <wp:inline distT="0" distB="0" distL="0" distR="0" wp14:anchorId="0FD9B5D1" wp14:editId="2E20C8E0">
-            <wp:extent cx="5250887" cy="4892040"/>
+          <wp:inline distT="0" distB="0" distL="0" distR="0" wp14:anchorId="1BE41C87" wp14:editId="19272563">
+            <wp:extent cx="6217920" cy="3497580"/>
             <wp:effectExtent l="0" t="0" r="0" b="0"/>
-            <wp:docPr id="6" name="Picture 6" descr="Figure 6. Task 03 CUDA password recovery in Google Colab."/>
+            <wp:docPr id="6" name="Picture 6" descr="Figure 6. Task 02 automatic GitHub resource download in the T4 runtime."/>
             <wp:cNvGraphicFramePr>
               <a:graphicFrameLocks xmlns:a="http://schemas.openxmlformats.org/drawingml/2006/main" noChangeAspect="1"/>
             </wp:cNvGraphicFramePr>
@@ -4917,7 +5627,7 @@
               <a:graphicData uri="http://schemas.openxmlformats.org/drawingml/2006/picture">
                 <pic:pic xmlns:pic="http://schemas.openxmlformats.org/drawingml/2006/picture">
                   <pic:nvPicPr>
-                    <pic:cNvPr id="0" name="Task_03_Colab.jpg"/>
+                    <pic:cNvPr id="0" name="Task_02_Setup_Colab.jpg"/>
                     <pic:cNvPicPr/>
                   </pic:nvPicPr>
                   <pic:blipFill>
@@ -4929,7 +5639,7 @@
                   <pic:spPr>
                     <a:xfrm>
                       <a:off x="0" y="0"/>
-                      <a:ext cx="5250887" cy="4892040"/>
+                      <a:ext cx="6217920" cy="3497580"/>
                     </a:xfrm>
                     <a:prstGeom prst="rect">
                       <a:avLst/>
@@ -4947,7 +5657,7 @@
         <w:pStyle w:val="Caption"/>
         <w:keepNext/>
       </w:pPr>
-      <w:bookmarkStart w:id="34" w:name="_Toc242268648"/>
+      <w:bookmarkStart w:id="27" w:name="_Toc242565044"/>
       <w:r>
         <w:t xml:space="preserve">Figure </w:t>
       </w:r>
@@ -4960,13 +5670,13 @@
         </w:r>
       </w:fldSimple>
       <w:r>
-        <w:t>. Task 03 CUDA password recovery in Google Colab.</w:t>
-      </w:r>
-      <w:bookmarkEnd w:id="34"/>
-    </w:p>
-    <w:p>
-      <w:r>
-        <w:t>The program summary reports 10,000 recovered and verified passwords out of 10,000 and identifies decrypted.txt. The display cell shows encrypted records beside their recovered two-letter, two-digit plaintext values. The T4 runtime is visible in the Colab status bar. The full-domain and invalid-input tests described above provide checks beyond these displayed examples.</w:t>
+        <w:t>. Task 02 automatic GitHub resource download in the T4 runtime.</w:t>
+      </w:r>
+      <w:bookmarkEnd w:id="27"/>
+    </w:p>
+    <w:p>
+      <w:r>
+        <w:t>The setup cell downloads MatData.txt from the public GitHub project, and the next cell writes MatrixOperations.c. The completed execution checks and T4 Python 3 status are visible. The full notebook run processed 50 matrices as 25 pairs. Matrix calculations use OpenMP on the CPU within this runtime.</w:t>
       </w:r>
     </w:p>
     <w:p>
@@ -4974,16 +5684,12 @@
         <w:pStyle w:val="Heading1"/>
         <w:pageBreakBefore/>
       </w:pPr>
-      <w:bookmarkStart w:id="35" w:name="_Toc242268631"/>
+      <w:bookmarkStart w:id="28" w:name="_Toc242565017"/>
       <w:r>
         <w:lastRenderedPageBreak/>
-        <w:t>Task 04</w:t>
-      </w:r>
-      <w:r>
-        <w:br/>
-        <w:t>Sobel Edge Detection using Cuda across many PNG images</w:t>
-      </w:r>
-      <w:bookmarkEnd w:id="35"/>
+        <w:t>Task 03 Password Cracking with Files using CUDA</w:t>
+      </w:r>
+      <w:bookmarkEnd w:id="28"/>
     </w:p>
     <w:p>
       <w:hyperlink r:id="rId22">
@@ -4992,7 +5698,7 @@
             <w:color w:val="164B6B"/>
             <w:u w:val="single"/>
           </w:rPr>
-          <w:t>Task 04 source notebook in Colab</w:t>
+          <w:t>Task 03 source notebook in Colab</w:t>
         </w:r>
       </w:hyperlink>
     </w:p>
@@ -5003,7 +5709,7 @@
             <w:color w:val="164B6B"/>
             <w:u w:val="single"/>
           </w:rPr>
-          <w:t>Executed Task 04 Colab notebook</w:t>
+          <w:t>Executed Task 03 Colab notebook</w:t>
         </w:r>
       </w:hyperlink>
     </w:p>
@@ -5011,57 +5717,57 @@
       <w:pPr>
         <w:pStyle w:val="Heading2"/>
       </w:pPr>
-      <w:bookmarkStart w:id="36" w:name="_Toc242268632"/>
+      <w:bookmarkStart w:id="29" w:name="_Toc242565018"/>
       <w:r>
         <w:t>Objective</w:t>
       </w:r>
-      <w:bookmarkEnd w:id="36"/>
-    </w:p>
-    <w:p>
-      <w:r>
-        <w:t>Use one public input image, download.png, to demonstrate the brief's four views: Original Image, Gradient in X direction, Gradient in Y direction and Sobel Edge Detection. The four panels are views of the same input. Save both gradient maps and the combined edge map at the original dimensions. The CUDA program also accepts multiple PNG paths when a batch is required.</w:t>
+      <w:bookmarkEnd w:id="29"/>
+    </w:p>
+    <w:p>
+      <w:r>
+        <w:t>Read every encrypted line from the command-line file, recover its two lowercase letters and two digits on the GPU, and write one plaintext answer per line to decrypted.txt in the original order.</w:t>
       </w:r>
     </w:p>
     <w:p>
       <w:pPr>
         <w:pStyle w:val="Heading2"/>
       </w:pPr>
-      <w:bookmarkStart w:id="37" w:name="_Toc242268633"/>
+      <w:bookmarkStart w:id="30" w:name="_Toc242565019"/>
       <w:r>
         <w:t>Implementation</w:t>
       </w:r>
-      <w:bookmarkEnd w:id="37"/>
-    </w:p>
-    <w:p>
-      <w:r>
-        <w:t>The notebook automatically downloads lodepng.cpp, lodepng.h and download.png (300x300) from the public GitHub project. The image is an unchanged copy of the public input in the last-class teaching example. The files are taken from a fixed project revision, so every fresh runtime uses the same inputs. LodePNG decodes the image into an RGBA host array, with its original licence notices retained.</w:t>
-      </w:r>
-    </w:p>
-    <w:p>
-      <w:r>
-        <w:t>The last-class sample demonstrates PNG decoding, explicit CUDA memory transfers and rgbToGray; its final kernel stops at grayscale conversion. This implementation extends that workflow with the assessed Sobel convolution. Luminance uses the lecturer's 0.30R + 0.59G + 0.11B weights as (30*R + 59*G + 11*B) / 100, rounded down. Integer arithmetic gives identical CPU and GPU truncation. Gx is [-1,0,1; -2,0,2; -1,0,1] and Gy is [-1,-2,-1; 0,0,0; 1,2,1]. Out-of-image neighbours are zero.</w:t>
-      </w:r>
-    </w:p>
-    <w:p>
-      <w:r>
-        <w:t>Gx measures left-to-right intensity changes and Gy measures top-to-bottom changes, following the written axis definitions. The kernel saves min(255, abs(Gx)) and min(255, abs(Gy)) in separate one-byte-per-pixel display buffers. The final magnitude uses the original signed sums: sqrt(Gx*Gx + Gy*Gy), then truncation and saturation at 255. Clipping a display map never changes that calculation. The final edge value fills RGB and preserves input alpha; the separate gradient maps contain grayscale intensity only.</w:t>
-      </w:r>
-    </w:p>
-    <w:p>
-      <w:r>
-        <w:t>RGBA input and final output arrays each use width*height*4 bytes. Each gradient array uses width*height bytes. The x grid has ceil(pixel_count/256) blocks and a guard for padded threads. The command accepts any number of PNGs. Output names are outImg_, outImg_Gx_ and outImg_Gy_ followed by the input basename. The host rejects duplicate or colliding generated names before processing. Gradient encoding uses lodepng_encode_file with LCT_GREY, 8, matching the lecturer's grayscale-buffer workflow.</w:t>
+      <w:bookmarkEnd w:id="30"/>
+    </w:p>
+    <w:p>
+      <w:r>
+        <w:t>The supplied CryptForCuda.c transformation creates ten encrypted characters from four raw characters. Its additions, subtractions, and boundary adjustments are retained exactly. The boundary adjustment is not replaced with conventional modulo wrapping. The device function writes into a caller-owned char[11] buffer, avoiding the shared static buffer used in the original serial example.</w:t>
+      </w:r>
+    </w:p>
+    <w:p>
+      <w:r>
+        <w:t>The host validates each line as six lowercase letters followed by four digits. It allocates 11*N encrypted bytes, 5*N plaintext bytes, and N*sizeof(int) status bytes, and copies the encrypted array to device memory. The x thread index is blockIdx.x * blockDim.x + threadIdx.x; a boundary guard excludes padded threads.</w:t>
+      </w:r>
+    </w:p>
+    <w:p>
+      <w:r>
+        <w:t>One CUDA thread owns one encrypted password. Nested loops generate the 26*26 letter pairs. The first six encrypted characters depend only on the letters, so a non-matching pair is rejected before trying the 100 digit pairs. A complete ten-character comparison determines success. This retains the lecturer's candidate-encryption logic while removing digit trials that cannot succeed.</w:t>
+      </w:r>
+    </w:p>
+    <w:p>
+      <w:r>
+        <w:t>For 10,000 records the launch is 40 x blocks with 256 threads per block. Smaller inputs use a smaller block size and at least two x blocks. Larger inputs derive the number of blocks from the record count and device limit. Each thread writes only its own result and status, so no global success flag or atomic operation is needed.</w:t>
       </w:r>
     </w:p>
     <w:p>
       <w:pPr>
         <w:pStyle w:val="Heading2"/>
       </w:pPr>
-      <w:bookmarkStart w:id="38" w:name="_Toc242268634"/>
+      <w:bookmarkStart w:id="31" w:name="_Toc242565020"/>
       <w:r>
         <w:lastRenderedPageBreak/>
         <w:t>Code I implemented</w:t>
       </w:r>
-      <w:bookmarkEnd w:id="38"/>
+      <w:bookmarkEnd w:id="31"/>
     </w:p>
     <w:p>
       <w:pPr>
@@ -5073,10 +5779,10 @@
           <w:noProof/>
         </w:rPr>
         <w:drawing>
-          <wp:inline distT="0" distB="0" distL="0" distR="0" wp14:anchorId="3AC70AD3" wp14:editId="00F70524">
-            <wp:extent cx="6040790" cy="4754879"/>
+          <wp:inline distT="0" distB="0" distL="0" distR="0" wp14:anchorId="41C90093" wp14:editId="5727DF24">
+            <wp:extent cx="6217920" cy="2114512"/>
             <wp:effectExtent l="0" t="0" r="0" b="0"/>
-            <wp:docPr id="7" name="Picture 7" descr="Figure 7. Colab code for pixel indexing, Sobel gradients and edge magnitude."/>
+            <wp:docPr id="16" name="Task_03_Code_Colab.png" descr="Figure 7. Colab code for password indexing and candidate search."/>
             <wp:cNvGraphicFramePr>
               <a:graphicFrameLocks xmlns:a="http://schemas.openxmlformats.org/drawingml/2006/main" noChangeAspect="1"/>
             </wp:cNvGraphicFramePr>
@@ -5084,7 +5790,7 @@
               <a:graphicData uri="http://schemas.openxmlformats.org/drawingml/2006/picture">
                 <pic:pic xmlns:pic="http://schemas.openxmlformats.org/drawingml/2006/picture">
                   <pic:nvPicPr>
-                    <pic:cNvPr id="0" name="Task_04_Code_Colab.jpg"/>
+                    <pic:cNvPr id="0" name="image.png"/>
                     <pic:cNvPicPr/>
                   </pic:nvPicPr>
                   <pic:blipFill>
@@ -5096,7 +5802,7 @@
                   <pic:spPr>
                     <a:xfrm>
                       <a:off x="0" y="0"/>
-                      <a:ext cx="6040790" cy="4754879"/>
+                      <a:ext cx="6217920" cy="2114512"/>
                     </a:xfrm>
                     <a:prstGeom prst="rect">
                       <a:avLst/>
@@ -5114,7 +5820,7 @@
         <w:pStyle w:val="Caption"/>
         <w:keepNext/>
       </w:pPr>
-      <w:bookmarkStart w:id="39" w:name="_Toc242268649"/>
+      <w:bookmarkStart w:id="32" w:name="_Toc242565045"/>
       <w:r>
         <w:t xml:space="preserve">Figure </w:t>
       </w:r>
@@ -5127,55 +5833,49 @@
         </w:r>
       </w:fldSimple>
       <w:r>
-        <w:t>. Colab code for pixel indexing, Sobel gradients and edge magnitude.</w:t>
-      </w:r>
-      <w:bookmarkEnd w:id="39"/>
-    </w:p>
-    <w:p>
-      <w:r>
-        <w:t>I implemented one CUDA thread per image pixel to calculate the X and Y gradients using the Sobel masks. Neighbours outside the image use zero padding, and the two signed gradient sums are combined with sqrt(Gx*Gx + Gy*Gy). I clamp the separate gradient display maps and the final magnitude to the 8-bit image range.</w:t>
-      </w:r>
-    </w:p>
-    <w:p>
-      <w:r>
-        <w:t>Source excerpt: SobelEdge.cu, sobelEdge, lines 22 to 46. The full source remains in SobelEdge.cu.</w:t>
+        <w:t>. Colab code for password indexing and candidate search.</w:t>
+      </w:r>
+      <w:bookmarkEnd w:id="32"/>
+    </w:p>
+    <w:p>
+      <w:r>
+        <w:t>I implemented a CUDA kernel in which each thread processes one encrypted password. The thread checks its index, uses its own candidate buffers and rejects letter pairs that fail to match the first six encrypted characters before trying digit pairs. A full match is copied to that thread's separate output slot.</w:t>
+      </w:r>
+    </w:p>
+    <w:p>
+      <w:r>
+        <w:t>Source excerpt: PWCrack.cu, crackPasswords, lines 40 to 64. The full source remains in PWCrack.cu.</w:t>
       </w:r>
     </w:p>
     <w:p>
       <w:pPr>
         <w:pStyle w:val="Heading2"/>
       </w:pPr>
-      <w:bookmarkStart w:id="40" w:name="_Toc242268635"/>
+      <w:bookmarkStart w:id="33" w:name="_Toc242565021"/>
       <w:r>
         <w:t>Synchronisation and memory</w:t>
       </w:r>
-      <w:bookmarkEnd w:id="40"/>
-    </w:p>
-    <w:p>
-      <w:r>
-        <w:t>Checked kernel completion precedes device-to-host copies of all three maps. A serial C reference expresses the gradients as neighbour sums and compares every final RGBA byte and both gradient buffers. An independent NumPy checker verifies all saved maps and their dimensions, including alpha in the final edge image.</w:t>
-      </w:r>
-    </w:p>
-    <w:p>
-      <w:r>
-        <w:t>Every successful output has exactly the original image dimensions. Zero padding can produce a visible edge around a constant bright image because its boundary neighbours are black. This is expected under the specified padding rule. PNG decode or encode failures and CUDA failures return errors; the batch can continue to a later valid input.</w:t>
-      </w:r>
-    </w:p>
-    <w:p>
-      <w:r>
-        <w:lastRenderedPageBreak/>
-        <w:t>Images are processed one at a time. Host image and reference buffers, all four device buffers and timing events are released after each image, including failure paths. Working memory depends on the largest image. Gradients are encoded losslessly from 8-bit grayscale buffers; LodePNG can optimise the file's storage without changing its decoded intensities.</w:t>
+      <w:bookmarkEnd w:id="33"/>
+    </w:p>
+    <w:p>
+      <w:r>
+        <w:t>The CPU copies plaintext and status arrays back after checking the kernel launch and completion. Every recovered plaintext is re-encrypted on the host and compared with its original encrypted line before it is accepted. An uncrackable but syntactically valid record writes NOT_FOUND in its position and returns exit code 2.</w:t>
+      </w:r>
+    </w:p>
+    <w:p>
+      <w:r>
+        <w:t>Input ordering is preserved by the fixed offsets record*11 and record*5. Every CUDA allocation, transfer, event, execution check and deallocation reports errors. Device buffers and events are released, and all host arrays are freed, including failure paths.</w:t>
       </w:r>
     </w:p>
     <w:p>
       <w:pPr>
         <w:pStyle w:val="Heading2"/>
       </w:pPr>
-      <w:bookmarkStart w:id="41" w:name="_Toc242268636"/>
+      <w:bookmarkStart w:id="34" w:name="_Toc242565022"/>
       <w:r>
         <w:t>Build and run</w:t>
       </w:r>
-      <w:bookmarkEnd w:id="41"/>
+      <w:bookmarkEnd w:id="34"/>
     </w:p>
     <w:p>
       <w:pPr>
@@ -5185,7 +5885,7 @@
         <w:rPr>
           <w:sz w:val="20"/>
         </w:rPr>
-        <w:t>nvcc -O2 -arch=sm_75 lodepng.cpp SobelEdge.cu -o SobelEdge</w:t>
+        <w:t>nvcc -O2 -arch=sm_75 PWCrack.cu -o PWCrack</w:t>
       </w:r>
     </w:p>
     <w:p>
@@ -5196,7 +5896,33 @@
         <w:rPr>
           <w:sz w:val="20"/>
         </w:rPr>
-        <w:t>mkdir -p outputs</w:t>
+        <w:t>./PWCrack passwords.txt</w:t>
+      </w:r>
+    </w:p>
+    <w:p>
+      <w:pPr>
+        <w:pStyle w:val="Heading2"/>
+      </w:pPr>
+      <w:bookmarkStart w:id="35" w:name="_Toc242565023"/>
+      <w:r>
+        <w:t>Results and tests</w:t>
+      </w:r>
+      <w:bookmarkEnd w:id="35"/>
+    </w:p>
+    <w:p>
+      <w:r>
+        <w:t>The normal dataset contains 10,000 synthetic passwords created with seed 6005 and the supplied encryption logic. It includes boundary cases such as aa00, zz99, az09 and za90. All 10,000 recovered values matched the known plaintext file exactly.</w:t>
+      </w:r>
+    </w:p>
+    <w:p>
+      <w:r>
+        <w:t>An exhaustive independent test generated all 67,600 possible raw passwords, checked that their encrypted values were distinct within this domain, and recovered every one in order. Input sizes of 1, 2 and 257 tested launch padding and multiple blocks. A separate test compiled and ran the lecturer's PasswordGeneratorToText.c and recovered its 25 generated records.</w:t>
+      </w:r>
+    </w:p>
+    <w:p>
+      <w:r>
+        <w:lastRenderedPageBreak/>
+        <w:t>Empty files, short lines, long lines, uppercase characters, invalid digits and blank lines were rejected. The valid-shaped string aaaaaa0000 had no candidate and correctly produced NOT_FOUND. The recorded kernel time for 10,000 records was 0.303 ms on the Tesla T4; file reads, allocation, transfers and output writes are excluded from that event timing.</w:t>
       </w:r>
     </w:p>
     <w:p>
@@ -5207,52 +5933,120 @@
         <w:rPr>
           <w:sz w:val="20"/>
         </w:rPr>
-        <w:t>./SobelEdge outputs images/download.png</w:t>
+        <w:t>GPU: Tesla T4</w:t>
+      </w:r>
+    </w:p>
+    <w:p>
+      <w:pPr>
+        <w:spacing w:after="0"/>
+      </w:pPr>
+      <w:r>
+        <w:rPr>
+          <w:sz w:val="20"/>
+        </w:rPr>
+        <w:t>Passwords: 10000; x blocks: 40; threads per block: 256</w:t>
+      </w:r>
+    </w:p>
+    <w:p>
+      <w:pPr>
+        <w:spacing w:after="0"/>
+      </w:pPr>
+      <w:r>
+        <w:rPr>
+          <w:sz w:val="20"/>
+        </w:rPr>
+        <w:t>CUDA kernel time: 0.303 ms</w:t>
+      </w:r>
+    </w:p>
+    <w:p>
+      <w:pPr>
+        <w:spacing w:after="0"/>
+      </w:pPr>
+      <w:r>
+        <w:rPr>
+          <w:sz w:val="20"/>
+        </w:rPr>
+        <w:t>Line 1: ccbddb2244 -&gt; aa00</w:t>
+      </w:r>
+    </w:p>
+    <w:p>
+      <w:pPr>
+        <w:spacing w:after="0"/>
+      </w:pPr>
+      <w:r>
+        <w:rPr>
+          <w:sz w:val="20"/>
+        </w:rPr>
+        <w:t>Line 2: cxbdwy2745 -&gt; zz99</w:t>
+      </w:r>
+    </w:p>
+    <w:p>
+      <w:pPr>
+        <w:spacing w:after="0"/>
+      </w:pPr>
+      <w:r>
+        <w:rPr>
+          <w:sz w:val="20"/>
+        </w:rPr>
+        <w:t>Line 3: ccbdwy2245 -&gt; az09</w:t>
+      </w:r>
+    </w:p>
+    <w:p>
+      <w:pPr>
+        <w:spacing w:after="0"/>
+      </w:pPr>
+      <w:r>
+        <w:rPr>
+          <w:sz w:val="20"/>
+        </w:rPr>
+        <w:t>Line 4: cxbddb2744 -&gt; za90</w:t>
+      </w:r>
+    </w:p>
+    <w:p>
+      <w:pPr>
+        <w:spacing w:after="0"/>
+      </w:pPr>
+      <w:r>
+        <w:rPr>
+          <w:sz w:val="20"/>
+        </w:rPr>
+        <w:t>Line 5: ccbeca3162 -&gt; ab12</w:t>
+      </w:r>
+    </w:p>
+    <w:p>
+      <w:pPr>
+        <w:spacing w:after="0"/>
+      </w:pPr>
+      <w:r>
+        <w:rPr>
+          <w:sz w:val="20"/>
+        </w:rPr>
+        <w:t>Line 6: oknqkm7312 -&gt; mn56</w:t>
+      </w:r>
+    </w:p>
+    <w:p>
+      <w:r>
+        <w:t>Actual CUDA execution excerpt. The full file has 10,000 recovered plaintext lines.</w:t>
       </w:r>
     </w:p>
     <w:p>
       <w:pPr>
         <w:pStyle w:val="Heading2"/>
       </w:pPr>
-      <w:bookmarkStart w:id="42" w:name="_Toc242268637"/>
-      <w:r>
-        <w:t>Results and tests</w:t>
-      </w:r>
-      <w:bookmarkEnd w:id="42"/>
-    </w:p>
-    <w:p>
-      <w:r>
-        <w:t>The revised notebook downloaded its single demonstration image live on the Tesla T4. Every pixel in the X gradient, Y gradient and final edge maps matched the references across 14 PNG test inputs. The public demonstration uses only download.png; additional small generated fixtures check zero padding, saturation, final-image transparency, grayscale rounding and padded launches.</w:t>
-      </w:r>
-    </w:p>
-    <w:p>
-      <w:r>
-        <w:t>Directional fixtures independently check that a horizontal ramp has zero interior Gy and a vertical ramp has zero interior Gx. Negative gradients remain visible through their absolute values. A constructed 3x3 patch gives Gx=6, Gy=8 and final magnitude 10 at its centre, reproducing the brief's numerical example. Corrupt files, invalid paths, duplicate inputs and cross-output filename collisions are also tested; a batch continues to a valid image after a corrupt one.</w:t>
-      </w:r>
-    </w:p>
-    <w:p>
-      <w:r>
-        <w:t>The updated 300x300 download.png run took 3.217 ms for serial CPU computation, 0.143 ms for the CUDA kernel, and 1.950 ms for transfers plus kernel. These are single-run observations. GPU allocation, PNG decoding and encoding are outside the transfer-and-kernel interval. The first CUDA invocation has additional startup overhead, so timings are not stable benchmark estimates.</w:t>
-      </w:r>
-    </w:p>
-    <w:p>
-      <w:pPr>
-        <w:pStyle w:val="Heading2"/>
-      </w:pPr>
-      <w:bookmarkStart w:id="43" w:name="_Toc242268638"/>
+      <w:bookmarkStart w:id="36" w:name="_Toc242565024"/>
       <w:r>
         <w:t>Performance and limits</w:t>
       </w:r>
-      <w:bookmarkEnd w:id="43"/>
-    </w:p>
-    <w:p>
-      <w:r>
-        <w:t>The implementation uses global memory and a basic one-thread-per-pixel kernel, matching the taught CUDA model. It does not use shared-memory tiling or concurrent image streams. Reading overlapping neighbourhoods repeats memory accesses, but the independent output ownership makes correctness straightforward.</w:t>
-      </w:r>
-    </w:p>
-    <w:p>
-      <w:r>
-        <w:t>Converting colour to luminance detects intensity edges. It does not preserve coloured edge directions. Very small images can be slower on the GPU once transfer and launch costs are included. The report separates the timing intervals to avoid implying that kernel speed is total application speed.</w:t>
+      <w:bookmarkEnd w:id="36"/>
+    </w:p>
+    <w:p>
+      <w:r>
+        <w:t>This is the assessment's synthetic character transformation, not an attack on a real authentication service. Candidate filtering is valid because encrypted positions 0..5 depend only on the two letters. Without this property, the same pruning would not be valid.</w:t>
+      </w:r>
+    </w:p>
+    <w:p>
+      <w:r>
+        <w:t>All records are held in host and device memory at once. Memory demand therefore grows linearly with file size, and files that cannot be allocated fail clearly. Kernel time alone must not be reported as end-to-end application time or compared with a CPU program that includes file I/O.</w:t>
       </w:r>
     </w:p>
     <w:p>
@@ -5260,12 +6054,12 @@
         <w:pStyle w:val="Heading2"/>
         <w:pageBreakBefore/>
       </w:pPr>
-      <w:bookmarkStart w:id="44" w:name="_Toc242268639"/>
+      <w:bookmarkStart w:id="37" w:name="_Toc242565025"/>
       <w:r>
         <w:lastRenderedPageBreak/>
         <w:t>Colab execution evidence</w:t>
       </w:r>
-      <w:bookmarkEnd w:id="44"/>
+      <w:bookmarkEnd w:id="37"/>
     </w:p>
     <w:p>
       <w:pPr>
@@ -5277,10 +6071,10 @@
           <w:noProof/>
         </w:rPr>
         <w:drawing>
-          <wp:inline distT="0" distB="0" distL="0" distR="0" wp14:anchorId="1F8CEA4E" wp14:editId="7C057CF6">
-            <wp:extent cx="5250887" cy="4892040"/>
+          <wp:inline distT="0" distB="0" distL="0" distR="0" wp14:anchorId="2FA85CD1" wp14:editId="68FD979D">
+            <wp:extent cx="6217920" cy="2054134"/>
             <wp:effectExtent l="0" t="0" r="0" b="0"/>
-            <wp:docPr id="8" name="Picture 8" descr="Figure 8. Task 04 single-image CUDA execution in Google Colab."/>
+            <wp:docPr id="17" name="Task_03_Colab.png" descr="Figure 8. Task 03 CUDA password recovery in Google Colab."/>
             <wp:cNvGraphicFramePr>
               <a:graphicFrameLocks xmlns:a="http://schemas.openxmlformats.org/drawingml/2006/main" noChangeAspect="1"/>
             </wp:cNvGraphicFramePr>
@@ -5288,7 +6082,7 @@
               <a:graphicData uri="http://schemas.openxmlformats.org/drawingml/2006/picture">
                 <pic:pic xmlns:pic="http://schemas.openxmlformats.org/drawingml/2006/picture">
                   <pic:nvPicPr>
-                    <pic:cNvPr id="0" name="Task_04_Colab.jpg"/>
+                    <pic:cNvPr id="0" name="image.png"/>
                     <pic:cNvPicPr/>
                   </pic:nvPicPr>
                   <pic:blipFill>
@@ -5300,7 +6094,7 @@
                   <pic:spPr>
                     <a:xfrm>
                       <a:off x="0" y="0"/>
-                      <a:ext cx="5250887" cy="4892040"/>
+                      <a:ext cx="6217920" cy="2054134"/>
                     </a:xfrm>
                     <a:prstGeom prst="rect">
                       <a:avLst/>
@@ -5318,7 +6112,7 @@
         <w:pStyle w:val="Caption"/>
         <w:keepNext/>
       </w:pPr>
-      <w:bookmarkStart w:id="45" w:name="_Toc242268650"/>
+      <w:bookmarkStart w:id="38" w:name="_Toc242565046"/>
       <w:r>
         <w:t xml:space="preserve">Figure </w:t>
       </w:r>
@@ -5331,26 +6125,108 @@
         </w:r>
       </w:fldSimple>
       <w:r>
-        <w:t>. Task 04 single-image CUDA execution in Google Colab.</w:t>
-      </w:r>
-      <w:bookmarkEnd w:id="45"/>
-    </w:p>
-    <w:p>
-      <w:r>
-        <w:t>This capture records the notebook run for the 300x300 download.png image on the T4 runtime. Its output identifies the X gradient, Y gradient and final edge PNGs. The reference comparison checks these maps against the serial C calculation. The independent NumPy tests check the saved PNG pixels and gradient directions separately.</w:t>
-      </w:r>
+        <w:t>. Task 03 CUDA password recovery in Google Colab.</w:t>
+      </w:r>
+      <w:bookmarkEnd w:id="38"/>
+    </w:p>
+    <w:p>
+      <w:r>
+        <w:t>The program summary reports 10,000 recovered and verified passwords out of 10,000 and identifies decrypted.txt. The display cell shows encrypted records beside their recovered two-letter, two-digit plaintext values. The full-domain and invalid-input tests described above provide checks beyond these displayed examples.</w:t>
+      </w:r>
+    </w:p>
+    <w:p>
+      <w:pPr>
+        <w:pStyle w:val="Heading1"/>
+        <w:pageBreakBefore/>
+      </w:pPr>
+      <w:bookmarkStart w:id="39" w:name="_Toc242565026"/>
+      <w:r>
+        <w:lastRenderedPageBreak/>
+        <w:t>Task 04</w:t>
+      </w:r>
+      <w:r>
+        <w:br/>
+        <w:t>Sobel Edge Detection using Cuda across many PNG images</w:t>
+      </w:r>
+      <w:bookmarkEnd w:id="39"/>
+    </w:p>
+    <w:p>
+      <w:hyperlink r:id="rId26">
+        <w:r>
+          <w:rPr>
+            <w:color w:val="164B6B"/>
+            <w:u w:val="single"/>
+          </w:rPr>
+          <w:t>Task 04 source notebook in Colab</w:t>
+        </w:r>
+      </w:hyperlink>
+    </w:p>
+    <w:p>
+      <w:hyperlink r:id="rId27">
+        <w:r>
+          <w:rPr>
+            <w:color w:val="164B6B"/>
+            <w:u w:val="single"/>
+          </w:rPr>
+          <w:t>Executed Task 04 Colab notebook</w:t>
+        </w:r>
+      </w:hyperlink>
     </w:p>
     <w:p>
       <w:pPr>
         <w:pStyle w:val="Heading2"/>
-        <w:pageBreakBefore/>
-      </w:pPr>
-      <w:bookmarkStart w:id="46" w:name="_Toc242268640"/>
+      </w:pPr>
+      <w:bookmarkStart w:id="40" w:name="_Toc242565027"/>
+      <w:r>
+        <w:t>Objective</w:t>
+      </w:r>
+      <w:bookmarkEnd w:id="40"/>
+    </w:p>
+    <w:p>
+      <w:r>
+        <w:t>Use one public input image, download.png, to demonstrate the brief's four views: Original Image, Gradient in X direction, Gradient in Y direction and Sobel Edge Detection. The four panels are views of the same input. Save both gradient maps and the combined edge map at the original dimensions. The CUDA program also accepts multiple PNG paths when a batch is required.</w:t>
+      </w:r>
+    </w:p>
+    <w:p>
+      <w:pPr>
+        <w:pStyle w:val="Heading2"/>
+      </w:pPr>
+      <w:bookmarkStart w:id="41" w:name="_Toc242565028"/>
+      <w:r>
+        <w:t>Implementation</w:t>
+      </w:r>
+      <w:bookmarkEnd w:id="41"/>
+    </w:p>
+    <w:p>
+      <w:r>
+        <w:t>The notebook automatically downloads lodepng.cpp, lodepng.h and download.png (300x300) from the public GitHub project. The image is an unchanged copy of the public input in the last-class teaching example. The files are taken from a fixed project revision, so every fresh runtime uses the same inputs. LodePNG decodes the image into an RGBA host array, with its original licence notices retained.</w:t>
+      </w:r>
+    </w:p>
+    <w:p>
+      <w:r>
+        <w:t>The last-class sample demonstrates PNG decoding, explicit CUDA memory transfers and rgbToGray; its final kernel stops at grayscale conversion. This implementation extends that workflow with the assessed Sobel convolution. Luminance uses the lecturer's 0.30R + 0.59G + 0.11B weights as (30*R + 59*G + 11*B) / 100, rounded down. Integer arithmetic gives identical CPU and GPU truncation. Gx is [-1,0,1; -2,0,2; -1,0,1] and Gy is [-1,-2,-1; 0,0,0; 1,2,1]. Out-of-image neighbours are zero.</w:t>
+      </w:r>
+    </w:p>
+    <w:p>
+      <w:r>
+        <w:t>Gx measures left-to-right intensity changes and Gy measures top-to-bottom changes, following the written axis definitions. The kernel saves min(255, abs(Gx)) and min(255, abs(Gy)) in separate one-byte-per-pixel display buffers. The final magnitude uses the original signed sums: sqrt(Gx*Gx + Gy*Gy), then truncation and saturation at 255. Clipping a display map never changes that calculation. The final edge value fills RGB and preserves input alpha; the separate gradient maps contain grayscale intensity only.</w:t>
+      </w:r>
+    </w:p>
+    <w:p>
+      <w:r>
+        <w:t>RGBA input and final output arrays each use width*height*4 bytes. Each gradient array uses width*height bytes. The x grid has ceil(pixel_count/256) blocks and a guard for padded threads. The command accepts any number of PNGs. Output names are outImg_, outImg_Gx_ and outImg_Gy_ followed by the input basename. The host rejects duplicate or colliding generated names before processing. Gradient encoding uses lodepng_encode_file with LCT_GREY, 8, matching the lecturer's grayscale-buffer workflow.</w:t>
+      </w:r>
+    </w:p>
+    <w:p>
+      <w:pPr>
+        <w:pStyle w:val="Heading2"/>
+      </w:pPr>
+      <w:bookmarkStart w:id="42" w:name="_Toc242565029"/>
       <w:r>
         <w:lastRenderedPageBreak/>
-        <w:t>Task 04 image outputs</w:t>
-      </w:r>
-      <w:bookmarkEnd w:id="46"/>
+        <w:t>Code I implemented</w:t>
+      </w:r>
+      <w:bookmarkEnd w:id="42"/>
     </w:p>
     <w:p>
       <w:pPr>
@@ -5362,10 +6238,10 @@
           <w:noProof/>
         </w:rPr>
         <w:drawing>
-          <wp:inline distT="0" distB="0" distL="0" distR="0" wp14:anchorId="7997F1C5" wp14:editId="552319A9">
-            <wp:extent cx="6217920" cy="5274668"/>
+          <wp:inline distT="0" distB="0" distL="0" distR="0" wp14:anchorId="63AE4C22" wp14:editId="30AB95FC">
+            <wp:extent cx="6217920" cy="2149404"/>
             <wp:effectExtent l="0" t="0" r="0" b="0"/>
-            <wp:docPr id="9" name="Picture 9" descr="Figure 9. Four views of the same download.png input displayed in Google Colab."/>
+            <wp:docPr id="18" name="Task_04_Code_Colab.png" descr="Figure 9. Colab code for pixel indexing, Sobel gradients and edge magnitude."/>
             <wp:cNvGraphicFramePr>
               <a:graphicFrameLocks xmlns:a="http://schemas.openxmlformats.org/drawingml/2006/main" noChangeAspect="1"/>
             </wp:cNvGraphicFramePr>
@@ -5373,11 +6249,11 @@
               <a:graphicData uri="http://schemas.openxmlformats.org/drawingml/2006/picture">
                 <pic:pic xmlns:pic="http://schemas.openxmlformats.org/drawingml/2006/picture">
                   <pic:nvPicPr>
-                    <pic:cNvPr id="0" name="Task_04_Four_Views_Colab.jpg"/>
+                    <pic:cNvPr id="0" name="image.png"/>
                     <pic:cNvPicPr/>
                   </pic:nvPicPr>
                   <pic:blipFill>
-                    <a:blip r:embed="rId26"/>
+                    <a:blip r:embed="rId28"/>
                     <a:stretch>
                       <a:fillRect/>
                     </a:stretch>
@@ -5385,7 +6261,7 @@
                   <pic:spPr>
                     <a:xfrm>
                       <a:off x="0" y="0"/>
-                      <a:ext cx="6217920" cy="5274668"/>
+                      <a:ext cx="6217920" cy="2149404"/>
                     </a:xfrm>
                     <a:prstGeom prst="rect">
                       <a:avLst/>
@@ -5403,7 +6279,7 @@
         <w:pStyle w:val="Caption"/>
         <w:keepNext/>
       </w:pPr>
-      <w:bookmarkStart w:id="47" w:name="_Toc242268651"/>
+      <w:bookmarkStart w:id="43" w:name="_Toc242565047"/>
       <w:r>
         <w:t xml:space="preserve">Figure </w:t>
       </w:r>
@@ -5416,13 +6292,390 @@
         </w:r>
       </w:fldSimple>
       <w:r>
+        <w:t>. Colab code for pixel indexing, Sobel gradients and edge magnitude.</w:t>
+      </w:r>
+      <w:bookmarkEnd w:id="43"/>
+    </w:p>
+    <w:p>
+      <w:r>
+        <w:t>I implemented one CUDA thread per image pixel to calculate the X and Y gradients using the Sobel masks. Neighbours outside the image use zero padding, and the two signed gradient sums are combined with sqrt(Gx*Gx + Gy*Gy). I clamp the separate gradient display maps and the final magnitude to the 8-bit image range.</w:t>
+      </w:r>
+    </w:p>
+    <w:p>
+      <w:r>
+        <w:t>Source excerpt: SobelEdge.cu, sobelEdge, lines 22 to 46. The full source remains in SobelEdge.cu.</w:t>
+      </w:r>
+    </w:p>
+    <w:p>
+      <w:pPr>
+        <w:pStyle w:val="Heading2"/>
+      </w:pPr>
+      <w:bookmarkStart w:id="44" w:name="_Toc242565030"/>
+      <w:r>
+        <w:t>Synchronisation and memory</w:t>
+      </w:r>
+      <w:bookmarkEnd w:id="44"/>
+    </w:p>
+    <w:p>
+      <w:r>
+        <w:t>Checked kernel completion precedes device-to-host copies of all three maps. A serial C reference expresses the gradients as neighbour sums and compares every final RGBA byte and both gradient buffers. An independent NumPy checker verifies all saved maps and their dimensions, including alpha in the final edge image.</w:t>
+      </w:r>
+    </w:p>
+    <w:p>
+      <w:r>
+        <w:t>Every successful output has exactly the original image dimensions. Zero padding can produce a visible edge around a constant bright image because its boundary neighbours are black. This is expected under the specified padding rule. PNG decode or encode failures and CUDA failures return errors; the batch can continue to a later valid input.</w:t>
+      </w:r>
+    </w:p>
+    <w:p>
+      <w:r>
+        <w:t>Images are processed one at a time. Host image and reference buffers, all four device buffers and timing events are released after each image, including failure paths. Working memory depends on the largest image. Gradients are encoded losslessly from 8-bit grayscale buffers; LodePNG can optimise the file's storage without changing its decoded intensities.</w:t>
+      </w:r>
+    </w:p>
+    <w:p>
+      <w:pPr>
+        <w:pStyle w:val="Heading2"/>
+      </w:pPr>
+      <w:bookmarkStart w:id="45" w:name="_Toc242565031"/>
+      <w:r>
+        <w:t>Build and run</w:t>
+      </w:r>
+      <w:bookmarkEnd w:id="45"/>
+    </w:p>
+    <w:p>
+      <w:pPr>
+        <w:spacing w:after="0"/>
+      </w:pPr>
+      <w:r>
+        <w:rPr>
+          <w:sz w:val="20"/>
+        </w:rPr>
+        <w:t>nvcc -O2 -arch=sm_75 lodepng.cpp SobelEdge.cu -o SobelEdge</w:t>
+      </w:r>
+    </w:p>
+    <w:p>
+      <w:pPr>
+        <w:spacing w:after="0"/>
+      </w:pPr>
+      <w:r>
+        <w:rPr>
+          <w:sz w:val="20"/>
+        </w:rPr>
+        <w:t>mkdir -p outputs</w:t>
+      </w:r>
+    </w:p>
+    <w:p>
+      <w:pPr>
+        <w:spacing w:after="0"/>
+      </w:pPr>
+      <w:r>
+        <w:rPr>
+          <w:sz w:val="20"/>
+        </w:rPr>
+        <w:t>./SobelEdge outputs images/download.png</w:t>
+      </w:r>
+    </w:p>
+    <w:p>
+      <w:pPr>
+        <w:pStyle w:val="Heading2"/>
+      </w:pPr>
+      <w:bookmarkStart w:id="46" w:name="_Toc242565032"/>
+      <w:r>
+        <w:t>Results and tests</w:t>
+      </w:r>
+      <w:bookmarkEnd w:id="46"/>
+    </w:p>
+    <w:p>
+      <w:r>
+        <w:t xml:space="preserve">The revised notebook downloaded its single demonstration image live on the Tesla T4. Every pixel in the X gradient, Y gradient and final edge maps matched the references across 14 PNG test inputs. </w:t>
+      </w:r>
+      <w:r>
+        <w:lastRenderedPageBreak/>
+        <w:t>The public demonstration uses only download.png; additional small generated fixtures check zero padding, saturation, final-image transparency, grayscale rounding and padded launches.</w:t>
+      </w:r>
+    </w:p>
+    <w:p>
+      <w:r>
+        <w:t>Directional fixtures independently check that a horizontal ramp has zero interior Gy and a vertical ramp has zero interior Gx. Negative gradients remain visible through their absolute values. A constructed 3x3 patch gives Gx=6, Gy=8 and final magnitude 10 at its centre, reproducing the brief's numerical example. Corrupt files, invalid paths, duplicate inputs and cross-output filename collisions are also tested; a batch continues to a valid image after a corrupt one.</w:t>
+      </w:r>
+    </w:p>
+    <w:p>
+      <w:r>
+        <w:t>The updated 300x300 download.png run took 3.217 ms for serial CPU computation, 0.143 ms for the CUDA kernel, and 1.950 ms for transfers plus kernel. These are single-run observations. GPU allocation, PNG decoding and encoding are outside the transfer-and-kernel interval. The first CUDA invocation has additional startup overhead, so timings are not stable benchmark estimates.</w:t>
+      </w:r>
+    </w:p>
+    <w:p>
+      <w:pPr>
+        <w:pStyle w:val="Heading2"/>
+      </w:pPr>
+      <w:bookmarkStart w:id="47" w:name="_Toc242565033"/>
+      <w:r>
+        <w:t>Performance and limits</w:t>
+      </w:r>
+      <w:bookmarkEnd w:id="47"/>
+    </w:p>
+    <w:p>
+      <w:r>
+        <w:t>The implementation uses global memory and a basic one-thread-per-pixel kernel, matching the taught CUDA model. It does not use shared-memory tiling or concurrent image streams. Reading overlapping neighbourhoods repeats memory accesses, but the independent output ownership makes correctness straightforward.</w:t>
+      </w:r>
+    </w:p>
+    <w:p>
+      <w:r>
+        <w:t>Converting colour to luminance detects intensity edges. It does not preserve coloured edge directions. Very small images can be slower on the GPU once transfer and launch costs are included. The report separates the timing intervals to avoid implying that kernel speed is total application speed.</w:t>
+      </w:r>
+    </w:p>
+    <w:p>
+      <w:pPr>
+        <w:pStyle w:val="Heading2"/>
+        <w:pageBreakBefore/>
+      </w:pPr>
+      <w:bookmarkStart w:id="48" w:name="_Toc242565034"/>
+      <w:r>
+        <w:lastRenderedPageBreak/>
+        <w:t>Colab execution evidence</w:t>
+      </w:r>
+      <w:bookmarkEnd w:id="48"/>
+    </w:p>
+    <w:p>
+      <w:pPr>
+        <w:keepNext/>
+        <w:jc w:val="center"/>
+      </w:pPr>
+      <w:r>
+        <w:rPr>
+          <w:noProof/>
+        </w:rPr>
+        <w:drawing>
+          <wp:inline distT="0" distB="0" distL="0" distR="0" wp14:anchorId="41A5B206" wp14:editId="0CAB62FB">
+            <wp:extent cx="6217920" cy="2112919"/>
+            <wp:effectExtent l="0" t="0" r="0" b="0"/>
+            <wp:docPr id="19" name="Task_04_Colab.png" descr="Figure 10. Task 04 single-image CUDA execution in Google Colab."/>
+            <wp:cNvGraphicFramePr>
+              <a:graphicFrameLocks xmlns:a="http://schemas.openxmlformats.org/drawingml/2006/main" noChangeAspect="1"/>
+            </wp:cNvGraphicFramePr>
+            <a:graphic xmlns:a="http://schemas.openxmlformats.org/drawingml/2006/main">
+              <a:graphicData uri="http://schemas.openxmlformats.org/drawingml/2006/picture">
+                <pic:pic xmlns:pic="http://schemas.openxmlformats.org/drawingml/2006/picture">
+                  <pic:nvPicPr>
+                    <pic:cNvPr id="0" name="image.png"/>
+                    <pic:cNvPicPr/>
+                  </pic:nvPicPr>
+                  <pic:blipFill>
+                    <a:blip r:embed="rId29"/>
+                    <a:stretch>
+                      <a:fillRect/>
+                    </a:stretch>
+                  </pic:blipFill>
+                  <pic:spPr>
+                    <a:xfrm>
+                      <a:off x="0" y="0"/>
+                      <a:ext cx="6217920" cy="2112919"/>
+                    </a:xfrm>
+                    <a:prstGeom prst="rect">
+                      <a:avLst/>
+                    </a:prstGeom>
+                  </pic:spPr>
+                </pic:pic>
+              </a:graphicData>
+            </a:graphic>
+          </wp:inline>
+        </w:drawing>
+      </w:r>
+    </w:p>
+    <w:p>
+      <w:pPr>
+        <w:pStyle w:val="Caption"/>
+        <w:keepNext/>
+      </w:pPr>
+      <w:bookmarkStart w:id="49" w:name="_Toc242565048"/>
+      <w:r>
+        <w:t xml:space="preserve">Figure </w:t>
+      </w:r>
+      <w:fldSimple w:instr=" SEQ Figure \* ARABIC ">
+        <w:r>
+          <w:rPr>
+            <w:noProof/>
+          </w:rPr>
+          <w:t>10</w:t>
+        </w:r>
+      </w:fldSimple>
+      <w:r>
+        <w:t>. Task 04 single-image CUDA execution in Google Colab.</w:t>
+      </w:r>
+      <w:bookmarkEnd w:id="49"/>
+    </w:p>
+    <w:p>
+      <w:r>
+        <w:t>This capture records the notebook run for the 300x300 download.png image on the T4 runtime. Its output identifies the X gradient, Y gradient and final edge PNGs. The reference comparison checks these maps against the serial C calculation. The independent NumPy tests check the saved PNG pixels and gradient directions separately.</w:t>
+      </w:r>
+    </w:p>
+    <w:p>
+      <w:pPr>
+        <w:pStyle w:val="Heading2"/>
+        <w:pageBreakBefore/>
+      </w:pPr>
+      <w:bookmarkStart w:id="50" w:name="_Toc242565035"/>
+      <w:r>
+        <w:lastRenderedPageBreak/>
+        <w:t>Task 04 image outputs</w:t>
+      </w:r>
+      <w:bookmarkEnd w:id="50"/>
+    </w:p>
+    <w:p>
+      <w:pPr>
+        <w:keepNext/>
+        <w:jc w:val="center"/>
+      </w:pPr>
+      <w:r>
+        <w:rPr>
+          <w:noProof/>
+        </w:rPr>
+        <w:drawing>
+          <wp:inline distT="0" distB="0" distL="0" distR="0" wp14:anchorId="2600DFA6" wp14:editId="0A909A15">
+            <wp:extent cx="6217920" cy="5291359"/>
+            <wp:effectExtent l="0" t="0" r="0" b="0"/>
+            <wp:docPr id="20" name="Task_04_Four_Views_Colab.png" descr="Figure 11. Four views of the same download.png input displayed in Google Colab."/>
+            <wp:cNvGraphicFramePr>
+              <a:graphicFrameLocks xmlns:a="http://schemas.openxmlformats.org/drawingml/2006/main" noChangeAspect="1"/>
+            </wp:cNvGraphicFramePr>
+            <a:graphic xmlns:a="http://schemas.openxmlformats.org/drawingml/2006/main">
+              <a:graphicData uri="http://schemas.openxmlformats.org/drawingml/2006/picture">
+                <pic:pic xmlns:pic="http://schemas.openxmlformats.org/drawingml/2006/picture">
+                  <pic:nvPicPr>
+                    <pic:cNvPr id="0" name="image.png"/>
+                    <pic:cNvPicPr/>
+                  </pic:nvPicPr>
+                  <pic:blipFill>
+                    <a:blip r:embed="rId30"/>
+                    <a:stretch>
+                      <a:fillRect/>
+                    </a:stretch>
+                  </pic:blipFill>
+                  <pic:spPr>
+                    <a:xfrm>
+                      <a:off x="0" y="0"/>
+                      <a:ext cx="6217920" cy="5291359"/>
+                    </a:xfrm>
+                    <a:prstGeom prst="rect">
+                      <a:avLst/>
+                    </a:prstGeom>
+                  </pic:spPr>
+                </pic:pic>
+              </a:graphicData>
+            </a:graphic>
+          </wp:inline>
+        </w:drawing>
+      </w:r>
+    </w:p>
+    <w:p>
+      <w:pPr>
+        <w:pStyle w:val="Caption"/>
+        <w:keepNext/>
+      </w:pPr>
+      <w:bookmarkStart w:id="51" w:name="_Toc242565049"/>
+      <w:r>
+        <w:t xml:space="preserve">Figure </w:t>
+      </w:r>
+      <w:fldSimple w:instr=" SEQ Figure \* ARABIC ">
+        <w:r>
+          <w:rPr>
+            <w:noProof/>
+          </w:rPr>
+          <w:t>11</w:t>
+        </w:r>
+      </w:fldSimple>
+      <w:r>
         <w:t>. Four views of the same download.png input displayed in Google Colab.</w:t>
       </w:r>
-      <w:bookmarkEnd w:id="47"/>
+      <w:bookmarkEnd w:id="51"/>
     </w:p>
     <w:p>
       <w:r>
         <w:t>The upper-left panel is the original colour image. The upper-right panel displays the absolute X gradient, which responds to left-right intensity changes; the lower-left displays the absolute Y gradient, which responds to top-bottom changes. The lower-right panel is the combined Sobel magnitude. Each map is calculated by the CUDA kernel from the same original pixels. Display values are clamped to 255, while the final magnitude uses the signed, unclipped Gx and Gy sums. All four views retain the 300x300 image dimensions.</w:t>
+      </w:r>
+    </w:p>
+    <w:p>
+      <w:pPr>
+        <w:pStyle w:val="Heading2"/>
+        <w:pageBreakBefore/>
+      </w:pPr>
+      <w:bookmarkStart w:id="52" w:name="_Toc242565036"/>
+      <w:r>
+        <w:lastRenderedPageBreak/>
+        <w:t>Task 04 validation evidence</w:t>
+      </w:r>
+      <w:bookmarkEnd w:id="52"/>
+    </w:p>
+    <w:p>
+      <w:pPr>
+        <w:keepNext/>
+        <w:jc w:val="center"/>
+      </w:pPr>
+      <w:r>
+        <w:rPr>
+          <w:noProof/>
+        </w:rPr>
+        <w:drawing>
+          <wp:inline distT="0" distB="0" distL="0" distR="0" wp14:anchorId="6873C2A3" wp14:editId="3BFECB18">
+            <wp:extent cx="5398108" cy="5029200"/>
+            <wp:effectExtent l="0" t="0" r="0" b="0"/>
+            <wp:docPr id="21" name="Task_04_Validation_Colab.jpg" descr="Figure 12. Task 04 validation results in Google Colab."/>
+            <wp:cNvGraphicFramePr>
+              <a:graphicFrameLocks xmlns:a="http://schemas.openxmlformats.org/drawingml/2006/main" noChangeAspect="1"/>
+            </wp:cNvGraphicFramePr>
+            <a:graphic xmlns:a="http://schemas.openxmlformats.org/drawingml/2006/main">
+              <a:graphicData uri="http://schemas.openxmlformats.org/drawingml/2006/picture">
+                <pic:pic xmlns:pic="http://schemas.openxmlformats.org/drawingml/2006/picture">
+                  <pic:nvPicPr>
+                    <pic:cNvPr id="0" name="image.jpg"/>
+                    <pic:cNvPicPr/>
+                  </pic:nvPicPr>
+                  <pic:blipFill>
+                    <a:blip r:embed="rId31"/>
+                    <a:stretch>
+                      <a:fillRect/>
+                    </a:stretch>
+                  </pic:blipFill>
+                  <pic:spPr>
+                    <a:xfrm>
+                      <a:off x="0" y="0"/>
+                      <a:ext cx="5398108" cy="5029200"/>
+                    </a:xfrm>
+                    <a:prstGeom prst="rect">
+                      <a:avLst/>
+                    </a:prstGeom>
+                  </pic:spPr>
+                </pic:pic>
+              </a:graphicData>
+            </a:graphic>
+          </wp:inline>
+        </w:drawing>
+      </w:r>
+    </w:p>
+    <w:p>
+      <w:pPr>
+        <w:pStyle w:val="Caption"/>
+        <w:keepNext/>
+      </w:pPr>
+      <w:bookmarkStart w:id="53" w:name="_Toc242565050"/>
+      <w:r>
+        <w:t xml:space="preserve">Figure </w:t>
+      </w:r>
+      <w:fldSimple w:instr=" SEQ Figure \* ARABIC ">
+        <w:r>
+          <w:rPr>
+            <w:noProof/>
+          </w:rPr>
+          <w:t>12</w:t>
+        </w:r>
+      </w:fldSimple>
+      <w:r>
+        <w:t>. Task 04 validation results in Google Colab.</w:t>
+      </w:r>
+      <w:bookmarkEnd w:id="53"/>
+    </w:p>
+    <w:p>
+      <w:r>
+        <w:t>The validation capture reports that all three test groups passed, including the full pixel comparison, gradient direction checks and invalid input checks.</w:t>
       </w:r>
     </w:p>
     <w:p>
@@ -5430,12 +6683,12 @@
         <w:pStyle w:val="Heading1"/>
         <w:pageBreakBefore/>
       </w:pPr>
-      <w:bookmarkStart w:id="48" w:name="_Toc242268641"/>
+      <w:bookmarkStart w:id="54" w:name="_Toc242565037"/>
       <w:r>
         <w:lastRenderedPageBreak/>
         <w:t>Evidence and submission</w:t>
       </w:r>
-      <w:bookmarkEnd w:id="48"/>
+      <w:bookmarkEnd w:id="54"/>
     </w:p>
     <w:p>
       <w:r>
@@ -5456,11 +6709,11 @@
       <w:pPr>
         <w:pStyle w:val="Heading1"/>
       </w:pPr>
-      <w:bookmarkStart w:id="49" w:name="_Toc242268642"/>
+      <w:bookmarkStart w:id="55" w:name="_Toc242565038"/>
       <w:r>
         <w:t>References</w:t>
       </w:r>
-      <w:bookmarkEnd w:id="49"/>
+      <w:bookmarkEnd w:id="55"/>
     </w:p>
     <w:p>
       <w:r>
@@ -5498,7 +6751,7 @@
       </w:r>
     </w:p>
     <w:p>
-      <w:hyperlink r:id="rId27">
+      <w:hyperlink r:id="rId32">
         <w:r>
           <w:rPr>
             <w:color w:val="164B6B"/>
@@ -5509,7 +6762,7 @@
       </w:hyperlink>
     </w:p>
     <w:p>
-      <w:hyperlink r:id="rId28">
+      <w:hyperlink r:id="rId33">
         <w:r>
           <w:rPr>
             <w:color w:val="164B6B"/>
@@ -5520,7 +6773,7 @@
       </w:hyperlink>
     </w:p>
     <w:p>
-      <w:hyperlink r:id="rId29">
+      <w:hyperlink r:id="rId34">
         <w:r>
           <w:rPr>
             <w:color w:val="164B6B"/>
@@ -5531,7 +6784,7 @@
       </w:hyperlink>
     </w:p>
     <w:p>
-      <w:hyperlink r:id="rId30">
+      <w:hyperlink r:id="rId35">
         <w:r>
           <w:rPr>
             <w:color w:val="164B6B"/>
@@ -5542,10 +6795,11 @@
       </w:hyperlink>
     </w:p>
     <w:sectPr>
-      <w:footerReference w:type="default" r:id="rId31"/>
+      <w:footerReference w:type="default" r:id="rId36"/>
       <w:pgSz w:w="12240" w:h="15840"/>
       <w:pgMar w:top="1152" w:right="1224" w:bottom="1296" w:left="1224" w:header="720" w:footer="504" w:gutter="0"/>
       <w:cols w:space="720"/>
+      <w:titlePg/>
       <w:docGrid w:linePitch="360"/>
     </w:sectPr>
   </w:body>
@@ -5801,31 +7055,31 @@
       </w:rPr>
     </w:lvl>
   </w:abstractNum>
-  <w:num w:numId="1" w16cid:durableId="359598881">
+  <w:num w:numId="1" w16cid:durableId="1230724754">
     <w:abstractNumId w:val="8"/>
   </w:num>
-  <w:num w:numId="2" w16cid:durableId="825821402">
+  <w:num w:numId="2" w16cid:durableId="1535145808">
     <w:abstractNumId w:val="6"/>
   </w:num>
-  <w:num w:numId="3" w16cid:durableId="27998067">
+  <w:num w:numId="3" w16cid:durableId="516509383">
     <w:abstractNumId w:val="5"/>
   </w:num>
-  <w:num w:numId="4" w16cid:durableId="1100760886">
+  <w:num w:numId="4" w16cid:durableId="1719234500">
     <w:abstractNumId w:val="4"/>
   </w:num>
-  <w:num w:numId="5" w16cid:durableId="603541976">
+  <w:num w:numId="5" w16cid:durableId="2131777630">
     <w:abstractNumId w:val="7"/>
   </w:num>
-  <w:num w:numId="6" w16cid:durableId="164709869">
+  <w:num w:numId="6" w16cid:durableId="433673842">
     <w:abstractNumId w:val="3"/>
   </w:num>
-  <w:num w:numId="7" w16cid:durableId="136652107">
+  <w:num w:numId="7" w16cid:durableId="335353522">
     <w:abstractNumId w:val="2"/>
   </w:num>
-  <w:num w:numId="8" w16cid:durableId="66803525">
+  <w:num w:numId="8" w16cid:durableId="146751125">
     <w:abstractNumId w:val="1"/>
   </w:num>
-  <w:num w:numId="9" w16cid:durableId="489370559">
+  <w:num w:numId="9" w16cid:durableId="428433635">
     <w:abstractNumId w:val="0"/>
   </w:num>
 </w:numbering>
@@ -17431,7 +18685,7 @@
     <w:autoRedefine/>
     <w:uiPriority w:val="39"/>
     <w:unhideWhenUsed/>
-    <w:rsid w:val="00C01FB6"/>
+    <w:rsid w:val="00FB5005"/>
     <w:pPr>
       <w:spacing w:after="100"/>
     </w:pPr>
@@ -17443,7 +18697,7 @@
     <w:autoRedefine/>
     <w:uiPriority w:val="39"/>
     <w:unhideWhenUsed/>
-    <w:rsid w:val="00C01FB6"/>
+    <w:rsid w:val="00FB5005"/>
     <w:pPr>
       <w:spacing w:after="100"/>
       <w:ind w:left="240"/>
@@ -17454,7 +18708,7 @@
     <w:basedOn w:val="DefaultParagraphFont"/>
     <w:uiPriority w:val="99"/>
     <w:unhideWhenUsed/>
-    <w:rsid w:val="00C01FB6"/>
+    <w:rsid w:val="00FB5005"/>
     <w:rPr>
       <w:color w:val="0000FF" w:themeColor="hyperlink"/>
       <w:u w:val="single"/>
@@ -17466,7 +18720,7 @@
     <w:next w:val="Normal"/>
     <w:uiPriority w:val="99"/>
     <w:unhideWhenUsed/>
-    <w:rsid w:val="00C01FB6"/>
+    <w:rsid w:val="00FB5005"/>
     <w:pPr>
       <w:spacing w:after="0"/>
     </w:pPr>

</xml_diff>